<commit_message>
Updated logical and relational models and continued working on final draft document (filling in notes).
</commit_message>
<xml_diff>
--- a/GIS-Data-Migration-Project/Assignment Documents/Final Project - Part 2 - Final Project Rough Draft.docx
+++ b/GIS-Data-Migration-Project/Assignment Documents/Final Project - Part 2 - Final Project Rough Draft.docx
@@ -21,6 +21,21 @@
         <w:t>Introduction</w:t>
       </w:r>
     </w:p>
+    <w:p>
+      <w:r>
+        <w:t>Intro Paragraph</w:t>
+      </w:r>
+    </w:p>
+    <w:p>
+      <w:r>
+        <w:t>Summary &amp; Why I chose this project paragraph</w:t>
+      </w:r>
+    </w:p>
+    <w:p>
+      <w:r>
+        <w:t>Minimal and Optimistic Goals for project</w:t>
+      </w:r>
+    </w:p>
     <w:p/>
     <w:p/>
     <w:p>
@@ -44,26 +59,10 @@
         </w:numPr>
       </w:pPr>
       <w:r>
-        <w:t xml:space="preserve">The general topic focuses on my goal to create a strong and flexible data layer for </w:t>
-      </w:r>
-      <w:proofErr w:type="gramStart"/>
-      <w:r>
-        <w:t>my</w:t>
-      </w:r>
-      <w:proofErr w:type="gramEnd"/>
-      <w:r>
-        <w:t xml:space="preserve"> explore more project. Specifically utilizing two different kinds of databases to successfully collect and pull information </w:t>
-      </w:r>
-      <w:r>
-        <w:t xml:space="preserve">from multiple sources to represent locations focused </w:t>
-      </w:r>
-      <w:proofErr w:type="gramStart"/>
-      <w:r>
-        <w:t>around</w:t>
-      </w:r>
-      <w:proofErr w:type="gramEnd"/>
-      <w:r>
-        <w:t xml:space="preserve"> State Parks, National Parks, State Recreational Areas, and more. </w:t>
+        <w:t xml:space="preserve">The general topic focuses on my goal to create a strong and flexible data layer for my explore more project. Specifically utilizing two different kinds of databases to successfully collect and pull information </w:t>
+      </w:r>
+      <w:r>
+        <w:t xml:space="preserve">from multiple sources to represent locations focused around State Parks, National Parks, State Recreational Areas, and more. </w:t>
       </w:r>
     </w:p>
     <w:p>
@@ -75,15 +74,7 @@
         </w:numPr>
       </w:pPr>
       <w:r>
-        <w:t xml:space="preserve">Gives </w:t>
-      </w:r>
-      <w:proofErr w:type="gramStart"/>
-      <w:r>
-        <w:t>a brief summary</w:t>
-      </w:r>
-      <w:proofErr w:type="gramEnd"/>
-      <w:r>
-        <w:t xml:space="preserve"> of the project</w:t>
+        <w:t>Gives a brief summary of the project</w:t>
       </w:r>
     </w:p>
     <w:p>
@@ -95,23 +86,7 @@
         </w:numPr>
       </w:pPr>
       <w:r>
-        <w:t xml:space="preserve">Summary of project: This project focuses on establishing a flexible but still structured schema for the data layer in </w:t>
-      </w:r>
-      <w:proofErr w:type="gramStart"/>
-      <w:r>
-        <w:t>my</w:t>
-      </w:r>
-      <w:proofErr w:type="gramEnd"/>
-      <w:r>
-        <w:t xml:space="preserve"> explore more project. Previously I </w:t>
-      </w:r>
-      <w:proofErr w:type="gramStart"/>
-      <w:r>
-        <w:t>have</w:t>
-      </w:r>
-      <w:proofErr w:type="gramEnd"/>
-      <w:r>
-        <w:t xml:space="preserve"> done some UI work on this project to have additional experience noted on my resume, but now I want to see this project all the way through.</w:t>
+        <w:t>Summary of project: This project focuses on establishing a flexible but still structured schema for the data layer in my explore more project. Previously I have done some UI work on this project to have additional experience noted on my resume, but now I want to see this project all the way through.</w:t>
       </w:r>
     </w:p>
     <w:p>
@@ -135,31 +110,7 @@
         </w:numPr>
       </w:pPr>
       <w:r>
-        <w:t xml:space="preserve">I chose this project as I love the outdoors. Especially the great state of Minnesota’s State and National Parks/Properties. However, I always find it difficult at times to find comprehensive information on some of these places. I go to google, but then I find I’m visiting multiple different websites to try to find a very seemingly simple answer. This and if I want to plan a fun day or weekend trip </w:t>
-      </w:r>
-      <w:proofErr w:type="gramStart"/>
-      <w:r>
-        <w:t>somewhere</w:t>
-      </w:r>
-      <w:proofErr w:type="gramEnd"/>
-      <w:r>
-        <w:t xml:space="preserve"> sometimes it would be nice to have the ability to choose a place in Minnesota and see what state and national parks are in the area. Google does a sub bar job with this, but I want to create a tool/website where this works even better and as I visit </w:t>
-      </w:r>
-      <w:proofErr w:type="gramStart"/>
-      <w:r>
-        <w:t>more and more</w:t>
-      </w:r>
-      <w:proofErr w:type="gramEnd"/>
-      <w:r>
-        <w:t xml:space="preserve"> of these state </w:t>
-      </w:r>
-      <w:proofErr w:type="gramStart"/>
-      <w:r>
-        <w:t>parks</w:t>
-      </w:r>
-      <w:proofErr w:type="gramEnd"/>
-      <w:r>
-        <w:t xml:space="preserve"> I can collect even more information about these places and have a better tool that others can hopefully take advantage of. </w:t>
+        <w:t xml:space="preserve">I chose this project as I love the outdoors. Especially the great state of Minnesota’s State and National Parks/Properties. However, I always find it difficult at times to find comprehensive information on some of these places. I go to google, but then I find I’m visiting multiple different websites to try to find a very seemingly simple answer. This and if I want to plan a fun day or weekend trip somewhere sometimes it would be nice to have the ability to choose a place in Minnesota and see what state and national parks are in the area. Google does a sub bar job with this, but I want to create a tool/website where this works even better and as I visit more and more of these state parks I can collect even more information about these places and have a better tool that others can hopefully take advantage of. </w:t>
       </w:r>
     </w:p>
     <w:p>
@@ -207,6 +158,26 @@
       </w:r>
     </w:p>
     <w:p>
+      <w:r>
+        <w:t>Prior Database experience</w:t>
+      </w:r>
+    </w:p>
+    <w:p>
+      <w:r>
+        <w:t>Initial Ideas</w:t>
+      </w:r>
+    </w:p>
+    <w:p>
+      <w:r>
+        <w:t>Topics Considered</w:t>
+      </w:r>
+    </w:p>
+    <w:p>
+      <w:r>
+        <w:t>Sources</w:t>
+      </w:r>
+    </w:p>
+    <w:p>
       <w:pPr>
         <w:pStyle w:val="ListParagraph"/>
         <w:numPr>
@@ -227,33 +198,145 @@
         </w:numPr>
       </w:pPr>
       <w:r>
+        <w:t>Prior to this class I had some experience with databases. I first did enroll in the database course at St. Thomas during my Comp Sci. undergraduate degree where we mainly used MySQL.</w:t>
+      </w:r>
+      <w:r>
+        <w:t xml:space="preserve"> I also had some university experience with </w:t>
+      </w:r>
+      <w:proofErr w:type="spellStart"/>
+      <w:r>
+        <w:t>SQLLite</w:t>
+      </w:r>
+      <w:proofErr w:type="spellEnd"/>
+      <w:r>
+        <w:t xml:space="preserve"> in my web development course. </w:t>
+      </w:r>
+      <w:r>
+        <w:t xml:space="preserve">After I graduated I experimented with some different databases during my job hunt including PostgreSQL, and Microsoft SQL. In the software development role that I have now, I work within my organization’s Microsoft SQL based database almost weekly mainly focused on </w:t>
+      </w:r>
+      <w:r>
+        <w:t xml:space="preserve">querying the database to see the structure of data for features, and resolving support tickets that come in. </w:t>
+      </w:r>
+    </w:p>
+    <w:p>
+      <w:pPr>
+        <w:pStyle w:val="ListParagraph"/>
+        <w:numPr>
+          <w:ilvl w:val="0"/>
+          <w:numId w:val="8"/>
+        </w:numPr>
+      </w:pPr>
+      <w:r>
+        <w:t>Initial ideas</w:t>
+      </w:r>
+    </w:p>
+    <w:p>
+      <w:pPr>
+        <w:pStyle w:val="ListParagraph"/>
+        <w:numPr>
+          <w:ilvl w:val="1"/>
+          <w:numId w:val="8"/>
+        </w:numPr>
+      </w:pPr>
+      <w:r>
+        <w:t xml:space="preserve">Create a database to track and manage Disney property entities like attractions, restaurants, </w:t>
+      </w:r>
+      <w:proofErr w:type="spellStart"/>
+      <w:r>
+        <w:t>etc</w:t>
+      </w:r>
+      <w:proofErr w:type="spellEnd"/>
+      <w:r>
+        <w:t>… -- would have been a comprehensive database to help track all of my Disney knowledge and interests throughout the years</w:t>
+      </w:r>
+    </w:p>
+    <w:p>
+      <w:pPr>
+        <w:pStyle w:val="ListParagraph"/>
+        <w:numPr>
+          <w:ilvl w:val="1"/>
+          <w:numId w:val="8"/>
+        </w:numPr>
+      </w:pPr>
+      <w:r>
+        <w:t xml:space="preserve">Create the data layer for a tool that could help developers better document and understand their databases. Similar to how one can make comments to describe columns in detail in Postgres, but a tool that would allow developers do this with some of the most used databases (Oracle, Microsoft SQL, SQL Lite, </w:t>
+      </w:r>
+      <w:proofErr w:type="spellStart"/>
+      <w:r>
+        <w:t>etc</w:t>
+      </w:r>
+      <w:proofErr w:type="spellEnd"/>
+      <w:r>
+        <w:t>…)</w:t>
+      </w:r>
+    </w:p>
+    <w:p>
+      <w:pPr>
+        <w:pStyle w:val="ListParagraph"/>
+        <w:numPr>
+          <w:ilvl w:val="1"/>
+          <w:numId w:val="8"/>
+        </w:numPr>
+      </w:pPr>
+      <w:r>
+        <w:t xml:space="preserve">Create the data layer for a tool that would allow an organization to setup branches that are managed by a parent organization. I was thinking </w:t>
+      </w:r>
+      <w:proofErr w:type="spellStart"/>
+      <w:r>
+        <w:t>kindof</w:t>
+      </w:r>
+      <w:proofErr w:type="spellEnd"/>
+      <w:r>
+        <w:t xml:space="preserve"> like bank branches being managed by a region branch which is then managed by a parent organization. (Didn’t go this direction as the map tool I felt was something I would be more interested in as well as have an opportunity to add more entities to the project)</w:t>
+      </w:r>
+    </w:p>
+    <w:p>
+      <w:pPr>
+        <w:pStyle w:val="ListParagraph"/>
+        <w:numPr>
+          <w:ilvl w:val="0"/>
+          <w:numId w:val="8"/>
+        </w:numPr>
+      </w:pPr>
+      <w:r>
+        <w:t>Topics considered</w:t>
+      </w:r>
+    </w:p>
+    <w:p>
+      <w:pPr>
+        <w:pStyle w:val="ListParagraph"/>
+        <w:numPr>
+          <w:ilvl w:val="1"/>
+          <w:numId w:val="8"/>
+        </w:numPr>
+      </w:pPr>
+      <w:r>
         <w:lastRenderedPageBreak/>
-        <w:t>Prior to this class I had some experience with databases. I first did enroll in the database course at St. Thomas during my Comp Sci. undergraduate degree where we mainly used MySQL.</w:t>
-      </w:r>
-      <w:r>
-        <w:t xml:space="preserve"> I also had some university experience with </w:t>
-      </w:r>
-      <w:proofErr w:type="spellStart"/>
-      <w:r>
-        <w:t>SQLLite</w:t>
-      </w:r>
-      <w:proofErr w:type="spellEnd"/>
-      <w:r>
-        <w:t xml:space="preserve"> in my web development course. </w:t>
-      </w:r>
-      <w:r>
-        <w:t xml:space="preserve">After I </w:t>
-      </w:r>
-      <w:proofErr w:type="gramStart"/>
-      <w:r>
-        <w:t>graduated</w:t>
-      </w:r>
-      <w:proofErr w:type="gramEnd"/>
-      <w:r>
-        <w:t xml:space="preserve"> I experimented with some different databases during my job hunt including PostgreSQL, and Microsoft SQL. In the software development role that I have now, I work within my organization’s Microsoft SQL based database almost weekly mainly focused on </w:t>
-      </w:r>
-      <w:r>
-        <w:t xml:space="preserve">querying the database to see the structure of data for features, and resolving support tickets that come in. </w:t>
+        <w:t>Mainly in creation of data layers for tools that I was thinking either of building or would be good to build for my resume</w:t>
+      </w:r>
+    </w:p>
+    <w:p>
+      <w:pPr>
+        <w:pStyle w:val="ListParagraph"/>
+        <w:numPr>
+          <w:ilvl w:val="1"/>
+          <w:numId w:val="8"/>
+        </w:numPr>
+      </w:pPr>
+      <w:r>
+        <w:t>Constructing a schema that I can use to track my personal information</w:t>
+      </w:r>
+    </w:p>
+    <w:p>
+      <w:pPr>
+        <w:pStyle w:val="ListParagraph"/>
+        <w:numPr>
+          <w:ilvl w:val="1"/>
+          <w:numId w:val="8"/>
+        </w:numPr>
+      </w:pPr>
+      <w:r>
+        <w:t xml:space="preserve">TODO: Need to be more academic here. </w:t>
       </w:r>
     </w:p>
     <w:p>
@@ -265,7 +348,7 @@
         </w:numPr>
       </w:pPr>
       <w:r>
-        <w:t>Initial ideas</w:t>
+        <w:t>Sources of information used to pick topics</w:t>
       </w:r>
     </w:p>
     <w:p>
@@ -277,23 +360,7 @@
         </w:numPr>
       </w:pPr>
       <w:r>
-        <w:t xml:space="preserve">Create a database to track and manage Disney property entities like attractions, restaurants, </w:t>
-      </w:r>
-      <w:proofErr w:type="spellStart"/>
-      <w:r>
-        <w:t>etc</w:t>
-      </w:r>
-      <w:proofErr w:type="spellEnd"/>
-      <w:r>
-        <w:t xml:space="preserve">… -- would have been a comprehensive database to help track </w:t>
-      </w:r>
-      <w:proofErr w:type="gramStart"/>
-      <w:r>
-        <w:t>all of</w:t>
-      </w:r>
-      <w:proofErr w:type="gramEnd"/>
-      <w:r>
-        <w:t xml:space="preserve"> my Disney knowledge and interests throughout the years</w:t>
+        <w:t>Google</w:t>
       </w:r>
     </w:p>
     <w:p>
@@ -305,31 +372,7 @@
         </w:numPr>
       </w:pPr>
       <w:r>
-        <w:t xml:space="preserve">Create the data layer </w:t>
-      </w:r>
-      <w:proofErr w:type="gramStart"/>
-      <w:r>
-        <w:t>for</w:t>
-      </w:r>
-      <w:proofErr w:type="gramEnd"/>
-      <w:r>
-        <w:t xml:space="preserve"> a tool that could help developers better document and understand their databases. </w:t>
-      </w:r>
-      <w:proofErr w:type="gramStart"/>
-      <w:r>
-        <w:t>Similar to</w:t>
-      </w:r>
-      <w:proofErr w:type="gramEnd"/>
-      <w:r>
-        <w:t xml:space="preserve"> how one can make comments to describe columns in detail in Postgres, but a tool that would allow developers do this with some of the most used databases (Oracle, Microsoft SQL, SQL Lite, </w:t>
-      </w:r>
-      <w:proofErr w:type="spellStart"/>
-      <w:r>
-        <w:t>etc</w:t>
-      </w:r>
-      <w:proofErr w:type="spellEnd"/>
-      <w:r>
-        <w:t>…)</w:t>
+        <w:t>ChatGPT consulting</w:t>
       </w:r>
     </w:p>
     <w:p>
@@ -341,142 +384,7 @@
         </w:numPr>
       </w:pPr>
       <w:r>
-        <w:t xml:space="preserve">Create the data layer for a tool that would allow an organization to </w:t>
-      </w:r>
-      <w:proofErr w:type="gramStart"/>
-      <w:r>
-        <w:t>setup</w:t>
-      </w:r>
-      <w:proofErr w:type="gramEnd"/>
-      <w:r>
-        <w:t xml:space="preserve"> branches that are managed by a parent organization. I was thinking </w:t>
-      </w:r>
-      <w:proofErr w:type="spellStart"/>
-      <w:proofErr w:type="gramStart"/>
-      <w:r>
-        <w:t>kindof</w:t>
-      </w:r>
-      <w:proofErr w:type="spellEnd"/>
-      <w:proofErr w:type="gramEnd"/>
-      <w:r>
-        <w:t xml:space="preserve"> like bank branches being managed by a region branch which is then managed by a parent organization. (Didn’t </w:t>
-      </w:r>
-      <w:proofErr w:type="gramStart"/>
-      <w:r>
-        <w:t>go</w:t>
-      </w:r>
-      <w:proofErr w:type="gramEnd"/>
-      <w:r>
-        <w:t xml:space="preserve"> this direction as the map tool I felt was something I would be more interested in as well as </w:t>
-      </w:r>
-      <w:proofErr w:type="gramStart"/>
-      <w:r>
-        <w:t>have</w:t>
-      </w:r>
-      <w:proofErr w:type="gramEnd"/>
-      <w:r>
-        <w:t xml:space="preserve"> an opportunity to add more entities to the project)</w:t>
-      </w:r>
-    </w:p>
-    <w:p>
-      <w:pPr>
-        <w:pStyle w:val="ListParagraph"/>
-        <w:numPr>
-          <w:ilvl w:val="0"/>
-          <w:numId w:val="8"/>
-        </w:numPr>
-      </w:pPr>
-      <w:r>
-        <w:t>Topics considered</w:t>
-      </w:r>
-    </w:p>
-    <w:p>
-      <w:pPr>
-        <w:pStyle w:val="ListParagraph"/>
-        <w:numPr>
-          <w:ilvl w:val="1"/>
-          <w:numId w:val="8"/>
-        </w:numPr>
-      </w:pPr>
-      <w:r>
-        <w:t>Mainly in creation of data layers for tools that I was thinking either of building or would be good to build for my resume</w:t>
-      </w:r>
-    </w:p>
-    <w:p>
-      <w:pPr>
-        <w:pStyle w:val="ListParagraph"/>
-        <w:numPr>
-          <w:ilvl w:val="1"/>
-          <w:numId w:val="8"/>
-        </w:numPr>
-      </w:pPr>
-      <w:r>
-        <w:t>Constructing a schema that I can use to track my personal information</w:t>
-      </w:r>
-    </w:p>
-    <w:p>
-      <w:pPr>
-        <w:pStyle w:val="ListParagraph"/>
-        <w:numPr>
-          <w:ilvl w:val="1"/>
-          <w:numId w:val="8"/>
-        </w:numPr>
-      </w:pPr>
-      <w:r>
-        <w:t xml:space="preserve">TODO: Need to be more academic here. </w:t>
-      </w:r>
-    </w:p>
-    <w:p>
-      <w:pPr>
-        <w:pStyle w:val="ListParagraph"/>
-        <w:numPr>
-          <w:ilvl w:val="0"/>
-          <w:numId w:val="8"/>
-        </w:numPr>
-      </w:pPr>
-      <w:r>
-        <w:t>Sources of information used to pick topics</w:t>
-      </w:r>
-    </w:p>
-    <w:p>
-      <w:pPr>
-        <w:pStyle w:val="ListParagraph"/>
-        <w:numPr>
-          <w:ilvl w:val="1"/>
-          <w:numId w:val="8"/>
-        </w:numPr>
-      </w:pPr>
-      <w:r>
-        <w:t>Google</w:t>
-      </w:r>
-    </w:p>
-    <w:p>
-      <w:pPr>
-        <w:pStyle w:val="ListParagraph"/>
-        <w:numPr>
-          <w:ilvl w:val="1"/>
-          <w:numId w:val="8"/>
-        </w:numPr>
-      </w:pPr>
-      <w:r>
-        <w:t>ChatGPT consulting</w:t>
-      </w:r>
-    </w:p>
-    <w:p>
-      <w:pPr>
-        <w:pStyle w:val="ListParagraph"/>
-        <w:numPr>
-          <w:ilvl w:val="1"/>
-          <w:numId w:val="8"/>
-        </w:numPr>
-      </w:pPr>
-      <w:proofErr w:type="gramStart"/>
-      <w:r>
-        <w:t>TODO;</w:t>
-      </w:r>
-      <w:proofErr w:type="gramEnd"/>
-      <w:r>
-        <w:t xml:space="preserve"> will update based on what is talked about in Topics</w:t>
+        <w:t>TODO; will update based on what is talked about in Topics</w:t>
       </w:r>
     </w:p>
     <w:p/>
@@ -496,7 +404,6 @@
           <w:sz w:val="32"/>
           <w:szCs w:val="32"/>
         </w:rPr>
-        <w:lastRenderedPageBreak/>
         <w:t>Building</w:t>
       </w:r>
     </w:p>
@@ -589,23 +496,7 @@
         </w:numPr>
       </w:pPr>
       <w:r>
-        <w:t xml:space="preserve">If </w:t>
-      </w:r>
-      <w:proofErr w:type="gramStart"/>
-      <w:r>
-        <w:t>research oriented</w:t>
-      </w:r>
-      <w:proofErr w:type="gramEnd"/>
-      <w:r>
-        <w:t xml:space="preserve"> project, then describe findings and choose an </w:t>
-      </w:r>
-      <w:proofErr w:type="gramStart"/>
-      <w:r>
-        <w:t>appropriate structure/subsections</w:t>
-      </w:r>
-      <w:proofErr w:type="gramEnd"/>
-      <w:r>
-        <w:t xml:space="preserve"> for this section</w:t>
+        <w:t>If research oriented project, then describe findings and choose an appropriate structure/subsections for this section</w:t>
       </w:r>
     </w:p>
     <w:p>
@@ -669,15 +560,7 @@
       </w:r>
       <w:proofErr w:type="spellEnd"/>
       <w:r>
-        <w:t xml:space="preserve"> describing where </w:t>
-      </w:r>
-      <w:proofErr w:type="gramStart"/>
-      <w:r>
-        <w:t>were you</w:t>
-      </w:r>
-      <w:proofErr w:type="gramEnd"/>
-      <w:r>
-        <w:t xml:space="preserve"> before the class and if/how the project advanced my knowledge</w:t>
+        <w:t xml:space="preserve"> describing where were you before the class and if/how the project advanced my knowledge</w:t>
       </w:r>
     </w:p>
     <w:p>
@@ -709,23 +592,7 @@
       </w:r>
       <w:proofErr w:type="spellEnd"/>
       <w:r>
-        <w:t xml:space="preserve"> and the use case in which it </w:t>
-      </w:r>
-      <w:proofErr w:type="gramStart"/>
-      <w:r>
-        <w:t>fills</w:t>
-      </w:r>
-      <w:proofErr w:type="gramEnd"/>
-      <w:r>
-        <w:t xml:space="preserve"> </w:t>
-      </w:r>
-      <w:proofErr w:type="gramStart"/>
-      <w:r>
-        <w:t>to help</w:t>
-      </w:r>
-      <w:proofErr w:type="gramEnd"/>
-      <w:r>
-        <w:t xml:space="preserve"> aggregate and manage large amounts of data from different sources</w:t>
+        <w:t xml:space="preserve"> and the use case in which it fills to help aggregate and manage large amounts of data from different sources</w:t>
       </w:r>
     </w:p>
     <w:p>
@@ -737,7 +604,11 @@
         </w:numPr>
       </w:pPr>
       <w:r>
-        <w:t xml:space="preserve">Strengthened my querying and query building skills where it challenged me to think about the data structures of the imported data to properly merge them into one normalized entity. Had to craft unique and careful queries to ensure that data from certain sources tool precedence over others. </w:t>
+        <w:t xml:space="preserve">Strengthened my querying and query building skills where it challenged me to think about the data structures of the imported </w:t>
+      </w:r>
+      <w:r>
+        <w:lastRenderedPageBreak/>
+        <w:t xml:space="preserve">data to properly merge them into one normalized entity. Had to craft unique and careful queries to ensure that data from certain sources tool precedence over others. </w:t>
       </w:r>
     </w:p>
     <w:p>
@@ -749,15 +620,7 @@
         </w:numPr>
       </w:pPr>
       <w:r>
-        <w:t xml:space="preserve">Improved my normalization skills. In this project I would say that I was exposed to many different organizational ways to manage and organize data. Some of which I agreed with for this </w:t>
-      </w:r>
-      <w:proofErr w:type="gramStart"/>
-      <w:r>
-        <w:t>project</w:t>
-      </w:r>
-      <w:proofErr w:type="gramEnd"/>
-      <w:r>
-        <w:t xml:space="preserve"> which was inherited, but other ways I wanted to structure this project worked differently from most if not all sources. </w:t>
+        <w:t xml:space="preserve">Improved my normalization skills. In this project I would say that I was exposed to many different organizational ways to manage and organize data. Some of which I agreed with for this project which was inherited, but other ways I wanted to structure this project worked differently from most if not all sources. </w:t>
       </w:r>
     </w:p>
     <w:p>
@@ -769,7 +632,6 @@
         </w:numPr>
       </w:pPr>
       <w:r>
-        <w:lastRenderedPageBreak/>
         <w:t xml:space="preserve">Note anything that didn’t work or I didn’t have time to complete, discuss why it didn’t work, what I might have done with more time, </w:t>
       </w:r>
       <w:proofErr w:type="spellStart"/>
@@ -790,55 +652,7 @@
         </w:numPr>
       </w:pPr>
       <w:r>
-        <w:t xml:space="preserve">There is still a lot of data that is missing </w:t>
-      </w:r>
-      <w:proofErr w:type="gramStart"/>
-      <w:r>
-        <w:t>for</w:t>
-      </w:r>
-      <w:proofErr w:type="gramEnd"/>
-      <w:r>
-        <w:t xml:space="preserve"> certain locations. For </w:t>
-      </w:r>
-      <w:proofErr w:type="gramStart"/>
-      <w:r>
-        <w:t>instance</w:t>
-      </w:r>
-      <w:proofErr w:type="gramEnd"/>
-      <w:r>
-        <w:t xml:space="preserve"> the information taken from </w:t>
-      </w:r>
-      <w:proofErr w:type="gramStart"/>
-      <w:r>
-        <w:t>the Google</w:t>
-      </w:r>
-      <w:proofErr w:type="gramEnd"/>
-      <w:r>
-        <w:t xml:space="preserve"> Maps </w:t>
-      </w:r>
-      <w:proofErr w:type="gramStart"/>
-      <w:r>
-        <w:t>data,</w:t>
-      </w:r>
-      <w:proofErr w:type="gramEnd"/>
-      <w:r>
-        <w:t xml:space="preserve"> isn’t complete in the slightest. I can </w:t>
-      </w:r>
-      <w:proofErr w:type="gramStart"/>
-      <w:r>
-        <w:t>pin point</w:t>
-      </w:r>
-      <w:proofErr w:type="gramEnd"/>
-      <w:r>
-        <w:t xml:space="preserve"> the markers on the map and tell the name and some minimal identification information about the location, but there </w:t>
-      </w:r>
-      <w:proofErr w:type="gramStart"/>
-      <w:r>
-        <w:t>is</w:t>
-      </w:r>
-      <w:proofErr w:type="gramEnd"/>
-      <w:r>
-        <w:t xml:space="preserve"> a lot of things that I don’t know about those locations. </w:t>
+        <w:t xml:space="preserve">There is still a lot of data that is missing for certain locations. For instance the information taken from the Google Maps data, isn’t complete in the slightest. I can pin point the markers on the map and tell the name and some minimal identification information about the location, but there is a lot of things that I don’t know about those locations. </w:t>
       </w:r>
     </w:p>
     <w:p>
@@ -850,39 +664,7 @@
         </w:numPr>
       </w:pPr>
       <w:r>
-        <w:t xml:space="preserve">It was difficult to properly assign locations as </w:t>
-      </w:r>
-      <w:proofErr w:type="gramStart"/>
-      <w:r>
-        <w:t>children</w:t>
-      </w:r>
-      <w:proofErr w:type="gramEnd"/>
-      <w:r>
-        <w:t xml:space="preserve"> locations to </w:t>
-      </w:r>
-      <w:proofErr w:type="gramStart"/>
-      <w:r>
-        <w:t>parent</w:t>
-      </w:r>
-      <w:proofErr w:type="gramEnd"/>
-      <w:r>
-        <w:t xml:space="preserve"> locations without being able to see how they were positioned geographically on the map. For instance, some campsite information from the NPS API is very structured where I could say that each campground location is a child of the national park location. However, I couldn’t do the </w:t>
-      </w:r>
-      <w:proofErr w:type="gramStart"/>
-      <w:r>
-        <w:t>same as</w:t>
-      </w:r>
-      <w:proofErr w:type="gramEnd"/>
-      <w:r>
-        <w:t xml:space="preserve"> easily with </w:t>
-      </w:r>
-      <w:proofErr w:type="gramStart"/>
-      <w:r>
-        <w:t>the Google</w:t>
-      </w:r>
-      <w:proofErr w:type="gramEnd"/>
-      <w:r>
-        <w:t xml:space="preserve"> place information. </w:t>
+        <w:t xml:space="preserve">It was difficult to properly assign locations as children locations to parent locations without being able to see how they were positioned geographically on the map. For instance, some campsite information from the NPS API is very structured where I could say that each campground location is a child of the national park location. However, I couldn’t do the same as easily with the Google place information. </w:t>
       </w:r>
     </w:p>
     <w:p>
@@ -893,13 +675,8 @@
           <w:numId w:val="8"/>
         </w:numPr>
       </w:pPr>
-      <w:proofErr w:type="gramStart"/>
-      <w:r>
-        <w:t>Depends</w:t>
-      </w:r>
-      <w:proofErr w:type="gramEnd"/>
-      <w:r>
-        <w:t xml:space="preserve"> on how much of the API and UI I get working (and migration scripts) working to </w:t>
+      <w:r>
+        <w:t xml:space="preserve">Depends on how much of the API and UI I get working (and migration scripts) working to </w:t>
       </w:r>
       <w:proofErr w:type="spellStart"/>
       <w:r>
@@ -975,15 +752,7 @@
         </w:numPr>
       </w:pPr>
       <w:r>
-        <w:t xml:space="preserve">Not everything needs to be working but </w:t>
-      </w:r>
-      <w:proofErr w:type="gramStart"/>
-      <w:r>
-        <w:t>need</w:t>
-      </w:r>
-      <w:proofErr w:type="gramEnd"/>
-      <w:r>
-        <w:t xml:space="preserve"> to have understanding and honesty to point out these issues. </w:t>
+        <w:t xml:space="preserve">Not everything needs to be working but need to have understanding and honesty to point out these issues. </w:t>
       </w:r>
     </w:p>
     <w:p>
@@ -995,6 +764,7 @@
         </w:numPr>
       </w:pPr>
       <w:r>
+        <w:lastRenderedPageBreak/>
         <w:t>Also mention any ethical issues that you can think of that may arise from your database</w:t>
       </w:r>
     </w:p>
@@ -1019,11 +789,7 @@
         </w:numPr>
       </w:pPr>
       <w:r>
-        <w:t xml:space="preserve">Unless I intend to ensure that all this information remains accurate, there is no way I can say that all this information is entirely accurate. Instead, I can </w:t>
-      </w:r>
-      <w:r>
-        <w:lastRenderedPageBreak/>
-        <w:t xml:space="preserve">share on the eventual production tool that I make publicly available that the information is up to date to the last time that I checked it. Custom tooling to re-retrieve the data and compare it to current production data would be important at this step. </w:t>
+        <w:t xml:space="preserve">Unless I intend to ensure that all this information remains accurate, there is no way I can say that all this information is entirely accurate. Instead, I can share on the eventual production tool that I make publicly available that the information is up to date to the last time that I checked it. Custom tooling to re-retrieve the data and compare it to current production data would be important at this step. </w:t>
       </w:r>
     </w:p>
     <w:p>
@@ -1089,6 +855,9 @@
       <w:r>
         <w:t>Data Modeling and Relational Model</w:t>
       </w:r>
+      <w:r>
+        <w:t xml:space="preserve"> – Note in Building Section</w:t>
+      </w:r>
     </w:p>
     <w:p>
       <w:pPr>
@@ -1128,6 +897,9 @@
       <w:r>
         <w:t>Database Normalization</w:t>
       </w:r>
+      <w:r>
+        <w:t xml:space="preserve"> – Note in Building Section</w:t>
+      </w:r>
     </w:p>
     <w:p>
       <w:pPr>
@@ -1152,6 +924,17 @@
       <w:r>
         <w:t>Advanced SQL (Spatial Extensions)</w:t>
       </w:r>
+      <w:r>
+        <w:t xml:space="preserve"> – Note in Exploring Section and Building Section / Also with </w:t>
+      </w:r>
+      <w:proofErr w:type="spellStart"/>
+      <w:r>
+        <w:t>DuckDB</w:t>
+      </w:r>
+      <w:proofErr w:type="spellEnd"/>
+      <w:r>
+        <w:t xml:space="preserve"> schemas where each can have their own tables / also note joining table concept to show information and moving data around within a database maybe</w:t>
+      </w:r>
     </w:p>
     <w:p>
       <w:pPr>
@@ -1190,19 +973,8 @@
         </w:numPr>
       </w:pPr>
       <w:r>
-        <w:t>Client Server Architecture</w:t>
-      </w:r>
-    </w:p>
-    <w:p>
-      <w:pPr>
-        <w:pStyle w:val="ListParagraph"/>
-        <w:numPr>
-          <w:ilvl w:val="1"/>
-          <w:numId w:val="10"/>
-        </w:numPr>
-      </w:pPr>
-      <w:r>
-        <w:t>Front and backend connection to Database if that comes true</w:t>
+        <w:lastRenderedPageBreak/>
+        <w:t>Views and Hierarchical Queries – Create a view that allows me to view location hierarchy from a specific location. – Note in building section</w:t>
       </w:r>
     </w:p>
     <w:p>
@@ -1214,14 +986,24 @@
         </w:numPr>
       </w:pPr>
       <w:r>
-        <w:t>??? – go through the database book later</w:t>
-      </w:r>
-    </w:p>
-    <w:p>
-      <w:pPr>
-        <w:pStyle w:val="ListParagraph"/>
-        <w:numPr>
-          <w:ilvl w:val="1"/>
+        <w:t xml:space="preserve">Highlight database table Transactions where if a SQL script fails any part of the way through the changes won’t </w:t>
+      </w:r>
+      <w:r>
+        <w:t>be</w:t>
+      </w:r>
+      <w:r>
+        <w:t xml:space="preserve"> committed to the final table which allows me to rollback and determine where the problematic data exists. This will be noted during the building section. Also, discuss Atomicity (A in ACID) (fails fallback) – Also, </w:t>
+      </w:r>
+      <w:r>
+        <w:t xml:space="preserve">figure out a way if not automatically shown to me a way to identify the problematic data that caused the script to fail. </w:t>
+      </w:r>
+    </w:p>
+    <w:p/>
+    <w:p>
+      <w:pPr>
+        <w:pStyle w:val="ListParagraph"/>
+        <w:numPr>
+          <w:ilvl w:val="0"/>
           <w:numId w:val="8"/>
         </w:numPr>
       </w:pPr>
@@ -1233,7 +1015,7 @@
       <w:pPr>
         <w:pStyle w:val="ListParagraph"/>
         <w:numPr>
-          <w:ilvl w:val="1"/>
+          <w:ilvl w:val="0"/>
           <w:numId w:val="8"/>
         </w:numPr>
       </w:pPr>
@@ -1245,7 +1027,7 @@
       <w:pPr>
         <w:pStyle w:val="ListParagraph"/>
         <w:numPr>
-          <w:ilvl w:val="1"/>
+          <w:ilvl w:val="0"/>
           <w:numId w:val="8"/>
         </w:numPr>
       </w:pPr>
@@ -1287,11 +1069,7 @@
         <w:t xml:space="preserve">How. </w:t>
       </w:r>
       <w:r>
-        <w:t xml:space="preserve">The what section focuses on the </w:t>
-      </w:r>
-      <w:r>
-        <w:lastRenderedPageBreak/>
-        <w:t xml:space="preserve">technology that I plan on using, the why section discusses the reasoning behind this project and the how section outlines the pessimistic and optimistic plans for this project, based on the time I’m able to pour into this project throughout the remainder of the semester. The optimistic section also outlines other technologies that may be used if time allows. </w:t>
+        <w:t xml:space="preserve">The what section focuses on the technology that I plan on using, the why section discusses the reasoning behind this project and the how section outlines the pessimistic and optimistic plans for this project, based on the time I’m able to pour into this project throughout the remainder of the semester. The optimistic section also outlines other technologies that may be used if time allows. </w:t>
       </w:r>
     </w:p>
     <w:p/>
@@ -1357,6 +1135,7 @@
           <w:b/>
           <w:bCs/>
         </w:rPr>
+        <w:lastRenderedPageBreak/>
         <w:t>NPS API</w:t>
       </w:r>
       <w:r>
@@ -1453,15 +1232,7 @@
         <w:t>Other Sources to be identified</w:t>
       </w:r>
       <w:r>
-        <w:t xml:space="preserve"> - The data sources above are the first sources I have found. Once I finish my </w:t>
-      </w:r>
-      <w:proofErr w:type="gramStart"/>
-      <w:r>
-        <w:t>research</w:t>
-      </w:r>
-      <w:proofErr w:type="gramEnd"/>
-      <w:r>
-        <w:t xml:space="preserve"> I'll be limiting the schema scope to keep the project within the minimal viable project goal. </w:t>
+        <w:t xml:space="preserve"> - The data sources above are the first sources I have found. Once I finish my research I'll be limiting the schema scope to keep the project within the minimal viable project goal. </w:t>
       </w:r>
     </w:p>
     <w:p>
@@ -1502,24 +1273,12 @@
         <w:t>Explore More US</w:t>
       </w:r>
       <w:r>
-        <w:t xml:space="preserve">. I want this project to be one where an </w:t>
-      </w:r>
-      <w:r>
-        <w:lastRenderedPageBreak/>
-        <w:t>individual can have quick and easy access to state park and national park information in one place. Maybe even extending to campgrounds if the data is available. However, before I can move forward with the frontend, I have realized from my prior classes that having a proper data layer is just as important if not more so.</w:t>
-      </w:r>
-    </w:p>
-    <w:p>
-      <w:r>
-        <w:t xml:space="preserve">By choosing this project, it gives me a structured opportunity to apply the core concepts from this course such as normalization, schema design and query development to a project I not only care about but plan to continue forward with. Based on the focus </w:t>
-      </w:r>
-      <w:proofErr w:type="gramStart"/>
-      <w:r>
-        <w:t>with</w:t>
-      </w:r>
-      <w:proofErr w:type="gramEnd"/>
-      <w:r>
-        <w:t xml:space="preserve"> aggregating data from multiple different sources, it will also give me practical experience with </w:t>
+        <w:t>. I want this project to be one where an individual can have quick and easy access to state park and national park information in one place. Maybe even extending to campgrounds if the data is available. However, before I can move forward with the frontend, I have realized from my prior classes that having a proper data layer is just as important if not more so.</w:t>
+      </w:r>
+    </w:p>
+    <w:p>
+      <w:r>
+        <w:t xml:space="preserve">By choosing this project, it gives me a structured opportunity to apply the core concepts from this course such as normalization, schema design and query development to a project I not only care about but plan to continue forward with. Based on the focus with aggregating data from multiple different sources, it will also give me practical experience with </w:t>
       </w:r>
       <w:proofErr w:type="spellStart"/>
       <w:r>
@@ -1577,6 +1336,7 @@
     </w:p>
     <w:p>
       <w:r>
+        <w:lastRenderedPageBreak/>
         <w:t xml:space="preserve">My pessimistic goal for this final assignment is to structure a normalized database and populate it using </w:t>
       </w:r>
       <w:proofErr w:type="spellStart"/>
@@ -1626,15 +1386,7 @@
         </w:numPr>
       </w:pPr>
       <w:r>
-        <w:t xml:space="preserve">Design a normalized schema - primary entities I'm currently planning on but will likely add more include locations, contacts, addresses, operating hours, activities and possibly (based on time) a structure focused on organizing campground data. The schema will be developed using some sort of ER Diagram tool that quite possibly will generate the DDL SQL code needed to </w:t>
-      </w:r>
-      <w:proofErr w:type="gramStart"/>
-      <w:r>
-        <w:t>use</w:t>
-      </w:r>
-      <w:proofErr w:type="gramEnd"/>
-      <w:r>
-        <w:t xml:space="preserve"> within </w:t>
+        <w:t xml:space="preserve">Design a normalized schema - primary entities I'm currently planning on but will likely add more include locations, contacts, addresses, operating hours, activities and possibly (based on time) a structure focused on organizing campground data. The schema will be developed using some sort of ER Diagram tool that quite possibly will generate the DDL SQL code needed to use within </w:t>
       </w:r>
       <w:proofErr w:type="spellStart"/>
       <w:r>
@@ -1686,7 +1438,6 @@
           <w:b/>
           <w:bCs/>
         </w:rPr>
-        <w:lastRenderedPageBreak/>
         <w:t>Planned Deliverable</w:t>
       </w:r>
       <w:r>
@@ -1790,6 +1541,7 @@
         </w:numPr>
       </w:pPr>
       <w:r>
+        <w:lastRenderedPageBreak/>
         <w:t>GET /parks/:id — full detail for one park</w:t>
       </w:r>
     </w:p>
@@ -3979,6 +3731,7 @@
   <w:style w:type="character" w:default="1" w:styleId="DefaultParagraphFont">
     <w:name w:val="Default Paragraph Font"/>
     <w:uiPriority w:val="1"/>
+    <w:semiHidden/>
     <w:unhideWhenUsed/>
   </w:style>
   <w:style w:type="table" w:default="1" w:styleId="TableNormal">

</xml_diff>

<commit_message>
progress on initial rough draft for final project
</commit_message>
<xml_diff>
--- a/GIS-Data-Migration-Project/Assignment Documents/Final Project - Part 2 - Final Project Rough Draft.docx
+++ b/GIS-Data-Migration-Project/Assignment Documents/Final Project - Part 2 - Final Project Rough Draft.docx
@@ -23,21 +23,147 @@
     </w:p>
     <w:p>
       <w:r>
+        <w:t>Through my studies, time spent attending different tech focused conferences, and my professional experience as a front-end developer, I have come to recognize that those who work directly with data and retain organizational or ‘domain’ knowledge are those who are harder to replace within a</w:t>
+      </w:r>
+      <w:r>
+        <w:t>n</w:t>
+      </w:r>
+      <w:r>
+        <w:t xml:space="preserve"> organization. It is this mindset that I came into this project with where I wanted to focus on a project that not only develops a database schema, but also manages, transforms, and organizes data into a clear, understandable</w:t>
+      </w:r>
+      <w:r>
+        <w:t>, somewhat flexible</w:t>
+      </w:r>
+      <w:r>
+        <w:t xml:space="preserve"> and easy to manage data layer that can be utilized by a</w:t>
+      </w:r>
+      <w:r>
+        <w:t>ny application from a mobile app, to a web application</w:t>
+      </w:r>
+      <w:r>
+        <w:t xml:space="preserve">. </w:t>
+      </w:r>
+    </w:p>
+    <w:p>
+      <w:r>
+        <w:t>One such application</w:t>
+      </w:r>
+      <w:r>
+        <w:t xml:space="preserve"> project</w:t>
+      </w:r>
+      <w:r>
+        <w:t xml:space="preserve"> that I have done some frontend work on up to this point</w:t>
+      </w:r>
+      <w:r>
+        <w:t xml:space="preserve"> but so far have no meaningful data layer</w:t>
+      </w:r>
+      <w:r>
+        <w:t xml:space="preserve"> I call Explore More</w:t>
+      </w:r>
+      <w:r>
+        <w:t xml:space="preserve">. Up to this point I want it to be a web application that focuses on collecting and sharing information about state, county and national parks that is more reliable than Google maps that can help those who simply want to ‘explore more’ of their state to find information to do so easily. </w:t>
+      </w:r>
+    </w:p>
+    <w:p>
+      <w:r>
+        <w:t xml:space="preserve">Other than creating a great data layer for this web project that I want to build out I also chose this project because I love being outdoors, but find it hard at times to find any good source that tracks and manages information about state and national parks in one place. For example, here in Minnesota, if you want to explore Minnesota </w:t>
+      </w:r>
+      <w:r>
+        <w:t xml:space="preserve">you may start with the MN DNR State parks website which is great for those who want to step out of the city for a weekend. However, what about wanting to learn more about the state’s state and national forests, national park managed properties, or even county parks? All managed and shared through different websites. Google is sub-par for collecting this information into one place, but I as well as others I have talked to agree that Google isn’t a solve-all solution. </w:t>
+      </w:r>
+    </w:p>
+    <w:p>
+      <w:r>
+        <w:t xml:space="preserve">From my description of this project, one can assume that the sky is the limit… and it is! I have ambitious plans for this project. However, to keep myself on track for this class I have defined some minimal and optimistic goals. </w:t>
+      </w:r>
+    </w:p>
+    <w:p>
+      <w:r>
+        <w:t xml:space="preserve">For minimal goals within this project, I’m focusing on developing just the data layer for this application focusing on the management of how to collect data from multiple sources and funneling them into one normalized source. The technologies that I chose to work with in this project include Python for scripting and </w:t>
+      </w:r>
+      <w:proofErr w:type="spellStart"/>
+      <w:r>
+        <w:t>DuckDB</w:t>
+      </w:r>
+      <w:proofErr w:type="spellEnd"/>
+      <w:r>
+        <w:t xml:space="preserve"> for managing the data. The final outcome goal minimally is to have a final normalized database schema that contains a number of tables that relationally manage the data that I have collected from multiple </w:t>
+      </w:r>
+      <w:r>
+        <w:lastRenderedPageBreak/>
+        <w:t>sources into one place. However, as I said the sky is the limit, so for this project, my data collection and management limit is to focus on US National Parks and Minnesota State Parks information.</w:t>
+      </w:r>
+    </w:p>
+    <w:p>
+      <w:r>
+        <w:t xml:space="preserve">For my optimistic goals for this project is to create a mini demo web application where the </w:t>
+      </w:r>
+      <w:proofErr w:type="spellStart"/>
+      <w:r>
+        <w:t>DuckDB</w:t>
+      </w:r>
+      <w:proofErr w:type="spellEnd"/>
+      <w:r>
+        <w:t xml:space="preserve"> data is migrated to a PostgreSQL database that utilizes a database plugin called POSTGIS which is a PostgreSQL extension for </w:t>
+      </w:r>
+      <w:r>
+        <w:t xml:space="preserve">geospatial data. For the frontend, this application would utilize React where it would be a mapping UI that may end up looking like Google maps after I’m finished. As for the backend, as we discussed in class data doesn’t come directly from the database but generally for security reasons served from an API layer. This API layer would be simple in nature where it is taking the data from the database and passing it off to the front end. This API layer would be built using Django and Python. </w:t>
+      </w:r>
+    </w:p>
+    <w:p/>
+    <w:p>
+      <w:pPr>
+        <w:rPr>
+          <w:strike/>
+        </w:rPr>
+      </w:pPr>
+      <w:r>
+        <w:rPr>
+          <w:strike/>
+        </w:rPr>
         <w:t>Intro Paragraph</w:t>
       </w:r>
     </w:p>
     <w:p>
-      <w:r>
+      <w:pPr>
+        <w:rPr>
+          <w:strike/>
+        </w:rPr>
+      </w:pPr>
+      <w:r>
+        <w:rPr>
+          <w:strike/>
+        </w:rPr>
         <w:t>Summary &amp; Why I chose this project paragraph</w:t>
       </w:r>
     </w:p>
     <w:p>
-      <w:r>
+      <w:pPr>
+        <w:rPr>
+          <w:strike/>
+        </w:rPr>
+      </w:pPr>
+      <w:r>
+        <w:rPr>
+          <w:strike/>
+        </w:rPr>
         <w:t>Minimal and Optimistic Goals for project</w:t>
       </w:r>
     </w:p>
-    <w:p/>
-    <w:p/>
+    <w:p>
+      <w:pPr>
+        <w:rPr>
+          <w:strike/>
+        </w:rPr>
+      </w:pPr>
+    </w:p>
+    <w:p>
+      <w:pPr>
+        <w:rPr>
+          <w:strike/>
+        </w:rPr>
+      </w:pPr>
+    </w:p>
     <w:p>
       <w:pPr>
         <w:pStyle w:val="ListParagraph"/>
@@ -45,8 +171,14 @@
           <w:ilvl w:val="0"/>
           <w:numId w:val="8"/>
         </w:numPr>
-      </w:pPr>
-      <w:r>
+        <w:rPr>
+          <w:strike/>
+        </w:rPr>
+      </w:pPr>
+      <w:r>
+        <w:rPr>
+          <w:strike/>
+        </w:rPr>
         <w:t>Informs the class about the general topic</w:t>
       </w:r>
     </w:p>
@@ -57,11 +189,20 @@
           <w:ilvl w:val="1"/>
           <w:numId w:val="8"/>
         </w:numPr>
-      </w:pPr>
-      <w:r>
+        <w:rPr>
+          <w:strike/>
+        </w:rPr>
+      </w:pPr>
+      <w:r>
+        <w:rPr>
+          <w:strike/>
+        </w:rPr>
         <w:t xml:space="preserve">The general topic focuses on my goal to create a strong and flexible data layer for my explore more project. Specifically utilizing two different kinds of databases to successfully collect and pull information </w:t>
       </w:r>
       <w:r>
+        <w:rPr>
+          <w:strike/>
+        </w:rPr>
         <w:t xml:space="preserve">from multiple sources to represent locations focused around State Parks, National Parks, State Recreational Areas, and more. </w:t>
       </w:r>
     </w:p>
@@ -72,8 +213,14 @@
           <w:ilvl w:val="0"/>
           <w:numId w:val="8"/>
         </w:numPr>
-      </w:pPr>
-      <w:r>
+        <w:rPr>
+          <w:strike/>
+        </w:rPr>
+      </w:pPr>
+      <w:r>
+        <w:rPr>
+          <w:strike/>
+        </w:rPr>
         <w:t>Gives a brief summary of the project</w:t>
       </w:r>
     </w:p>
@@ -84,8 +231,14 @@
           <w:ilvl w:val="1"/>
           <w:numId w:val="8"/>
         </w:numPr>
-      </w:pPr>
-      <w:r>
+        <w:rPr>
+          <w:strike/>
+        </w:rPr>
+      </w:pPr>
+      <w:r>
+        <w:rPr>
+          <w:strike/>
+        </w:rPr>
         <w:t>Summary of project: This project focuses on establishing a flexible but still structured schema for the data layer in my explore more project. Previously I have done some UI work on this project to have additional experience noted on my resume, but now I want to see this project all the way through.</w:t>
       </w:r>
     </w:p>
@@ -96,8 +249,14 @@
           <w:ilvl w:val="0"/>
           <w:numId w:val="8"/>
         </w:numPr>
-      </w:pPr>
-      <w:r>
+        <w:rPr>
+          <w:strike/>
+        </w:rPr>
+      </w:pPr>
+      <w:r>
+        <w:rPr>
+          <w:strike/>
+        </w:rPr>
         <w:t>Explains why I chose the project</w:t>
       </w:r>
     </w:p>
@@ -108,9 +267,22 @@
           <w:ilvl w:val="1"/>
           <w:numId w:val="8"/>
         </w:numPr>
-      </w:pPr>
-      <w:r>
-        <w:t xml:space="preserve">I chose this project as I love the outdoors. Especially the great state of Minnesota’s State and National Parks/Properties. However, I always find it difficult at times to find comprehensive information on some of these places. I go to google, but then I find I’m visiting multiple different websites to try to find a very seemingly simple answer. This and if I want to plan a fun day or weekend trip somewhere sometimes it would be nice to have the ability to choose a place in Minnesota and see what state and national parks are in the area. Google does a sub bar job with this, but I want to create a tool/website where this works even better and as I visit more and more of these state parks I can collect even more information about these places and have a better tool that others can hopefully take advantage of. </w:t>
+        <w:rPr>
+          <w:strike/>
+        </w:rPr>
+      </w:pPr>
+      <w:r>
+        <w:rPr>
+          <w:strike/>
+        </w:rPr>
+        <w:t xml:space="preserve">I chose this project as I love the outdoors. Especially the great state of Minnesota’s State and National Parks/Properties. However, I always find it </w:t>
+      </w:r>
+      <w:r>
+        <w:rPr>
+          <w:strike/>
+        </w:rPr>
+        <w:lastRenderedPageBreak/>
+        <w:t xml:space="preserve">difficult at times to find comprehensive information on some of these places. I go to google, but then I find I’m visiting multiple different websites to try to find a very seemingly simple answer. This and if I want to plan a fun day or weekend trip somewhere sometimes it would be nice to have the ability to choose a place in Minnesota and see what state and national parks are in the area. Google does a sub bar job with this, but I want to create a tool/website where this works even better and as I visit more and more of these state parks I can collect even more information about these places and have a better tool that others can hopefully take advantage of. </w:t>
       </w:r>
     </w:p>
     <w:p>
@@ -120,8 +292,14 @@
           <w:ilvl w:val="0"/>
           <w:numId w:val="8"/>
         </w:numPr>
-      </w:pPr>
-      <w:r>
+        <w:rPr>
+          <w:strike/>
+        </w:rPr>
+      </w:pPr>
+      <w:r>
+        <w:rPr>
+          <w:strike/>
+        </w:rPr>
         <w:t>What were the minimal and optimistic goals</w:t>
       </w:r>
     </w:p>
@@ -132,8 +310,14 @@
           <w:ilvl w:val="1"/>
           <w:numId w:val="8"/>
         </w:numPr>
-      </w:pPr>
-      <w:r>
+        <w:rPr>
+          <w:strike/>
+        </w:rPr>
+      </w:pPr>
+      <w:r>
+        <w:rPr>
+          <w:strike/>
+        </w:rPr>
         <w:t xml:space="preserve">Noted in the initial project text towards the bottom of this document that haven’t been removed yet. </w:t>
       </w:r>
     </w:p>
@@ -159,23 +343,211 @@
     </w:p>
     <w:p>
       <w:r>
-        <w:t>Prior Database experience</w:t>
-      </w:r>
-    </w:p>
-    <w:p>
-      <w:r>
-        <w:t>Initial Ideas</w:t>
-      </w:r>
-    </w:p>
-    <w:p>
-      <w:r>
+        <w:t xml:space="preserve">Prior to this course, I did have some experience with databases. Not only did I take a undergraduate database course during my time at St. Thomas, but I also have interacted with databases at work </w:t>
+      </w:r>
+      <w:r>
+        <w:t xml:space="preserve">in the role as </w:t>
+      </w:r>
+      <w:proofErr w:type="spellStart"/>
+      <w:r>
+        <w:t>a</w:t>
+      </w:r>
+      <w:proofErr w:type="spellEnd"/>
+      <w:r>
+        <w:t xml:space="preserve"> application user according to our textbook where</w:t>
+      </w:r>
+      <w:r>
+        <w:t xml:space="preserve"> I’m mainly writing SELECT and sometimes UPDATE or ALTER TABLE queries to help in managing the database to fix bugs that come up during application use. Also during my job hunt after graduation from St. Thomas I did some personal projects that allowed me to work and experiment with different kinds of databases including </w:t>
+      </w:r>
+      <w:proofErr w:type="spellStart"/>
+      <w:r>
+        <w:t>sqllite</w:t>
+      </w:r>
+      <w:proofErr w:type="spellEnd"/>
+      <w:r>
+        <w:t xml:space="preserve">, PostgreSQL, and Microsoft SQL. However, where I lack in my database experience is additional practice in database administration as well as </w:t>
+      </w:r>
+      <w:r>
+        <w:t xml:space="preserve">data normalization techniques which is what brings me to this class. </w:t>
+      </w:r>
+    </w:p>
+    <w:p>
+      <w:r>
+        <w:t xml:space="preserve">As for initial topics, there were a few that I was mulling over. The first was creating a good data layer that can be utilized by any kind of application be it mobile or web in nature. Other topics that I was considering included doing research on the differences between different databases. The idea I was thinking of was comparing a analytical focused database to a application focused database (such as comparing PostgreSQL and </w:t>
+      </w:r>
+      <w:proofErr w:type="spellStart"/>
+      <w:r>
+        <w:t>Duckdb</w:t>
+      </w:r>
+      <w:proofErr w:type="spellEnd"/>
+      <w:r>
+        <w:t xml:space="preserve">) and the pros and cons to each. One other idea that would be to determine a good pipeline process that could be established when migrating data from one system to another. This comes from me learning about how when companies move from one system to another (think some smaller CRM system to another like Salesforce) a lot of the time, the organization wants to </w:t>
+      </w:r>
+      <w:r>
+        <w:lastRenderedPageBreak/>
+        <w:t xml:space="preserve">migrate their data over. However, I have heard on more than one occasion that </w:t>
+      </w:r>
+      <w:r>
+        <w:t xml:space="preserve">this process isn’t always the smoothest and sometimes cause the organization that wanted to migrate their data over to quit and just say with the system they are only sub-content with. All these being good ideas in themselves, I decided to do a project that encompassed a portion of each of these projects in themselves. As I reviewed and researched each idea, I noticed there were certain aspects of each of these projects that interested me and I believed based on my experience that each were too specific to be a good final project that I would actually learn a lot from. Therefore, I decided to encompass aspects from each where the core of the project is building a good data layer for any application to use, creating a data normalization step to simulate the need to normalize and reshape data from other sources into one, and if I have enough time to complete my optimistic plans be able to highlight a little between the differences between </w:t>
+      </w:r>
+      <w:proofErr w:type="spellStart"/>
+      <w:r>
+        <w:t>DuckDb</w:t>
+      </w:r>
+      <w:proofErr w:type="spellEnd"/>
+      <w:r>
+        <w:t xml:space="preserve"> being more of a analytical database vs PostgreSQL which is </w:t>
+      </w:r>
+      <w:proofErr w:type="spellStart"/>
+      <w:r>
+        <w:t>moreso</w:t>
+      </w:r>
+      <w:proofErr w:type="spellEnd"/>
+      <w:r>
+        <w:t xml:space="preserve"> a application production database (although it can still be used for analytic and other uses).</w:t>
+      </w:r>
+    </w:p>
+    <w:p>
+      <w:r>
+        <w:t xml:space="preserve">When it comes to my sources while researching, </w:t>
+      </w:r>
+      <w:r>
+        <w:t xml:space="preserve">most was influenced by things I have heard and learned while talking to others at work and with family &amp; friends. However, to be sure, I also found a few resources that backed what I have learned from others. First for example, when it comes to data migrations between systems, I stumbled upon this article that warns individuals about all the things to be careful about when considering of moving data between different systems: </w:t>
+      </w:r>
+      <w:hyperlink r:id="rId7" w:history="1">
+        <w:r>
+          <w:rPr>
+            <w:rStyle w:val="Hyperlink"/>
+          </w:rPr>
+          <w:t>https://www.salesforceben.com/tales-of-a-salesforce-migration-challenges-and-pitfalls-to-avoid/</w:t>
+        </w:r>
+      </w:hyperlink>
+      <w:r>
+        <w:t xml:space="preserve">. Here is another: </w:t>
+      </w:r>
+      <w:hyperlink r:id="rId8" w:history="1">
+        <w:r>
+          <w:rPr>
+            <w:rStyle w:val="Hyperlink"/>
+          </w:rPr>
+          <w:t>https://www.minusculetechnologies.com/blogs/salesforce-data-migration-challenges</w:t>
+        </w:r>
+      </w:hyperlink>
+      <w:r>
+        <w:t>. As for other research for this specific project, I have found and reviewed different websites like stateparks.com however, when you click into some of the pages, the information is very sparse (</w:t>
+      </w:r>
+      <w:hyperlink r:id="rId9" w:history="1">
+        <w:r>
+          <w:rPr>
+            <w:rStyle w:val="Hyperlink"/>
+          </w:rPr>
+          <w:t>https://secure.stateparks.com/battleground_state_forest_in_minnesota.html</w:t>
+        </w:r>
+      </w:hyperlink>
+      <w:r>
+        <w:t xml:space="preserve">) and the user interface reminds me of something from the early 2000s. As for the choice in databases, it comes from my curiosity comes from prior experience with learning about both of them minimally, but here are a few articles that go into more detail about what piqued my interest in both: </w:t>
+      </w:r>
+    </w:p>
+    <w:p>
+      <w:hyperlink r:id="rId10" w:history="1">
+        <w:r>
+          <w:rPr>
+            <w:rStyle w:val="Hyperlink"/>
+          </w:rPr>
+          <w:t>https://www.digitalogy.co/blog/duckdb-vs-postgresql/</w:t>
+        </w:r>
+      </w:hyperlink>
+    </w:p>
+    <w:p>
+      <w:hyperlink r:id="rId11" w:history="1">
+        <w:r>
+          <w:rPr>
+            <w:rStyle w:val="Hyperlink"/>
+          </w:rPr>
+          <w:t>https://motherduck.com/blog/postgres-duckdb-options/</w:t>
+        </w:r>
+      </w:hyperlink>
+    </w:p>
+    <w:p>
+      <w:hyperlink r:id="rId12" w:history="1">
+        <w:r>
+          <w:rPr>
+            <w:rStyle w:val="Hyperlink"/>
+          </w:rPr>
+          <w:t>https://github.com/saurshaz/analytics-and-databases/blob/main/analytical-db-knockout/blog/performance-comparison-postgres-sqlite-duckdb.md</w:t>
+        </w:r>
+      </w:hyperlink>
+    </w:p>
+    <w:p>
+      <w:hyperlink r:id="rId13" w:history="1">
+        <w:r>
+          <w:rPr>
+            <w:rStyle w:val="Hyperlink"/>
+          </w:rPr>
+          <w:t>https://www.maplibrary.org/10579/6-best-open-source-geodatabase-solutions-to-explore/</w:t>
+        </w:r>
+      </w:hyperlink>
+    </w:p>
+    <w:p>
+      <w:hyperlink r:id="rId14" w:history="1">
+        <w:r>
+          <w:rPr>
+            <w:rStyle w:val="Hyperlink"/>
+          </w:rPr>
+          <w:t>https://www.spatialpost.com/best-geospatial-database-systems/</w:t>
+        </w:r>
+      </w:hyperlink>
+    </w:p>
+    <w:p>
+      <w:hyperlink r:id="rId15" w:history="1">
+        <w:r>
+          <w:rPr>
+            <w:rStyle w:val="Hyperlink"/>
+          </w:rPr>
+          <w:t>https://geodatainsights.com/top-5-spatial-databases-for-gis-professionals-in-2025/</w:t>
+        </w:r>
+      </w:hyperlink>
+    </w:p>
+    <w:p/>
+    <w:p/>
+    <w:p/>
+    <w:p>
+      <w:pPr>
+        <w:rPr>
+          <w:strike/>
+        </w:rPr>
+      </w:pPr>
+      <w:r>
+        <w:rPr>
+          <w:strike/>
+        </w:rPr>
         <w:t>Topics Considered</w:t>
       </w:r>
-    </w:p>
-    <w:p>
-      <w:r>
+      <w:r>
+        <w:rPr>
+          <w:strike/>
+        </w:rPr>
+        <w:t xml:space="preserve"> – focus on noting different topics in which I could have focused on for my explore more project</w:t>
+      </w:r>
+    </w:p>
+    <w:p>
+      <w:pPr>
+        <w:rPr>
+          <w:strike/>
+        </w:rPr>
+      </w:pPr>
+      <w:r>
+        <w:rPr>
+          <w:strike/>
+        </w:rPr>
         <w:t>Sources</w:t>
       </w:r>
+      <w:r>
+        <w:rPr>
+          <w:strike/>
+        </w:rPr>
+        <w:t xml:space="preserve"> – need to highlight sources in which I used to justify my notes above</w:t>
+      </w:r>
     </w:p>
     <w:p>
       <w:pPr>
@@ -184,8 +556,14 @@
           <w:ilvl w:val="0"/>
           <w:numId w:val="8"/>
         </w:numPr>
-      </w:pPr>
-      <w:r>
+        <w:rPr>
+          <w:strike/>
+        </w:rPr>
+      </w:pPr>
+      <w:r>
+        <w:rPr>
+          <w:strike/>
+        </w:rPr>
         <w:t>Describe the initial starting point (previous database experience)</w:t>
       </w:r>
     </w:p>
@@ -196,25 +574,46 @@
           <w:ilvl w:val="1"/>
           <w:numId w:val="8"/>
         </w:numPr>
-      </w:pPr>
-      <w:r>
+        <w:rPr>
+          <w:strike/>
+        </w:rPr>
+      </w:pPr>
+      <w:r>
+        <w:rPr>
+          <w:strike/>
+        </w:rPr>
         <w:t>Prior to this class I had some experience with databases. I first did enroll in the database course at St. Thomas during my Comp Sci. undergraduate degree where we mainly used MySQL.</w:t>
       </w:r>
       <w:r>
+        <w:rPr>
+          <w:strike/>
+        </w:rPr>
         <w:t xml:space="preserve"> I also had some university experience with </w:t>
       </w:r>
       <w:proofErr w:type="spellStart"/>
       <w:r>
+        <w:rPr>
+          <w:strike/>
+        </w:rPr>
         <w:t>SQLLite</w:t>
       </w:r>
       <w:proofErr w:type="spellEnd"/>
       <w:r>
+        <w:rPr>
+          <w:strike/>
+        </w:rPr>
         <w:t xml:space="preserve"> in my web development course. </w:t>
       </w:r>
       <w:r>
+        <w:rPr>
+          <w:strike/>
+        </w:rPr>
         <w:t xml:space="preserve">After I graduated I experimented with some different databases during my job hunt including PostgreSQL, and Microsoft SQL. In the software development role that I have now, I work within my organization’s Microsoft SQL based database almost weekly mainly focused on </w:t>
       </w:r>
       <w:r>
+        <w:rPr>
+          <w:strike/>
+        </w:rPr>
         <w:t xml:space="preserve">querying the database to see the structure of data for features, and resolving support tickets that come in. </w:t>
       </w:r>
     </w:p>
@@ -225,8 +624,14 @@
           <w:ilvl w:val="0"/>
           <w:numId w:val="8"/>
         </w:numPr>
-      </w:pPr>
-      <w:r>
+        <w:rPr>
+          <w:strike/>
+        </w:rPr>
+      </w:pPr>
+      <w:r>
+        <w:rPr>
+          <w:strike/>
+        </w:rPr>
         <w:t>Initial ideas</w:t>
       </w:r>
     </w:p>
@@ -237,16 +642,28 @@
           <w:ilvl w:val="1"/>
           <w:numId w:val="8"/>
         </w:numPr>
-      </w:pPr>
-      <w:r>
+        <w:rPr>
+          <w:strike/>
+        </w:rPr>
+      </w:pPr>
+      <w:r>
+        <w:rPr>
+          <w:strike/>
+        </w:rPr>
         <w:t xml:space="preserve">Create a database to track and manage Disney property entities like attractions, restaurants, </w:t>
       </w:r>
       <w:proofErr w:type="spellStart"/>
       <w:r>
+        <w:rPr>
+          <w:strike/>
+        </w:rPr>
         <w:t>etc</w:t>
       </w:r>
       <w:proofErr w:type="spellEnd"/>
       <w:r>
+        <w:rPr>
+          <w:strike/>
+        </w:rPr>
         <w:t>… -- would have been a comprehensive database to help track all of my Disney knowledge and interests throughout the years</w:t>
       </w:r>
     </w:p>
@@ -257,16 +674,28 @@
           <w:ilvl w:val="1"/>
           <w:numId w:val="8"/>
         </w:numPr>
-      </w:pPr>
-      <w:r>
+        <w:rPr>
+          <w:strike/>
+        </w:rPr>
+      </w:pPr>
+      <w:r>
+        <w:rPr>
+          <w:strike/>
+        </w:rPr>
         <w:t xml:space="preserve">Create the data layer for a tool that could help developers better document and understand their databases. Similar to how one can make comments to describe columns in detail in Postgres, but a tool that would allow developers do this with some of the most used databases (Oracle, Microsoft SQL, SQL Lite, </w:t>
       </w:r>
       <w:proofErr w:type="spellStart"/>
       <w:r>
+        <w:rPr>
+          <w:strike/>
+        </w:rPr>
         <w:t>etc</w:t>
       </w:r>
       <w:proofErr w:type="spellEnd"/>
       <w:r>
+        <w:rPr>
+          <w:strike/>
+        </w:rPr>
         <w:t>…)</w:t>
       </w:r>
     </w:p>
@@ -277,17 +706,36 @@
           <w:ilvl w:val="1"/>
           <w:numId w:val="8"/>
         </w:numPr>
-      </w:pPr>
-      <w:r>
+        <w:rPr>
+          <w:strike/>
+        </w:rPr>
+      </w:pPr>
+      <w:r>
+        <w:rPr>
+          <w:strike/>
+        </w:rPr>
         <w:t xml:space="preserve">Create the data layer for a tool that would allow an organization to setup branches that are managed by a parent organization. I was thinking </w:t>
       </w:r>
       <w:proofErr w:type="spellStart"/>
       <w:r>
+        <w:rPr>
+          <w:strike/>
+        </w:rPr>
         <w:t>kindof</w:t>
       </w:r>
       <w:proofErr w:type="spellEnd"/>
       <w:r>
-        <w:t xml:space="preserve"> like bank branches being managed by a region branch which is then managed by a parent organization. (Didn’t go this direction as the map tool I felt was something I would be more interested in as well as have an opportunity to add more entities to the project)</w:t>
+        <w:rPr>
+          <w:strike/>
+        </w:rPr>
+        <w:t xml:space="preserve"> </w:t>
+      </w:r>
+      <w:r>
+        <w:rPr>
+          <w:strike/>
+        </w:rPr>
+        <w:lastRenderedPageBreak/>
+        <w:t>like bank branches being managed by a region branch which is then managed by a parent organization. (Didn’t go this direction as the map tool I felt was something I would be more interested in as well as have an opportunity to add more entities to the project)</w:t>
       </w:r>
     </w:p>
     <w:p>
@@ -297,8 +745,14 @@
           <w:ilvl w:val="0"/>
           <w:numId w:val="8"/>
         </w:numPr>
-      </w:pPr>
-      <w:r>
+        <w:rPr>
+          <w:strike/>
+        </w:rPr>
+      </w:pPr>
+      <w:r>
+        <w:rPr>
+          <w:strike/>
+        </w:rPr>
         <w:t>Topics considered</w:t>
       </w:r>
     </w:p>
@@ -309,9 +763,14 @@
           <w:ilvl w:val="1"/>
           <w:numId w:val="8"/>
         </w:numPr>
-      </w:pPr>
-      <w:r>
-        <w:lastRenderedPageBreak/>
+        <w:rPr>
+          <w:strike/>
+        </w:rPr>
+      </w:pPr>
+      <w:r>
+        <w:rPr>
+          <w:strike/>
+        </w:rPr>
         <w:t>Mainly in creation of data layers for tools that I was thinking either of building or would be good to build for my resume</w:t>
       </w:r>
     </w:p>
@@ -322,8 +781,14 @@
           <w:ilvl w:val="1"/>
           <w:numId w:val="8"/>
         </w:numPr>
-      </w:pPr>
-      <w:r>
+        <w:rPr>
+          <w:strike/>
+        </w:rPr>
+      </w:pPr>
+      <w:r>
+        <w:rPr>
+          <w:strike/>
+        </w:rPr>
         <w:t>Constructing a schema that I can use to track my personal information</w:t>
       </w:r>
     </w:p>
@@ -334,8 +799,14 @@
           <w:ilvl w:val="1"/>
           <w:numId w:val="8"/>
         </w:numPr>
-      </w:pPr>
-      <w:r>
+        <w:rPr>
+          <w:strike/>
+        </w:rPr>
+      </w:pPr>
+      <w:r>
+        <w:rPr>
+          <w:strike/>
+        </w:rPr>
         <w:t xml:space="preserve">TODO: Need to be more academic here. </w:t>
       </w:r>
     </w:p>
@@ -346,8 +817,14 @@
           <w:ilvl w:val="0"/>
           <w:numId w:val="8"/>
         </w:numPr>
-      </w:pPr>
-      <w:r>
+        <w:rPr>
+          <w:strike/>
+        </w:rPr>
+      </w:pPr>
+      <w:r>
+        <w:rPr>
+          <w:strike/>
+        </w:rPr>
         <w:t>Sources of information used to pick topics</w:t>
       </w:r>
     </w:p>
@@ -358,8 +835,14 @@
           <w:ilvl w:val="1"/>
           <w:numId w:val="8"/>
         </w:numPr>
-      </w:pPr>
-      <w:r>
+        <w:rPr>
+          <w:strike/>
+        </w:rPr>
+      </w:pPr>
+      <w:r>
+        <w:rPr>
+          <w:strike/>
+        </w:rPr>
         <w:t>Google</w:t>
       </w:r>
     </w:p>
@@ -370,8 +853,14 @@
           <w:ilvl w:val="1"/>
           <w:numId w:val="8"/>
         </w:numPr>
-      </w:pPr>
-      <w:r>
+        <w:rPr>
+          <w:strike/>
+        </w:rPr>
+      </w:pPr>
+      <w:r>
+        <w:rPr>
+          <w:strike/>
+        </w:rPr>
         <w:t>ChatGPT consulting</w:t>
       </w:r>
     </w:p>
@@ -382,8 +871,14 @@
           <w:ilvl w:val="1"/>
           <w:numId w:val="8"/>
         </w:numPr>
-      </w:pPr>
-      <w:r>
+        <w:rPr>
+          <w:strike/>
+        </w:rPr>
+      </w:pPr>
+      <w:r>
+        <w:rPr>
+          <w:strike/>
+        </w:rPr>
         <w:t>TODO; will update based on what is talked about in Topics</w:t>
       </w:r>
     </w:p>
@@ -408,6 +903,122 @@
       </w:r>
     </w:p>
     <w:p>
+      <w:r>
+        <w:t>What was built for this project was the beginning of a comprehensive data processing pipeline that focuses on collecting and combining data from multiple different sources into one that can be used for some sort of application that is developed either it be a website or a mobile app. The minimal viable goal of this project was to create this pipeline and be able to present some created views and queries that would show the real data that was collected and normalized. If time allows, the optimistic goal was to create a demo web based application with React and Django/Python to be able to present the collected and managed data in a more clear and easy to view/present manner.</w:t>
+      </w:r>
+    </w:p>
+    <w:p>
+      <w:r>
+        <w:t xml:space="preserve">Before I go into detail as to what was built, I first wanted to outline the data sources that I used for this project. There were five sources in total that I discovered and used for this project. The first was the National Park Service API that anyone has access to. This API allows anyone (up to 1,000 API requests a day) to be able to retrieve and use data collected by the US’s National Park Service about all national park managed lands throughout the United States. The second source was Google Places API. It is accessible through the Google Cloud and there are up to 1,000 free requests </w:t>
+      </w:r>
+      <w:r>
+        <w:t xml:space="preserve">for the API every month. The third source is from MN Geospatial Commons website managed by the state of Minnesota. There are many different kinds of data sources managed on the website and updated regularly, however, the one that I’m using with this project is a it’s State Parks, Recreation </w:t>
+      </w:r>
+      <w:r>
+        <w:lastRenderedPageBreak/>
+        <w:t>Areas and Waysides dataset. This is a file download which was in the format of a shapefile format which “</w:t>
+      </w:r>
+      <w:r>
+        <w:t>geospatial vector data format for geographic information system (GIS) software</w:t>
+      </w:r>
+      <w:r>
+        <w:t xml:space="preserve">” (Wikipedia). The fourth source was a little easier to manage file-wise, which was from a website called Recreation.gov. They have a dataset on their website that represents all their managed locations I believe for the entirety of the United States as well when it comes to campgrounds, and forests. This data came in the format of CSV files. The final and hardest data source that I had to deal with was a MN State map that is created and updated every year by the Minnesota DNR. The map simply shows a grid outlining attribute-based information with every State Park and Recreational Area within the State of Minnesota. </w:t>
+      </w:r>
+    </w:p>
+    <w:p>
+      <w:hyperlink r:id="rId16" w:history="1">
+        <w:r>
+          <w:rPr>
+            <w:rStyle w:val="Hyperlink"/>
+          </w:rPr>
+          <w:t>https://en.wikipedia.org/wiki/Shapefile</w:t>
+        </w:r>
+      </w:hyperlink>
+    </w:p>
+    <w:p>
+      <w:hyperlink r:id="rId17" w:history="1">
+        <w:r>
+          <w:rPr>
+            <w:rStyle w:val="Hyperlink"/>
+          </w:rPr>
+          <w:t>https://files.dnr.state.mn.us/destinations/state_parks/publications/pat_guide/2025.pdf</w:t>
+        </w:r>
+      </w:hyperlink>
+    </w:p>
+    <w:p>
+      <w:hyperlink r:id="rId18" w:history="1">
+        <w:r>
+          <w:rPr>
+            <w:rStyle w:val="Hyperlink"/>
+          </w:rPr>
+          <w:t>https://ridb.recreation.gov/download</w:t>
+        </w:r>
+      </w:hyperlink>
+    </w:p>
+    <w:p>
+      <w:hyperlink r:id="rId19" w:history="1">
+        <w:r>
+          <w:rPr>
+            <w:rStyle w:val="Hyperlink"/>
+          </w:rPr>
+          <w:t>https://www.nps.gov/subjects/developer/api-documentation.htm#/campgrounds/getCampgrounds</w:t>
+        </w:r>
+      </w:hyperlink>
+    </w:p>
+    <w:p>
+      <w:hyperlink r:id="rId20" w:history="1">
+        <w:r>
+          <w:rPr>
+            <w:rStyle w:val="Hyperlink"/>
+          </w:rPr>
+          <w:t>https://gisdata.mn.gov/dataset/bdry-dnr-lrs-prk</w:t>
+        </w:r>
+      </w:hyperlink>
+    </w:p>
+    <w:p>
+      <w:hyperlink r:id="rId21" w:history="1">
+        <w:r>
+          <w:rPr>
+            <w:rStyle w:val="Hyperlink"/>
+          </w:rPr>
+          <w:t>https://gis.data.mn.gov/maps/a42128766db2447cb77a247d4a074173/about</w:t>
+        </w:r>
+      </w:hyperlink>
+    </w:p>
+    <w:p/>
+    <w:p/>
+    <w:p>
+      <w:pPr>
+        <w:rPr>
+          <w:strike/>
+        </w:rPr>
+      </w:pPr>
+      <w:r>
+        <w:rPr>
+          <w:strike/>
+        </w:rPr>
+        <w:t>Intro outline</w:t>
+      </w:r>
+    </w:p>
+    <w:p>
+      <w:pPr>
+        <w:rPr>
+          <w:strike/>
+        </w:rPr>
+      </w:pPr>
+      <w:r>
+        <w:rPr>
+          <w:strike/>
+        </w:rPr>
+        <w:t>What data I used (real data from multiple sources)</w:t>
+      </w:r>
+    </w:p>
+    <w:p>
+      <w:r>
+        <w:t>Data collection scripts (used Gemini Google AI to help with the Python portion)</w:t>
+      </w:r>
+    </w:p>
+    <w:p>
       <w:pPr>
         <w:pStyle w:val="ListParagraph"/>
         <w:numPr>
@@ -416,6 +1027,175 @@
         </w:numPr>
       </w:pPr>
       <w:r>
+        <w:t xml:space="preserve">Concept from chapter about advanced SQL / </w:t>
+      </w:r>
+      <w:proofErr w:type="spellStart"/>
+      <w:r>
+        <w:t>DuckDB</w:t>
+      </w:r>
+      <w:proofErr w:type="spellEnd"/>
+      <w:r>
+        <w:t xml:space="preserve"> extensions used throughout project</w:t>
+      </w:r>
+    </w:p>
+    <w:p>
+      <w:r>
+        <w:t>Entity Relation Diagrams</w:t>
+      </w:r>
+    </w:p>
+    <w:p>
+      <w:pPr>
+        <w:pStyle w:val="ListParagraph"/>
+        <w:numPr>
+          <w:ilvl w:val="0"/>
+          <w:numId w:val="8"/>
+        </w:numPr>
+      </w:pPr>
+      <w:r>
+        <w:t>Concept from chapter on data modeling and relational model</w:t>
+      </w:r>
+    </w:p>
+    <w:p>
+      <w:pPr>
+        <w:pStyle w:val="ListParagraph"/>
+        <w:numPr>
+          <w:ilvl w:val="0"/>
+          <w:numId w:val="8"/>
+        </w:numPr>
+      </w:pPr>
+      <w:r>
+        <w:t>Concept from chapter on ER Diagrams</w:t>
+      </w:r>
+    </w:p>
+    <w:p>
+      <w:r>
+        <w:t xml:space="preserve">Normalized Schema created for </w:t>
+      </w:r>
+      <w:proofErr w:type="spellStart"/>
+      <w:r>
+        <w:t>DuckDB</w:t>
+      </w:r>
+      <w:proofErr w:type="spellEnd"/>
+      <w:r>
+        <w:t xml:space="preserve"> </w:t>
+      </w:r>
+    </w:p>
+    <w:p>
+      <w:pPr>
+        <w:pStyle w:val="ListParagraph"/>
+        <w:numPr>
+          <w:ilvl w:val="0"/>
+          <w:numId w:val="8"/>
+        </w:numPr>
+      </w:pPr>
+      <w:r>
+        <w:lastRenderedPageBreak/>
+        <w:t>Concept from chapter on normalization</w:t>
+      </w:r>
+    </w:p>
+    <w:p>
+      <w:pPr>
+        <w:pStyle w:val="ListParagraph"/>
+        <w:numPr>
+          <w:ilvl w:val="1"/>
+          <w:numId w:val="8"/>
+        </w:numPr>
+      </w:pPr>
+      <w:r>
+        <w:t>Highlight the denormalized data somewhat from different sources</w:t>
+      </w:r>
+    </w:p>
+    <w:p>
+      <w:pPr>
+        <w:pStyle w:val="ListParagraph"/>
+        <w:numPr>
+          <w:ilvl w:val="0"/>
+          <w:numId w:val="8"/>
+        </w:numPr>
+      </w:pPr>
+      <w:r>
+        <w:t>Hierarchical query on locations table</w:t>
+      </w:r>
+    </w:p>
+    <w:p>
+      <w:r>
+        <w:t>Database scripts to transform/move the data collected from each source into the final normalized database schema</w:t>
+      </w:r>
+    </w:p>
+    <w:p>
+      <w:pPr>
+        <w:pStyle w:val="ListParagraph"/>
+        <w:numPr>
+          <w:ilvl w:val="1"/>
+          <w:numId w:val="8"/>
+        </w:numPr>
+      </w:pPr>
+      <w:r>
+        <w:t>Queries that I tried to make possible</w:t>
+      </w:r>
+    </w:p>
+    <w:p>
+      <w:pPr>
+        <w:pStyle w:val="ListParagraph"/>
+        <w:numPr>
+          <w:ilvl w:val="0"/>
+          <w:numId w:val="8"/>
+        </w:numPr>
+      </w:pPr>
+      <w:r>
+        <w:t>Concept from chapter about database transactions with Commit and finding error prone data while running the query</w:t>
+      </w:r>
+    </w:p>
+    <w:p>
+      <w:pPr>
+        <w:pStyle w:val="ListParagraph"/>
+        <w:numPr>
+          <w:ilvl w:val="0"/>
+          <w:numId w:val="8"/>
+        </w:numPr>
+      </w:pPr>
+      <w:r>
+        <w:t>Concept from chapter about database views</w:t>
+      </w:r>
+    </w:p>
+    <w:p>
+      <w:r>
+        <w:t xml:space="preserve">Migration from </w:t>
+      </w:r>
+      <w:proofErr w:type="spellStart"/>
+      <w:r>
+        <w:t>DuckDB</w:t>
+      </w:r>
+      <w:proofErr w:type="spellEnd"/>
+      <w:r>
+        <w:t xml:space="preserve"> to PostgreSQL database</w:t>
+      </w:r>
+    </w:p>
+    <w:p>
+      <w:r>
+        <w:t>Backend API</w:t>
+      </w:r>
+    </w:p>
+    <w:p>
+      <w:r>
+        <w:t>Frontend</w:t>
+      </w:r>
+    </w:p>
+    <w:p>
+      <w:pPr>
+        <w:pStyle w:val="ListParagraph"/>
+        <w:numPr>
+          <w:ilvl w:val="0"/>
+          <w:numId w:val="8"/>
+        </w:numPr>
+        <w:rPr>
+          <w:strike/>
+        </w:rPr>
+      </w:pPr>
+      <w:r>
+        <w:rPr>
+          <w:strike/>
+        </w:rPr>
         <w:t>What I did to build the database</w:t>
       </w:r>
     </w:p>
@@ -426,8 +1206,14 @@
           <w:ilvl w:val="1"/>
           <w:numId w:val="8"/>
         </w:numPr>
-      </w:pPr>
-      <w:r>
+        <w:rPr>
+          <w:strike/>
+        </w:rPr>
+      </w:pPr>
+      <w:r>
+        <w:rPr>
+          <w:strike/>
+        </w:rPr>
         <w:t>What was the design</w:t>
       </w:r>
     </w:p>
@@ -438,8 +1224,14 @@
           <w:ilvl w:val="2"/>
           <w:numId w:val="8"/>
         </w:numPr>
-      </w:pPr>
-      <w:r>
+        <w:rPr>
+          <w:strike/>
+        </w:rPr>
+      </w:pPr>
+      <w:r>
+        <w:rPr>
+          <w:strike/>
+        </w:rPr>
         <w:t>Design specifics go here including ER Diagram showing relational and logical structures</w:t>
       </w:r>
     </w:p>
@@ -450,16 +1242,28 @@
           <w:ilvl w:val="1"/>
           <w:numId w:val="8"/>
         </w:numPr>
-      </w:pPr>
-      <w:r>
+        <w:rPr>
+          <w:strike/>
+        </w:rPr>
+      </w:pPr>
+      <w:r>
+        <w:rPr>
+          <w:strike/>
+        </w:rPr>
         <w:t xml:space="preserve">What data did I use (mock vs external source data vs hand-entered data </w:t>
       </w:r>
       <w:proofErr w:type="spellStart"/>
       <w:r>
+        <w:rPr>
+          <w:strike/>
+        </w:rPr>
         <w:t>etc</w:t>
       </w:r>
       <w:proofErr w:type="spellEnd"/>
       <w:r>
+        <w:rPr>
+          <w:strike/>
+        </w:rPr>
         <w:t>…)</w:t>
       </w:r>
     </w:p>
@@ -470,8 +1274,14 @@
           <w:ilvl w:val="2"/>
           <w:numId w:val="8"/>
         </w:numPr>
-      </w:pPr>
-      <w:r>
+        <w:rPr>
+          <w:strike/>
+        </w:rPr>
+      </w:pPr>
+      <w:r>
+        <w:rPr>
+          <w:strike/>
+        </w:rPr>
         <w:t>All real data collected from real sources</w:t>
       </w:r>
     </w:p>
@@ -482,35 +1292,61 @@
           <w:ilvl w:val="1"/>
           <w:numId w:val="8"/>
         </w:numPr>
-      </w:pPr>
-      <w:r>
+        <w:rPr>
+          <w:strike/>
+        </w:rPr>
+      </w:pPr>
+      <w:r>
+        <w:rPr>
+          <w:strike/>
+        </w:rPr>
         <w:t>What types of queries did I try to make possible</w:t>
       </w:r>
     </w:p>
     <w:p>
-      <w:pPr>
-        <w:pStyle w:val="ListParagraph"/>
-        <w:numPr>
-          <w:ilvl w:val="0"/>
-          <w:numId w:val="8"/>
-        </w:numPr>
-      </w:pPr>
-      <w:r>
-        <w:t>If research oriented project, then describe findings and choose an appropriate structure/subsections for this section</w:t>
-      </w:r>
-    </w:p>
-    <w:p>
-      <w:pPr>
-        <w:pStyle w:val="ListParagraph"/>
-        <w:numPr>
-          <w:ilvl w:val="1"/>
-          <w:numId w:val="8"/>
-        </w:numPr>
-      </w:pPr>
-      <w:r>
-        <w:t>N/A</w:t>
-      </w:r>
-    </w:p>
+      <w:r>
+        <w:rPr>
+          <w:noProof/>
+        </w:rPr>
+        <w:lastRenderedPageBreak/>
+        <w:drawing>
+          <wp:inline distT="0" distB="0" distL="0" distR="0" wp14:anchorId="6E711341" wp14:editId="1931F50E">
+            <wp:extent cx="5943600" cy="2873375"/>
+            <wp:effectExtent l="0" t="0" r="0" b="3175"/>
+            <wp:docPr id="1664148944" name="Picture 1"/>
+            <wp:cNvGraphicFramePr>
+              <a:graphicFrameLocks xmlns:a="http://schemas.openxmlformats.org/drawingml/2006/main" noChangeAspect="1"/>
+            </wp:cNvGraphicFramePr>
+            <a:graphic xmlns:a="http://schemas.openxmlformats.org/drawingml/2006/main">
+              <a:graphicData uri="http://schemas.openxmlformats.org/drawingml/2006/picture">
+                <pic:pic xmlns:pic="http://schemas.openxmlformats.org/drawingml/2006/picture">
+                  <pic:nvPicPr>
+                    <pic:cNvPr id="1664148944" name=""/>
+                    <pic:cNvPicPr/>
+                  </pic:nvPicPr>
+                  <pic:blipFill>
+                    <a:blip r:embed="rId22"/>
+                    <a:stretch>
+                      <a:fillRect/>
+                    </a:stretch>
+                  </pic:blipFill>
+                  <pic:spPr>
+                    <a:xfrm>
+                      <a:off x="0" y="0"/>
+                      <a:ext cx="5943600" cy="2873375"/>
+                    </a:xfrm>
+                    <a:prstGeom prst="rect">
+                      <a:avLst/>
+                    </a:prstGeom>
+                  </pic:spPr>
+                </pic:pic>
+              </a:graphicData>
+            </a:graphic>
+          </wp:inline>
+        </w:drawing>
+      </w:r>
+    </w:p>
+    <w:p/>
     <w:p/>
     <w:p>
       <w:pPr>
@@ -604,11 +1440,7 @@
         </w:numPr>
       </w:pPr>
       <w:r>
-        <w:t xml:space="preserve">Strengthened my querying and query building skills where it challenged me to think about the data structures of the imported </w:t>
-      </w:r>
-      <w:r>
-        <w:lastRenderedPageBreak/>
-        <w:t xml:space="preserve">data to properly merge them into one normalized entity. Had to craft unique and careful queries to ensure that data from certain sources tool precedence over others. </w:t>
+        <w:t xml:space="preserve">Strengthened my querying and query building skills where it challenged me to think about the data structures of the imported data to properly merge them into one normalized entity. Had to craft unique and careful queries to ensure that data from certain sources tool precedence over others. </w:t>
       </w:r>
     </w:p>
     <w:p>
@@ -620,7 +1452,11 @@
         </w:numPr>
       </w:pPr>
       <w:r>
-        <w:t xml:space="preserve">Improved my normalization skills. In this project I would say that I was exposed to many different organizational ways to manage and organize data. Some of which I agreed with for this project which was inherited, but other ways I wanted to structure this project worked differently from most if not all sources. </w:t>
+        <w:t xml:space="preserve">Improved my normalization skills. In this project I would say that I was exposed to many different organizational ways to manage and organize data. Some of which I agreed with for this project which </w:t>
+      </w:r>
+      <w:r>
+        <w:lastRenderedPageBreak/>
+        <w:t xml:space="preserve">was inherited, but other ways I wanted to structure this project worked differently from most if not all sources. </w:t>
       </w:r>
     </w:p>
     <w:p>
@@ -764,31 +1600,31 @@
         </w:numPr>
       </w:pPr>
       <w:r>
+        <w:t>Also mention any ethical issues that you can think of that may arise from your database</w:t>
+      </w:r>
+    </w:p>
+    <w:p>
+      <w:pPr>
+        <w:pStyle w:val="ListParagraph"/>
+        <w:numPr>
+          <w:ilvl w:val="1"/>
+          <w:numId w:val="8"/>
+        </w:numPr>
+      </w:pPr>
+      <w:r>
+        <w:t xml:space="preserve">One ethical issue that I can think of is prior to releasing this tool, I need to confirm the use of the collected data. Yes, most of the information I collected was from state and federal government websites, but I still need to ensure that this data can be made publicly available on my personal website. </w:t>
+      </w:r>
+    </w:p>
+    <w:p>
+      <w:pPr>
+        <w:pStyle w:val="ListParagraph"/>
+        <w:numPr>
+          <w:ilvl w:val="1"/>
+          <w:numId w:val="8"/>
+        </w:numPr>
+      </w:pPr>
+      <w:r>
         <w:lastRenderedPageBreak/>
-        <w:t>Also mention any ethical issues that you can think of that may arise from your database</w:t>
-      </w:r>
-    </w:p>
-    <w:p>
-      <w:pPr>
-        <w:pStyle w:val="ListParagraph"/>
-        <w:numPr>
-          <w:ilvl w:val="1"/>
-          <w:numId w:val="8"/>
-        </w:numPr>
-      </w:pPr>
-      <w:r>
-        <w:t xml:space="preserve">One ethical issue that I can think of is prior to releasing this tool, I need to confirm the use of the collected data. Yes, most of the information I collected was from state and federal government websites, but I still need to ensure that this data can be made publicly available on my personal website. </w:t>
-      </w:r>
-    </w:p>
-    <w:p>
-      <w:pPr>
-        <w:pStyle w:val="ListParagraph"/>
-        <w:numPr>
-          <w:ilvl w:val="1"/>
-          <w:numId w:val="8"/>
-        </w:numPr>
-      </w:pPr>
-      <w:r>
         <w:t xml:space="preserve">Unless I intend to ensure that all this information remains accurate, there is no way I can say that all this information is entirely accurate. Instead, I can share on the eventual production tool that I make publicly available that the information is up to date to the last time that I checked it. Custom tooling to re-retrieve the data and compare it to current production data would be important at this step. </w:t>
       </w:r>
     </w:p>
@@ -973,7 +1809,6 @@
         </w:numPr>
       </w:pPr>
       <w:r>
-        <w:lastRenderedPageBreak/>
         <w:t>Views and Hierarchical Queries – Create a view that allows me to view location hierarchy from a specific location. – Note in building section</w:t>
       </w:r>
     </w:p>
@@ -992,7 +1827,11 @@
         <w:t>be</w:t>
       </w:r>
       <w:r>
-        <w:t xml:space="preserve"> committed to the final table which allows me to rollback and determine where the problematic data exists. This will be noted during the building section. Also, discuss Atomicity (A in ACID) (fails fallback) – Also, </w:t>
+        <w:t xml:space="preserve"> committed to the final table which allows me to rollback and determine where the problematic data exists. This will be noted during the building section. Also, discuss Atomicity (A in ACID) (fails fallback) – </w:t>
+      </w:r>
+      <w:r>
+        <w:lastRenderedPageBreak/>
+        <w:t xml:space="preserve">Also, </w:t>
       </w:r>
       <w:r>
         <w:t xml:space="preserve">figure out a way if not automatically shown to me a way to identify the problematic data that caused the script to fail. </w:t>
@@ -1135,13 +1974,12 @@
           <w:b/>
           <w:bCs/>
         </w:rPr>
-        <w:lastRenderedPageBreak/>
         <w:t>NPS API</w:t>
       </w:r>
       <w:r>
         <w:t xml:space="preserve"> (</w:t>
       </w:r>
-      <w:hyperlink r:id="rId7" w:tgtFrame="_blank" w:history="1">
+      <w:hyperlink r:id="rId23" w:tgtFrame="_blank" w:history="1">
         <w:r>
           <w:rPr>
             <w:rStyle w:val="Hyperlink"/>
@@ -1170,7 +2008,7 @@
       <w:r>
         <w:t xml:space="preserve"> (</w:t>
       </w:r>
-      <w:hyperlink r:id="rId8" w:tgtFrame="_blank" w:history="1">
+      <w:hyperlink r:id="rId24" w:tgtFrame="_blank" w:history="1">
         <w:r>
           <w:rPr>
             <w:rStyle w:val="Hyperlink"/>
@@ -1194,12 +2032,13 @@
           <w:b/>
           <w:bCs/>
         </w:rPr>
+        <w:lastRenderedPageBreak/>
         <w:t>MN DNR State Park Dataset</w:t>
       </w:r>
       <w:r>
         <w:t xml:space="preserve"> (</w:t>
       </w:r>
-      <w:hyperlink r:id="rId9" w:tgtFrame="_blank" w:history="1">
+      <w:hyperlink r:id="rId25" w:tgtFrame="_blank" w:history="1">
         <w:r>
           <w:rPr>
             <w:rStyle w:val="Hyperlink"/>
@@ -1336,7 +2175,6 @@
     </w:p>
     <w:p>
       <w:r>
-        <w:lastRenderedPageBreak/>
         <w:t xml:space="preserve">My pessimistic goal for this final assignment is to structure a normalized database and populate it using </w:t>
       </w:r>
       <w:proofErr w:type="spellStart"/>
@@ -1375,6 +2213,7 @@
         </w:numPr>
       </w:pPr>
       <w:r>
+        <w:lastRenderedPageBreak/>
         <w:t>Identify and download or query public datasets (MN DNR State Park Dataset, NPS API, Recreation.gov CSV dump)</w:t>
       </w:r>
     </w:p>
@@ -1541,7 +2380,6 @@
         </w:numPr>
       </w:pPr>
       <w:r>
-        <w:lastRenderedPageBreak/>
         <w:t>GET /parks/:id — full detail for one park</w:t>
       </w:r>
     </w:p>
@@ -1572,6 +2410,7 @@
         </w:numPr>
       </w:pPr>
       <w:r>
+        <w:lastRenderedPageBreak/>
         <w:t>Display the park data as map markers on the map with a sidebar that appears when a marker is clicked. The sidebar will contain detailed information about a specific location.</w:t>
       </w:r>
     </w:p>
@@ -1599,7 +2438,7 @@
     </w:p>
     <w:p/>
     <w:sectPr>
-      <w:headerReference w:type="default" r:id="rId10"/>
+      <w:headerReference w:type="default" r:id="rId26"/>
       <w:pgSz w:w="12240" w:h="15840"/>
       <w:pgMar w:top="1440" w:right="1440" w:bottom="1440" w:left="1440" w:header="720" w:footer="720" w:gutter="0"/>
       <w:cols w:space="720"/>
@@ -3731,7 +4570,6 @@
   <w:style w:type="character" w:default="1" w:styleId="DefaultParagraphFont">
     <w:name w:val="Default Paragraph Font"/>
     <w:uiPriority w:val="1"/>
-    <w:semiHidden/>
     <w:unhideWhenUsed/>
   </w:style>
   <w:style w:type="table" w:default="1" w:styleId="TableNormal">

</xml_diff>

<commit_message>
finished creating normalized database model
Co-authored-by: Copilot <copilot@github.com>
</commit_message>
<xml_diff>
--- a/GIS-Data-Migration-Project/Assignment Documents/Final Project - Part 2 - Final Project Rough Draft.docx
+++ b/GIS-Data-Migration-Project/Assignment Documents/Final Project - Part 2 - Final Project Rough Draft.docx
@@ -79,15 +79,7 @@
     </w:p>
     <w:p>
       <w:r>
-        <w:t xml:space="preserve">For minimal goals within this project, I’m focusing on developing just the data layer for this application focusing on the management of how to collect data from multiple sources and funneling them into one normalized source. The technologies that I chose to work with in this project include Python for scripting and </w:t>
-      </w:r>
-      <w:proofErr w:type="spellStart"/>
-      <w:r>
-        <w:t>DuckDB</w:t>
-      </w:r>
-      <w:proofErr w:type="spellEnd"/>
-      <w:r>
-        <w:t xml:space="preserve"> for managing the data. The final outcome goal minimally is to have a final normalized database schema that contains a number of tables that relationally manage the data that I have collected from multiple </w:t>
+        <w:t xml:space="preserve">For minimal goals within this project, I’m focusing on developing just the data layer for this application focusing on the management of how to collect data from multiple sources and funneling them into one normalized source. The technologies that I chose to work with in this project include Python for scripting and DuckDB for managing the data. The final outcome goal minimally is to have a final normalized database schema that contains a number of tables that relationally manage the data that I have collected from multiple </w:t>
       </w:r>
       <w:r>
         <w:lastRenderedPageBreak/>
@@ -96,15 +88,7 @@
     </w:p>
     <w:p>
       <w:r>
-        <w:t xml:space="preserve">For my optimistic goals for this project is to create a mini demo web application where the </w:t>
-      </w:r>
-      <w:proofErr w:type="spellStart"/>
-      <w:r>
-        <w:t>DuckDB</w:t>
-      </w:r>
-      <w:proofErr w:type="spellEnd"/>
-      <w:r>
-        <w:t xml:space="preserve"> data is migrated to a PostgreSQL database that utilizes a database plugin called POSTGIS which is a PostgreSQL extension for </w:t>
+        <w:t xml:space="preserve">For my optimistic goals for this project is to create a mini demo web application where the DuckDB data is migrated to a PostgreSQL database that utilizes a database plugin called POSTGIS which is a PostgreSQL extension for </w:t>
       </w:r>
       <w:r>
         <w:t xml:space="preserve">geospatial data. For the frontend, this application would utilize React where it would be a mapping UI that may end up looking like Google maps after I’m finished. As for the backend, as we discussed in class data doesn’t come directly from the database but generally for security reasons served from an API layer. This API layer would be simple in nature where it is taking the data from the database and passing it off to the front end. This API layer would be built using Django and Python. </w:t>
@@ -346,26 +330,10 @@
         <w:t xml:space="preserve">Prior to this course, I did have some experience with databases. Not only did I take a undergraduate database course during my time at St. Thomas, but I also have interacted with databases at work </w:t>
       </w:r>
       <w:r>
-        <w:t xml:space="preserve">in the role as </w:t>
-      </w:r>
-      <w:proofErr w:type="spellStart"/>
-      <w:r>
-        <w:t>a</w:t>
-      </w:r>
-      <w:proofErr w:type="spellEnd"/>
-      <w:r>
-        <w:t xml:space="preserve"> application user according to our textbook where</w:t>
-      </w:r>
-      <w:r>
-        <w:t xml:space="preserve"> I’m mainly writing SELECT and sometimes UPDATE or ALTER TABLE queries to help in managing the database to fix bugs that come up during application use. Also during my job hunt after graduation from St. Thomas I did some personal projects that allowed me to work and experiment with different kinds of databases including </w:t>
-      </w:r>
-      <w:proofErr w:type="spellStart"/>
-      <w:r>
-        <w:t>sqllite</w:t>
-      </w:r>
-      <w:proofErr w:type="spellEnd"/>
-      <w:r>
-        <w:t xml:space="preserve">, PostgreSQL, and Microsoft SQL. However, where I lack in my database experience is additional practice in database administration as well as </w:t>
+        <w:t>in the role as a application user according to our textbook where</w:t>
+      </w:r>
+      <w:r>
+        <w:t xml:space="preserve"> I’m mainly writing SELECT and sometimes UPDATE or ALTER TABLE queries to help in managing the database to fix bugs that come up during application use. Also during my job hunt after graduation from St. Thomas I did some personal projects that allowed me to work and experiment with different kinds of databases including sqllite, PostgreSQL, and Microsoft SQL. However, where I lack in my database experience is additional practice in database administration as well as </w:t>
       </w:r>
       <w:r>
         <w:t xml:space="preserve">data normalization techniques which is what brings me to this class. </w:t>
@@ -373,38 +341,14 @@
     </w:p>
     <w:p>
       <w:r>
-        <w:t xml:space="preserve">As for initial topics, there were a few that I was mulling over. The first was creating a good data layer that can be utilized by any kind of application be it mobile or web in nature. Other topics that I was considering included doing research on the differences between different databases. The idea I was thinking of was comparing a analytical focused database to a application focused database (such as comparing PostgreSQL and </w:t>
-      </w:r>
-      <w:proofErr w:type="spellStart"/>
-      <w:r>
-        <w:t>Duckdb</w:t>
-      </w:r>
-      <w:proofErr w:type="spellEnd"/>
-      <w:r>
-        <w:t xml:space="preserve">) and the pros and cons to each. One other idea that would be to determine a good pipeline process that could be established when migrating data from one system to another. This comes from me learning about how when companies move from one system to another (think some smaller CRM system to another like Salesforce) a lot of the time, the organization wants to </w:t>
+        <w:t xml:space="preserve">As for initial topics, there were a few that I was mulling over. The first was creating a good data layer that can be utilized by any kind of application be it mobile or web in nature. Other topics that I was considering included doing research on the differences between different databases. The idea I was thinking of was comparing a analytical focused database to a application focused database (such as comparing PostgreSQL and Duckdb) and the pros and cons to each. One other idea that would be to determine a good pipeline process that could be established when migrating data from one system to another. This comes from me learning about how when companies move from one system to another (think some smaller CRM system to another like Salesforce) a lot of the time, the organization wants to </w:t>
       </w:r>
       <w:r>
         <w:lastRenderedPageBreak/>
         <w:t xml:space="preserve">migrate their data over. However, I have heard on more than one occasion that </w:t>
       </w:r>
       <w:r>
-        <w:t xml:space="preserve">this process isn’t always the smoothest and sometimes cause the organization that wanted to migrate their data over to quit and just say with the system they are only sub-content with. All these being good ideas in themselves, I decided to do a project that encompassed a portion of each of these projects in themselves. As I reviewed and researched each idea, I noticed there were certain aspects of each of these projects that interested me and I believed based on my experience that each were too specific to be a good final project that I would actually learn a lot from. Therefore, I decided to encompass aspects from each where the core of the project is building a good data layer for any application to use, creating a data normalization step to simulate the need to normalize and reshape data from other sources into one, and if I have enough time to complete my optimistic plans be able to highlight a little between the differences between </w:t>
-      </w:r>
-      <w:proofErr w:type="spellStart"/>
-      <w:r>
-        <w:t>DuckDb</w:t>
-      </w:r>
-      <w:proofErr w:type="spellEnd"/>
-      <w:r>
-        <w:t xml:space="preserve"> being more of a analytical database vs PostgreSQL which is </w:t>
-      </w:r>
-      <w:proofErr w:type="spellStart"/>
-      <w:r>
-        <w:t>moreso</w:t>
-      </w:r>
-      <w:proofErr w:type="spellEnd"/>
-      <w:r>
-        <w:t xml:space="preserve"> a application production database (although it can still be used for analytic and other uses).</w:t>
+        <w:t>this process isn’t always the smoothest and sometimes cause the organization that wanted to migrate their data over to quit and just say with the system they are only sub-content with. All these being good ideas in themselves, I decided to do a project that encompassed a portion of each of these projects in themselves. As I reviewed and researched each idea, I noticed there were certain aspects of each of these projects that interested me and I believed based on my experience that each were too specific to be a good final project that I would actually learn a lot from. Therefore, I decided to encompass aspects from each where the core of the project is building a good data layer for any application to use, creating a data normalization step to simulate the need to normalize and reshape data from other sources into one, and if I have enough time to complete my optimistic plans be able to highlight a little between the differences between DuckDb being more of a analytical database vs PostgreSQL which is moreso a application production database (although it can still be used for analytic and other uses).</w:t>
       </w:r>
     </w:p>
     <w:p>
@@ -588,21 +532,7 @@
         <w:rPr>
           <w:strike/>
         </w:rPr>
-        <w:t xml:space="preserve"> I also had some university experience with </w:t>
-      </w:r>
-      <w:proofErr w:type="spellStart"/>
-      <w:r>
-        <w:rPr>
-          <w:strike/>
-        </w:rPr>
-        <w:t>SQLLite</w:t>
-      </w:r>
-      <w:proofErr w:type="spellEnd"/>
-      <w:r>
-        <w:rPr>
-          <w:strike/>
-        </w:rPr>
-        <w:t xml:space="preserve"> in my web development course. </w:t>
+        <w:t xml:space="preserve"> I also had some university experience with SQLLite in my web development course. </w:t>
       </w:r>
       <w:r>
         <w:rPr>
@@ -650,21 +580,7 @@
         <w:rPr>
           <w:strike/>
         </w:rPr>
-        <w:t xml:space="preserve">Create a database to track and manage Disney property entities like attractions, restaurants, </w:t>
-      </w:r>
-      <w:proofErr w:type="spellStart"/>
-      <w:r>
-        <w:rPr>
-          <w:strike/>
-        </w:rPr>
-        <w:t>etc</w:t>
-      </w:r>
-      <w:proofErr w:type="spellEnd"/>
-      <w:r>
-        <w:rPr>
-          <w:strike/>
-        </w:rPr>
-        <w:t>… -- would have been a comprehensive database to help track all of my Disney knowledge and interests throughout the years</w:t>
+        <w:t>Create a database to track and manage Disney property entities like attractions, restaurants, etc… -- would have been a comprehensive database to help track all of my Disney knowledge and interests throughout the years</w:t>
       </w:r>
     </w:p>
     <w:p>
@@ -682,21 +598,7 @@
         <w:rPr>
           <w:strike/>
         </w:rPr>
-        <w:t xml:space="preserve">Create the data layer for a tool that could help developers better document and understand their databases. Similar to how one can make comments to describe columns in detail in Postgres, but a tool that would allow developers do this with some of the most used databases (Oracle, Microsoft SQL, SQL Lite, </w:t>
-      </w:r>
-      <w:proofErr w:type="spellStart"/>
-      <w:r>
-        <w:rPr>
-          <w:strike/>
-        </w:rPr>
-        <w:t>etc</w:t>
-      </w:r>
-      <w:proofErr w:type="spellEnd"/>
-      <w:r>
-        <w:rPr>
-          <w:strike/>
-        </w:rPr>
-        <w:t>…)</w:t>
+        <w:t>Create the data layer for a tool that could help developers better document and understand their databases. Similar to how one can make comments to describe columns in detail in Postgres, but a tool that would allow developers do this with some of the most used databases (Oracle, Microsoft SQL, SQL Lite, etc…)</w:t>
       </w:r>
     </w:p>
     <w:p>
@@ -714,21 +616,7 @@
         <w:rPr>
           <w:strike/>
         </w:rPr>
-        <w:t xml:space="preserve">Create the data layer for a tool that would allow an organization to setup branches that are managed by a parent organization. I was thinking </w:t>
-      </w:r>
-      <w:proofErr w:type="spellStart"/>
-      <w:r>
-        <w:rPr>
-          <w:strike/>
-        </w:rPr>
-        <w:t>kindof</w:t>
-      </w:r>
-      <w:proofErr w:type="spellEnd"/>
-      <w:r>
-        <w:rPr>
-          <w:strike/>
-        </w:rPr>
-        <w:t xml:space="preserve"> </w:t>
+        <w:t xml:space="preserve">Create the data layer for a tool that would allow an organization to setup branches that are managed by a parent organization. I was thinking kindof </w:t>
       </w:r>
       <w:r>
         <w:rPr>
@@ -956,7 +844,7 @@
       </w:hyperlink>
     </w:p>
     <w:p>
-      <w:hyperlink r:id="rId19" w:history="1">
+      <w:hyperlink r:id="rId19" w:anchor="/campgrounds/getCampgrounds" w:history="1">
         <w:r>
           <w:rPr>
             <w:rStyle w:val="Hyperlink"/>
@@ -1027,15 +915,7 @@
         </w:numPr>
       </w:pPr>
       <w:r>
-        <w:t xml:space="preserve">Concept from chapter about advanced SQL / </w:t>
-      </w:r>
-      <w:proofErr w:type="spellStart"/>
-      <w:r>
-        <w:t>DuckDB</w:t>
-      </w:r>
-      <w:proofErr w:type="spellEnd"/>
-      <w:r>
-        <w:t xml:space="preserve"> extensions used throughout project</w:t>
+        <w:t>Concept from chapter about advanced SQL / DuckDB extensions used throughout project</w:t>
       </w:r>
     </w:p>
     <w:p>
@@ -1069,15 +949,7 @@
     </w:p>
     <w:p>
       <w:r>
-        <w:t xml:space="preserve">Normalized Schema created for </w:t>
-      </w:r>
-      <w:proofErr w:type="spellStart"/>
-      <w:r>
-        <w:t>DuckDB</w:t>
-      </w:r>
-      <w:proofErr w:type="spellEnd"/>
-      <w:r>
-        <w:t xml:space="preserve"> </w:t>
+        <w:t xml:space="preserve">Normalized Schema created for DuckDB </w:t>
       </w:r>
     </w:p>
     <w:p>
@@ -1160,15 +1032,7 @@
     </w:p>
     <w:p>
       <w:r>
-        <w:t xml:space="preserve">Migration from </w:t>
-      </w:r>
-      <w:proofErr w:type="spellStart"/>
-      <w:r>
-        <w:t>DuckDB</w:t>
-      </w:r>
-      <w:proofErr w:type="spellEnd"/>
-      <w:r>
-        <w:t xml:space="preserve"> to PostgreSQL database</w:t>
+        <w:t>Migration from DuckDB to PostgreSQL database</w:t>
       </w:r>
     </w:p>
     <w:p>
@@ -1250,21 +1114,7 @@
         <w:rPr>
           <w:strike/>
         </w:rPr>
-        <w:t xml:space="preserve">What data did I use (mock vs external source data vs hand-entered data </w:t>
-      </w:r>
-      <w:proofErr w:type="spellStart"/>
-      <w:r>
-        <w:rPr>
-          <w:strike/>
-        </w:rPr>
-        <w:t>etc</w:t>
-      </w:r>
-      <w:proofErr w:type="spellEnd"/>
-      <w:r>
-        <w:rPr>
-          <w:strike/>
-        </w:rPr>
-        <w:t>…)</w:t>
+        <w:t>What data did I use (mock vs external source data vs hand-entered data etc…)</w:t>
       </w:r>
     </w:p>
     <w:p>
@@ -1304,16 +1154,26 @@
       </w:r>
     </w:p>
     <w:p>
+      <w:r>
+        <w:t>Logical Model</w:t>
+      </w:r>
+    </w:p>
+    <w:p>
+      <w:pPr>
+        <w:rPr>
+          <w:strike/>
+        </w:rPr>
+      </w:pPr>
       <w:r>
         <w:rPr>
           <w:noProof/>
         </w:rPr>
         <w:lastRenderedPageBreak/>
         <w:drawing>
-          <wp:inline distT="0" distB="0" distL="0" distR="0" wp14:anchorId="6E711341" wp14:editId="1931F50E">
-            <wp:extent cx="5943600" cy="2873375"/>
-            <wp:effectExtent l="0" t="0" r="0" b="3175"/>
-            <wp:docPr id="1664148944" name="Picture 1"/>
+          <wp:inline distT="0" distB="0" distL="0" distR="0" wp14:anchorId="66F51414" wp14:editId="6E2F9983">
+            <wp:extent cx="5943600" cy="3487420"/>
+            <wp:effectExtent l="0" t="0" r="0" b="0"/>
+            <wp:docPr id="1941586756" name="Picture 1"/>
             <wp:cNvGraphicFramePr>
               <a:graphicFrameLocks xmlns:a="http://schemas.openxmlformats.org/drawingml/2006/main" noChangeAspect="1"/>
             </wp:cNvGraphicFramePr>
@@ -1321,7 +1181,7 @@
               <a:graphicData uri="http://schemas.openxmlformats.org/drawingml/2006/picture">
                 <pic:pic xmlns:pic="http://schemas.openxmlformats.org/drawingml/2006/picture">
                   <pic:nvPicPr>
-                    <pic:cNvPr id="1664148944" name=""/>
+                    <pic:cNvPr id="1941586756" name=""/>
                     <pic:cNvPicPr/>
                   </pic:nvPicPr>
                   <pic:blipFill>
@@ -1333,7 +1193,7 @@
                   <pic:spPr>
                     <a:xfrm>
                       <a:off x="0" y="0"/>
-                      <a:ext cx="5943600" cy="2873375"/>
+                      <a:ext cx="5943600" cy="3487420"/>
                     </a:xfrm>
                     <a:prstGeom prst="rect">
                       <a:avLst/>
@@ -1346,6 +1206,53 @@
         </w:drawing>
       </w:r>
     </w:p>
+    <w:p>
+      <w:r>
+        <w:t>Relational Model</w:t>
+      </w:r>
+    </w:p>
+    <w:p>
+      <w:r>
+        <w:rPr>
+          <w:noProof/>
+        </w:rPr>
+        <w:drawing>
+          <wp:inline distT="0" distB="0" distL="0" distR="0" wp14:anchorId="4ED438F9" wp14:editId="6D05C727">
+            <wp:extent cx="5943600" cy="2858135"/>
+            <wp:effectExtent l="0" t="0" r="0" b="0"/>
+            <wp:docPr id="1668863461" name="Picture 1"/>
+            <wp:cNvGraphicFramePr>
+              <a:graphicFrameLocks xmlns:a="http://schemas.openxmlformats.org/drawingml/2006/main" noChangeAspect="1"/>
+            </wp:cNvGraphicFramePr>
+            <a:graphic xmlns:a="http://schemas.openxmlformats.org/drawingml/2006/main">
+              <a:graphicData uri="http://schemas.openxmlformats.org/drawingml/2006/picture">
+                <pic:pic xmlns:pic="http://schemas.openxmlformats.org/drawingml/2006/picture">
+                  <pic:nvPicPr>
+                    <pic:cNvPr id="1668863461" name=""/>
+                    <pic:cNvPicPr/>
+                  </pic:nvPicPr>
+                  <pic:blipFill>
+                    <a:blip r:embed="rId23"/>
+                    <a:stretch>
+                      <a:fillRect/>
+                    </a:stretch>
+                  </pic:blipFill>
+                  <pic:spPr>
+                    <a:xfrm>
+                      <a:off x="0" y="0"/>
+                      <a:ext cx="5943600" cy="2858135"/>
+                    </a:xfrm>
+                    <a:prstGeom prst="rect">
+                      <a:avLst/>
+                    </a:prstGeom>
+                  </pic:spPr>
+                </pic:pic>
+              </a:graphicData>
+            </a:graphic>
+          </wp:inline>
+        </w:drawing>
+      </w:r>
+    </w:p>
     <w:p/>
     <w:p/>
     <w:p>
@@ -1364,6 +1271,7 @@
           <w:sz w:val="32"/>
           <w:szCs w:val="32"/>
         </w:rPr>
+        <w:lastRenderedPageBreak/>
         <w:t>Discovering</w:t>
       </w:r>
     </w:p>
@@ -1388,15 +1296,7 @@
         </w:numPr>
       </w:pPr>
       <w:r>
-        <w:t xml:space="preserve">Give </w:t>
-      </w:r>
-      <w:proofErr w:type="spellStart"/>
-      <w:r>
-        <w:t>self assessment</w:t>
-      </w:r>
-      <w:proofErr w:type="spellEnd"/>
-      <w:r>
-        <w:t xml:space="preserve"> describing where were you before the class and if/how the project advanced my knowledge</w:t>
+        <w:t>Give self assessment describing where were you before the class and if/how the project advanced my knowledge</w:t>
       </w:r>
     </w:p>
     <w:p>
@@ -1420,15 +1320,7 @@
         </w:numPr>
       </w:pPr>
       <w:r>
-        <w:t xml:space="preserve">Learned about </w:t>
-      </w:r>
-      <w:proofErr w:type="spellStart"/>
-      <w:r>
-        <w:t>DuckDB</w:t>
-      </w:r>
-      <w:proofErr w:type="spellEnd"/>
-      <w:r>
-        <w:t xml:space="preserve"> and the use case in which it fills to help aggregate and manage large amounts of data from different sources</w:t>
+        <w:t>Learned about DuckDB and the use case in which it fills to help aggregate and manage large amounts of data from different sources</w:t>
       </w:r>
     </w:p>
     <w:p>
@@ -1452,11 +1344,7 @@
         </w:numPr>
       </w:pPr>
       <w:r>
-        <w:t xml:space="preserve">Improved my normalization skills. In this project I would say that I was exposed to many different organizational ways to manage and organize data. Some of which I agreed with for this project which </w:t>
-      </w:r>
-      <w:r>
-        <w:lastRenderedPageBreak/>
-        <w:t xml:space="preserve">was inherited, but other ways I wanted to structure this project worked differently from most if not all sources. </w:t>
+        <w:t xml:space="preserve">Improved my normalization skills. In this project I would say that I was exposed to many different organizational ways to manage and organize data. Some of which I agreed with for this project which was inherited, but other ways I wanted to structure this project worked differently from most if not all sources. </w:t>
       </w:r>
     </w:p>
     <w:p>
@@ -1468,15 +1356,7 @@
         </w:numPr>
       </w:pPr>
       <w:r>
-        <w:t xml:space="preserve">Note anything that didn’t work or I didn’t have time to complete, discuss why it didn’t work, what I might have done with more time, </w:t>
-      </w:r>
-      <w:proofErr w:type="spellStart"/>
-      <w:r>
-        <w:t>etc</w:t>
-      </w:r>
-      <w:proofErr w:type="spellEnd"/>
-      <w:r>
-        <w:t>…</w:t>
+        <w:t>Note anything that didn’t work or I didn’t have time to complete, discuss why it didn’t work, what I might have done with more time, etc…</w:t>
       </w:r>
     </w:p>
     <w:p>
@@ -1512,15 +1392,7 @@
         </w:numPr>
       </w:pPr>
       <w:r>
-        <w:t xml:space="preserve">Depends on how much of the API and UI I get working (and migration scripts) working to </w:t>
-      </w:r>
-      <w:proofErr w:type="spellStart"/>
-      <w:r>
-        <w:t>postgresql</w:t>
-      </w:r>
-      <w:proofErr w:type="spellEnd"/>
-      <w:r>
-        <w:t xml:space="preserve"> this may be another point to talk about</w:t>
+        <w:t>Depends on how much of the API and UI I get working (and migration scripts) working to postgresql this may be another point to talk about</w:t>
       </w:r>
     </w:p>
     <w:p/>
@@ -1540,6 +1412,7 @@
           <w:sz w:val="32"/>
           <w:szCs w:val="32"/>
         </w:rPr>
+        <w:lastRenderedPageBreak/>
         <w:t>Limitations</w:t>
       </w:r>
     </w:p>
@@ -1624,7 +1497,6 @@
         </w:numPr>
       </w:pPr>
       <w:r>
-        <w:lastRenderedPageBreak/>
         <w:t xml:space="preserve">Unless I intend to ensure that all this information remains accurate, there is no way I can say that all this information is entirely accurate. Instead, I can share on the eventual production tool that I make publicly available that the information is up to date to the last time that I checked it. Custom tooling to re-retrieve the data and compare it to current production data would be important at this step. </w:t>
       </w:r>
     </w:p>
@@ -1637,15 +1509,7 @@
         </w:numPr>
       </w:pPr>
       <w:r>
-        <w:t xml:space="preserve">There may be limitations to what and how I use information on my website. For example, if I wanted to show any of the images on my tool’s website that Google has associated to certain locations, then I would have to make sure that I continue using the Google API and paying for it’s usage instead of downloading images from Google and then uploading those images to my own media server (unethical just to avoid paying Google for API </w:t>
-      </w:r>
-      <w:proofErr w:type="spellStart"/>
-      <w:r>
-        <w:t>uage</w:t>
-      </w:r>
-      <w:proofErr w:type="spellEnd"/>
-      <w:r>
-        <w:t>.</w:t>
+        <w:t>There may be limitations to what and how I use information on my website. For example, if I wanted to show any of the images on my tool’s website that Google has associated to certain locations, then I would have to make sure that I continue using the Google API and paying for it’s usage instead of downloading images from Google and then uploading those images to my own media server (unethical just to avoid paying Google for API uage.</w:t>
       </w:r>
     </w:p>
     <w:p/>
@@ -1719,6 +1583,7 @@
         </w:numPr>
       </w:pPr>
       <w:r>
+        <w:lastRenderedPageBreak/>
         <w:t>ER Diagram</w:t>
       </w:r>
     </w:p>
@@ -1761,15 +1626,7 @@
         <w:t>Advanced SQL (Spatial Extensions)</w:t>
       </w:r>
       <w:r>
-        <w:t xml:space="preserve"> – Note in Exploring Section and Building Section / Also with </w:t>
-      </w:r>
-      <w:proofErr w:type="spellStart"/>
-      <w:r>
-        <w:t>DuckDB</w:t>
-      </w:r>
-      <w:proofErr w:type="spellEnd"/>
-      <w:r>
-        <w:t xml:space="preserve"> schemas where each can have their own tables / also note joining table concept to show information and moving data around within a database maybe</w:t>
+        <w:t xml:space="preserve"> – Note in Exploring Section and Building Section / Also with DuckDB schemas where each can have their own tables / also note joining table concept to show information and moving data around within a database maybe</w:t>
       </w:r>
     </w:p>
     <w:p>
@@ -1781,23 +1638,7 @@
         </w:numPr>
       </w:pPr>
       <w:r>
-        <w:t xml:space="preserve">Use of the </w:t>
-      </w:r>
-      <w:proofErr w:type="spellStart"/>
-      <w:r>
-        <w:t>PostGIS</w:t>
-      </w:r>
-      <w:proofErr w:type="spellEnd"/>
-      <w:r>
-        <w:t xml:space="preserve"> Spatial Extension and the extension that </w:t>
-      </w:r>
-      <w:proofErr w:type="spellStart"/>
-      <w:r>
-        <w:t>DuckDB</w:t>
-      </w:r>
-      <w:proofErr w:type="spellEnd"/>
-      <w:r>
-        <w:t xml:space="preserve"> uses. </w:t>
+        <w:t xml:space="preserve">Use of the PostGIS Spatial Extension and the extension that DuckDB uses. </w:t>
       </w:r>
     </w:p>
     <w:p>
@@ -1827,11 +1668,7 @@
         <w:t>be</w:t>
       </w:r>
       <w:r>
-        <w:t xml:space="preserve"> committed to the final table which allows me to rollback and determine where the problematic data exists. This will be noted during the building section. Also, discuss Atomicity (A in ACID) (fails fallback) – </w:t>
-      </w:r>
-      <w:r>
-        <w:lastRenderedPageBreak/>
-        <w:t xml:space="preserve">Also, </w:t>
+        <w:t xml:space="preserve"> committed to the final table which allows me to rollback and determine where the problematic data exists. This will be noted during the building section. Also, discuss Atomicity (A in ACID) (fails fallback) – Also, </w:t>
       </w:r>
       <w:r>
         <w:t xml:space="preserve">figure out a way if not automatically shown to me a way to identify the problematic data that caused the script to fail. </w:t>
@@ -1926,35 +1763,12 @@
           <w:sz w:val="32"/>
           <w:szCs w:val="32"/>
         </w:rPr>
+        <w:lastRenderedPageBreak/>
         <w:t>What</w:t>
       </w:r>
       <w:r>
         <w:br/>
-        <w:t xml:space="preserve">For this project, I want to build a normalized relational database using </w:t>
-      </w:r>
-      <w:proofErr w:type="spellStart"/>
-      <w:r>
-        <w:t>DuckDB</w:t>
-      </w:r>
-      <w:proofErr w:type="spellEnd"/>
-      <w:r>
-        <w:t xml:space="preserve"> that aggregates publicly available data about Minnesota state park and NPS (National Park Service) park information. The idea is by using </w:t>
-      </w:r>
-      <w:proofErr w:type="spellStart"/>
-      <w:r>
-        <w:t>DuckDB</w:t>
-      </w:r>
-      <w:proofErr w:type="spellEnd"/>
-      <w:r>
-        <w:t xml:space="preserve"> I'll be able to incorporate and consolidate information from multiple various sources including but not limited to downloadable datasets, REST APIs and government data portals — into a single, </w:t>
-      </w:r>
-      <w:proofErr w:type="spellStart"/>
-      <w:r>
-        <w:t>queryable</w:t>
-      </w:r>
-      <w:proofErr w:type="spellEnd"/>
-      <w:r>
-        <w:t>, well-structured schema</w:t>
+        <w:t>For this project, I want to build a normalized relational database using DuckDB that aggregates publicly available data about Minnesota state park and NPS (National Park Service) park information. The idea is by using DuckDB I'll be able to incorporate and consolidate information from multiple various sources including but not limited to downloadable datasets, REST APIs and government data portals — into a single, queryable, well-structured schema</w:t>
       </w:r>
     </w:p>
     <w:p>
@@ -1979,7 +1793,7 @@
       <w:r>
         <w:t xml:space="preserve"> (</w:t>
       </w:r>
-      <w:hyperlink r:id="rId23" w:tgtFrame="_blank" w:history="1">
+      <w:hyperlink r:id="rId24" w:tgtFrame="_blank" w:history="1">
         <w:r>
           <w:rPr>
             <w:rStyle w:val="Hyperlink"/>
@@ -2008,7 +1822,7 @@
       <w:r>
         <w:t xml:space="preserve"> (</w:t>
       </w:r>
-      <w:hyperlink r:id="rId24" w:tgtFrame="_blank" w:history="1">
+      <w:hyperlink r:id="rId25" w:tgtFrame="_blank" w:history="1">
         <w:r>
           <w:rPr>
             <w:rStyle w:val="Hyperlink"/>
@@ -2032,13 +1846,12 @@
           <w:b/>
           <w:bCs/>
         </w:rPr>
-        <w:lastRenderedPageBreak/>
         <w:t>MN DNR State Park Dataset</w:t>
       </w:r>
       <w:r>
         <w:t xml:space="preserve"> (</w:t>
       </w:r>
-      <w:hyperlink r:id="rId25" w:tgtFrame="_blank" w:history="1">
+      <w:hyperlink r:id="rId26" w:tgtFrame="_blank" w:history="1">
         <w:r>
           <w:rPr>
             <w:rStyle w:val="Hyperlink"/>
@@ -2117,15 +1930,11 @@
     </w:p>
     <w:p>
       <w:r>
-        <w:t xml:space="preserve">By choosing this project, it gives me a structured opportunity to apply the core concepts from this course such as normalization, schema design and query development to a project I not only care about but plan to continue forward with. Based on the focus with aggregating data from multiple different sources, it will also give me practical experience with </w:t>
-      </w:r>
-      <w:proofErr w:type="spellStart"/>
-      <w:r>
-        <w:t>DuckDB</w:t>
-      </w:r>
-      <w:proofErr w:type="spellEnd"/>
-      <w:r>
-        <w:t xml:space="preserve">, which I have no prior experience using. </w:t>
+        <w:t xml:space="preserve">By choosing this project, it gives me a structured opportunity to apply the core concepts from this course such as normalization, schema design and query development to a </w:t>
+      </w:r>
+      <w:r>
+        <w:lastRenderedPageBreak/>
+        <w:t xml:space="preserve">project I not only care about but plan to continue forward with. Based on the focus with aggregating data from multiple different sources, it will also give me practical experience with DuckDB, which I have no prior experience using. </w:t>
       </w:r>
     </w:p>
     <w:p>
@@ -2175,15 +1984,7 @@
     </w:p>
     <w:p>
       <w:r>
-        <w:t xml:space="preserve">My pessimistic goal for this final assignment is to structure a normalized database and populate it using </w:t>
-      </w:r>
-      <w:proofErr w:type="spellStart"/>
-      <w:r>
-        <w:t>DuckDB</w:t>
-      </w:r>
-      <w:proofErr w:type="spellEnd"/>
-      <w:r>
-        <w:t xml:space="preserve"> and at least 2 if not more sources that I noted in the </w:t>
+        <w:t xml:space="preserve">My pessimistic goal for this final assignment is to structure a normalized database and populate it using DuckDB and at least 2 if not more sources that I noted in the </w:t>
       </w:r>
       <w:r>
         <w:rPr>
@@ -2213,7 +2014,6 @@
         </w:numPr>
       </w:pPr>
       <w:r>
-        <w:lastRenderedPageBreak/>
         <w:t>Identify and download or query public datasets (MN DNR State Park Dataset, NPS API, Recreation.gov CSV dump)</w:t>
       </w:r>
     </w:p>
@@ -2225,15 +2025,7 @@
         </w:numPr>
       </w:pPr>
       <w:r>
-        <w:t xml:space="preserve">Design a normalized schema - primary entities I'm currently planning on but will likely add more include locations, contacts, addresses, operating hours, activities and possibly (based on time) a structure focused on organizing campground data. The schema will be developed using some sort of ER Diagram tool that quite possibly will generate the DDL SQL code needed to use within </w:t>
-      </w:r>
-      <w:proofErr w:type="spellStart"/>
-      <w:r>
-        <w:t>DuckDB</w:t>
-      </w:r>
-      <w:proofErr w:type="spellEnd"/>
-      <w:r>
-        <w:t>.</w:t>
+        <w:t>Design a normalized schema - primary entities I'm currently planning on but will likely add more include locations, contacts, addresses, operating hours, activities and possibly (based on time) a structure focused on organizing campground data. The schema will be developed using some sort of ER Diagram tool that quite possibly will generate the DDL SQL code needed to use within DuckDB.</w:t>
       </w:r>
     </w:p>
     <w:p>
@@ -2244,13 +2036,8 @@
         </w:numPr>
       </w:pPr>
       <w:r>
-        <w:t xml:space="preserve">If needed write individual scripts (likely in Python) to clean, transform and load each source's data into </w:t>
-      </w:r>
-      <w:proofErr w:type="spellStart"/>
-      <w:r>
-        <w:t>DuckDB</w:t>
-      </w:r>
-      <w:proofErr w:type="spellEnd"/>
+        <w:t>If needed write individual scripts (likely in Python) to clean, transform and load each source's data into DuckDB</w:t>
+      </w:r>
     </w:p>
     <w:p>
       <w:pPr>
@@ -2260,15 +2047,7 @@
         </w:numPr>
       </w:pPr>
       <w:r>
-        <w:t xml:space="preserve">Validate the information with cross join queries aimed in ensuring that the information that exists in the </w:t>
-      </w:r>
-      <w:proofErr w:type="spellStart"/>
-      <w:r>
-        <w:t>DuckDB</w:t>
-      </w:r>
-      <w:proofErr w:type="spellEnd"/>
-      <w:r>
-        <w:t xml:space="preserve"> database is accurate to the sources the data is collected from. </w:t>
+        <w:t xml:space="preserve">Validate the information with cross join queries aimed in ensuring that the information that exists in the DuckDB database is accurate to the sources the data is collected from. </w:t>
       </w:r>
     </w:p>
     <w:p>
@@ -2280,15 +2059,7 @@
         <w:t>Planned Deliverable</w:t>
       </w:r>
       <w:r>
-        <w:t>: A populated .</w:t>
-      </w:r>
-      <w:proofErr w:type="spellStart"/>
-      <w:r>
-        <w:t>duckdb</w:t>
-      </w:r>
-      <w:proofErr w:type="spellEnd"/>
-      <w:r>
-        <w:t xml:space="preserve"> file, any python scripts created, ER diagram of the normalized schema created, and the final writeup and video. </w:t>
+        <w:t xml:space="preserve">: A populated .duckdb file, any python scripts created, ER diagram of the normalized schema created, and the final writeup and video. </w:t>
       </w:r>
     </w:p>
     <w:p>
@@ -2325,6 +2096,7 @@
         </w:numPr>
       </w:pPr>
       <w:r>
+        <w:lastRenderedPageBreak/>
         <w:t>Completed when checked</w:t>
       </w:r>
       <w:r>
@@ -2361,15 +2133,7 @@
         </w:numPr>
       </w:pPr>
       <w:r>
-        <w:t xml:space="preserve">GET /parks — list parks with filters (state, type, </w:t>
-      </w:r>
-      <w:proofErr w:type="spellStart"/>
-      <w:r>
-        <w:t>has_camping</w:t>
-      </w:r>
-      <w:proofErr w:type="spellEnd"/>
-      <w:r>
-        <w:t>, etc...)</w:t>
+        <w:t>GET /parks — list parks with filters (state, type, has_camping, etc...)</w:t>
       </w:r>
     </w:p>
     <w:p>
@@ -2391,15 +2155,7 @@
         </w:numPr>
       </w:pPr>
       <w:r>
-        <w:t xml:space="preserve">Build and connect a Map frontend UI (using React + </w:t>
-      </w:r>
-      <w:proofErr w:type="spellStart"/>
-      <w:r>
-        <w:t>OpenLayers</w:t>
-      </w:r>
-      <w:proofErr w:type="spellEnd"/>
-      <w:r>
-        <w:t xml:space="preserve"> map) to the API </w:t>
+        <w:t xml:space="preserve">Build and connect a Map frontend UI (using React + OpenLayers map) to the API </w:t>
       </w:r>
     </w:p>
     <w:p>
@@ -2410,7 +2166,6 @@
         </w:numPr>
       </w:pPr>
       <w:r>
-        <w:lastRenderedPageBreak/>
         <w:t>Display the park data as map markers on the map with a sidebar that appears when a marker is clicked. The sidebar will contain detailed information about a specific location.</w:t>
       </w:r>
     </w:p>
@@ -2438,7 +2193,7 @@
     </w:p>
     <w:p/>
     <w:sectPr>
-      <w:headerReference w:type="default" r:id="rId26"/>
+      <w:headerReference w:type="default" r:id="rId27"/>
       <w:pgSz w:w="12240" w:h="15840"/>
       <w:pgMar w:top="1440" w:right="1440" w:bottom="1440" w:left="1440" w:header="720" w:footer="720" w:gutter="0"/>
       <w:cols w:space="720"/>
@@ -4570,6 +4325,7 @@
   <w:style w:type="character" w:default="1" w:styleId="DefaultParagraphFont">
     <w:name w:val="Default Paragraph Font"/>
     <w:uiPriority w:val="1"/>
+    <w:semiHidden/>
     <w:unhideWhenUsed/>
   </w:style>
   <w:style w:type="table" w:default="1" w:styleId="TableNormal">

</xml_diff>

<commit_message>
additional er diagram changes for operating hours structure and initial queries for transforming data from nps to normalized tables.
Co-authored-by: Copilot <copilot@github.com>
</commit_message>
<xml_diff>
--- a/GIS-Data-Migration-Project/Assignment Documents/Final Project - Part 2 - Final Project Rough Draft.docx
+++ b/GIS-Data-Migration-Project/Assignment Documents/Final Project - Part 2 - Final Project Rough Draft.docx
@@ -1159,16 +1159,58 @@
       </w:r>
     </w:p>
     <w:p>
-      <w:pPr>
-        <w:rPr>
-          <w:strike/>
-        </w:rPr>
-      </w:pPr>
       <w:r>
         <w:rPr>
           <w:noProof/>
         </w:rPr>
         <w:lastRenderedPageBreak/>
+        <w:drawing>
+          <wp:inline distT="0" distB="0" distL="0" distR="0" wp14:anchorId="33BAA08F" wp14:editId="0772A51D">
+            <wp:extent cx="5943600" cy="3592195"/>
+            <wp:effectExtent l="0" t="0" r="0" b="8255"/>
+            <wp:docPr id="586225190" name="Picture 1"/>
+            <wp:cNvGraphicFramePr>
+              <a:graphicFrameLocks xmlns:a="http://schemas.openxmlformats.org/drawingml/2006/main" noChangeAspect="1"/>
+            </wp:cNvGraphicFramePr>
+            <a:graphic xmlns:a="http://schemas.openxmlformats.org/drawingml/2006/main">
+              <a:graphicData uri="http://schemas.openxmlformats.org/drawingml/2006/picture">
+                <pic:pic xmlns:pic="http://schemas.openxmlformats.org/drawingml/2006/picture">
+                  <pic:nvPicPr>
+                    <pic:cNvPr id="586225190" name=""/>
+                    <pic:cNvPicPr/>
+                  </pic:nvPicPr>
+                  <pic:blipFill>
+                    <a:blip r:embed="rId22"/>
+                    <a:stretch>
+                      <a:fillRect/>
+                    </a:stretch>
+                  </pic:blipFill>
+                  <pic:spPr>
+                    <a:xfrm>
+                      <a:off x="0" y="0"/>
+                      <a:ext cx="5943600" cy="3592195"/>
+                    </a:xfrm>
+                    <a:prstGeom prst="rect">
+                      <a:avLst/>
+                    </a:prstGeom>
+                  </pic:spPr>
+                </pic:pic>
+              </a:graphicData>
+            </a:graphic>
+          </wp:inline>
+        </w:drawing>
+      </w:r>
+    </w:p>
+    <w:p>
+      <w:pPr>
+        <w:rPr>
+          <w:strike/>
+        </w:rPr>
+      </w:pPr>
+      <w:r>
+        <w:rPr>
+          <w:noProof/>
+        </w:rPr>
         <w:drawing>
           <wp:inline distT="0" distB="0" distL="0" distR="0" wp14:anchorId="66F51414" wp14:editId="6E2F9983">
             <wp:extent cx="5943600" cy="3487420"/>
@@ -1185,7 +1227,7 @@
                     <pic:cNvPicPr/>
                   </pic:nvPicPr>
                   <pic:blipFill>
-                    <a:blip r:embed="rId22"/>
+                    <a:blip r:embed="rId23"/>
                     <a:stretch>
                       <a:fillRect/>
                     </a:stretch>
@@ -1216,6 +1258,49 @@
         <w:rPr>
           <w:noProof/>
         </w:rPr>
+        <w:lastRenderedPageBreak/>
+        <w:drawing>
+          <wp:inline distT="0" distB="0" distL="0" distR="0" wp14:anchorId="1CCFF425" wp14:editId="498C89DA">
+            <wp:extent cx="5943600" cy="2993390"/>
+            <wp:effectExtent l="0" t="0" r="0" b="0"/>
+            <wp:docPr id="1715177803" name="Picture 1"/>
+            <wp:cNvGraphicFramePr>
+              <a:graphicFrameLocks xmlns:a="http://schemas.openxmlformats.org/drawingml/2006/main" noChangeAspect="1"/>
+            </wp:cNvGraphicFramePr>
+            <a:graphic xmlns:a="http://schemas.openxmlformats.org/drawingml/2006/main">
+              <a:graphicData uri="http://schemas.openxmlformats.org/drawingml/2006/picture">
+                <pic:pic xmlns:pic="http://schemas.openxmlformats.org/drawingml/2006/picture">
+                  <pic:nvPicPr>
+                    <pic:cNvPr id="1715177803" name=""/>
+                    <pic:cNvPicPr/>
+                  </pic:nvPicPr>
+                  <pic:blipFill>
+                    <a:blip r:embed="rId24"/>
+                    <a:stretch>
+                      <a:fillRect/>
+                    </a:stretch>
+                  </pic:blipFill>
+                  <pic:spPr>
+                    <a:xfrm>
+                      <a:off x="0" y="0"/>
+                      <a:ext cx="5943600" cy="2993390"/>
+                    </a:xfrm>
+                    <a:prstGeom prst="rect">
+                      <a:avLst/>
+                    </a:prstGeom>
+                  </pic:spPr>
+                </pic:pic>
+              </a:graphicData>
+            </a:graphic>
+          </wp:inline>
+        </w:drawing>
+      </w:r>
+    </w:p>
+    <w:p>
+      <w:r>
+        <w:rPr>
+          <w:noProof/>
+        </w:rPr>
         <w:drawing>
           <wp:inline distT="0" distB="0" distL="0" distR="0" wp14:anchorId="4ED438F9" wp14:editId="6D05C727">
             <wp:extent cx="5943600" cy="2858135"/>
@@ -1232,7 +1317,7 @@
                     <pic:cNvPicPr/>
                   </pic:nvPicPr>
                   <pic:blipFill>
-                    <a:blip r:embed="rId23"/>
+                    <a:blip r:embed="rId25"/>
                     <a:stretch>
                       <a:fillRect/>
                     </a:stretch>
@@ -1271,31 +1356,31 @@
           <w:sz w:val="32"/>
           <w:szCs w:val="32"/>
         </w:rPr>
+        <w:t>Discovering</w:t>
+      </w:r>
+    </w:p>
+    <w:p>
+      <w:pPr>
+        <w:pStyle w:val="ListParagraph"/>
+        <w:numPr>
+          <w:ilvl w:val="0"/>
+          <w:numId w:val="8"/>
+        </w:numPr>
+      </w:pPr>
+      <w:r>
+        <w:t>What did I learn from the project</w:t>
+      </w:r>
+    </w:p>
+    <w:p>
+      <w:pPr>
+        <w:pStyle w:val="ListParagraph"/>
+        <w:numPr>
+          <w:ilvl w:val="1"/>
+          <w:numId w:val="8"/>
+        </w:numPr>
+      </w:pPr>
+      <w:r>
         <w:lastRenderedPageBreak/>
-        <w:t>Discovering</w:t>
-      </w:r>
-    </w:p>
-    <w:p>
-      <w:pPr>
-        <w:pStyle w:val="ListParagraph"/>
-        <w:numPr>
-          <w:ilvl w:val="0"/>
-          <w:numId w:val="8"/>
-        </w:numPr>
-      </w:pPr>
-      <w:r>
-        <w:t>What did I learn from the project</w:t>
-      </w:r>
-    </w:p>
-    <w:p>
-      <w:pPr>
-        <w:pStyle w:val="ListParagraph"/>
-        <w:numPr>
-          <w:ilvl w:val="1"/>
-          <w:numId w:val="8"/>
-        </w:numPr>
-      </w:pPr>
-      <w:r>
         <w:t>Give self assessment describing where were you before the class and if/how the project advanced my knowledge</w:t>
       </w:r>
     </w:p>
@@ -1412,19 +1497,19 @@
           <w:sz w:val="32"/>
           <w:szCs w:val="32"/>
         </w:rPr>
+        <w:t>Limitations</w:t>
+      </w:r>
+    </w:p>
+    <w:p>
+      <w:pPr>
+        <w:pStyle w:val="ListParagraph"/>
+        <w:numPr>
+          <w:ilvl w:val="0"/>
+          <w:numId w:val="8"/>
+        </w:numPr>
+      </w:pPr>
+      <w:r>
         <w:lastRenderedPageBreak/>
-        <w:t>Limitations</w:t>
-      </w:r>
-    </w:p>
-    <w:p>
-      <w:pPr>
-        <w:pStyle w:val="ListParagraph"/>
-        <w:numPr>
-          <w:ilvl w:val="0"/>
-          <w:numId w:val="8"/>
-        </w:numPr>
-      </w:pPr>
-      <w:r>
         <w:t>Describe any parts of project that might be wrong, incomplete, or otherwise lacking</w:t>
       </w:r>
     </w:p>
@@ -1583,7 +1668,6 @@
         </w:numPr>
       </w:pPr>
       <w:r>
-        <w:lastRenderedPageBreak/>
         <w:t>ER Diagram</w:t>
       </w:r>
     </w:p>
@@ -1611,6 +1695,7 @@
         </w:numPr>
       </w:pPr>
       <w:r>
+        <w:lastRenderedPageBreak/>
         <w:t>Better normalization of schema based on multiple data sources</w:t>
       </w:r>
     </w:p>
@@ -1793,7 +1878,7 @@
       <w:r>
         <w:t xml:space="preserve"> (</w:t>
       </w:r>
-      <w:hyperlink r:id="rId24" w:tgtFrame="_blank" w:history="1">
+      <w:hyperlink r:id="rId26" w:tgtFrame="_blank" w:history="1">
         <w:r>
           <w:rPr>
             <w:rStyle w:val="Hyperlink"/>
@@ -1822,7 +1907,7 @@
       <w:r>
         <w:t xml:space="preserve"> (</w:t>
       </w:r>
-      <w:hyperlink r:id="rId25" w:tgtFrame="_blank" w:history="1">
+      <w:hyperlink r:id="rId27" w:tgtFrame="_blank" w:history="1">
         <w:r>
           <w:rPr>
             <w:rStyle w:val="Hyperlink"/>
@@ -1851,7 +1936,7 @@
       <w:r>
         <w:t xml:space="preserve"> (</w:t>
       </w:r>
-      <w:hyperlink r:id="rId26" w:tgtFrame="_blank" w:history="1">
+      <w:hyperlink r:id="rId28" w:tgtFrame="_blank" w:history="1">
         <w:r>
           <w:rPr>
             <w:rStyle w:val="Hyperlink"/>
@@ -2193,7 +2278,7 @@
     </w:p>
     <w:p/>
     <w:sectPr>
-      <w:headerReference w:type="default" r:id="rId27"/>
+      <w:headerReference w:type="default" r:id="rId29"/>
       <w:pgSz w:w="12240" w:h="15840"/>
       <w:pgMar w:top="1440" w:right="1440" w:bottom="1440" w:left="1440" w:header="720" w:footer="720" w:gutter="0"/>
       <w:cols w:space="720"/>

</xml_diff>

<commit_message>
progress on word doc
</commit_message>
<xml_diff>
--- a/GIS-Data-Migration-Project/Assignment Documents/Final Project - Part 2 - Final Project Rough Draft.docx
+++ b/GIS-Data-Migration-Project/Assignment Documents/Final Project - Part 2 - Final Project Rough Draft.docx
@@ -66,7 +66,15 @@
     </w:p>
     <w:p>
       <w:r>
-        <w:t xml:space="preserve">Other than creating a great data layer for this web project that I want to build out I also chose this project because I love being outdoors, but find it hard at times to find any good source that tracks and manages information about state and national parks in one place. For example, here in Minnesota, if you want to explore Minnesota </w:t>
+        <w:t xml:space="preserve">Other than creating a great data layer for this web project that I want to build out I also chose this project because I love being </w:t>
+      </w:r>
+      <w:proofErr w:type="gramStart"/>
+      <w:r>
+        <w:t>outdoors, but</w:t>
+      </w:r>
+      <w:proofErr w:type="gramEnd"/>
+      <w:r>
+        <w:t xml:space="preserve"> find it hard at times to find any good source that tracks and manages information about state and national parks in one place. For example, here in Minnesota, if you want to explore Minnesota </w:t>
       </w:r>
       <w:r>
         <w:t xml:space="preserve">you may start with the MN DNR State parks website which is great for those who want to step out of the city for a weekend. However, what about wanting to learn more about the state’s state and national forests, national park managed properties, or even county parks? All managed and shared through different websites. Google is sub-par for collecting this information into one place, but I as well as others I have talked to agree that Google isn’t a solve-all solution. </w:t>
@@ -79,7 +87,39 @@
     </w:p>
     <w:p>
       <w:r>
-        <w:t xml:space="preserve">For minimal goals within this project, I’m focusing on developing just the data layer for this application focusing on the management of how to collect data from multiple sources and funneling them into one normalized source. The technologies that I chose to work with in this project include Python for scripting and DuckDB for managing the data. The final outcome goal minimally is to have a final normalized database schema that contains a number of tables that relationally manage the data that I have collected from multiple </w:t>
+        <w:t xml:space="preserve">For minimal goals within this project, I’m focusing on developing just the data layer for this application focusing on the management of how to collect data from multiple sources and funneling them into one normalized source. The technologies that I chose to work with in this project include Python for scripting and </w:t>
+      </w:r>
+      <w:proofErr w:type="spellStart"/>
+      <w:r>
+        <w:t>DuckDB</w:t>
+      </w:r>
+      <w:proofErr w:type="spellEnd"/>
+      <w:r>
+        <w:t xml:space="preserve"> for managing the data. The </w:t>
+      </w:r>
+      <w:proofErr w:type="gramStart"/>
+      <w:r>
+        <w:t>final outcome</w:t>
+      </w:r>
+      <w:proofErr w:type="gramEnd"/>
+      <w:r>
+        <w:t xml:space="preserve"> goal minimally is to have a final normalized database schema that contains </w:t>
+      </w:r>
+      <w:proofErr w:type="gramStart"/>
+      <w:r>
+        <w:t>a number of</w:t>
+      </w:r>
+      <w:proofErr w:type="gramEnd"/>
+      <w:r>
+        <w:t xml:space="preserve"> tables </w:t>
+      </w:r>
+      <w:proofErr w:type="gramStart"/>
+      <w:r>
+        <w:t>that relationally</w:t>
+      </w:r>
+      <w:proofErr w:type="gramEnd"/>
+      <w:r>
+        <w:t xml:space="preserve"> manage the data that I have collected from multiple </w:t>
       </w:r>
       <w:r>
         <w:lastRenderedPageBreak/>
@@ -88,7 +128,15 @@
     </w:p>
     <w:p>
       <w:r>
-        <w:t xml:space="preserve">For my optimistic goals for this project is to create a mini demo web application where the DuckDB data is migrated to a PostgreSQL database that utilizes a database plugin called POSTGIS which is a PostgreSQL extension for </w:t>
+        <w:t xml:space="preserve">For my optimistic goals for this project is to create a mini demo web application where the </w:t>
+      </w:r>
+      <w:proofErr w:type="spellStart"/>
+      <w:r>
+        <w:t>DuckDB</w:t>
+      </w:r>
+      <w:proofErr w:type="spellEnd"/>
+      <w:r>
+        <w:t xml:space="preserve"> data is migrated to a PostgreSQL database that utilizes a database plugin called POSTGIS which is a PostgreSQL extension for </w:t>
       </w:r>
       <w:r>
         <w:t xml:space="preserve">geospatial data. For the frontend, this application would utilize React where it would be a mapping UI that may end up looking like Google maps after I’m finished. As for the backend, as we discussed in class data doesn’t come directly from the database but generally for security reasons served from an API layer. This API layer would be simple in nature where it is taking the data from the database and passing it off to the front end. This API layer would be built using Django and Python. </w:t>
@@ -181,13 +229,41 @@
         <w:rPr>
           <w:strike/>
         </w:rPr>
-        <w:t xml:space="preserve">The general topic focuses on my goal to create a strong and flexible data layer for my explore more project. Specifically utilizing two different kinds of databases to successfully collect and pull information </w:t>
-      </w:r>
-      <w:r>
-        <w:rPr>
-          <w:strike/>
-        </w:rPr>
-        <w:t xml:space="preserve">from multiple sources to represent locations focused around State Parks, National Parks, State Recreational Areas, and more. </w:t>
+        <w:t xml:space="preserve">The general topic focuses on my goal to create a strong and flexible data layer for </w:t>
+      </w:r>
+      <w:proofErr w:type="gramStart"/>
+      <w:r>
+        <w:rPr>
+          <w:strike/>
+        </w:rPr>
+        <w:t>my</w:t>
+      </w:r>
+      <w:proofErr w:type="gramEnd"/>
+      <w:r>
+        <w:rPr>
+          <w:strike/>
+        </w:rPr>
+        <w:t xml:space="preserve"> explore more project. Specifically utilizing two different kinds of databases to successfully collect and pull information </w:t>
+      </w:r>
+      <w:r>
+        <w:rPr>
+          <w:strike/>
+        </w:rPr>
+        <w:t xml:space="preserve">from multiple sources to represent locations focused </w:t>
+      </w:r>
+      <w:proofErr w:type="gramStart"/>
+      <w:r>
+        <w:rPr>
+          <w:strike/>
+        </w:rPr>
+        <w:t>around</w:t>
+      </w:r>
+      <w:proofErr w:type="gramEnd"/>
+      <w:r>
+        <w:rPr>
+          <w:strike/>
+        </w:rPr>
+        <w:t xml:space="preserve"> State Parks, National Parks, State Recreational Areas, and more. </w:t>
       </w:r>
     </w:p>
     <w:p>
@@ -205,7 +281,21 @@
         <w:rPr>
           <w:strike/>
         </w:rPr>
-        <w:t>Gives a brief summary of the project</w:t>
+        <w:t xml:space="preserve">Gives </w:t>
+      </w:r>
+      <w:proofErr w:type="gramStart"/>
+      <w:r>
+        <w:rPr>
+          <w:strike/>
+        </w:rPr>
+        <w:t>a brief summary</w:t>
+      </w:r>
+      <w:proofErr w:type="gramEnd"/>
+      <w:r>
+        <w:rPr>
+          <w:strike/>
+        </w:rPr>
+        <w:t xml:space="preserve"> of the project</w:t>
       </w:r>
     </w:p>
     <w:p>
@@ -223,7 +313,35 @@
         <w:rPr>
           <w:strike/>
         </w:rPr>
-        <w:t>Summary of project: This project focuses on establishing a flexible but still structured schema for the data layer in my explore more project. Previously I have done some UI work on this project to have additional experience noted on my resume, but now I want to see this project all the way through.</w:t>
+        <w:t xml:space="preserve">Summary of project: This project focuses on establishing a flexible but still structured schema for the data layer in </w:t>
+      </w:r>
+      <w:proofErr w:type="gramStart"/>
+      <w:r>
+        <w:rPr>
+          <w:strike/>
+        </w:rPr>
+        <w:t>my</w:t>
+      </w:r>
+      <w:proofErr w:type="gramEnd"/>
+      <w:r>
+        <w:rPr>
+          <w:strike/>
+        </w:rPr>
+        <w:t xml:space="preserve"> explore more project. Previously I </w:t>
+      </w:r>
+      <w:proofErr w:type="gramStart"/>
+      <w:r>
+        <w:rPr>
+          <w:strike/>
+        </w:rPr>
+        <w:t>have</w:t>
+      </w:r>
+      <w:proofErr w:type="gramEnd"/>
+      <w:r>
+        <w:rPr>
+          <w:strike/>
+        </w:rPr>
+        <w:t xml:space="preserve"> done some UI work on this project to have additional experience noted on my resume, but now I want to see this project all the way through.</w:t>
       </w:r>
     </w:p>
     <w:p>
@@ -266,7 +384,49 @@
           <w:strike/>
         </w:rPr>
         <w:lastRenderedPageBreak/>
-        <w:t xml:space="preserve">difficult at times to find comprehensive information on some of these places. I go to google, but then I find I’m visiting multiple different websites to try to find a very seemingly simple answer. This and if I want to plan a fun day or weekend trip somewhere sometimes it would be nice to have the ability to choose a place in Minnesota and see what state and national parks are in the area. Google does a sub bar job with this, but I want to create a tool/website where this works even better and as I visit more and more of these state parks I can collect even more information about these places and have a better tool that others can hopefully take advantage of. </w:t>
+        <w:t xml:space="preserve">difficult at times to find comprehensive information on some of these places. I go to google, but then I find I’m visiting multiple different websites to try to find a very seemingly simple answer. This and if I want to plan a fun day or weekend trip </w:t>
+      </w:r>
+      <w:proofErr w:type="gramStart"/>
+      <w:r>
+        <w:rPr>
+          <w:strike/>
+        </w:rPr>
+        <w:t>somewhere</w:t>
+      </w:r>
+      <w:proofErr w:type="gramEnd"/>
+      <w:r>
+        <w:rPr>
+          <w:strike/>
+        </w:rPr>
+        <w:t xml:space="preserve"> sometimes it would be nice to have the ability to choose a place in Minnesota and see what state and national parks are in the area. Google does a sub bar job with this, but I want to create a tool/website where this works even better and as I visit </w:t>
+      </w:r>
+      <w:proofErr w:type="gramStart"/>
+      <w:r>
+        <w:rPr>
+          <w:strike/>
+        </w:rPr>
+        <w:t>more and more</w:t>
+      </w:r>
+      <w:proofErr w:type="gramEnd"/>
+      <w:r>
+        <w:rPr>
+          <w:strike/>
+        </w:rPr>
+        <w:t xml:space="preserve"> of these state </w:t>
+      </w:r>
+      <w:proofErr w:type="gramStart"/>
+      <w:r>
+        <w:rPr>
+          <w:strike/>
+        </w:rPr>
+        <w:t>parks</w:t>
+      </w:r>
+      <w:proofErr w:type="gramEnd"/>
+      <w:r>
+        <w:rPr>
+          <w:strike/>
+        </w:rPr>
+        <w:t xml:space="preserve"> I can collect even more information about these places and have a better tool that others can hopefully take advantage of. </w:t>
       </w:r>
     </w:p>
     <w:p>
@@ -330,10 +490,42 @@
         <w:t xml:space="preserve">Prior to this course, I did have some experience with databases. Not only did I take a undergraduate database course during my time at St. Thomas, but I also have interacted with databases at work </w:t>
       </w:r>
       <w:r>
-        <w:t>in the role as a application user according to our textbook where</w:t>
-      </w:r>
-      <w:r>
-        <w:t xml:space="preserve"> I’m mainly writing SELECT and sometimes UPDATE or ALTER TABLE queries to help in managing the database to fix bugs that come up during application use. Also during my job hunt after graduation from St. Thomas I did some personal projects that allowed me to work and experiment with different kinds of databases including sqllite, PostgreSQL, and Microsoft SQL. However, where I lack in my database experience is additional practice in database administration as well as </w:t>
+        <w:t xml:space="preserve">in the role as </w:t>
+      </w:r>
+      <w:proofErr w:type="spellStart"/>
+      <w:r>
+        <w:t>a</w:t>
+      </w:r>
+      <w:proofErr w:type="spellEnd"/>
+      <w:r>
+        <w:t xml:space="preserve"> application user according to our textbook where</w:t>
+      </w:r>
+      <w:r>
+        <w:t xml:space="preserve"> I’m mainly writing SELECT and sometimes UPDATE or ALTER TABLE queries to help in managing the database to fix bugs that come up during application use. Also during my job hunt after graduation from </w:t>
+      </w:r>
+      <w:proofErr w:type="gramStart"/>
+      <w:r>
+        <w:t>St. Thomas</w:t>
+      </w:r>
+      <w:proofErr w:type="gramEnd"/>
+      <w:r>
+        <w:t xml:space="preserve"> I did some personal projects that allowed me to work and experiment with different kinds of databases including </w:t>
+      </w:r>
+      <w:proofErr w:type="spellStart"/>
+      <w:r>
+        <w:t>sqllite</w:t>
+      </w:r>
+      <w:proofErr w:type="spellEnd"/>
+      <w:r>
+        <w:t xml:space="preserve">, PostgreSQL, and Microsoft SQL. However, where I </w:t>
+      </w:r>
+      <w:proofErr w:type="gramStart"/>
+      <w:r>
+        <w:t>lack in</w:t>
+      </w:r>
+      <w:proofErr w:type="gramEnd"/>
+      <w:r>
+        <w:t xml:space="preserve"> my database experience is additional practice in database administration as well as </w:t>
       </w:r>
       <w:r>
         <w:t xml:space="preserve">data normalization techniques which is what brings me to this class. </w:t>
@@ -341,14 +533,114 @@
     </w:p>
     <w:p>
       <w:r>
-        <w:t xml:space="preserve">As for initial topics, there were a few that I was mulling over. The first was creating a good data layer that can be utilized by any kind of application be it mobile or web in nature. Other topics that I was considering included doing research on the differences between different databases. The idea I was thinking of was comparing a analytical focused database to a application focused database (such as comparing PostgreSQL and Duckdb) and the pros and cons to each. One other idea that would be to determine a good pipeline process that could be established when migrating data from one system to another. This comes from me learning about how when companies move from one system to another (think some smaller CRM system to another like Salesforce) a lot of the time, the organization wants to </w:t>
+        <w:t xml:space="preserve">As for initial topics, there were a few that I was mulling over. The first was creating a good data layer that can be utilized by any kind of application be it mobile or web in nature. Other topics that I was considering included doing research on the differences between different databases. The idea I was thinking of was comparing </w:t>
+      </w:r>
+      <w:proofErr w:type="spellStart"/>
+      <w:proofErr w:type="gramStart"/>
+      <w:r>
+        <w:t>a</w:t>
+      </w:r>
+      <w:proofErr w:type="spellEnd"/>
+      <w:proofErr w:type="gramEnd"/>
+      <w:r>
+        <w:t xml:space="preserve"> analytical focused database to </w:t>
+      </w:r>
+      <w:proofErr w:type="spellStart"/>
+      <w:proofErr w:type="gramStart"/>
+      <w:r>
+        <w:t>a</w:t>
+      </w:r>
+      <w:proofErr w:type="spellEnd"/>
+      <w:proofErr w:type="gramEnd"/>
+      <w:r>
+        <w:t xml:space="preserve"> application focused database (such as comparing PostgreSQL and </w:t>
+      </w:r>
+      <w:proofErr w:type="spellStart"/>
+      <w:r>
+        <w:t>Duckdb</w:t>
+      </w:r>
+      <w:proofErr w:type="spellEnd"/>
+      <w:r>
+        <w:t xml:space="preserve">) and the pros and cons to each. One other </w:t>
+      </w:r>
+      <w:proofErr w:type="gramStart"/>
+      <w:r>
+        <w:t>idea that</w:t>
+      </w:r>
+      <w:proofErr w:type="gramEnd"/>
+      <w:r>
+        <w:t xml:space="preserve"> would be to determine a good pipeline process that could be established when migrating data from one system to another. This comes from me learning about how when companies move from one system to another (think some smaller CRM system to another like Salesforce) a lot of the time, the organization wants to </w:t>
       </w:r>
       <w:r>
         <w:lastRenderedPageBreak/>
         <w:t xml:space="preserve">migrate their data over. However, I have heard on more than one occasion that </w:t>
       </w:r>
       <w:r>
-        <w:t>this process isn’t always the smoothest and sometimes cause the organization that wanted to migrate their data over to quit and just say with the system they are only sub-content with. All these being good ideas in themselves, I decided to do a project that encompassed a portion of each of these projects in themselves. As I reviewed and researched each idea, I noticed there were certain aspects of each of these projects that interested me and I believed based on my experience that each were too specific to be a good final project that I would actually learn a lot from. Therefore, I decided to encompass aspects from each where the core of the project is building a good data layer for any application to use, creating a data normalization step to simulate the need to normalize and reshape data from other sources into one, and if I have enough time to complete my optimistic plans be able to highlight a little between the differences between DuckDb being more of a analytical database vs PostgreSQL which is moreso a application production database (although it can still be used for analytic and other uses).</w:t>
+        <w:t xml:space="preserve">this process isn’t always the smoothest and sometimes </w:t>
+      </w:r>
+      <w:proofErr w:type="gramStart"/>
+      <w:r>
+        <w:t>cause</w:t>
+      </w:r>
+      <w:proofErr w:type="gramEnd"/>
+      <w:r>
+        <w:t xml:space="preserve"> the organization that wanted to migrate their data over to quit and just say with the system they are only sub-content with. All </w:t>
+      </w:r>
+      <w:proofErr w:type="gramStart"/>
+      <w:r>
+        <w:t>these being</w:t>
+      </w:r>
+      <w:proofErr w:type="gramEnd"/>
+      <w:r>
+        <w:t xml:space="preserve"> good ideas in themselves, I decided to do a project that encompassed a portion of each of these projects in themselves. As I reviewed and researched each idea, I noticed there were certain aspects of each of these projects that interested me and I believed based on my experience that each </w:t>
+      </w:r>
+      <w:proofErr w:type="gramStart"/>
+      <w:r>
+        <w:t>were</w:t>
+      </w:r>
+      <w:proofErr w:type="gramEnd"/>
+      <w:r>
+        <w:t xml:space="preserve"> too specific to be a good final project that I would </w:t>
+      </w:r>
+      <w:proofErr w:type="gramStart"/>
+      <w:r>
+        <w:t>actually learn</w:t>
+      </w:r>
+      <w:proofErr w:type="gramEnd"/>
+      <w:r>
+        <w:t xml:space="preserve"> a lot from. Therefore, I decided to encompass aspects from each where the core of the project is building a good data layer for any application to use, creating a data normalization step to simulate the need to normalize and reshape data from other sources into one, and if I have enough time to complete my optimistic plans be able to highlight a little between the differences between </w:t>
+      </w:r>
+      <w:proofErr w:type="spellStart"/>
+      <w:r>
+        <w:t>DuckDb</w:t>
+      </w:r>
+      <w:proofErr w:type="spellEnd"/>
+      <w:r>
+        <w:t xml:space="preserve"> being more of </w:t>
+      </w:r>
+      <w:proofErr w:type="spellStart"/>
+      <w:r>
+        <w:t>a</w:t>
+      </w:r>
+      <w:proofErr w:type="spellEnd"/>
+      <w:r>
+        <w:t xml:space="preserve"> analytical database vs PostgreSQL which is </w:t>
+      </w:r>
+      <w:proofErr w:type="spellStart"/>
+      <w:r>
+        <w:t>moreso</w:t>
+      </w:r>
+      <w:proofErr w:type="spellEnd"/>
+      <w:r>
+        <w:t xml:space="preserve"> </w:t>
+      </w:r>
+      <w:proofErr w:type="spellStart"/>
+      <w:r>
+        <w:t>a</w:t>
+      </w:r>
+      <w:proofErr w:type="spellEnd"/>
+      <w:r>
+        <w:t xml:space="preserve"> application production database (although it can still be used for analytic and other uses).</w:t>
       </w:r>
     </w:p>
     <w:p>
@@ -356,7 +648,15 @@
         <w:t xml:space="preserve">When it comes to my sources while researching, </w:t>
       </w:r>
       <w:r>
-        <w:t xml:space="preserve">most was influenced by things I have heard and learned while talking to others at work and with family &amp; friends. However, to be sure, I also found a few resources that backed what I have learned from others. First for example, when it comes to data migrations between systems, I stumbled upon this article that warns individuals about all the things to be careful about when considering of moving data between different systems: </w:t>
+        <w:t xml:space="preserve">most </w:t>
+      </w:r>
+      <w:proofErr w:type="gramStart"/>
+      <w:r>
+        <w:t>was</w:t>
+      </w:r>
+      <w:proofErr w:type="gramEnd"/>
+      <w:r>
+        <w:t xml:space="preserve"> influenced by things I have heard and learned while talking to others at work and with family &amp; friends. However, to be sure, I also found a few resources that backed what I have learned from others. First for example, when it comes to data migrations between systems, I stumbled upon this article that warns individuals about all the things to be careful about when considering of moving data between different systems: </w:t>
       </w:r>
       <w:hyperlink r:id="rId7" w:history="1">
         <w:r>
@@ -389,7 +689,23 @@
         </w:r>
       </w:hyperlink>
       <w:r>
-        <w:t xml:space="preserve">) and the user interface reminds me of something from the early 2000s. As for the choice in databases, it comes from my curiosity comes from prior experience with learning about both of them minimally, but here are a few articles that go into more detail about what piqued my interest in both: </w:t>
+        <w:t xml:space="preserve">) and the user interface reminds me of something from the early 2000s. As for the choice </w:t>
+      </w:r>
+      <w:proofErr w:type="gramStart"/>
+      <w:r>
+        <w:t>in</w:t>
+      </w:r>
+      <w:proofErr w:type="gramEnd"/>
+      <w:r>
+        <w:t xml:space="preserve"> databases, it comes from my curiosity comes from prior experience with learning about </w:t>
+      </w:r>
+      <w:proofErr w:type="gramStart"/>
+      <w:r>
+        <w:t>both of them</w:t>
+      </w:r>
+      <w:proofErr w:type="gramEnd"/>
+      <w:r>
+        <w:t xml:space="preserve"> minimally, but here are a few articles that go into more detail about what piqued my interest in both: </w:t>
       </w:r>
     </w:p>
     <w:p>
@@ -471,7 +787,21 @@
         <w:rPr>
           <w:strike/>
         </w:rPr>
-        <w:t xml:space="preserve"> – focus on noting different topics in which I could have focused on for my explore more project</w:t>
+        <w:t xml:space="preserve"> – focus on noting different topics in which I could have focused on for </w:t>
+      </w:r>
+      <w:proofErr w:type="gramStart"/>
+      <w:r>
+        <w:rPr>
+          <w:strike/>
+        </w:rPr>
+        <w:t>my</w:t>
+      </w:r>
+      <w:proofErr w:type="gramEnd"/>
+      <w:r>
+        <w:rPr>
+          <w:strike/>
+        </w:rPr>
+        <w:t xml:space="preserve"> explore more project</w:t>
       </w:r>
     </w:p>
     <w:p>
@@ -532,13 +862,41 @@
         <w:rPr>
           <w:strike/>
         </w:rPr>
-        <w:t xml:space="preserve"> I also had some university experience with SQLLite in my web development course. </w:t>
-      </w:r>
-      <w:r>
-        <w:rPr>
-          <w:strike/>
-        </w:rPr>
-        <w:t xml:space="preserve">After I graduated I experimented with some different databases during my job hunt including PostgreSQL, and Microsoft SQL. In the software development role that I have now, I work within my organization’s Microsoft SQL based database almost weekly mainly focused on </w:t>
+        <w:t xml:space="preserve"> I also had some university experience with </w:t>
+      </w:r>
+      <w:proofErr w:type="spellStart"/>
+      <w:r>
+        <w:rPr>
+          <w:strike/>
+        </w:rPr>
+        <w:t>SQLLite</w:t>
+      </w:r>
+      <w:proofErr w:type="spellEnd"/>
+      <w:r>
+        <w:rPr>
+          <w:strike/>
+        </w:rPr>
+        <w:t xml:space="preserve"> in my web development course. </w:t>
+      </w:r>
+      <w:r>
+        <w:rPr>
+          <w:strike/>
+        </w:rPr>
+        <w:t xml:space="preserve">After I </w:t>
+      </w:r>
+      <w:proofErr w:type="gramStart"/>
+      <w:r>
+        <w:rPr>
+          <w:strike/>
+        </w:rPr>
+        <w:t>graduated</w:t>
+      </w:r>
+      <w:proofErr w:type="gramEnd"/>
+      <w:r>
+        <w:rPr>
+          <w:strike/>
+        </w:rPr>
+        <w:t xml:space="preserve"> I experimented with some different databases during my job hunt including PostgreSQL, and Microsoft SQL. In the software development role that I have now, I work within my organization’s Microsoft SQL based database almost weekly mainly focused on </w:t>
       </w:r>
       <w:r>
         <w:rPr>
@@ -580,7 +938,35 @@
         <w:rPr>
           <w:strike/>
         </w:rPr>
-        <w:t>Create a database to track and manage Disney property entities like attractions, restaurants, etc… -- would have been a comprehensive database to help track all of my Disney knowledge and interests throughout the years</w:t>
+        <w:t xml:space="preserve">Create a database to track and manage Disney property entities like attractions, restaurants, </w:t>
+      </w:r>
+      <w:proofErr w:type="spellStart"/>
+      <w:r>
+        <w:rPr>
+          <w:strike/>
+        </w:rPr>
+        <w:t>etc</w:t>
+      </w:r>
+      <w:proofErr w:type="spellEnd"/>
+      <w:r>
+        <w:rPr>
+          <w:strike/>
+        </w:rPr>
+        <w:t xml:space="preserve">… -- would have been a comprehensive database to help track </w:t>
+      </w:r>
+      <w:proofErr w:type="gramStart"/>
+      <w:r>
+        <w:rPr>
+          <w:strike/>
+        </w:rPr>
+        <w:t>all of</w:t>
+      </w:r>
+      <w:proofErr w:type="gramEnd"/>
+      <w:r>
+        <w:rPr>
+          <w:strike/>
+        </w:rPr>
+        <w:t xml:space="preserve"> my Disney knowledge and interests throughout the years</w:t>
       </w:r>
     </w:p>
     <w:p>
@@ -598,7 +984,49 @@
         <w:rPr>
           <w:strike/>
         </w:rPr>
-        <w:t>Create the data layer for a tool that could help developers better document and understand their databases. Similar to how one can make comments to describe columns in detail in Postgres, but a tool that would allow developers do this with some of the most used databases (Oracle, Microsoft SQL, SQL Lite, etc…)</w:t>
+        <w:t xml:space="preserve">Create the data layer </w:t>
+      </w:r>
+      <w:proofErr w:type="gramStart"/>
+      <w:r>
+        <w:rPr>
+          <w:strike/>
+        </w:rPr>
+        <w:t>for</w:t>
+      </w:r>
+      <w:proofErr w:type="gramEnd"/>
+      <w:r>
+        <w:rPr>
+          <w:strike/>
+        </w:rPr>
+        <w:t xml:space="preserve"> a tool that could help developers better document and understand their databases. </w:t>
+      </w:r>
+      <w:proofErr w:type="gramStart"/>
+      <w:r>
+        <w:rPr>
+          <w:strike/>
+        </w:rPr>
+        <w:t>Similar to</w:t>
+      </w:r>
+      <w:proofErr w:type="gramEnd"/>
+      <w:r>
+        <w:rPr>
+          <w:strike/>
+        </w:rPr>
+        <w:t xml:space="preserve"> how one can make comments to describe columns in detail in Postgres, but a tool that would allow developers do this with some of the most used databases (Oracle, Microsoft SQL, SQL Lite, </w:t>
+      </w:r>
+      <w:proofErr w:type="spellStart"/>
+      <w:r>
+        <w:rPr>
+          <w:strike/>
+        </w:rPr>
+        <w:t>etc</w:t>
+      </w:r>
+      <w:proofErr w:type="spellEnd"/>
+      <w:r>
+        <w:rPr>
+          <w:strike/>
+        </w:rPr>
+        <w:t>…)</w:t>
       </w:r>
     </w:p>
     <w:p>
@@ -616,14 +1044,72 @@
         <w:rPr>
           <w:strike/>
         </w:rPr>
-        <w:t xml:space="preserve">Create the data layer for a tool that would allow an organization to setup branches that are managed by a parent organization. I was thinking kindof </w:t>
+        <w:t xml:space="preserve">Create the data layer for a tool that would allow an organization to </w:t>
+      </w:r>
+      <w:proofErr w:type="gramStart"/>
+      <w:r>
+        <w:rPr>
+          <w:strike/>
+        </w:rPr>
+        <w:t>setup</w:t>
+      </w:r>
+      <w:proofErr w:type="gramEnd"/>
+      <w:r>
+        <w:rPr>
+          <w:strike/>
+        </w:rPr>
+        <w:t xml:space="preserve"> branches that are managed by a parent organization. I was thinking </w:t>
+      </w:r>
+      <w:proofErr w:type="spellStart"/>
+      <w:proofErr w:type="gramStart"/>
+      <w:r>
+        <w:rPr>
+          <w:strike/>
+        </w:rPr>
+        <w:t>kindof</w:t>
+      </w:r>
+      <w:proofErr w:type="spellEnd"/>
+      <w:proofErr w:type="gramEnd"/>
+      <w:r>
+        <w:rPr>
+          <w:strike/>
+        </w:rPr>
+        <w:t xml:space="preserve"> </w:t>
       </w:r>
       <w:r>
         <w:rPr>
           <w:strike/>
         </w:rPr>
         <w:lastRenderedPageBreak/>
-        <w:t>like bank branches being managed by a region branch which is then managed by a parent organization. (Didn’t go this direction as the map tool I felt was something I would be more interested in as well as have an opportunity to add more entities to the project)</w:t>
+        <w:t xml:space="preserve">like bank branches being managed by a region branch which is then managed by a parent organization. (Didn’t </w:t>
+      </w:r>
+      <w:proofErr w:type="gramStart"/>
+      <w:r>
+        <w:rPr>
+          <w:strike/>
+        </w:rPr>
+        <w:t>go</w:t>
+      </w:r>
+      <w:proofErr w:type="gramEnd"/>
+      <w:r>
+        <w:rPr>
+          <w:strike/>
+        </w:rPr>
+        <w:t xml:space="preserve"> this direction as the map tool I felt was something I would be more interested in as well as </w:t>
+      </w:r>
+      <w:proofErr w:type="gramStart"/>
+      <w:r>
+        <w:rPr>
+          <w:strike/>
+        </w:rPr>
+        <w:t>have</w:t>
+      </w:r>
+      <w:proofErr w:type="gramEnd"/>
+      <w:r>
+        <w:rPr>
+          <w:strike/>
+        </w:rPr>
+        <w:t xml:space="preserve"> an opportunity to add more entities to the project)</w:t>
       </w:r>
     </w:p>
     <w:p>
@@ -792,15 +1278,69 @@
     </w:p>
     <w:p>
       <w:r>
-        <w:t>What was built for this project was the beginning of a comprehensive data processing pipeline that focuses on collecting and combining data from multiple different sources into one that can be used for some sort of application that is developed either it be a website or a mobile app. The minimal viable goal of this project was to create this pipeline and be able to present some created views and queries that would show the real data that was collected and normalized. If time allows, the optimistic goal was to create a demo web based application with React and Django/Python to be able to present the collected and managed data in a more clear and easy to view/present manner.</w:t>
-      </w:r>
-    </w:p>
-    <w:p>
-      <w:r>
-        <w:t xml:space="preserve">Before I go into detail as to what was built, I first wanted to outline the data sources that I used for this project. There were five sources in total that I discovered and used for this project. The first was the National Park Service API that anyone has access to. This API allows anyone (up to 1,000 API requests a day) to be able to retrieve and use data collected by the US’s National Park Service about all national park managed lands throughout the United States. The second source was Google Places API. It is accessible through the Google Cloud and there are up to 1,000 free requests </w:t>
-      </w:r>
-      <w:r>
-        <w:t xml:space="preserve">for the API every month. The third source is from MN Geospatial Commons website managed by the state of Minnesota. There are many different kinds of data sources managed on the website and updated regularly, however, the one that I’m using with this project is a it’s State Parks, Recreation </w:t>
+        <w:t xml:space="preserve">What was built for this project was the beginning of a comprehensive data processing pipeline that focuses on collecting and combining data from multiple different sources into one that can be used for some sort of application that is developed </w:t>
+      </w:r>
+      <w:proofErr w:type="gramStart"/>
+      <w:r>
+        <w:t>either it</w:t>
+      </w:r>
+      <w:proofErr w:type="gramEnd"/>
+      <w:r>
+        <w:t xml:space="preserve"> </w:t>
+      </w:r>
+      <w:proofErr w:type="gramStart"/>
+      <w:r>
+        <w:t>be</w:t>
+      </w:r>
+      <w:proofErr w:type="gramEnd"/>
+      <w:r>
+        <w:t xml:space="preserve"> a website or a mobile app. The minimal viable goal of this project was to create this pipeline and be able to present some created views and queries that would show the real data that was collected and normalized. If time allows, the optimistic goal was to create a demo </w:t>
+      </w:r>
+      <w:proofErr w:type="gramStart"/>
+      <w:r>
+        <w:t>web based</w:t>
+      </w:r>
+      <w:proofErr w:type="gramEnd"/>
+      <w:r>
+        <w:t xml:space="preserve"> application with React and Django/Python to be able to present the collected and managed data in a </w:t>
+      </w:r>
+      <w:proofErr w:type="gramStart"/>
+      <w:r>
+        <w:t>more clear and easy</w:t>
+      </w:r>
+      <w:proofErr w:type="gramEnd"/>
+      <w:r>
+        <w:t xml:space="preserve"> to view/present manner.</w:t>
+      </w:r>
+    </w:p>
+    <w:p>
+      <w:r>
+        <w:t xml:space="preserve">Before I go into detail as to what was built, I first wanted to outline the data sources that I used for this project. There were five sources in total that I discovered and used for this project. The first was the National Park Service API that anyone has access to. This API allows anyone (up to 1,000 API requests a day) to be able to retrieve and use data collected by the US’s National Park Service about all national park managed lands throughout the United States. The second source was Google Places API. It is accessible through </w:t>
+      </w:r>
+      <w:proofErr w:type="gramStart"/>
+      <w:r>
+        <w:t>the Google</w:t>
+      </w:r>
+      <w:proofErr w:type="gramEnd"/>
+      <w:r>
+        <w:t xml:space="preserve"> Cloud and there are up to 1,000 free requests </w:t>
+      </w:r>
+      <w:r>
+        <w:t xml:space="preserve">for the API every month. The third source is from MN Geospatial Commons website managed by the state of Minnesota. There are </w:t>
+      </w:r>
+      <w:proofErr w:type="gramStart"/>
+      <w:r>
+        <w:t>many different kinds of</w:t>
+      </w:r>
+      <w:proofErr w:type="gramEnd"/>
+      <w:r>
+        <w:t xml:space="preserve"> data sources managed on the website and updated regularly, however, the one that I’m using with this project is </w:t>
+      </w:r>
+      <w:r>
+        <w:t>the</w:t>
+      </w:r>
+      <w:r>
+        <w:t xml:space="preserve"> State Parks, Recreation </w:t>
       </w:r>
       <w:r>
         <w:lastRenderedPageBreak/>
@@ -810,7 +1350,13 @@
         <w:t>geospatial vector data format for geographic information system (GIS) software</w:t>
       </w:r>
       <w:r>
-        <w:t xml:space="preserve">” (Wikipedia). The fourth source was a little easier to manage file-wise, which was from a website called Recreation.gov. They have a dataset on their website that represents all their managed locations I believe for the entirety of the United States as well when it comes to campgrounds, and forests. This data came in the format of CSV files. The final and hardest data source that I had to deal with was a MN State map that is created and updated every year by the Minnesota DNR. The map simply shows a grid outlining attribute-based information with every State Park and Recreational Area within the State of Minnesota. </w:t>
+        <w:t xml:space="preserve">” (Wikipedia). The fourth source was a little easier to manage file-wise, which was from a website called Recreation.gov. They have a dataset on their website that represents all their managed locations I believe for the entirety of the United States as well when it comes to campgrounds, and </w:t>
+      </w:r>
+      <w:r>
+        <w:t>recreation areas</w:t>
+      </w:r>
+      <w:r>
+        <w:t xml:space="preserve">. This data came in the format of CSV files. The final and hardest data source that I had to deal with was a MN State map that is created and updated every year by the Minnesota DNR. The map simply shows a grid outlining attribute-based information with every State Park and Recreational Area within the State of Minnesota. </w:t>
       </w:r>
     </w:p>
     <w:p>
@@ -873,289 +1419,128 @@
         </w:r>
       </w:hyperlink>
     </w:p>
-    <w:p/>
-    <w:p/>
-    <w:p>
-      <w:pPr>
-        <w:rPr>
-          <w:strike/>
-        </w:rPr>
-      </w:pPr>
-      <w:r>
-        <w:rPr>
-          <w:strike/>
-        </w:rPr>
-        <w:t>Intro outline</w:t>
-      </w:r>
-    </w:p>
-    <w:p>
-      <w:pPr>
-        <w:rPr>
-          <w:strike/>
-        </w:rPr>
-      </w:pPr>
-      <w:r>
-        <w:rPr>
-          <w:strike/>
-        </w:rPr>
-        <w:t>What data I used (real data from multiple sources)</w:t>
-      </w:r>
-    </w:p>
-    <w:p>
-      <w:r>
-        <w:t>Data collection scripts (used Gemini Google AI to help with the Python portion)</w:t>
-      </w:r>
-    </w:p>
-    <w:p>
-      <w:pPr>
-        <w:pStyle w:val="ListParagraph"/>
-        <w:numPr>
-          <w:ilvl w:val="0"/>
-          <w:numId w:val="8"/>
-        </w:numPr>
-      </w:pPr>
-      <w:r>
-        <w:t>Concept from chapter about advanced SQL / DuckDB extensions used throughout project</w:t>
-      </w:r>
-    </w:p>
-    <w:p>
-      <w:r>
-        <w:t>Entity Relation Diagrams</w:t>
-      </w:r>
-    </w:p>
-    <w:p>
-      <w:pPr>
-        <w:pStyle w:val="ListParagraph"/>
-        <w:numPr>
-          <w:ilvl w:val="0"/>
-          <w:numId w:val="8"/>
-        </w:numPr>
-      </w:pPr>
-      <w:r>
-        <w:t>Concept from chapter on data modeling and relational model</w:t>
-      </w:r>
-    </w:p>
-    <w:p>
-      <w:pPr>
-        <w:pStyle w:val="ListParagraph"/>
-        <w:numPr>
-          <w:ilvl w:val="0"/>
-          <w:numId w:val="8"/>
-        </w:numPr>
-      </w:pPr>
-      <w:r>
-        <w:t>Concept from chapter on ER Diagrams</w:t>
-      </w:r>
-    </w:p>
-    <w:p>
-      <w:r>
-        <w:t xml:space="preserve">Normalized Schema created for DuckDB </w:t>
-      </w:r>
-    </w:p>
-    <w:p>
-      <w:pPr>
-        <w:pStyle w:val="ListParagraph"/>
-        <w:numPr>
-          <w:ilvl w:val="0"/>
-          <w:numId w:val="8"/>
-        </w:numPr>
-      </w:pPr>
+    <w:p>
+      <w:r>
+        <w:t xml:space="preserve">After collecting the data, the next step was to get it all imported into a </w:t>
+      </w:r>
+      <w:proofErr w:type="spellStart"/>
+      <w:r>
+        <w:t>DuckDB</w:t>
+      </w:r>
+      <w:proofErr w:type="spellEnd"/>
+      <w:r>
+        <w:t xml:space="preserve"> database for analysis and transformation into the final normalized schema that I’ll discuss in the next paragraph. To get the data into</w:t>
+      </w:r>
+      <w:r>
+        <w:t xml:space="preserve"> a</w:t>
+      </w:r>
+      <w:r>
+        <w:t xml:space="preserve"> </w:t>
+      </w:r>
+      <w:proofErr w:type="spellStart"/>
+      <w:r>
+        <w:t>DuckDB</w:t>
+      </w:r>
+      <w:proofErr w:type="spellEnd"/>
+      <w:r>
+        <w:t xml:space="preserve"> database</w:t>
+      </w:r>
+      <w:r>
+        <w:t xml:space="preserve">, I created </w:t>
+      </w:r>
+      <w:proofErr w:type="gramStart"/>
+      <w:r>
+        <w:t>a number of</w:t>
+      </w:r>
+      <w:proofErr w:type="gramEnd"/>
+      <w:r>
+        <w:t xml:space="preserve"> Python </w:t>
+      </w:r>
+      <w:r>
+        <w:t xml:space="preserve">scripts (one for each source exactly) managed by a single orchestrator script to easily manage the iterative process of testing the script by uploading some information from a data source, reviewing the output, fixing any issues and running the script again. I was able to do so in the orchestrator script by setting flags for each source. When all the scripts worked how I wanted them to, I ran the orchestrator script for all the data to be imported into the </w:t>
+      </w:r>
+      <w:proofErr w:type="spellStart"/>
+      <w:r>
+        <w:t>duckdb</w:t>
+      </w:r>
+      <w:proofErr w:type="spellEnd"/>
+      <w:r>
+        <w:t xml:space="preserve"> database. </w:t>
+      </w:r>
+    </w:p>
+    <w:p>
+      <w:r>
+        <w:t xml:space="preserve">As for the </w:t>
+      </w:r>
+      <w:proofErr w:type="spellStart"/>
+      <w:r>
+        <w:t>duckdb</w:t>
+      </w:r>
+      <w:proofErr w:type="spellEnd"/>
+      <w:r>
+        <w:t xml:space="preserve"> database structure, I needed to determine a way to organize the database tables and views for each source as I was importing the data. I discovered that I could utilize what </w:t>
+      </w:r>
+      <w:proofErr w:type="spellStart"/>
+      <w:r>
+        <w:t>duckdb</w:t>
+      </w:r>
+      <w:proofErr w:type="spellEnd"/>
+      <w:r>
+        <w:t xml:space="preserve"> classifies as a SCHEMA which is a way to organize database objects like tables and views into namespaces. For this project, each </w:t>
+      </w:r>
+      <w:proofErr w:type="spellStart"/>
+      <w:r>
+        <w:t>datasource</w:t>
+      </w:r>
+      <w:proofErr w:type="spellEnd"/>
+      <w:r>
+        <w:t xml:space="preserve"> got their </w:t>
+      </w:r>
       <w:r>
         <w:lastRenderedPageBreak/>
-        <w:t>Concept from chapter on normalization</w:t>
-      </w:r>
-    </w:p>
-    <w:p>
-      <w:pPr>
-        <w:pStyle w:val="ListParagraph"/>
-        <w:numPr>
-          <w:ilvl w:val="1"/>
-          <w:numId w:val="8"/>
-        </w:numPr>
-      </w:pPr>
-      <w:r>
-        <w:t>Highlight the denormalized data somewhat from different sources</w:t>
-      </w:r>
-    </w:p>
-    <w:p>
-      <w:pPr>
-        <w:pStyle w:val="ListParagraph"/>
-        <w:numPr>
-          <w:ilvl w:val="0"/>
-          <w:numId w:val="8"/>
-        </w:numPr>
-      </w:pPr>
-      <w:r>
-        <w:t>Hierarchical query on locations table</w:t>
-      </w:r>
-    </w:p>
-    <w:p>
-      <w:r>
-        <w:t>Database scripts to transform/move the data collected from each source into the final normalized database schema</w:t>
-      </w:r>
-    </w:p>
-    <w:p>
-      <w:pPr>
-        <w:pStyle w:val="ListParagraph"/>
-        <w:numPr>
-          <w:ilvl w:val="1"/>
-          <w:numId w:val="8"/>
-        </w:numPr>
-      </w:pPr>
-      <w:r>
-        <w:t>Queries that I tried to make possible</w:t>
-      </w:r>
-    </w:p>
-    <w:p>
-      <w:pPr>
-        <w:pStyle w:val="ListParagraph"/>
-        <w:numPr>
-          <w:ilvl w:val="0"/>
-          <w:numId w:val="8"/>
-        </w:numPr>
-      </w:pPr>
-      <w:r>
-        <w:t>Concept from chapter about database transactions with Commit and finding error prone data while running the query</w:t>
-      </w:r>
-    </w:p>
-    <w:p>
-      <w:pPr>
-        <w:pStyle w:val="ListParagraph"/>
-        <w:numPr>
-          <w:ilvl w:val="0"/>
-          <w:numId w:val="8"/>
-        </w:numPr>
-      </w:pPr>
-      <w:r>
-        <w:t>Concept from chapter about database views</w:t>
-      </w:r>
-    </w:p>
-    <w:p>
-      <w:r>
-        <w:t>Migration from DuckDB to PostgreSQL database</w:t>
-      </w:r>
-    </w:p>
-    <w:p>
-      <w:r>
-        <w:t>Backend API</w:t>
-      </w:r>
-    </w:p>
-    <w:p>
-      <w:r>
-        <w:t>Frontend</w:t>
-      </w:r>
-    </w:p>
-    <w:p>
-      <w:pPr>
-        <w:pStyle w:val="ListParagraph"/>
-        <w:numPr>
-          <w:ilvl w:val="0"/>
-          <w:numId w:val="8"/>
-        </w:numPr>
-        <w:rPr>
-          <w:strike/>
-        </w:rPr>
-      </w:pPr>
-      <w:r>
-        <w:rPr>
-          <w:strike/>
-        </w:rPr>
-        <w:t>What I did to build the database</w:t>
-      </w:r>
-    </w:p>
-    <w:p>
-      <w:pPr>
-        <w:pStyle w:val="ListParagraph"/>
-        <w:numPr>
-          <w:ilvl w:val="1"/>
-          <w:numId w:val="8"/>
-        </w:numPr>
-        <w:rPr>
-          <w:strike/>
-        </w:rPr>
-      </w:pPr>
-      <w:r>
-        <w:rPr>
-          <w:strike/>
-        </w:rPr>
-        <w:t>What was the design</w:t>
-      </w:r>
-    </w:p>
-    <w:p>
-      <w:pPr>
-        <w:pStyle w:val="ListParagraph"/>
-        <w:numPr>
-          <w:ilvl w:val="2"/>
-          <w:numId w:val="8"/>
-        </w:numPr>
-        <w:rPr>
-          <w:strike/>
-        </w:rPr>
-      </w:pPr>
-      <w:r>
-        <w:rPr>
-          <w:strike/>
-        </w:rPr>
-        <w:t>Design specifics go here including ER Diagram showing relational and logical structures</w:t>
-      </w:r>
-    </w:p>
-    <w:p>
-      <w:pPr>
-        <w:pStyle w:val="ListParagraph"/>
-        <w:numPr>
-          <w:ilvl w:val="1"/>
-          <w:numId w:val="8"/>
-        </w:numPr>
-        <w:rPr>
-          <w:strike/>
-        </w:rPr>
-      </w:pPr>
-      <w:r>
-        <w:rPr>
-          <w:strike/>
-        </w:rPr>
-        <w:t>What data did I use (mock vs external source data vs hand-entered data etc…)</w:t>
-      </w:r>
-    </w:p>
-    <w:p>
-      <w:pPr>
-        <w:pStyle w:val="ListParagraph"/>
-        <w:numPr>
-          <w:ilvl w:val="2"/>
-          <w:numId w:val="8"/>
-        </w:numPr>
-        <w:rPr>
-          <w:strike/>
-        </w:rPr>
-      </w:pPr>
-      <w:r>
-        <w:rPr>
-          <w:strike/>
-        </w:rPr>
-        <w:t>All real data collected from real sources</w:t>
-      </w:r>
-    </w:p>
-    <w:p>
-      <w:pPr>
-        <w:pStyle w:val="ListParagraph"/>
-        <w:numPr>
-          <w:ilvl w:val="1"/>
-          <w:numId w:val="8"/>
-        </w:numPr>
-        <w:rPr>
-          <w:strike/>
-        </w:rPr>
-      </w:pPr>
-      <w:r>
-        <w:rPr>
-          <w:strike/>
-        </w:rPr>
-        <w:t>What types of queries did I try to make possible</w:t>
-      </w:r>
-    </w:p>
-    <w:p>
-      <w:r>
-        <w:t>Logical Model</w:t>
+        <w:t xml:space="preserve">own namespace, which allowed me to easily manage all the tables for all the different data sources easily and efficiently. </w:t>
+      </w:r>
+    </w:p>
+    <w:p>
+      <w:hyperlink r:id="rId22" w:history="1">
+        <w:r>
+          <w:rPr>
+            <w:rStyle w:val="Hyperlink"/>
+          </w:rPr>
+          <w:t>https://motherduck.com/glossary/schema/</w:t>
+        </w:r>
+      </w:hyperlink>
+    </w:p>
+    <w:p>
+      <w:r>
+        <w:t xml:space="preserve">Once all the data was imported and managed under their own schema namespace within the </w:t>
+      </w:r>
+      <w:proofErr w:type="spellStart"/>
+      <w:r>
+        <w:t>duckdb</w:t>
+      </w:r>
+      <w:proofErr w:type="spellEnd"/>
+      <w:r>
+        <w:t xml:space="preserve"> database. My next step was to create a normalized database schema to transform the data from all the sources into. For the matter of working with </w:t>
+      </w:r>
+      <w:proofErr w:type="gramStart"/>
+      <w:r>
+        <w:t>a visual</w:t>
+      </w:r>
+      <w:proofErr w:type="gramEnd"/>
+      <w:r>
+        <w:t xml:space="preserve"> </w:t>
+      </w:r>
+      <w:proofErr w:type="gramStart"/>
+      <w:r>
+        <w:t>software</w:t>
+      </w:r>
+      <w:proofErr w:type="gramEnd"/>
+      <w:r>
+        <w:t xml:space="preserve"> I decided to use Oracle’s SQL Data Modeler tool we have been using throughout this semester to create a comprehensive normalized database </w:t>
+      </w:r>
+      <w:r>
+        <w:t xml:space="preserve">that would manage entities including Locations, Operating Hours, Media, Phone Numbers, Email Addresses, Addresses, and Websites; all with their own type tables. </w:t>
       </w:r>
     </w:p>
     <w:p>
@@ -1163,12 +1548,11 @@
         <w:rPr>
           <w:noProof/>
         </w:rPr>
-        <w:lastRenderedPageBreak/>
         <w:drawing>
-          <wp:inline distT="0" distB="0" distL="0" distR="0" wp14:anchorId="33BAA08F" wp14:editId="0772A51D">
+          <wp:inline distT="0" distB="0" distL="0" distR="0" wp14:anchorId="65A9832A" wp14:editId="4ED8D91D">
             <wp:extent cx="5943600" cy="3592195"/>
             <wp:effectExtent l="0" t="0" r="0" b="8255"/>
-            <wp:docPr id="586225190" name="Picture 1"/>
+            <wp:docPr id="779421568" name="Picture 1"/>
             <wp:cNvGraphicFramePr>
               <a:graphicFrameLocks xmlns:a="http://schemas.openxmlformats.org/drawingml/2006/main" noChangeAspect="1"/>
             </wp:cNvGraphicFramePr>
@@ -1180,7 +1564,7 @@
                     <pic:cNvPicPr/>
                   </pic:nvPicPr>
                   <pic:blipFill>
-                    <a:blip r:embed="rId22"/>
+                    <a:blip r:embed="rId23"/>
                     <a:stretch>
                       <a:fillRect/>
                     </a:stretch>
@@ -1202,15 +1586,775 @@
       </w:r>
     </w:p>
     <w:p>
-      <w:pPr>
-        <w:rPr>
-          <w:strike/>
-        </w:rPr>
-      </w:pPr>
+      <w:r>
+        <w:t xml:space="preserve">I started out with creating the logical model noted above. This model outlines all the planned entities as well as attributes and relationships between all the entities. Starting with the Location entity, it has a self-referencing relationship that will allow </w:t>
+      </w:r>
+      <w:proofErr w:type="gramStart"/>
+      <w:r>
+        <w:t>an</w:t>
+      </w:r>
+      <w:proofErr w:type="gramEnd"/>
+      <w:r>
+        <w:t xml:space="preserve"> hierarchical structure to be established where I can classify campground locations that are within state parks, national parks or other locations. This relationship is a </w:t>
+      </w:r>
+      <w:proofErr w:type="gramStart"/>
+      <w:r>
+        <w:t>one to one</w:t>
+      </w:r>
+      <w:proofErr w:type="gramEnd"/>
+      <w:r>
+        <w:t xml:space="preserve"> where every </w:t>
+      </w:r>
+      <w:proofErr w:type="gramStart"/>
+      <w:r>
+        <w:t>child</w:t>
+      </w:r>
+      <w:proofErr w:type="gramEnd"/>
+      <w:r>
+        <w:t xml:space="preserve"> location can only </w:t>
+      </w:r>
+      <w:proofErr w:type="gramStart"/>
+      <w:r>
+        <w:t>associate to</w:t>
+      </w:r>
+      <w:proofErr w:type="gramEnd"/>
+      <w:r>
+        <w:t xml:space="preserve"> a single </w:t>
+      </w:r>
+      <w:proofErr w:type="gramStart"/>
+      <w:r>
+        <w:t>parent</w:t>
+      </w:r>
+      <w:proofErr w:type="gramEnd"/>
+      <w:r>
+        <w:t xml:space="preserve"> location and it is optional. The next entity </w:t>
+      </w:r>
+      <w:r>
+        <w:lastRenderedPageBreak/>
+        <w:t xml:space="preserve">relationship with the Locations table is the data source entity. As the logical model outlines above the relationship is optional in the sense that a data source may or may not be associated to any </w:t>
+      </w:r>
+      <w:proofErr w:type="gramStart"/>
+      <w:r>
+        <w:t>locations</w:t>
+      </w:r>
+      <w:proofErr w:type="gramEnd"/>
+      <w:r>
+        <w:t xml:space="preserve">, but a created location must and can only be associated with a single data source. As we can </w:t>
+      </w:r>
+      <w:proofErr w:type="gramStart"/>
+      <w:r>
+        <w:t>see</w:t>
+      </w:r>
+      <w:proofErr w:type="gramEnd"/>
+      <w:r>
+        <w:t xml:space="preserve"> this is the same association for the location </w:t>
+      </w:r>
+      <w:proofErr w:type="gramStart"/>
+      <w:r>
+        <w:t>types</w:t>
+      </w:r>
+      <w:proofErr w:type="gramEnd"/>
+      <w:r>
+        <w:t xml:space="preserve"> entity where a location cannot exist without a location type, but a location type can exist without any locations. One other thing to note about the data source and location </w:t>
+      </w:r>
+      <w:proofErr w:type="gramStart"/>
+      <w:r>
+        <w:t>types</w:t>
+      </w:r>
+      <w:proofErr w:type="gramEnd"/>
+      <w:r>
+        <w:t xml:space="preserve"> entities, is that many locations can associate to a single type, but only one type can be associated to a single location. </w:t>
+      </w:r>
+      <w:r>
+        <w:t xml:space="preserve">The next set of relationships are the same between the location entity and the websites, addresses, media, contact phone numbers, contact emails and operating hours entities. In these cases, each of these entities cannot exist within this database, unless there is one and only one location that the entity can associate with. However, on the other side, a single location can associate with zero to </w:t>
+      </w:r>
+      <w:proofErr w:type="gramStart"/>
+      <w:r>
+        <w:t>many of each</w:t>
+      </w:r>
+      <w:proofErr w:type="gramEnd"/>
+      <w:r>
+        <w:t xml:space="preserve"> of these entities. In other words, each location could have no to many websites, media, addresses, </w:t>
+      </w:r>
+      <w:proofErr w:type="spellStart"/>
+      <w:r>
+        <w:t>etc</w:t>
+      </w:r>
+      <w:proofErr w:type="spellEnd"/>
+      <w:r>
+        <w:t xml:space="preserve">… but each of these entities must associate to one and only one location. The three of the last four tables are type tables for the Websites, Addresses and Media tables. These type tables allow me to deduplicate the text needed to identify the same type of each of these entities across hundreds or even thousands of records. In </w:t>
+      </w:r>
+      <w:r>
+        <w:t xml:space="preserve">these </w:t>
+      </w:r>
+      <w:proofErr w:type="gramStart"/>
+      <w:r>
+        <w:t>cases</w:t>
+      </w:r>
+      <w:proofErr w:type="gramEnd"/>
+      <w:r>
+        <w:t xml:space="preserve"> the relationship between the </w:t>
+      </w:r>
+      <w:r>
+        <w:t>three</w:t>
+      </w:r>
+      <w:r>
+        <w:t xml:space="preserve"> tables were </w:t>
+      </w:r>
+      <w:proofErr w:type="gramStart"/>
+      <w:r>
+        <w:t>setup</w:t>
+      </w:r>
+      <w:proofErr w:type="gramEnd"/>
+      <w:r>
+        <w:t xml:space="preserve"> so the </w:t>
+      </w:r>
+      <w:proofErr w:type="gramStart"/>
+      <w:r>
+        <w:t>type</w:t>
+      </w:r>
+      <w:proofErr w:type="gramEnd"/>
+      <w:r>
+        <w:t xml:space="preserve"> association is required meaning no address</w:t>
+      </w:r>
+      <w:r>
+        <w:t>,</w:t>
+      </w:r>
+      <w:r>
+        <w:t xml:space="preserve"> media</w:t>
+      </w:r>
+      <w:r>
+        <w:t>, or website</w:t>
+      </w:r>
+      <w:r>
+        <w:t xml:space="preserve"> element can exist unless it has a proper media type</w:t>
+      </w:r>
+      <w:r>
+        <w:t>,</w:t>
+      </w:r>
+      <w:r>
+        <w:t xml:space="preserve"> address type</w:t>
+      </w:r>
+      <w:r>
+        <w:t>, or website type</w:t>
+      </w:r>
+      <w:r>
+        <w:t xml:space="preserve"> (respective to the correct tables per the logical diagram) defined first. The relationships in the diagram also show that many media</w:t>
+      </w:r>
+      <w:r>
+        <w:t xml:space="preserve">, </w:t>
+      </w:r>
+      <w:r>
+        <w:t>address</w:t>
+      </w:r>
+      <w:r>
+        <w:t>es or websites</w:t>
+      </w:r>
+      <w:r>
+        <w:t xml:space="preserve"> can associate to a single type, but each media</w:t>
+      </w:r>
+      <w:r>
+        <w:t>,</w:t>
+      </w:r>
+      <w:r>
+        <w:t xml:space="preserve"> address</w:t>
+      </w:r>
+      <w:r>
+        <w:t xml:space="preserve"> and website</w:t>
+      </w:r>
+      <w:r>
+        <w:t xml:space="preserve"> must associate to one and only one type respective to their type tables.</w:t>
+      </w:r>
+      <w:r>
+        <w:t xml:space="preserve"> The final entity that hasn’t been discussed yet is the operating </w:t>
+      </w:r>
+      <w:proofErr w:type="spellStart"/>
+      <w:r>
+        <w:t>hours time</w:t>
+      </w:r>
+      <w:proofErr w:type="spellEnd"/>
+      <w:r>
+        <w:t xml:space="preserve"> entity. The relationship established here allows me to have multiple operating </w:t>
+      </w:r>
+      <w:proofErr w:type="gramStart"/>
+      <w:r>
+        <w:t>hour times</w:t>
+      </w:r>
+      <w:proofErr w:type="gramEnd"/>
+      <w:r>
+        <w:t xml:space="preserve"> associated </w:t>
+      </w:r>
+      <w:proofErr w:type="gramStart"/>
+      <w:r>
+        <w:t>to</w:t>
+      </w:r>
+      <w:proofErr w:type="gramEnd"/>
+      <w:r>
+        <w:t xml:space="preserve"> a single operating hours descriptor. This is important as this setup allows me to have one record per day defined in the </w:t>
+      </w:r>
+      <w:proofErr w:type="gramStart"/>
+      <w:r>
+        <w:t>time table</w:t>
+      </w:r>
+      <w:proofErr w:type="gramEnd"/>
+      <w:r>
+        <w:t xml:space="preserve"> which associates back to the parent operating hours table. The alternative would be to have a JSON structured column for each day defined on the Operating Hours </w:t>
+      </w:r>
+      <w:proofErr w:type="gramStart"/>
+      <w:r>
+        <w:t>table</w:t>
+      </w:r>
+      <w:proofErr w:type="gramEnd"/>
+      <w:r>
+        <w:t xml:space="preserve"> which isn’t as structured as desired. The relationship between these two tables essentially says zero to many operating </w:t>
+      </w:r>
+      <w:proofErr w:type="spellStart"/>
+      <w:r>
+        <w:t>hours time</w:t>
+      </w:r>
+      <w:proofErr w:type="spellEnd"/>
+      <w:r>
+        <w:t xml:space="preserve"> elements can associate </w:t>
+      </w:r>
+      <w:proofErr w:type="gramStart"/>
+      <w:r>
+        <w:t>to</w:t>
+      </w:r>
+      <w:proofErr w:type="gramEnd"/>
+      <w:r>
+        <w:t xml:space="preserve"> the parent operating hours entity, but one and only one operating hours parent entity can associate </w:t>
+      </w:r>
+      <w:proofErr w:type="gramStart"/>
+      <w:r>
+        <w:t>to</w:t>
+      </w:r>
+      <w:proofErr w:type="gramEnd"/>
+      <w:r>
+        <w:t xml:space="preserve"> any given operating </w:t>
+      </w:r>
+      <w:proofErr w:type="spellStart"/>
+      <w:r>
+        <w:t>hours time</w:t>
+      </w:r>
+      <w:proofErr w:type="spellEnd"/>
+      <w:r>
+        <w:t xml:space="preserve"> entity at a given time. </w:t>
+      </w:r>
+    </w:p>
+    <w:p>
       <w:r>
         <w:rPr>
           <w:noProof/>
         </w:rPr>
+        <w:lastRenderedPageBreak/>
+        <w:drawing>
+          <wp:inline distT="0" distB="0" distL="0" distR="0" wp14:anchorId="7AC51256" wp14:editId="42816062">
+            <wp:extent cx="5943600" cy="2993390"/>
+            <wp:effectExtent l="0" t="0" r="0" b="0"/>
+            <wp:docPr id="1981445529" name="Picture 1"/>
+            <wp:cNvGraphicFramePr>
+              <a:graphicFrameLocks xmlns:a="http://schemas.openxmlformats.org/drawingml/2006/main" noChangeAspect="1"/>
+            </wp:cNvGraphicFramePr>
+            <a:graphic xmlns:a="http://schemas.openxmlformats.org/drawingml/2006/main">
+              <a:graphicData uri="http://schemas.openxmlformats.org/drawingml/2006/picture">
+                <pic:pic xmlns:pic="http://schemas.openxmlformats.org/drawingml/2006/picture">
+                  <pic:nvPicPr>
+                    <pic:cNvPr id="1715177803" name=""/>
+                    <pic:cNvPicPr/>
+                  </pic:nvPicPr>
+                  <pic:blipFill>
+                    <a:blip r:embed="rId24"/>
+                    <a:stretch>
+                      <a:fillRect/>
+                    </a:stretch>
+                  </pic:blipFill>
+                  <pic:spPr>
+                    <a:xfrm>
+                      <a:off x="0" y="0"/>
+                      <a:ext cx="5943600" cy="2993390"/>
+                    </a:xfrm>
+                    <a:prstGeom prst="rect">
+                      <a:avLst/>
+                    </a:prstGeom>
+                  </pic:spPr>
+                </pic:pic>
+              </a:graphicData>
+            </a:graphic>
+          </wp:inline>
+        </w:drawing>
+      </w:r>
+    </w:p>
+    <w:p>
+      <w:r>
+        <w:t xml:space="preserve">As the generated relational model shows above, all relationships established were at most one to many, which doesn’t generate any connecting or ??? tables. We can also see in this relational er diagram that association keys between the different relationships were established correctly that doesn’t show in the logical diagram mainly like all the foreign keys and foreign key constraint classifiers on each table. This relational model lays out the exact design that I then took and coded into the normalized </w:t>
+      </w:r>
+      <w:proofErr w:type="spellStart"/>
+      <w:r>
+        <w:t>duckdb</w:t>
+      </w:r>
+      <w:proofErr w:type="spellEnd"/>
+      <w:r>
+        <w:t xml:space="preserve"> schema that I ended up using to transform data from the other five sources into this single relation. </w:t>
+      </w:r>
+      <w:r>
+        <w:t xml:space="preserve"> </w:t>
+      </w:r>
+    </w:p>
+    <w:p>
+      <w:r>
+        <w:t xml:space="preserve">Now the er diagram of the normalized schema is created, and all the data for the </w:t>
+      </w:r>
+      <w:proofErr w:type="spellStart"/>
+      <w:r>
+        <w:t>duckdb</w:t>
+      </w:r>
+      <w:proofErr w:type="spellEnd"/>
+      <w:r>
+        <w:t xml:space="preserve"> data has been migrated into the </w:t>
+      </w:r>
+      <w:proofErr w:type="spellStart"/>
+      <w:r>
+        <w:t>duckdb</w:t>
+      </w:r>
+      <w:proofErr w:type="spellEnd"/>
+      <w:r>
+        <w:t xml:space="preserve"> database. My next step was to create the </w:t>
+      </w:r>
+      <w:proofErr w:type="spellStart"/>
+      <w:r>
+        <w:t>duckdb</w:t>
+      </w:r>
+      <w:proofErr w:type="spellEnd"/>
+      <w:r>
+        <w:t xml:space="preserve"> DDL code </w:t>
+      </w:r>
+      <w:r>
+        <w:t xml:space="preserve">needed to create the normalized schema in the diagrams under the normalized schema definition. </w:t>
+      </w:r>
+    </w:p>
+    <w:p>
+      <w:r>
+        <w:t xml:space="preserve">The final step is to transform the data into </w:t>
+      </w:r>
+      <w:proofErr w:type="gramStart"/>
+      <w:r>
+        <w:t>the</w:t>
+      </w:r>
+      <w:proofErr w:type="gramEnd"/>
+      <w:r>
+        <w:t xml:space="preserve"> normalized schema. I was able to accomplish this by not using python but creating individual views within each data source that allowed me to transform the data from each data source into a recognizable structure to insert into the normalized database tables. The project has one SQL file defined for each data source. </w:t>
+      </w:r>
+    </w:p>
+    <w:p>
+      <w:r>
+        <w:t xml:space="preserve">TODO: </w:t>
+      </w:r>
+    </w:p>
+    <w:p>
+      <w:r>
+        <w:t>Talk about the queries that I wanted to exemplify after uploading all the data</w:t>
+      </w:r>
+    </w:p>
+    <w:p>
+      <w:r>
+        <w:lastRenderedPageBreak/>
+        <w:tab/>
+        <w:t>Hierarchical</w:t>
+      </w:r>
+    </w:p>
+    <w:p>
+      <w:r>
+        <w:tab/>
+        <w:t>Geospatial</w:t>
+      </w:r>
+    </w:p>
+    <w:p>
+      <w:r>
+        <w:tab/>
+        <w:t>General join queries</w:t>
+      </w:r>
+    </w:p>
+    <w:p>
+      <w:r>
+        <w:t>Talk about some of the queries that I wanted to create for this project (DDL and DML queries)</w:t>
+      </w:r>
+    </w:p>
+    <w:p/>
+    <w:p/>
+    <w:p>
+      <w:pPr>
+        <w:rPr>
+          <w:strike/>
+        </w:rPr>
+      </w:pPr>
+      <w:r>
+        <w:rPr>
+          <w:strike/>
+        </w:rPr>
+        <w:t>Intro outline</w:t>
+      </w:r>
+    </w:p>
+    <w:p>
+      <w:pPr>
+        <w:rPr>
+          <w:strike/>
+        </w:rPr>
+      </w:pPr>
+      <w:r>
+        <w:rPr>
+          <w:strike/>
+        </w:rPr>
+        <w:t>What data I used (real data from multiple sources)</w:t>
+      </w:r>
+    </w:p>
+    <w:p>
+      <w:r>
+        <w:t>Data collection scripts (used Gemini Google AI to help with the Python portion)</w:t>
+      </w:r>
+    </w:p>
+    <w:p>
+      <w:pPr>
+        <w:pStyle w:val="ListParagraph"/>
+        <w:numPr>
+          <w:ilvl w:val="0"/>
+          <w:numId w:val="8"/>
+        </w:numPr>
+      </w:pPr>
+      <w:r>
+        <w:t xml:space="preserve">Concept from chapter about advanced SQL / </w:t>
+      </w:r>
+      <w:proofErr w:type="spellStart"/>
+      <w:r>
+        <w:t>DuckDB</w:t>
+      </w:r>
+      <w:proofErr w:type="spellEnd"/>
+      <w:r>
+        <w:t xml:space="preserve"> extensions used throughout project</w:t>
+      </w:r>
+    </w:p>
+    <w:p>
+      <w:r>
+        <w:t>Entity Relation Diagrams</w:t>
+      </w:r>
+    </w:p>
+    <w:p>
+      <w:pPr>
+        <w:pStyle w:val="ListParagraph"/>
+        <w:numPr>
+          <w:ilvl w:val="0"/>
+          <w:numId w:val="8"/>
+        </w:numPr>
+      </w:pPr>
+      <w:r>
+        <w:t>Concept from chapter on data modeling and relational model</w:t>
+      </w:r>
+    </w:p>
+    <w:p>
+      <w:pPr>
+        <w:pStyle w:val="ListParagraph"/>
+        <w:numPr>
+          <w:ilvl w:val="0"/>
+          <w:numId w:val="8"/>
+        </w:numPr>
+      </w:pPr>
+      <w:r>
+        <w:t>Concept from chapter on ER Diagrams</w:t>
+      </w:r>
+    </w:p>
+    <w:p>
+      <w:r>
+        <w:t xml:space="preserve">Normalized Schema created for </w:t>
+      </w:r>
+      <w:proofErr w:type="spellStart"/>
+      <w:r>
+        <w:t>DuckDB</w:t>
+      </w:r>
+      <w:proofErr w:type="spellEnd"/>
+      <w:r>
+        <w:t xml:space="preserve"> </w:t>
+      </w:r>
+    </w:p>
+    <w:p>
+      <w:pPr>
+        <w:pStyle w:val="ListParagraph"/>
+        <w:numPr>
+          <w:ilvl w:val="0"/>
+          <w:numId w:val="8"/>
+        </w:numPr>
+      </w:pPr>
+      <w:r>
+        <w:t>Concept from chapter on normalization</w:t>
+      </w:r>
+    </w:p>
+    <w:p>
+      <w:pPr>
+        <w:pStyle w:val="ListParagraph"/>
+        <w:numPr>
+          <w:ilvl w:val="1"/>
+          <w:numId w:val="8"/>
+        </w:numPr>
+      </w:pPr>
+      <w:r>
+        <w:t>Highlight the denormalized data somewhat from different sources</w:t>
+      </w:r>
+    </w:p>
+    <w:p>
+      <w:pPr>
+        <w:pStyle w:val="ListParagraph"/>
+        <w:numPr>
+          <w:ilvl w:val="0"/>
+          <w:numId w:val="8"/>
+        </w:numPr>
+      </w:pPr>
+      <w:r>
+        <w:t>Hierarchical query on locations table</w:t>
+      </w:r>
+    </w:p>
+    <w:p>
+      <w:r>
+        <w:t>Database scripts to transform/move the data collected from each source into the final normalized database schema</w:t>
+      </w:r>
+    </w:p>
+    <w:p>
+      <w:pPr>
+        <w:pStyle w:val="ListParagraph"/>
+        <w:numPr>
+          <w:ilvl w:val="1"/>
+          <w:numId w:val="8"/>
+        </w:numPr>
+      </w:pPr>
+      <w:r>
+        <w:t>Queries that I tried to make possible</w:t>
+      </w:r>
+    </w:p>
+    <w:p>
+      <w:pPr>
+        <w:pStyle w:val="ListParagraph"/>
+        <w:numPr>
+          <w:ilvl w:val="0"/>
+          <w:numId w:val="8"/>
+        </w:numPr>
+      </w:pPr>
+      <w:r>
+        <w:t>Concept from chapter about database transactions with Commit and finding error prone data while running the query</w:t>
+      </w:r>
+    </w:p>
+    <w:p>
+      <w:pPr>
+        <w:pStyle w:val="ListParagraph"/>
+        <w:numPr>
+          <w:ilvl w:val="0"/>
+          <w:numId w:val="8"/>
+        </w:numPr>
+      </w:pPr>
+      <w:r>
+        <w:t>Concept from chapter about database views</w:t>
+      </w:r>
+    </w:p>
+    <w:p>
+      <w:r>
+        <w:t xml:space="preserve">Migration from </w:t>
+      </w:r>
+      <w:proofErr w:type="spellStart"/>
+      <w:r>
+        <w:t>DuckDB</w:t>
+      </w:r>
+      <w:proofErr w:type="spellEnd"/>
+      <w:r>
+        <w:t xml:space="preserve"> to PostgreSQL database</w:t>
+      </w:r>
+    </w:p>
+    <w:p>
+      <w:r>
+        <w:t>Backend API</w:t>
+      </w:r>
+    </w:p>
+    <w:p>
+      <w:r>
+        <w:lastRenderedPageBreak/>
+        <w:t>Frontend</w:t>
+      </w:r>
+    </w:p>
+    <w:p>
+      <w:pPr>
+        <w:pStyle w:val="ListParagraph"/>
+        <w:numPr>
+          <w:ilvl w:val="0"/>
+          <w:numId w:val="8"/>
+        </w:numPr>
+        <w:rPr>
+          <w:strike/>
+        </w:rPr>
+      </w:pPr>
+      <w:r>
+        <w:rPr>
+          <w:strike/>
+        </w:rPr>
+        <w:t>What I did to build the database</w:t>
+      </w:r>
+    </w:p>
+    <w:p>
+      <w:pPr>
+        <w:pStyle w:val="ListParagraph"/>
+        <w:numPr>
+          <w:ilvl w:val="1"/>
+          <w:numId w:val="8"/>
+        </w:numPr>
+        <w:rPr>
+          <w:strike/>
+        </w:rPr>
+      </w:pPr>
+      <w:r>
+        <w:rPr>
+          <w:strike/>
+        </w:rPr>
+        <w:t>What was the design</w:t>
+      </w:r>
+    </w:p>
+    <w:p>
+      <w:pPr>
+        <w:pStyle w:val="ListParagraph"/>
+        <w:numPr>
+          <w:ilvl w:val="2"/>
+          <w:numId w:val="8"/>
+        </w:numPr>
+        <w:rPr>
+          <w:strike/>
+        </w:rPr>
+      </w:pPr>
+      <w:r>
+        <w:rPr>
+          <w:strike/>
+        </w:rPr>
+        <w:t>Design specifics go here including ER Diagram showing relational and logical structures</w:t>
+      </w:r>
+    </w:p>
+    <w:p>
+      <w:pPr>
+        <w:pStyle w:val="ListParagraph"/>
+        <w:numPr>
+          <w:ilvl w:val="1"/>
+          <w:numId w:val="8"/>
+        </w:numPr>
+        <w:rPr>
+          <w:strike/>
+        </w:rPr>
+      </w:pPr>
+      <w:r>
+        <w:rPr>
+          <w:strike/>
+        </w:rPr>
+        <w:t xml:space="preserve">What data did I use (mock vs external source data vs hand-entered data </w:t>
+      </w:r>
+      <w:proofErr w:type="spellStart"/>
+      <w:r>
+        <w:rPr>
+          <w:strike/>
+        </w:rPr>
+        <w:t>etc</w:t>
+      </w:r>
+      <w:proofErr w:type="spellEnd"/>
+      <w:r>
+        <w:rPr>
+          <w:strike/>
+        </w:rPr>
+        <w:t>…)</w:t>
+      </w:r>
+    </w:p>
+    <w:p>
+      <w:pPr>
+        <w:pStyle w:val="ListParagraph"/>
+        <w:numPr>
+          <w:ilvl w:val="2"/>
+          <w:numId w:val="8"/>
+        </w:numPr>
+        <w:rPr>
+          <w:strike/>
+        </w:rPr>
+      </w:pPr>
+      <w:r>
+        <w:rPr>
+          <w:strike/>
+        </w:rPr>
+        <w:t>All real data collected from real sources</w:t>
+      </w:r>
+    </w:p>
+    <w:p>
+      <w:pPr>
+        <w:pStyle w:val="ListParagraph"/>
+        <w:numPr>
+          <w:ilvl w:val="1"/>
+          <w:numId w:val="8"/>
+        </w:numPr>
+        <w:rPr>
+          <w:strike/>
+        </w:rPr>
+      </w:pPr>
+      <w:r>
+        <w:rPr>
+          <w:strike/>
+        </w:rPr>
+        <w:t>What types of queries did I try to make possible</w:t>
+      </w:r>
+    </w:p>
+    <w:p>
+      <w:r>
+        <w:t>Logical Model</w:t>
+      </w:r>
+    </w:p>
+    <w:p>
+      <w:r>
+        <w:rPr>
+          <w:noProof/>
+        </w:rPr>
+        <w:drawing>
+          <wp:inline distT="0" distB="0" distL="0" distR="0" wp14:anchorId="33BAA08F" wp14:editId="0772A51D">
+            <wp:extent cx="5943600" cy="3592195"/>
+            <wp:effectExtent l="0" t="0" r="0" b="8255"/>
+            <wp:docPr id="586225190" name="Picture 1"/>
+            <wp:cNvGraphicFramePr>
+              <a:graphicFrameLocks xmlns:a="http://schemas.openxmlformats.org/drawingml/2006/main" noChangeAspect="1"/>
+            </wp:cNvGraphicFramePr>
+            <a:graphic xmlns:a="http://schemas.openxmlformats.org/drawingml/2006/main">
+              <a:graphicData uri="http://schemas.openxmlformats.org/drawingml/2006/picture">
+                <pic:pic xmlns:pic="http://schemas.openxmlformats.org/drawingml/2006/picture">
+                  <pic:nvPicPr>
+                    <pic:cNvPr id="586225190" name=""/>
+                    <pic:cNvPicPr/>
+                  </pic:nvPicPr>
+                  <pic:blipFill>
+                    <a:blip r:embed="rId23"/>
+                    <a:stretch>
+                      <a:fillRect/>
+                    </a:stretch>
+                  </pic:blipFill>
+                  <pic:spPr>
+                    <a:xfrm>
+                      <a:off x="0" y="0"/>
+                      <a:ext cx="5943600" cy="3592195"/>
+                    </a:xfrm>
+                    <a:prstGeom prst="rect">
+                      <a:avLst/>
+                    </a:prstGeom>
+                  </pic:spPr>
+                </pic:pic>
+              </a:graphicData>
+            </a:graphic>
+          </wp:inline>
+        </w:drawing>
+      </w:r>
+    </w:p>
+    <w:p>
+      <w:pPr>
+        <w:rPr>
+          <w:strike/>
+        </w:rPr>
+      </w:pPr>
+      <w:r>
+        <w:rPr>
+          <w:noProof/>
+        </w:rPr>
+        <w:lastRenderedPageBreak/>
         <w:drawing>
           <wp:inline distT="0" distB="0" distL="0" distR="0" wp14:anchorId="66F51414" wp14:editId="6E2F9983">
             <wp:extent cx="5943600" cy="3487420"/>
@@ -1227,7 +2371,7 @@
                     <pic:cNvPicPr/>
                   </pic:nvPicPr>
                   <pic:blipFill>
-                    <a:blip r:embed="rId23"/>
+                    <a:blip r:embed="rId25"/>
                     <a:stretch>
                       <a:fillRect/>
                     </a:stretch>
@@ -1258,7 +2402,6 @@
         <w:rPr>
           <w:noProof/>
         </w:rPr>
-        <w:lastRenderedPageBreak/>
         <w:drawing>
           <wp:inline distT="0" distB="0" distL="0" distR="0" wp14:anchorId="1CCFF425" wp14:editId="498C89DA">
             <wp:extent cx="5943600" cy="2993390"/>
@@ -1301,6 +2444,7 @@
         <w:rPr>
           <w:noProof/>
         </w:rPr>
+        <w:lastRenderedPageBreak/>
         <w:drawing>
           <wp:inline distT="0" distB="0" distL="0" distR="0" wp14:anchorId="4ED438F9" wp14:editId="6D05C727">
             <wp:extent cx="5943600" cy="2858135"/>
@@ -1317,7 +2461,7 @@
                     <pic:cNvPicPr/>
                   </pic:nvPicPr>
                   <pic:blipFill>
-                    <a:blip r:embed="rId25"/>
+                    <a:blip r:embed="rId26"/>
                     <a:stretch>
                       <a:fillRect/>
                     </a:stretch>
@@ -1360,14 +2504,121 @@
       </w:r>
     </w:p>
     <w:p>
+      <w:r>
+        <w:t xml:space="preserve">I learned a lot from this project. </w:t>
+      </w:r>
+      <w:proofErr w:type="gramStart"/>
+      <w:r>
+        <w:t>First</w:t>
+      </w:r>
+      <w:proofErr w:type="gramEnd"/>
+      <w:r>
+        <w:t xml:space="preserve"> I learned about </w:t>
+      </w:r>
+      <w:proofErr w:type="spellStart"/>
+      <w:r>
+        <w:t>duckdb</w:t>
+      </w:r>
+      <w:proofErr w:type="spellEnd"/>
+      <w:r>
+        <w:t xml:space="preserve"> as a piece of technology mainly used for analytical purposes. However, for my project, I utilized its fast and efficient nature to create the beginnings of a data pipeline for </w:t>
+      </w:r>
+      <w:proofErr w:type="gramStart"/>
+      <w:r>
+        <w:t>my</w:t>
+      </w:r>
+      <w:proofErr w:type="gramEnd"/>
+      <w:r>
+        <w:t xml:space="preserve"> explore more project. This was an interesting project, as working with </w:t>
+      </w:r>
+      <w:proofErr w:type="spellStart"/>
+      <w:r>
+        <w:t>duckdb</w:t>
+      </w:r>
+      <w:proofErr w:type="spellEnd"/>
+      <w:r>
+        <w:t xml:space="preserve"> was quick to setup, easy to interact with and interesting to learn how to properly upload and manage data from multiple different sources. </w:t>
+      </w:r>
+    </w:p>
+    <w:p>
+      <w:proofErr w:type="gramStart"/>
+      <w:r>
+        <w:t>Also</w:t>
+      </w:r>
+      <w:proofErr w:type="gramEnd"/>
+      <w:r>
+        <w:t xml:space="preserve"> throughout this project, I believe that I have strengthened my SQL querying skills. Although, it will still take me some time to learn all the different syntactical differences between the ‘flavors’ of SQL that I’ll end up using at work and in my future projects, I believe that I have been able to strengthen through this project my knowledge and understanding on how I can utilize database technology to effectively manage data more efficiently than I ever could in a single spreadsheet in Excel or Google Sheets. </w:t>
+      </w:r>
+    </w:p>
+    <w:p>
+      <w:r>
+        <w:t xml:space="preserve">A third concept that I was able to learn and strengthen throughout this project was the ability to structure an ER diagram and code it into actual SQL code (and not relying on AI or the Data Modeler). There were some limitations within </w:t>
+      </w:r>
+      <w:proofErr w:type="spellStart"/>
+      <w:r>
+        <w:t>duckdb</w:t>
+      </w:r>
+      <w:proofErr w:type="spellEnd"/>
+      <w:r>
+        <w:t xml:space="preserve"> that I had to overcome such </w:t>
+      </w:r>
+      <w:r>
+        <w:lastRenderedPageBreak/>
+        <w:t xml:space="preserve">as there not being </w:t>
+      </w:r>
+      <w:proofErr w:type="gramStart"/>
+      <w:r>
+        <w:t>a</w:t>
+      </w:r>
+      <w:proofErr w:type="gramEnd"/>
+      <w:r>
+        <w:t xml:space="preserve"> easy to use auto incrementing primary key id constraint that I could set on every table, as well as there not being any ability to setup triggers as we could within the Oracle database we used throughout the semester. </w:t>
+      </w:r>
+    </w:p>
+    <w:p>
+      <w:r>
+        <w:t xml:space="preserve">Although I learned a lot, I also learned throughout this project some limitations and struggles that as of writing this haven’t allowed me to complete the </w:t>
+      </w:r>
+      <w:proofErr w:type="spellStart"/>
+      <w:r>
+        <w:t>api</w:t>
+      </w:r>
+      <w:proofErr w:type="spellEnd"/>
+      <w:r>
+        <w:t xml:space="preserve"> and frontend layers of this project yet. First, my data sources that I found aren’t entirely complete. The most complete is the NPS data source. However, other sources like the MN DNR and MN GIS sources are only partial. I </w:t>
+      </w:r>
+      <w:proofErr w:type="gramStart"/>
+      <w:r>
+        <w:t>wasn’t able to</w:t>
+      </w:r>
+      <w:proofErr w:type="gramEnd"/>
+      <w:r>
+        <w:t xml:space="preserve"> have enough time to create the portion of the pipeline needed to successfully merge these data sources into one to have locations that are more representative </w:t>
+      </w:r>
+      <w:proofErr w:type="gramStart"/>
+      <w:r>
+        <w:t>as a whole instead</w:t>
+      </w:r>
+      <w:proofErr w:type="gramEnd"/>
+      <w:r>
+        <w:t xml:space="preserve"> of differently.</w:t>
+      </w:r>
+    </w:p>
+    <w:p>
       <w:pPr>
         <w:pStyle w:val="ListParagraph"/>
         <w:numPr>
           <w:ilvl w:val="0"/>
           <w:numId w:val="8"/>
         </w:numPr>
-      </w:pPr>
-      <w:r>
+        <w:rPr>
+          <w:strike/>
+        </w:rPr>
+      </w:pPr>
+      <w:r>
+        <w:rPr>
+          <w:strike/>
+        </w:rPr>
         <w:t>What did I learn from the project</w:t>
       </w:r>
     </w:p>
@@ -1378,10 +2629,43 @@
           <w:ilvl w:val="1"/>
           <w:numId w:val="8"/>
         </w:numPr>
-      </w:pPr>
-      <w:r>
-        <w:lastRenderedPageBreak/>
-        <w:t>Give self assessment describing where were you before the class and if/how the project advanced my knowledge</w:t>
+        <w:rPr>
+          <w:strike/>
+        </w:rPr>
+      </w:pPr>
+      <w:r>
+        <w:rPr>
+          <w:strike/>
+        </w:rPr>
+        <w:t xml:space="preserve">Give </w:t>
+      </w:r>
+      <w:proofErr w:type="spellStart"/>
+      <w:r>
+        <w:rPr>
+          <w:strike/>
+        </w:rPr>
+        <w:t>self assessment</w:t>
+      </w:r>
+      <w:proofErr w:type="spellEnd"/>
+      <w:r>
+        <w:rPr>
+          <w:strike/>
+        </w:rPr>
+        <w:t xml:space="preserve"> describing where </w:t>
+      </w:r>
+      <w:proofErr w:type="gramStart"/>
+      <w:r>
+        <w:rPr>
+          <w:strike/>
+        </w:rPr>
+        <w:t>were you</w:t>
+      </w:r>
+      <w:proofErr w:type="gramEnd"/>
+      <w:r>
+        <w:rPr>
+          <w:strike/>
+        </w:rPr>
+        <w:t xml:space="preserve"> before the class and if/how the project advanced my knowledge</w:t>
       </w:r>
     </w:p>
     <w:p>
@@ -1391,8 +2675,14 @@
           <w:ilvl w:val="2"/>
           <w:numId w:val="8"/>
         </w:numPr>
-      </w:pPr>
-      <w:r>
+        <w:rPr>
+          <w:strike/>
+        </w:rPr>
+      </w:pPr>
+      <w:r>
+        <w:rPr>
+          <w:strike/>
+        </w:rPr>
         <w:t xml:space="preserve">I learned a lot from this project. </w:t>
       </w:r>
     </w:p>
@@ -1403,9 +2693,57 @@
           <w:ilvl w:val="0"/>
           <w:numId w:val="9"/>
         </w:numPr>
-      </w:pPr>
-      <w:r>
-        <w:t>Learned about DuckDB and the use case in which it fills to help aggregate and manage large amounts of data from different sources</w:t>
+        <w:rPr>
+          <w:strike/>
+        </w:rPr>
+      </w:pPr>
+      <w:r>
+        <w:rPr>
+          <w:strike/>
+        </w:rPr>
+        <w:t xml:space="preserve">Learned about </w:t>
+      </w:r>
+      <w:proofErr w:type="spellStart"/>
+      <w:r>
+        <w:rPr>
+          <w:strike/>
+        </w:rPr>
+        <w:t>DuckDB</w:t>
+      </w:r>
+      <w:proofErr w:type="spellEnd"/>
+      <w:r>
+        <w:rPr>
+          <w:strike/>
+        </w:rPr>
+        <w:t xml:space="preserve"> and the use case in which it </w:t>
+      </w:r>
+      <w:proofErr w:type="gramStart"/>
+      <w:r>
+        <w:rPr>
+          <w:strike/>
+        </w:rPr>
+        <w:t>fills</w:t>
+      </w:r>
+      <w:proofErr w:type="gramEnd"/>
+      <w:r>
+        <w:rPr>
+          <w:strike/>
+        </w:rPr>
+        <w:t xml:space="preserve"> </w:t>
+      </w:r>
+      <w:proofErr w:type="gramStart"/>
+      <w:r>
+        <w:rPr>
+          <w:strike/>
+        </w:rPr>
+        <w:t>to help</w:t>
+      </w:r>
+      <w:proofErr w:type="gramEnd"/>
+      <w:r>
+        <w:rPr>
+          <w:strike/>
+        </w:rPr>
+        <w:t xml:space="preserve"> aggregate and manage large amounts of data from different sources</w:t>
       </w:r>
     </w:p>
     <w:p>
@@ -1415,8 +2753,14 @@
           <w:ilvl w:val="0"/>
           <w:numId w:val="9"/>
         </w:numPr>
-      </w:pPr>
-      <w:r>
+        <w:rPr>
+          <w:strike/>
+        </w:rPr>
+      </w:pPr>
+      <w:r>
+        <w:rPr>
+          <w:strike/>
+        </w:rPr>
         <w:t xml:space="preserve">Strengthened my querying and query building skills where it challenged me to think about the data structures of the imported data to properly merge them into one normalized entity. Had to craft unique and careful queries to ensure that data from certain sources tool precedence over others. </w:t>
       </w:r>
     </w:p>
@@ -1427,9 +2771,29 @@
           <w:ilvl w:val="0"/>
           <w:numId w:val="9"/>
         </w:numPr>
-      </w:pPr>
-      <w:r>
-        <w:t xml:space="preserve">Improved my normalization skills. In this project I would say that I was exposed to many different organizational ways to manage and organize data. Some of which I agreed with for this project which was inherited, but other ways I wanted to structure this project worked differently from most if not all sources. </w:t>
+        <w:rPr>
+          <w:strike/>
+        </w:rPr>
+      </w:pPr>
+      <w:r>
+        <w:rPr>
+          <w:strike/>
+        </w:rPr>
+        <w:t xml:space="preserve">Improved my normalization skills. In this project I would say that I was exposed to many different organizational ways to manage and organize data. Some of which I agreed with for this </w:t>
+      </w:r>
+      <w:proofErr w:type="gramStart"/>
+      <w:r>
+        <w:rPr>
+          <w:strike/>
+        </w:rPr>
+        <w:t>project</w:t>
+      </w:r>
+      <w:proofErr w:type="gramEnd"/>
+      <w:r>
+        <w:rPr>
+          <w:strike/>
+        </w:rPr>
+        <w:t xml:space="preserve"> which was inherited, but other ways I wanted to structure this project worked differently from most if not all sources. </w:t>
       </w:r>
     </w:p>
     <w:p>
@@ -1439,9 +2803,29 @@
           <w:ilvl w:val="0"/>
           <w:numId w:val="8"/>
         </w:numPr>
-      </w:pPr>
-      <w:r>
-        <w:t>Note anything that didn’t work or I didn’t have time to complete, discuss why it didn’t work, what I might have done with more time, etc…</w:t>
+        <w:rPr>
+          <w:strike/>
+        </w:rPr>
+      </w:pPr>
+      <w:r>
+        <w:rPr>
+          <w:strike/>
+        </w:rPr>
+        <w:t xml:space="preserve">Note anything that didn’t work or I didn’t have time to complete, discuss why it didn’t work, what I might have done with more time, </w:t>
+      </w:r>
+      <w:proofErr w:type="spellStart"/>
+      <w:r>
+        <w:rPr>
+          <w:strike/>
+        </w:rPr>
+        <w:t>etc</w:t>
+      </w:r>
+      <w:proofErr w:type="spellEnd"/>
+      <w:r>
+        <w:rPr>
+          <w:strike/>
+        </w:rPr>
+        <w:t>…</w:t>
       </w:r>
     </w:p>
     <w:p>
@@ -1451,9 +2835,99 @@
           <w:ilvl w:val="1"/>
           <w:numId w:val="8"/>
         </w:numPr>
-      </w:pPr>
-      <w:r>
-        <w:t xml:space="preserve">There is still a lot of data that is missing for certain locations. For instance the information taken from the Google Maps data, isn’t complete in the slightest. I can pin point the markers on the map and tell the name and some minimal identification information about the location, but there is a lot of things that I don’t know about those locations. </w:t>
+        <w:rPr>
+          <w:strike/>
+        </w:rPr>
+      </w:pPr>
+      <w:r>
+        <w:rPr>
+          <w:strike/>
+        </w:rPr>
+        <w:t xml:space="preserve">There is still a lot of data that is missing </w:t>
+      </w:r>
+      <w:proofErr w:type="gramStart"/>
+      <w:r>
+        <w:rPr>
+          <w:strike/>
+        </w:rPr>
+        <w:t>for</w:t>
+      </w:r>
+      <w:proofErr w:type="gramEnd"/>
+      <w:r>
+        <w:rPr>
+          <w:strike/>
+        </w:rPr>
+        <w:t xml:space="preserve"> certain locations. For </w:t>
+      </w:r>
+      <w:proofErr w:type="gramStart"/>
+      <w:r>
+        <w:rPr>
+          <w:strike/>
+        </w:rPr>
+        <w:t>instance</w:t>
+      </w:r>
+      <w:proofErr w:type="gramEnd"/>
+      <w:r>
+        <w:rPr>
+          <w:strike/>
+        </w:rPr>
+        <w:t xml:space="preserve"> the information taken from </w:t>
+      </w:r>
+      <w:proofErr w:type="gramStart"/>
+      <w:r>
+        <w:rPr>
+          <w:strike/>
+        </w:rPr>
+        <w:t>the Google</w:t>
+      </w:r>
+      <w:proofErr w:type="gramEnd"/>
+      <w:r>
+        <w:rPr>
+          <w:strike/>
+        </w:rPr>
+        <w:t xml:space="preserve"> Maps </w:t>
+      </w:r>
+      <w:proofErr w:type="gramStart"/>
+      <w:r>
+        <w:rPr>
+          <w:strike/>
+        </w:rPr>
+        <w:t>data,</w:t>
+      </w:r>
+      <w:proofErr w:type="gramEnd"/>
+      <w:r>
+        <w:rPr>
+          <w:strike/>
+        </w:rPr>
+        <w:t xml:space="preserve"> isn’t complete in the slightest. I can </w:t>
+      </w:r>
+      <w:proofErr w:type="gramStart"/>
+      <w:r>
+        <w:rPr>
+          <w:strike/>
+        </w:rPr>
+        <w:t>pin point</w:t>
+      </w:r>
+      <w:proofErr w:type="gramEnd"/>
+      <w:r>
+        <w:rPr>
+          <w:strike/>
+        </w:rPr>
+        <w:t xml:space="preserve"> the markers on the map and tell the name and some minimal identification information about the location, but there </w:t>
+      </w:r>
+      <w:proofErr w:type="gramStart"/>
+      <w:r>
+        <w:rPr>
+          <w:strike/>
+        </w:rPr>
+        <w:t>is</w:t>
+      </w:r>
+      <w:proofErr w:type="gramEnd"/>
+      <w:r>
+        <w:rPr>
+          <w:strike/>
+        </w:rPr>
+        <w:t xml:space="preserve"> a lot of things that I don’t know about those locations. </w:t>
       </w:r>
     </w:p>
     <w:p>
@@ -1463,9 +2937,58 @@
           <w:ilvl w:val="1"/>
           <w:numId w:val="8"/>
         </w:numPr>
-      </w:pPr>
-      <w:r>
-        <w:t xml:space="preserve">It was difficult to properly assign locations as children locations to parent locations without being able to see how they were positioned geographically on the map. For instance, some campsite information from the NPS API is very structured where I could say that each campground location is a child of the national park location. However, I couldn’t do the same as easily with the Google place information. </w:t>
+        <w:rPr>
+          <w:strike/>
+        </w:rPr>
+      </w:pPr>
+      <w:r>
+        <w:rPr>
+          <w:strike/>
+        </w:rPr>
+        <w:lastRenderedPageBreak/>
+        <w:t xml:space="preserve">It was difficult to properly assign locations as </w:t>
+      </w:r>
+      <w:proofErr w:type="gramStart"/>
+      <w:r>
+        <w:rPr>
+          <w:strike/>
+        </w:rPr>
+        <w:t>children</w:t>
+      </w:r>
+      <w:proofErr w:type="gramEnd"/>
+      <w:r>
+        <w:rPr>
+          <w:strike/>
+        </w:rPr>
+        <w:t xml:space="preserve"> locations to parent locations without being able to see how they were positioned geographically on the map. For instance, some campsite information from the NPS API is very structured where I could say that each campground location is a child of the national park location. However, I couldn’t do the </w:t>
+      </w:r>
+      <w:proofErr w:type="gramStart"/>
+      <w:r>
+        <w:rPr>
+          <w:strike/>
+        </w:rPr>
+        <w:t>same as</w:t>
+      </w:r>
+      <w:proofErr w:type="gramEnd"/>
+      <w:r>
+        <w:rPr>
+          <w:strike/>
+        </w:rPr>
+        <w:t xml:space="preserve"> easily with </w:t>
+      </w:r>
+      <w:proofErr w:type="gramStart"/>
+      <w:r>
+        <w:rPr>
+          <w:strike/>
+        </w:rPr>
+        <w:t>the Google</w:t>
+      </w:r>
+      <w:proofErr w:type="gramEnd"/>
+      <w:r>
+        <w:rPr>
+          <w:strike/>
+        </w:rPr>
+        <w:t xml:space="preserve"> place information. </w:t>
       </w:r>
     </w:p>
     <w:p>
@@ -1475,9 +2998,37 @@
           <w:ilvl w:val="1"/>
           <w:numId w:val="8"/>
         </w:numPr>
-      </w:pPr>
-      <w:r>
-        <w:t>Depends on how much of the API and UI I get working (and migration scripts) working to postgresql this may be another point to talk about</w:t>
+        <w:rPr>
+          <w:strike/>
+        </w:rPr>
+      </w:pPr>
+      <w:proofErr w:type="gramStart"/>
+      <w:r>
+        <w:rPr>
+          <w:strike/>
+        </w:rPr>
+        <w:t>Depends</w:t>
+      </w:r>
+      <w:proofErr w:type="gramEnd"/>
+      <w:r>
+        <w:rPr>
+          <w:strike/>
+        </w:rPr>
+        <w:t xml:space="preserve"> on how much of the API and UI I get working (and migration scripts) working to </w:t>
+      </w:r>
+      <w:proofErr w:type="spellStart"/>
+      <w:r>
+        <w:rPr>
+          <w:strike/>
+        </w:rPr>
+        <w:t>postgresql</w:t>
+      </w:r>
+      <w:proofErr w:type="spellEnd"/>
+      <w:r>
+        <w:rPr>
+          <w:strike/>
+        </w:rPr>
+        <w:t xml:space="preserve"> this may be another point to talk about</w:t>
       </w:r>
     </w:p>
     <w:p/>
@@ -1501,15 +3052,154 @@
       </w:r>
     </w:p>
     <w:p>
+      <w:r>
+        <w:t xml:space="preserve">This </w:t>
+      </w:r>
+      <w:proofErr w:type="gramStart"/>
+      <w:r>
+        <w:t>project</w:t>
+      </w:r>
+      <w:proofErr w:type="gramEnd"/>
+      <w:r>
+        <w:t xml:space="preserve"> although interesting and fun to work </w:t>
+      </w:r>
+      <w:proofErr w:type="gramStart"/>
+      <w:r>
+        <w:t>on</w:t>
+      </w:r>
+      <w:proofErr w:type="gramEnd"/>
+      <w:r>
+        <w:t xml:space="preserve"> is short </w:t>
+      </w:r>
+      <w:proofErr w:type="gramStart"/>
+      <w:r>
+        <w:t>from</w:t>
+      </w:r>
+      <w:proofErr w:type="gramEnd"/>
+      <w:r>
+        <w:t xml:space="preserve"> being complete. I discovered throughout the project that </w:t>
+      </w:r>
+      <w:proofErr w:type="gramStart"/>
+      <w:r>
+        <w:t>there are things that</w:t>
+      </w:r>
+      <w:proofErr w:type="gramEnd"/>
+      <w:r>
+        <w:t xml:space="preserve"> aren't entirely working and won’t be by the end of this semester. </w:t>
+      </w:r>
+    </w:p>
+    <w:p>
+      <w:r>
+        <w:t xml:space="preserve">The first thing that isn’t entirely working is the </w:t>
+      </w:r>
+      <w:r>
+        <w:t xml:space="preserve">aspect of incomplete data from some of the different data sources. For example, the RIDB and NPS data sources have nearly complete data, however the MN DNR and MN GIS data sources are far from complete and </w:t>
+      </w:r>
+      <w:proofErr w:type="gramStart"/>
+      <w:r>
+        <w:t>actually may</w:t>
+      </w:r>
+      <w:proofErr w:type="gramEnd"/>
+      <w:r>
+        <w:t xml:space="preserve"> be better if they are merged. Therefore, the next step after this semester for this project will be to create a comprehensive process in this pipeline that would analyze locations via their latitude and longitude proximity and estimate which locations could either become children or parent locations and which ones should be merged into one. For example, I believe that the MN GIS and Google Places data sources both have location references to the same MN State Parks throughout the state. </w:t>
+      </w:r>
+    </w:p>
+    <w:p>
+      <w:r>
+        <w:t xml:space="preserve">Another limitation of this project is the non-completion of the optimistic goal for the </w:t>
+      </w:r>
+      <w:proofErr w:type="gramStart"/>
+      <w:r>
+        <w:t>project</w:t>
+      </w:r>
+      <w:proofErr w:type="gramEnd"/>
+      <w:r>
+        <w:t xml:space="preserve"> which was to migrate the data into PostgreSQL, and create </w:t>
+      </w:r>
+      <w:proofErr w:type="gramStart"/>
+      <w:r>
+        <w:t>a</w:t>
+      </w:r>
+      <w:proofErr w:type="gramEnd"/>
+      <w:r>
+        <w:t xml:space="preserve"> API and frontend layers to better demo the data to the class. The minimum viable project turned out to be more SQL queries in </w:t>
+      </w:r>
+      <w:proofErr w:type="spellStart"/>
+      <w:r>
+        <w:t>duckdb</w:t>
+      </w:r>
+      <w:proofErr w:type="spellEnd"/>
+      <w:r>
+        <w:t xml:space="preserve"> than I previously estimated which took more of my time there. </w:t>
+      </w:r>
+    </w:p>
+    <w:p>
+      <w:r>
+        <w:t xml:space="preserve">Also, as I was working on this project, I started thinking about if there were any ethical angles to this project. A few that I started thinking about is the use of the data collected from these data sources. For the sources used in this project, they were all found </w:t>
+      </w:r>
+      <w:proofErr w:type="gramStart"/>
+      <w:r>
+        <w:t>in</w:t>
+      </w:r>
+      <w:proofErr w:type="gramEnd"/>
+      <w:r>
+        <w:t xml:space="preserve"> public </w:t>
+      </w:r>
+      <w:proofErr w:type="gramStart"/>
+      <w:r>
+        <w:t>websites</w:t>
+      </w:r>
+      <w:proofErr w:type="gramEnd"/>
+      <w:r>
+        <w:t xml:space="preserve"> most of them managed by MN and federal governments. However, with the data collected from google, I need to ensure that after collecting the information that I have the legal right to share the information being I did collect it though Google’s main API. Google </w:t>
+      </w:r>
+      <w:r>
+        <w:lastRenderedPageBreak/>
+        <w:t xml:space="preserve">may be a bad example in this case scenario, but I’m thinking if I pursue this project further if I request datasets or find data elsewhere, what ethical </w:t>
+      </w:r>
+      <w:proofErr w:type="spellStart"/>
+      <w:r>
+        <w:t>consideradions</w:t>
+      </w:r>
+      <w:proofErr w:type="spellEnd"/>
+      <w:r>
+        <w:t xml:space="preserve"> should I take into mind with collecting and displaying the data on in my project (especially if I decide to publish it for others to use in the future). One </w:t>
+      </w:r>
+      <w:proofErr w:type="gramStart"/>
+      <w:r>
+        <w:t>such use</w:t>
+      </w:r>
+      <w:proofErr w:type="gramEnd"/>
+      <w:r>
+        <w:t xml:space="preserve"> case </w:t>
+      </w:r>
+      <w:proofErr w:type="gramStart"/>
+      <w:r>
+        <w:t>is web</w:t>
+      </w:r>
+      <w:proofErr w:type="gramEnd"/>
+      <w:r>
+        <w:t xml:space="preserve"> scraping common websites for information like Wikipedia, state and federal websites and others like tpl.org and </w:t>
+      </w:r>
+      <w:r>
+        <w:t xml:space="preserve">stateparks.com. Things to think about while working on this project. </w:t>
+      </w:r>
+    </w:p>
+    <w:p>
       <w:pPr>
         <w:pStyle w:val="ListParagraph"/>
         <w:numPr>
           <w:ilvl w:val="0"/>
           <w:numId w:val="8"/>
         </w:numPr>
-      </w:pPr>
-      <w:r>
-        <w:lastRenderedPageBreak/>
+        <w:rPr>
+          <w:strike/>
+        </w:rPr>
+      </w:pPr>
+      <w:r>
+        <w:rPr>
+          <w:strike/>
+        </w:rPr>
         <w:t>Describe any parts of project that might be wrong, incomplete, or otherwise lacking</w:t>
       </w:r>
     </w:p>
@@ -1520,8 +3210,14 @@
           <w:ilvl w:val="1"/>
           <w:numId w:val="8"/>
         </w:numPr>
-      </w:pPr>
-      <w:r>
+        <w:rPr>
+          <w:strike/>
+        </w:rPr>
+      </w:pPr>
+      <w:r>
+        <w:rPr>
+          <w:strike/>
+        </w:rPr>
         <w:t xml:space="preserve">The data. I was able to collect mostly comprehensive data on MN State Parks and MN National Park locations, however, information specific to campgrounds and such is still limited. </w:t>
       </w:r>
     </w:p>
@@ -1532,8 +3228,14 @@
           <w:ilvl w:val="1"/>
           <w:numId w:val="8"/>
         </w:numPr>
-      </w:pPr>
-      <w:r>
+        <w:rPr>
+          <w:strike/>
+        </w:rPr>
+      </w:pPr>
+      <w:r>
+        <w:rPr>
+          <w:strike/>
+        </w:rPr>
         <w:t xml:space="preserve">Only focused on the state of Minnesota. It would be a more powerful data layer if this would be focused on the entire United States. </w:t>
       </w:r>
     </w:p>
@@ -1544,9 +3246,29 @@
           <w:ilvl w:val="0"/>
           <w:numId w:val="8"/>
         </w:numPr>
-      </w:pPr>
-      <w:r>
-        <w:t xml:space="preserve">Not everything needs to be working but need to have understanding and honesty to point out these issues. </w:t>
+        <w:rPr>
+          <w:strike/>
+        </w:rPr>
+      </w:pPr>
+      <w:r>
+        <w:rPr>
+          <w:strike/>
+        </w:rPr>
+        <w:t xml:space="preserve">Not everything needs to be working but </w:t>
+      </w:r>
+      <w:proofErr w:type="gramStart"/>
+      <w:r>
+        <w:rPr>
+          <w:strike/>
+        </w:rPr>
+        <w:t>need</w:t>
+      </w:r>
+      <w:proofErr w:type="gramEnd"/>
+      <w:r>
+        <w:rPr>
+          <w:strike/>
+        </w:rPr>
+        <w:t xml:space="preserve"> to have understanding and honesty to point out these issues. </w:t>
       </w:r>
     </w:p>
     <w:p>
@@ -1556,8 +3278,14 @@
           <w:ilvl w:val="0"/>
           <w:numId w:val="8"/>
         </w:numPr>
-      </w:pPr>
-      <w:r>
+        <w:rPr>
+          <w:strike/>
+        </w:rPr>
+      </w:pPr>
+      <w:r>
+        <w:rPr>
+          <w:strike/>
+        </w:rPr>
         <w:t>Also mention any ethical issues that you can think of that may arise from your database</w:t>
       </w:r>
     </w:p>
@@ -1568,8 +3296,14 @@
           <w:ilvl w:val="1"/>
           <w:numId w:val="8"/>
         </w:numPr>
-      </w:pPr>
-      <w:r>
+        <w:rPr>
+          <w:strike/>
+        </w:rPr>
+      </w:pPr>
+      <w:r>
+        <w:rPr>
+          <w:strike/>
+        </w:rPr>
         <w:t xml:space="preserve">One ethical issue that I can think of is prior to releasing this tool, I need to confirm the use of the collected data. Yes, most of the information I collected was from state and federal government websites, but I still need to ensure that this data can be made publicly available on my personal website. </w:t>
       </w:r>
     </w:p>
@@ -1580,8 +3314,14 @@
           <w:ilvl w:val="1"/>
           <w:numId w:val="8"/>
         </w:numPr>
-      </w:pPr>
-      <w:r>
+        <w:rPr>
+          <w:strike/>
+        </w:rPr>
+      </w:pPr>
+      <w:r>
+        <w:rPr>
+          <w:strike/>
+        </w:rPr>
         <w:t xml:space="preserve">Unless I intend to ensure that all this information remains accurate, there is no way I can say that all this information is entirely accurate. Instead, I can share on the eventual production tool that I make publicly available that the information is up to date to the last time that I checked it. Custom tooling to re-retrieve the data and compare it to current production data would be important at this step. </w:t>
       </w:r>
     </w:p>
@@ -1592,9 +3332,43 @@
           <w:ilvl w:val="1"/>
           <w:numId w:val="8"/>
         </w:numPr>
-      </w:pPr>
-      <w:r>
-        <w:t>There may be limitations to what and how I use information on my website. For example, if I wanted to show any of the images on my tool’s website that Google has associated to certain locations, then I would have to make sure that I continue using the Google API and paying for it’s usage instead of downloading images from Google and then uploading those images to my own media server (unethical just to avoid paying Google for API uage.</w:t>
+        <w:rPr>
+          <w:strike/>
+        </w:rPr>
+      </w:pPr>
+      <w:r>
+        <w:rPr>
+          <w:strike/>
+        </w:rPr>
+        <w:t xml:space="preserve">There may be limitations to what and how I use information on my website. For example, if I wanted to show any of the images on my tool’s website that Google has associated to certain locations, then I would have to make sure that I continue using the Google API and paying for </w:t>
+      </w:r>
+      <w:proofErr w:type="spellStart"/>
+      <w:r>
+        <w:rPr>
+          <w:strike/>
+        </w:rPr>
+        <w:t>it’s</w:t>
+      </w:r>
+      <w:proofErr w:type="spellEnd"/>
+      <w:r>
+        <w:rPr>
+          <w:strike/>
+        </w:rPr>
+        <w:t xml:space="preserve"> usage instead of downloading images from Google and then uploading those images to my own media server (unethical just to avoid paying Google for API </w:t>
+      </w:r>
+      <w:proofErr w:type="spellStart"/>
+      <w:r>
+        <w:rPr>
+          <w:strike/>
+        </w:rPr>
+        <w:t>uage</w:t>
+      </w:r>
+      <w:proofErr w:type="spellEnd"/>
+      <w:r>
+        <w:rPr>
+          <w:strike/>
+        </w:rPr>
+        <w:t>.</w:t>
       </w:r>
     </w:p>
     <w:p/>
@@ -1614,6 +3388,7 @@
           <w:sz w:val="32"/>
           <w:szCs w:val="32"/>
         </w:rPr>
+        <w:lastRenderedPageBreak/>
         <w:t xml:space="preserve">Other Requirements: </w:t>
       </w:r>
     </w:p>
@@ -1695,7 +3470,6 @@
         </w:numPr>
       </w:pPr>
       <w:r>
-        <w:lastRenderedPageBreak/>
         <w:t>Better normalization of schema based on multiple data sources</w:t>
       </w:r>
     </w:p>
@@ -1711,7 +3485,15 @@
         <w:t>Advanced SQL (Spatial Extensions)</w:t>
       </w:r>
       <w:r>
-        <w:t xml:space="preserve"> – Note in Exploring Section and Building Section / Also with DuckDB schemas where each can have their own tables / also note joining table concept to show information and moving data around within a database maybe</w:t>
+        <w:t xml:space="preserve"> – Note in Exploring Section and Building Section / Also with </w:t>
+      </w:r>
+      <w:proofErr w:type="spellStart"/>
+      <w:r>
+        <w:t>DuckDB</w:t>
+      </w:r>
+      <w:proofErr w:type="spellEnd"/>
+      <w:r>
+        <w:t xml:space="preserve"> schemas where each can have their own tables / also note joining table concept to show information and moving data around within a database maybe</w:t>
       </w:r>
     </w:p>
     <w:p>
@@ -1723,7 +3505,23 @@
         </w:numPr>
       </w:pPr>
       <w:r>
-        <w:t xml:space="preserve">Use of the PostGIS Spatial Extension and the extension that DuckDB uses. </w:t>
+        <w:t xml:space="preserve">Use of the </w:t>
+      </w:r>
+      <w:proofErr w:type="spellStart"/>
+      <w:r>
+        <w:t>PostGIS</w:t>
+      </w:r>
+      <w:proofErr w:type="spellEnd"/>
+      <w:r>
+        <w:t xml:space="preserve"> Spatial Extension and the extension that </w:t>
+      </w:r>
+      <w:proofErr w:type="spellStart"/>
+      <w:r>
+        <w:t>DuckDB</w:t>
+      </w:r>
+      <w:proofErr w:type="spellEnd"/>
+      <w:r>
+        <w:t xml:space="preserve"> uses. </w:t>
       </w:r>
     </w:p>
     <w:p>
@@ -1753,7 +3551,15 @@
         <w:t>be</w:t>
       </w:r>
       <w:r>
-        <w:t xml:space="preserve"> committed to the final table which allows me to rollback and determine where the problematic data exists. This will be noted during the building section. Also, discuss Atomicity (A in ACID) (fails fallback) – Also, </w:t>
+        <w:t xml:space="preserve"> committed to the final table which allows me to </w:t>
+      </w:r>
+      <w:proofErr w:type="gramStart"/>
+      <w:r>
+        <w:t>rollback</w:t>
+      </w:r>
+      <w:proofErr w:type="gramEnd"/>
+      <w:r>
+        <w:t xml:space="preserve"> and determine where the problematic data exists. This will be noted during the building section. Also, discuss Atomicity (A in ACID) (fails fallback) – Also, </w:t>
       </w:r>
       <w:r>
         <w:t xml:space="preserve">figure out a way if not automatically shown to me a way to identify the problematic data that caused the script to fail. </w:t>
@@ -1830,7 +3636,11 @@
         <w:t xml:space="preserve">How. </w:t>
       </w:r>
       <w:r>
-        <w:t xml:space="preserve">The what section focuses on the technology that I plan on using, the why section discusses the reasoning behind this project and the how section outlines the pessimistic and optimistic plans for this project, based on the time I’m able to pour into this project throughout the remainder of the semester. The optimistic section also outlines other technologies that may be used if time allows. </w:t>
+        <w:t xml:space="preserve">The what section focuses on the technology that I plan on using, the why section discusses the reasoning behind this project and the how section outlines the pessimistic and optimistic plans for this project, </w:t>
+      </w:r>
+      <w:r>
+        <w:lastRenderedPageBreak/>
+        <w:t xml:space="preserve">based on the time I’m able to pour into this project throughout the remainder of the semester. The optimistic section also outlines other technologies that may be used if time allows. </w:t>
       </w:r>
     </w:p>
     <w:p/>
@@ -1848,12 +3658,35 @@
           <w:sz w:val="32"/>
           <w:szCs w:val="32"/>
         </w:rPr>
-        <w:lastRenderedPageBreak/>
         <w:t>What</w:t>
       </w:r>
       <w:r>
         <w:br/>
-        <w:t>For this project, I want to build a normalized relational database using DuckDB that aggregates publicly available data about Minnesota state park and NPS (National Park Service) park information. The idea is by using DuckDB I'll be able to incorporate and consolidate information from multiple various sources including but not limited to downloadable datasets, REST APIs and government data portals — into a single, queryable, well-structured schema</w:t>
+        <w:t xml:space="preserve">For this project, I want to build a normalized relational database using </w:t>
+      </w:r>
+      <w:proofErr w:type="spellStart"/>
+      <w:r>
+        <w:t>DuckDB</w:t>
+      </w:r>
+      <w:proofErr w:type="spellEnd"/>
+      <w:r>
+        <w:t xml:space="preserve"> that aggregates publicly available data about Minnesota state park and NPS (National Park Service) park information. The idea is by using </w:t>
+      </w:r>
+      <w:proofErr w:type="spellStart"/>
+      <w:r>
+        <w:t>DuckDB</w:t>
+      </w:r>
+      <w:proofErr w:type="spellEnd"/>
+      <w:r>
+        <w:t xml:space="preserve"> I'll be able to incorporate and consolidate information from multiple various sources including but not limited to downloadable datasets, REST APIs and government data portals — into a single, </w:t>
+      </w:r>
+      <w:proofErr w:type="spellStart"/>
+      <w:r>
+        <w:t>queryable</w:t>
+      </w:r>
+      <w:proofErr w:type="spellEnd"/>
+      <w:r>
+        <w:t>, well-structured schema</w:t>
       </w:r>
     </w:p>
     <w:p>
@@ -1878,7 +3711,7 @@
       <w:r>
         <w:t xml:space="preserve"> (</w:t>
       </w:r>
-      <w:hyperlink r:id="rId26" w:tgtFrame="_blank" w:history="1">
+      <w:hyperlink r:id="rId27" w:tgtFrame="_blank" w:history="1">
         <w:r>
           <w:rPr>
             <w:rStyle w:val="Hyperlink"/>
@@ -1907,7 +3740,7 @@
       <w:r>
         <w:t xml:space="preserve"> (</w:t>
       </w:r>
-      <w:hyperlink r:id="rId27" w:tgtFrame="_blank" w:history="1">
+      <w:hyperlink r:id="rId28" w:tgtFrame="_blank" w:history="1">
         <w:r>
           <w:rPr>
             <w:rStyle w:val="Hyperlink"/>
@@ -1936,7 +3769,7 @@
       <w:r>
         <w:t xml:space="preserve"> (</w:t>
       </w:r>
-      <w:hyperlink r:id="rId28" w:tgtFrame="_blank" w:history="1">
+      <w:hyperlink r:id="rId29" w:tgtFrame="_blank" w:history="1">
         <w:r>
           <w:rPr>
             <w:rStyle w:val="Hyperlink"/>
@@ -1969,7 +3802,15 @@
         <w:t>Other Sources to be identified</w:t>
       </w:r>
       <w:r>
-        <w:t xml:space="preserve"> - The data sources above are the first sources I have found. Once I finish my research I'll be limiting the schema scope to keep the project within the minimal viable project goal. </w:t>
+        <w:t xml:space="preserve"> - The data sources above are the first sources I have found. Once I finish my </w:t>
+      </w:r>
+      <w:proofErr w:type="gramStart"/>
+      <w:r>
+        <w:t>research</w:t>
+      </w:r>
+      <w:proofErr w:type="gramEnd"/>
+      <w:r>
+        <w:t xml:space="preserve"> I'll be limiting the schema scope to keep the project within the minimal viable project goal. </w:t>
       </w:r>
     </w:p>
     <w:p>
@@ -2010,16 +3851,32 @@
         <w:t>Explore More US</w:t>
       </w:r>
       <w:r>
-        <w:t>. I want this project to be one where an individual can have quick and easy access to state park and national park information in one place. Maybe even extending to campgrounds if the data is available. However, before I can move forward with the frontend, I have realized from my prior classes that having a proper data layer is just as important if not more so.</w:t>
-      </w:r>
-    </w:p>
-    <w:p>
-      <w:r>
-        <w:t xml:space="preserve">By choosing this project, it gives me a structured opportunity to apply the core concepts from this course such as normalization, schema design and query development to a </w:t>
+        <w:t xml:space="preserve">. I want this project to be one where an individual can have quick and easy access to state park and national park information in one place. Maybe even extending to campgrounds if the data is available. However, before I </w:t>
       </w:r>
       <w:r>
         <w:lastRenderedPageBreak/>
-        <w:t xml:space="preserve">project I not only care about but plan to continue forward with. Based on the focus with aggregating data from multiple different sources, it will also give me practical experience with DuckDB, which I have no prior experience using. </w:t>
+        <w:t>can move forward with the frontend, I have realized from my prior classes that having a proper data layer is just as important if not more so.</w:t>
+      </w:r>
+    </w:p>
+    <w:p>
+      <w:r>
+        <w:t xml:space="preserve">By choosing this project, it gives me a structured opportunity to apply the core concepts from this course such as normalization, schema design and query development to a project I not only care about but plan to continue forward with. Based on the focus </w:t>
+      </w:r>
+      <w:proofErr w:type="gramStart"/>
+      <w:r>
+        <w:t>with</w:t>
+      </w:r>
+      <w:proofErr w:type="gramEnd"/>
+      <w:r>
+        <w:t xml:space="preserve"> aggregating data from multiple different sources, it will also give me practical experience with </w:t>
+      </w:r>
+      <w:proofErr w:type="spellStart"/>
+      <w:r>
+        <w:t>DuckDB</w:t>
+      </w:r>
+      <w:proofErr w:type="spellEnd"/>
+      <w:r>
+        <w:t xml:space="preserve">, which I have no prior experience using. </w:t>
       </w:r>
     </w:p>
     <w:p>
@@ -2069,7 +3926,15 @@
     </w:p>
     <w:p>
       <w:r>
-        <w:t xml:space="preserve">My pessimistic goal for this final assignment is to structure a normalized database and populate it using DuckDB and at least 2 if not more sources that I noted in the </w:t>
+        <w:t xml:space="preserve">My pessimistic goal for this final assignment is to structure a normalized database and populate it using </w:t>
+      </w:r>
+      <w:proofErr w:type="spellStart"/>
+      <w:r>
+        <w:t>DuckDB</w:t>
+      </w:r>
+      <w:proofErr w:type="spellEnd"/>
+      <w:r>
+        <w:t xml:space="preserve"> and at least 2 if not more sources that I noted in the </w:t>
       </w:r>
       <w:r>
         <w:rPr>
@@ -2110,7 +3975,23 @@
         </w:numPr>
       </w:pPr>
       <w:r>
-        <w:t>Design a normalized schema - primary entities I'm currently planning on but will likely add more include locations, contacts, addresses, operating hours, activities and possibly (based on time) a structure focused on organizing campground data. The schema will be developed using some sort of ER Diagram tool that quite possibly will generate the DDL SQL code needed to use within DuckDB.</w:t>
+        <w:t xml:space="preserve">Design a normalized schema - primary entities I'm currently planning on but will likely add more include locations, contacts, addresses, operating hours, activities and possibly (based on time) a structure focused on organizing campground data. The schema will be developed using some sort of ER Diagram tool that quite possibly will generate the DDL SQL code needed to </w:t>
+      </w:r>
+      <w:proofErr w:type="gramStart"/>
+      <w:r>
+        <w:t>use</w:t>
+      </w:r>
+      <w:proofErr w:type="gramEnd"/>
+      <w:r>
+        <w:t xml:space="preserve"> within </w:t>
+      </w:r>
+      <w:proofErr w:type="spellStart"/>
+      <w:r>
+        <w:t>DuckDB</w:t>
+      </w:r>
+      <w:proofErr w:type="spellEnd"/>
+      <w:r>
+        <w:t>.</w:t>
       </w:r>
     </w:p>
     <w:p>
@@ -2121,8 +4002,13 @@
         </w:numPr>
       </w:pPr>
       <w:r>
-        <w:t>If needed write individual scripts (likely in Python) to clean, transform and load each source's data into DuckDB</w:t>
-      </w:r>
+        <w:t xml:space="preserve">If needed write individual scripts (likely in Python) to clean, transform and load each source's data into </w:t>
+      </w:r>
+      <w:proofErr w:type="spellStart"/>
+      <w:r>
+        <w:t>DuckDB</w:t>
+      </w:r>
+      <w:proofErr w:type="spellEnd"/>
     </w:p>
     <w:p>
       <w:pPr>
@@ -2132,7 +4018,15 @@
         </w:numPr>
       </w:pPr>
       <w:r>
-        <w:t xml:space="preserve">Validate the information with cross join queries aimed in ensuring that the information that exists in the DuckDB database is accurate to the sources the data is collected from. </w:t>
+        <w:t xml:space="preserve">Validate the information with cross join queries aimed in ensuring that the information that exists in the </w:t>
+      </w:r>
+      <w:proofErr w:type="spellStart"/>
+      <w:r>
+        <w:t>DuckDB</w:t>
+      </w:r>
+      <w:proofErr w:type="spellEnd"/>
+      <w:r>
+        <w:t xml:space="preserve"> database is accurate to the sources the data is collected from. </w:t>
       </w:r>
     </w:p>
     <w:p>
@@ -2144,11 +4038,20 @@
         <w:t>Planned Deliverable</w:t>
       </w:r>
       <w:r>
-        <w:t xml:space="preserve">: A populated .duckdb file, any python scripts created, ER diagram of the normalized schema created, and the final writeup and video. </w:t>
-      </w:r>
-    </w:p>
-    <w:p>
-      <w:r>
+        <w:t>: A populated .</w:t>
+      </w:r>
+      <w:proofErr w:type="spellStart"/>
+      <w:r>
+        <w:t>duckdb</w:t>
+      </w:r>
+      <w:proofErr w:type="spellEnd"/>
+      <w:r>
+        <w:t xml:space="preserve"> file, any python scripts created, ER diagram of the normalized schema created, and the final writeup and video. </w:t>
+      </w:r>
+    </w:p>
+    <w:p>
+      <w:r>
+        <w:lastRenderedPageBreak/>
         <w:pict w14:anchorId="34A51758">
           <v:rect id="_x0000_i1027" style="width:0;height:1.5pt" o:hralign="center" o:hrstd="t" o:hr="t" fillcolor="#a0a0a0" stroked="f"/>
         </w:pict>
@@ -2181,7 +4084,6 @@
         </w:numPr>
       </w:pPr>
       <w:r>
-        <w:lastRenderedPageBreak/>
         <w:t>Completed when checked</w:t>
       </w:r>
       <w:r>
@@ -2218,7 +4120,15 @@
         </w:numPr>
       </w:pPr>
       <w:r>
-        <w:t>GET /parks — list parks with filters (state, type, has_camping, etc...)</w:t>
+        <w:t xml:space="preserve">GET /parks — list parks with filters (state, type, </w:t>
+      </w:r>
+      <w:proofErr w:type="spellStart"/>
+      <w:r>
+        <w:t>has_camping</w:t>
+      </w:r>
+      <w:proofErr w:type="spellEnd"/>
+      <w:r>
+        <w:t>, etc...)</w:t>
       </w:r>
     </w:p>
     <w:p>
@@ -2240,7 +4150,15 @@
         </w:numPr>
       </w:pPr>
       <w:r>
-        <w:t xml:space="preserve">Build and connect a Map frontend UI (using React + OpenLayers map) to the API </w:t>
+        <w:t xml:space="preserve">Build and connect a Map frontend UI (using React + </w:t>
+      </w:r>
+      <w:proofErr w:type="spellStart"/>
+      <w:r>
+        <w:t>OpenLayers</w:t>
+      </w:r>
+      <w:proofErr w:type="spellEnd"/>
+      <w:r>
+        <w:t xml:space="preserve"> map) to the API </w:t>
       </w:r>
     </w:p>
     <w:p>
@@ -2278,7 +4196,7 @@
     </w:p>
     <w:p/>
     <w:sectPr>
-      <w:headerReference w:type="default" r:id="rId29"/>
+      <w:headerReference w:type="default" r:id="rId30"/>
       <w:pgSz w:w="12240" w:h="15840"/>
       <w:pgMar w:top="1440" w:right="1440" w:bottom="1440" w:left="1440" w:header="720" w:footer="720" w:gutter="0"/>
       <w:cols w:space="720"/>

</xml_diff>

<commit_message>
final project rough draft nearly finished with updates to er diagram
</commit_message>
<xml_diff>
--- a/GIS-Data-Migration-Project/Assignment Documents/Final Project - Part 2 - Final Project Rough Draft.docx
+++ b/GIS-Data-Migration-Project/Assignment Documents/Final Project - Part 2 - Final Project Rough Draft.docx
@@ -267,7 +267,23 @@
           <w:rFonts w:ascii="Times New Roman" w:eastAsia="Arial" w:hAnsi="Times New Roman" w:cs="Times New Roman"/>
           <w:color w:val="1A1A1A"/>
         </w:rPr>
-        <w:t xml:space="preserve">My optimistic goal for this project is to build on top of my minimal goals by creating a mini demo web application where the DuckDB data is migrated into a PostgreSQL database with the PostGIS extension for geospatial data installed. The front end would utilize React as a mapping UI with a similar feel to Google Maps. The backend would be a simple Django/Python API layer that would serve the data from the database to the frontend, following the pattern that we discussed in class where data doesn’t travel directly from the database to the client. </w:t>
+        <w:t xml:space="preserve">My optimistic goal for this project is to build on top of my minimal goals by creating a mini demo web application where the DuckDB data is migrated into a PostgreSQL database with the </w:t>
+      </w:r>
+      <w:proofErr w:type="spellStart"/>
+      <w:r>
+        <w:rPr>
+          <w:rFonts w:ascii="Times New Roman" w:eastAsia="Arial" w:hAnsi="Times New Roman" w:cs="Times New Roman"/>
+          <w:color w:val="1A1A1A"/>
+        </w:rPr>
+        <w:t>PostGIS</w:t>
+      </w:r>
+      <w:proofErr w:type="spellEnd"/>
+      <w:r>
+        <w:rPr>
+          <w:rFonts w:ascii="Times New Roman" w:eastAsia="Arial" w:hAnsi="Times New Roman" w:cs="Times New Roman"/>
+          <w:color w:val="1A1A1A"/>
+        </w:rPr>
+        <w:t xml:space="preserve"> extension for geospatial data installed. The front end would utilize React as a mapping UI with a similar feel to Google Maps. The backend would be a simple Django/Python API layer that would serve the data from the database to the frontend, following the pattern that we discussed in class where data doesn’t travel directly from the database to the client. </w:t>
       </w:r>
     </w:p>
     <w:p>
@@ -743,16 +759,6 @@
     <w:p>
       <w:pPr>
         <w:rPr>
-          <w:rFonts w:ascii="Times New Roman" w:hAnsi="Times New Roman" w:cs="Times New Roman"/>
-          <w:b/>
-          <w:bCs/>
-          <w:color w:val="156082" w:themeColor="accent1"/>
-        </w:rPr>
-      </w:pPr>
-    </w:p>
-    <w:p>
-      <w:pPr>
-        <w:rPr>
           <w:b/>
           <w:bCs/>
           <w:color w:val="156082" w:themeColor="accent1"/>
@@ -774,6 +780,2161 @@
     <w:p>
       <w:pPr>
         <w:rPr>
+          <w:rFonts w:ascii="Times New Roman" w:hAnsi="Times New Roman" w:cs="Times New Roman"/>
+        </w:rPr>
+      </w:pPr>
+      <w:r>
+        <w:rPr>
+          <w:rFonts w:ascii="Times New Roman" w:hAnsi="Times New Roman" w:cs="Times New Roman"/>
+        </w:rPr>
+        <w:t xml:space="preserve">What was built for this project is the foundation of a data processing pipeline that focuses on collecting and combining data from multiple different sources into one unified schema that can be used by any kind of application. The minimal viable goal was to create this pipeline and to be able to present views and queries showing the real collected and normalized data. </w:t>
+      </w:r>
+    </w:p>
+    <w:p>
+      <w:pPr>
+        <w:rPr>
+          <w:rFonts w:cs="Times New Roman"/>
+          <w:b/>
+          <w:bCs/>
+          <w:color w:val="156082" w:themeColor="accent1"/>
+          <w:sz w:val="28"/>
+          <w:szCs w:val="28"/>
+        </w:rPr>
+      </w:pPr>
+      <w:r>
+        <w:rPr>
+          <w:rFonts w:cs="Times New Roman"/>
+          <w:b/>
+          <w:bCs/>
+          <w:color w:val="156082" w:themeColor="accent1"/>
+          <w:sz w:val="28"/>
+          <w:szCs w:val="28"/>
+        </w:rPr>
+        <w:t>Data Sources</w:t>
+      </w:r>
+    </w:p>
+    <w:p>
+      <w:pPr>
+        <w:rPr>
+          <w:rFonts w:ascii="Times New Roman" w:hAnsi="Times New Roman" w:cs="Times New Roman"/>
+        </w:rPr>
+      </w:pPr>
+      <w:r>
+        <w:rPr>
+          <w:rFonts w:ascii="Times New Roman" w:hAnsi="Times New Roman" w:cs="Times New Roman"/>
+        </w:rPr>
+        <w:t>There were five data sources chosen for this project</w:t>
+      </w:r>
+      <w:r>
+        <w:rPr>
+          <w:rFonts w:ascii="Times New Roman" w:hAnsi="Times New Roman" w:cs="Times New Roman"/>
+        </w:rPr>
+        <w:t>:</w:t>
+      </w:r>
+    </w:p>
+    <w:p>
+      <w:pPr>
+        <w:pStyle w:val="ListParagraph"/>
+        <w:numPr>
+          <w:ilvl w:val="0"/>
+          <w:numId w:val="13"/>
+        </w:numPr>
+        <w:spacing w:after="120" w:line="240" w:lineRule="auto"/>
+        <w:contextualSpacing w:val="0"/>
+        <w:rPr>
+          <w:rFonts w:ascii="Times New Roman" w:hAnsi="Times New Roman" w:cs="Times New Roman"/>
+        </w:rPr>
+      </w:pPr>
+      <w:r>
+        <w:rPr>
+          <w:rFonts w:ascii="Times New Roman" w:eastAsia="Arial" w:hAnsi="Times New Roman" w:cs="Times New Roman"/>
+          <w:b/>
+          <w:bCs/>
+          <w:color w:val="1A1A1A"/>
+        </w:rPr>
+        <w:t>National Park Service (NPS) API</w:t>
+      </w:r>
+      <w:r>
+        <w:rPr>
+          <w:rFonts w:ascii="Times New Roman" w:eastAsia="Arial" w:hAnsi="Times New Roman" w:cs="Times New Roman"/>
+          <w:color w:val="1A1A1A"/>
+        </w:rPr>
+        <w:t xml:space="preserve"> — Publicly accessible (up to 1,000 requests/day), this API provides park descriptions, operating hours, contact information, addresses, activities, and entrance fees for all NPS-managed lands across the United States. (</w:t>
+      </w:r>
+      <w:hyperlink r:id="rId13" w:history="1">
+        <w:r>
+          <w:rPr>
+            <w:rFonts w:ascii="Times New Roman" w:eastAsia="Arial" w:hAnsi="Times New Roman" w:cs="Times New Roman"/>
+            <w:color w:val="0563C1"/>
+            <w:u w:val="single"/>
+          </w:rPr>
+          <w:t>nps.gov/subjects/developer</w:t>
+        </w:r>
+      </w:hyperlink>
+      <w:r>
+        <w:rPr>
+          <w:rFonts w:ascii="Times New Roman" w:eastAsia="Arial" w:hAnsi="Times New Roman" w:cs="Times New Roman"/>
+          <w:color w:val="1A1A1A"/>
+        </w:rPr>
+        <w:t>)</w:t>
+      </w:r>
+    </w:p>
+    <w:p>
+      <w:pPr>
+        <w:pStyle w:val="ListParagraph"/>
+        <w:numPr>
+          <w:ilvl w:val="0"/>
+          <w:numId w:val="13"/>
+        </w:numPr>
+        <w:spacing w:after="120" w:line="240" w:lineRule="auto"/>
+        <w:contextualSpacing w:val="0"/>
+        <w:rPr>
+          <w:rFonts w:ascii="Times New Roman" w:hAnsi="Times New Roman" w:cs="Times New Roman"/>
+        </w:rPr>
+      </w:pPr>
+      <w:r>
+        <w:rPr>
+          <w:rFonts w:ascii="Times New Roman" w:eastAsia="Arial" w:hAnsi="Times New Roman" w:cs="Times New Roman"/>
+          <w:b/>
+          <w:bCs/>
+          <w:color w:val="1A1A1A"/>
+        </w:rPr>
+        <w:t>Google Places API</w:t>
+      </w:r>
+      <w:r>
+        <w:rPr>
+          <w:rFonts w:ascii="Times New Roman" w:eastAsia="Arial" w:hAnsi="Times New Roman" w:cs="Times New Roman"/>
+          <w:color w:val="1A1A1A"/>
+        </w:rPr>
+        <w:t xml:space="preserve"> — Accessible through Google Cloud with up to 1,000 free requests per month. Used to retrieve location-level detail for </w:t>
+      </w:r>
+      <w:r>
+        <w:rPr>
+          <w:rFonts w:ascii="Times New Roman" w:eastAsia="Arial" w:hAnsi="Times New Roman" w:cs="Times New Roman"/>
+          <w:color w:val="1A1A1A"/>
+        </w:rPr>
+        <w:t xml:space="preserve">Minnesota State Forests, County Parks, State Parks, and City Parks. </w:t>
+      </w:r>
+    </w:p>
+    <w:p>
+      <w:pPr>
+        <w:pStyle w:val="ListParagraph"/>
+        <w:numPr>
+          <w:ilvl w:val="0"/>
+          <w:numId w:val="13"/>
+        </w:numPr>
+        <w:spacing w:after="120" w:line="240" w:lineRule="auto"/>
+        <w:contextualSpacing w:val="0"/>
+        <w:rPr>
+          <w:rFonts w:ascii="Times New Roman" w:hAnsi="Times New Roman" w:cs="Times New Roman"/>
+        </w:rPr>
+      </w:pPr>
+      <w:r>
+        <w:rPr>
+          <w:rFonts w:ascii="Times New Roman" w:eastAsia="Arial" w:hAnsi="Times New Roman" w:cs="Times New Roman"/>
+          <w:b/>
+          <w:bCs/>
+          <w:color w:val="1A1A1A"/>
+        </w:rPr>
+        <w:t>MN Geospatial Commons</w:t>
+      </w:r>
+      <w:r>
+        <w:rPr>
+          <w:rFonts w:ascii="Times New Roman" w:eastAsia="Arial" w:hAnsi="Times New Roman" w:cs="Times New Roman"/>
+          <w:color w:val="1A1A1A"/>
+        </w:rPr>
+        <w:t xml:space="preserve"> — Managed by the State of Minnesota, this source provided the State Parks, Recreation Areas and Waysides dataset in shapefile format — a geospatial vector data format used in GIS software. (</w:t>
+      </w:r>
+      <w:hyperlink r:id="rId14" w:history="1">
+        <w:r>
+          <w:rPr>
+            <w:rFonts w:ascii="Times New Roman" w:eastAsia="Arial" w:hAnsi="Times New Roman" w:cs="Times New Roman"/>
+            <w:color w:val="0563C1"/>
+            <w:u w:val="single"/>
+          </w:rPr>
+          <w:t>gisdata.mn.gov</w:t>
+        </w:r>
+      </w:hyperlink>
+      <w:r>
+        <w:rPr>
+          <w:rFonts w:ascii="Times New Roman" w:eastAsia="Arial" w:hAnsi="Times New Roman" w:cs="Times New Roman"/>
+          <w:color w:val="1A1A1A"/>
+        </w:rPr>
+        <w:t>)</w:t>
+      </w:r>
+    </w:p>
+    <w:p>
+      <w:pPr>
+        <w:pStyle w:val="ListParagraph"/>
+        <w:numPr>
+          <w:ilvl w:val="0"/>
+          <w:numId w:val="13"/>
+        </w:numPr>
+        <w:spacing w:after="120" w:line="240" w:lineRule="auto"/>
+        <w:contextualSpacing w:val="0"/>
+        <w:rPr>
+          <w:rFonts w:ascii="Times New Roman" w:hAnsi="Times New Roman" w:cs="Times New Roman"/>
+        </w:rPr>
+      </w:pPr>
+      <w:r>
+        <w:rPr>
+          <w:rFonts w:ascii="Times New Roman" w:eastAsia="Arial" w:hAnsi="Times New Roman" w:cs="Times New Roman"/>
+          <w:b/>
+          <w:bCs/>
+          <w:color w:val="1A1A1A"/>
+        </w:rPr>
+        <w:lastRenderedPageBreak/>
+        <w:t>Recreation.gov (RIDB)</w:t>
+      </w:r>
+      <w:r>
+        <w:rPr>
+          <w:rFonts w:ascii="Times New Roman" w:eastAsia="Arial" w:hAnsi="Times New Roman" w:cs="Times New Roman"/>
+          <w:color w:val="1A1A1A"/>
+        </w:rPr>
+        <w:t xml:space="preserve"> — A dataset representing campgrounds and recreation areas managed by federal agencies across the United States, provided as downloadable CSV files. (</w:t>
+      </w:r>
+      <w:hyperlink r:id="rId15" w:history="1">
+        <w:r>
+          <w:rPr>
+            <w:rFonts w:ascii="Times New Roman" w:eastAsia="Arial" w:hAnsi="Times New Roman" w:cs="Times New Roman"/>
+            <w:color w:val="0563C1"/>
+            <w:u w:val="single"/>
+          </w:rPr>
+          <w:t>ridb.recreation.gov/download</w:t>
+        </w:r>
+      </w:hyperlink>
+      <w:r>
+        <w:rPr>
+          <w:rFonts w:ascii="Times New Roman" w:eastAsia="Arial" w:hAnsi="Times New Roman" w:cs="Times New Roman"/>
+          <w:color w:val="1A1A1A"/>
+        </w:rPr>
+        <w:t>)</w:t>
+      </w:r>
+    </w:p>
+    <w:p>
+      <w:pPr>
+        <w:pStyle w:val="ListParagraph"/>
+        <w:numPr>
+          <w:ilvl w:val="0"/>
+          <w:numId w:val="13"/>
+        </w:numPr>
+        <w:spacing w:after="120" w:line="240" w:lineRule="auto"/>
+        <w:contextualSpacing w:val="0"/>
+        <w:rPr>
+          <w:rFonts w:ascii="Times New Roman" w:hAnsi="Times New Roman" w:cs="Times New Roman"/>
+        </w:rPr>
+      </w:pPr>
+      <w:r>
+        <w:rPr>
+          <w:rFonts w:ascii="Times New Roman" w:eastAsia="Arial" w:hAnsi="Times New Roman" w:cs="Times New Roman"/>
+          <w:b/>
+          <w:bCs/>
+          <w:color w:val="1A1A1A"/>
+        </w:rPr>
+        <w:t>MN DNR Park and Trail Guide</w:t>
+      </w:r>
+      <w:r>
+        <w:rPr>
+          <w:rFonts w:ascii="Times New Roman" w:eastAsia="Arial" w:hAnsi="Times New Roman" w:cs="Times New Roman"/>
+          <w:color w:val="1A1A1A"/>
+        </w:rPr>
+        <w:t xml:space="preserve"> — A map published and updated annually by the Minnesota DNR that outlines attribute-based information for every State Park and Recreational Area in Minnesota. (</w:t>
+      </w:r>
+      <w:hyperlink r:id="rId16" w:history="1">
+        <w:r>
+          <w:rPr>
+            <w:rFonts w:ascii="Times New Roman" w:eastAsia="Arial" w:hAnsi="Times New Roman" w:cs="Times New Roman"/>
+            <w:color w:val="0563C1"/>
+            <w:u w:val="single"/>
+          </w:rPr>
+          <w:t>2025 PDF</w:t>
+        </w:r>
+      </w:hyperlink>
+      <w:r>
+        <w:rPr>
+          <w:rFonts w:ascii="Times New Roman" w:eastAsia="Arial" w:hAnsi="Times New Roman" w:cs="Times New Roman"/>
+          <w:color w:val="1A1A1A"/>
+        </w:rPr>
+        <w:t>)</w:t>
+      </w:r>
+    </w:p>
+    <w:p>
+      <w:pPr>
+        <w:rPr>
+          <w:rFonts w:cs="Times New Roman"/>
+          <w:b/>
+          <w:bCs/>
+          <w:color w:val="156082" w:themeColor="accent1"/>
+          <w:sz w:val="28"/>
+          <w:szCs w:val="28"/>
+        </w:rPr>
+      </w:pPr>
+      <w:r>
+        <w:rPr>
+          <w:rFonts w:cs="Times New Roman"/>
+          <w:b/>
+          <w:bCs/>
+          <w:color w:val="156082" w:themeColor="accent1"/>
+          <w:sz w:val="28"/>
+          <w:szCs w:val="28"/>
+        </w:rPr>
+        <w:t>Data</w:t>
+      </w:r>
+      <w:r>
+        <w:rPr>
+          <w:rFonts w:cs="Times New Roman"/>
+          <w:b/>
+          <w:bCs/>
+          <w:color w:val="156082" w:themeColor="accent1"/>
+          <w:sz w:val="28"/>
+          <w:szCs w:val="28"/>
+        </w:rPr>
+        <w:t xml:space="preserve"> Collection Pipeline</w:t>
+      </w:r>
+    </w:p>
+    <w:p>
+      <w:pPr>
+        <w:spacing w:after="120" w:line="240" w:lineRule="auto"/>
+        <w:rPr>
+          <w:rFonts w:ascii="Times New Roman" w:hAnsi="Times New Roman" w:cs="Times New Roman"/>
+        </w:rPr>
+      </w:pPr>
+      <w:r>
+        <w:rPr>
+          <w:rFonts w:ascii="Times New Roman" w:hAnsi="Times New Roman" w:cs="Times New Roman"/>
+        </w:rPr>
+        <w:t xml:space="preserve">To get all the data imported into a DuckDB database for analysis and transformation, I created a Python script for each source, all managed by a single orchestrator script. The orchestrator script can be run from a command line shell and utilizes flags that are established per source to make it easy to run individual loaders during testing or </w:t>
+      </w:r>
+      <w:r>
+        <w:rPr>
+          <w:rFonts w:ascii="Times New Roman" w:hAnsi="Times New Roman" w:cs="Times New Roman"/>
+        </w:rPr>
+        <w:t>needing</w:t>
+      </w:r>
+      <w:r>
+        <w:rPr>
+          <w:rFonts w:ascii="Times New Roman" w:hAnsi="Times New Roman" w:cs="Times New Roman"/>
+        </w:rPr>
+        <w:t xml:space="preserve"> to re-import the information. This approach kept the iterative process of testing, reviewing output and fixing issues manageable.</w:t>
+      </w:r>
+      <w:r>
+        <w:rPr>
+          <w:rFonts w:ascii="Times New Roman" w:hAnsi="Times New Roman" w:cs="Times New Roman"/>
+        </w:rPr>
+        <w:t xml:space="preserve"> When this iterative process was complete, I simply ran the orchestrator script with the ‘--all’ flag to import all sources successfully into one single DuckDB database. For transparency purposes AI was used to create about 60% of these Python scripts. </w:t>
+      </w:r>
+    </w:p>
+    <w:p>
+      <w:pPr>
+        <w:spacing w:after="120" w:line="240" w:lineRule="auto"/>
+        <w:rPr>
+          <w:rFonts w:ascii="Times New Roman" w:hAnsi="Times New Roman" w:cs="Times New Roman"/>
+        </w:rPr>
+      </w:pPr>
+      <w:r>
+        <w:rPr>
+          <w:rFonts w:ascii="Times New Roman" w:hAnsi="Times New Roman" w:cs="Times New Roman"/>
+        </w:rPr>
+        <w:t>TODO: Image here</w:t>
+      </w:r>
+    </w:p>
+    <w:p>
+      <w:pPr>
+        <w:spacing w:after="120" w:line="240" w:lineRule="auto"/>
+        <w:rPr>
+          <w:rFonts w:ascii="Times New Roman" w:hAnsi="Times New Roman" w:cs="Times New Roman"/>
+        </w:rPr>
+      </w:pPr>
+      <w:r>
+        <w:rPr>
+          <w:rFonts w:ascii="Times New Roman" w:hAnsi="Times New Roman" w:cs="Times New Roman"/>
+        </w:rPr>
+        <w:t xml:space="preserve">One important DuckDB concept that is important to note here </w:t>
+      </w:r>
+      <w:r>
+        <w:rPr>
+          <w:rFonts w:ascii="Times New Roman" w:hAnsi="Times New Roman" w:cs="Times New Roman"/>
+        </w:rPr>
+        <w:t xml:space="preserve">is </w:t>
+      </w:r>
+      <w:proofErr w:type="spellStart"/>
+      <w:r>
+        <w:rPr>
+          <w:rFonts w:ascii="Times New Roman" w:hAnsi="Times New Roman" w:cs="Times New Roman"/>
+        </w:rPr>
+        <w:t>DuckDB’s</w:t>
+      </w:r>
+      <w:proofErr w:type="spellEnd"/>
+      <w:r>
+        <w:rPr>
+          <w:rFonts w:ascii="Times New Roman" w:hAnsi="Times New Roman" w:cs="Times New Roman"/>
+        </w:rPr>
+        <w:t xml:space="preserve"> SCHEMA feature. This feature allowed me to organize the data from all the different sources into individual namespaces. All I needed to do then with these namespaces was include the namespace definition when created ahead of each table when querying that specific data source. </w:t>
+      </w:r>
+      <w:r>
+        <w:rPr>
+          <w:rFonts w:ascii="Times New Roman" w:hAnsi="Times New Roman" w:cs="Times New Roman"/>
+        </w:rPr>
+        <w:t xml:space="preserve">I set up the Python scripts to create a unique and associable namespace within the same DuckDB database for each data source which allowed me to efficiently and easily manage all the tables across all five sources efficiently without naming conflicts or confusion. For example, the NPS source data lives under a </w:t>
+      </w:r>
+      <w:proofErr w:type="spellStart"/>
+      <w:r>
+        <w:rPr>
+          <w:rFonts w:ascii="Times New Roman" w:hAnsi="Times New Roman" w:cs="Times New Roman"/>
+          <w:b/>
+          <w:bCs/>
+        </w:rPr>
+        <w:t>nps</w:t>
+      </w:r>
+      <w:proofErr w:type="spellEnd"/>
+      <w:r>
+        <w:rPr>
+          <w:rFonts w:ascii="Times New Roman" w:hAnsi="Times New Roman" w:cs="Times New Roman"/>
+        </w:rPr>
+        <w:t xml:space="preserve"> schema, while the MN GIS data lives under a </w:t>
+      </w:r>
+      <w:proofErr w:type="spellStart"/>
+      <w:r>
+        <w:rPr>
+          <w:rFonts w:ascii="Times New Roman" w:hAnsi="Times New Roman" w:cs="Times New Roman"/>
+          <w:b/>
+          <w:bCs/>
+        </w:rPr>
+        <w:t>mn_gis</w:t>
+      </w:r>
+      <w:proofErr w:type="spellEnd"/>
+      <w:r>
+        <w:rPr>
+          <w:rFonts w:ascii="Times New Roman" w:hAnsi="Times New Roman" w:cs="Times New Roman"/>
+        </w:rPr>
+        <w:t xml:space="preserve"> schema. </w:t>
+      </w:r>
+    </w:p>
+    <w:p>
+      <w:pPr>
+        <w:spacing w:after="120" w:line="240" w:lineRule="auto"/>
+        <w:rPr>
+          <w:rFonts w:ascii="Times New Roman" w:hAnsi="Times New Roman" w:cs="Times New Roman"/>
+        </w:rPr>
+      </w:pPr>
+    </w:p>
+    <w:p>
+      <w:pPr>
+        <w:jc w:val="center"/>
+        <w:rPr>
+          <w:rFonts w:ascii="Times New Roman" w:eastAsia="Arial" w:hAnsi="Times New Roman" w:cs="Times New Roman"/>
+          <w:color w:val="1A1A1A"/>
+        </w:rPr>
+      </w:pPr>
+      <w:r>
+        <w:rPr>
+          <w:noProof/>
+        </w:rPr>
+        <w:drawing>
+          <wp:inline distT="0" distB="0" distL="0" distR="0" wp14:anchorId="524C1FF1" wp14:editId="4D7240CC">
+            <wp:extent cx="3580952" cy="1571429"/>
+            <wp:effectExtent l="0" t="0" r="635" b="0"/>
+            <wp:docPr id="1517017527" name="Picture 1"/>
+            <wp:cNvGraphicFramePr>
+              <a:graphicFrameLocks xmlns:a="http://schemas.openxmlformats.org/drawingml/2006/main" noChangeAspect="1"/>
+            </wp:cNvGraphicFramePr>
+            <a:graphic xmlns:a="http://schemas.openxmlformats.org/drawingml/2006/main">
+              <a:graphicData uri="http://schemas.openxmlformats.org/drawingml/2006/picture">
+                <pic:pic xmlns:pic="http://schemas.openxmlformats.org/drawingml/2006/picture">
+                  <pic:nvPicPr>
+                    <pic:cNvPr id="1517017527" name=""/>
+                    <pic:cNvPicPr/>
+                  </pic:nvPicPr>
+                  <pic:blipFill>
+                    <a:blip r:embed="rId17"/>
+                    <a:stretch>
+                      <a:fillRect/>
+                    </a:stretch>
+                  </pic:blipFill>
+                  <pic:spPr>
+                    <a:xfrm>
+                      <a:off x="0" y="0"/>
+                      <a:ext cx="3580952" cy="1571429"/>
+                    </a:xfrm>
+                    <a:prstGeom prst="rect">
+                      <a:avLst/>
+                    </a:prstGeom>
+                  </pic:spPr>
+                </pic:pic>
+              </a:graphicData>
+            </a:graphic>
+          </wp:inline>
+        </w:drawing>
+      </w:r>
+    </w:p>
+    <w:p>
+      <w:pPr>
+        <w:jc w:val="center"/>
+        <w:rPr>
+          <w:rFonts w:ascii="Times New Roman" w:eastAsia="Arial" w:hAnsi="Times New Roman" w:cs="Times New Roman"/>
+          <w:color w:val="1A1A1A"/>
+          <w:sz w:val="20"/>
+          <w:szCs w:val="20"/>
+        </w:rPr>
+      </w:pPr>
+      <w:r>
+        <w:rPr>
+          <w:rFonts w:ascii="Times New Roman" w:eastAsia="Arial" w:hAnsi="Times New Roman" w:cs="Times New Roman"/>
+          <w:color w:val="1A1A1A"/>
+          <w:sz w:val="20"/>
+          <w:szCs w:val="20"/>
+        </w:rPr>
+        <w:t xml:space="preserve">DuckDB Database structure view within </w:t>
+      </w:r>
+      <w:proofErr w:type="spellStart"/>
+      <w:r>
+        <w:rPr>
+          <w:rFonts w:ascii="Times New Roman" w:eastAsia="Arial" w:hAnsi="Times New Roman" w:cs="Times New Roman"/>
+          <w:color w:val="1A1A1A"/>
+          <w:sz w:val="20"/>
+          <w:szCs w:val="20"/>
+        </w:rPr>
+        <w:t>DBeaver</w:t>
+      </w:r>
+      <w:proofErr w:type="spellEnd"/>
+      <w:r>
+        <w:rPr>
+          <w:rFonts w:ascii="Times New Roman" w:eastAsia="Arial" w:hAnsi="Times New Roman" w:cs="Times New Roman"/>
+          <w:color w:val="1A1A1A"/>
+          <w:sz w:val="20"/>
+          <w:szCs w:val="20"/>
+        </w:rPr>
+        <w:t xml:space="preserve"> DBMS</w:t>
+      </w:r>
+    </w:p>
+    <w:p>
+      <w:pPr>
+        <w:rPr>
+          <w:rFonts w:ascii="Times New Roman" w:hAnsi="Times New Roman" w:cs="Times New Roman"/>
+        </w:rPr>
+      </w:pPr>
+      <w:r>
+        <w:rPr>
+          <w:rFonts w:ascii="Times New Roman" w:eastAsia="Arial" w:hAnsi="Times New Roman" w:cs="Times New Roman"/>
+          <w:color w:val="1A1A1A"/>
+        </w:rPr>
+        <w:t xml:space="preserve">Reference: </w:t>
+      </w:r>
+      <w:hyperlink r:id="rId18" w:history="1">
+        <w:r>
+          <w:rPr>
+            <w:rFonts w:ascii="Times New Roman" w:eastAsia="Arial" w:hAnsi="Times New Roman" w:cs="Times New Roman"/>
+            <w:color w:val="0563C1"/>
+            <w:u w:val="single"/>
+          </w:rPr>
+          <w:t>DuckDB Schema Documentation</w:t>
+        </w:r>
+      </w:hyperlink>
+    </w:p>
+    <w:p>
+      <w:pPr>
+        <w:pStyle w:val="Heading2"/>
+        <w:rPr>
+          <w:rFonts w:ascii="Arial" w:eastAsia="Arial" w:hAnsi="Arial" w:cs="Arial"/>
+          <w:b/>
+          <w:bCs/>
+          <w:color w:val="156082" w:themeColor="accent1"/>
+          <w:sz w:val="26"/>
+          <w:szCs w:val="26"/>
+        </w:rPr>
+      </w:pPr>
+      <w:r>
+        <w:rPr>
+          <w:rFonts w:ascii="Arial" w:eastAsia="Arial" w:hAnsi="Arial" w:cs="Arial"/>
+          <w:b/>
+          <w:bCs/>
+          <w:color w:val="156082" w:themeColor="accent1"/>
+          <w:sz w:val="26"/>
+          <w:szCs w:val="26"/>
+        </w:rPr>
+        <w:lastRenderedPageBreak/>
+        <w:t>Normalized Database Design</w:t>
+      </w:r>
+    </w:p>
+    <w:p>
+      <w:pPr>
+        <w:rPr>
+          <w:rFonts w:ascii="Times New Roman" w:hAnsi="Times New Roman" w:cs="Times New Roman"/>
+        </w:rPr>
+      </w:pPr>
+      <w:r>
+        <w:rPr>
+          <w:rFonts w:ascii="Times New Roman" w:hAnsi="Times New Roman" w:cs="Times New Roman"/>
+        </w:rPr>
+        <w:t>Once all data was imported and organized into the source-specific schema namespaces within DuckDB, the next step was to create a normalized database schema to transform all the source data into. Before writing any SQL code for this normalized database schema, I used Oracle’s SQL Data Modeler tool to design a comprehensive, intuitive, and normalized database managing the following entities: Locations, Operating Hours, Operating Hours Times, Media, Phone Numbers, Email Addresses, Addresses and Websites, some with their own corresponding type tables.</w:t>
+      </w:r>
+    </w:p>
+    <w:p>
+      <w:pPr>
+        <w:rPr>
+          <w:rFonts w:cs="Times New Roman"/>
+          <w:b/>
+          <w:bCs/>
+          <w:color w:val="156082" w:themeColor="accent1"/>
+          <w:sz w:val="28"/>
+          <w:szCs w:val="28"/>
+        </w:rPr>
+      </w:pPr>
+      <w:r>
+        <w:rPr>
+          <w:rFonts w:cs="Times New Roman"/>
+          <w:b/>
+          <w:bCs/>
+          <w:color w:val="156082" w:themeColor="accent1"/>
+          <w:sz w:val="28"/>
+          <w:szCs w:val="28"/>
+        </w:rPr>
+        <w:t xml:space="preserve">Data Modeling </w:t>
+      </w:r>
+      <w:r>
+        <w:rPr>
+          <w:rFonts w:cs="Times New Roman"/>
+          <w:b/>
+          <w:bCs/>
+          <w:color w:val="156082" w:themeColor="accent1"/>
+          <w:sz w:val="28"/>
+          <w:szCs w:val="28"/>
+        </w:rPr>
+        <w:t>–</w:t>
+      </w:r>
+      <w:r>
+        <w:rPr>
+          <w:rFonts w:cs="Times New Roman"/>
+          <w:b/>
+          <w:bCs/>
+          <w:color w:val="156082" w:themeColor="accent1"/>
+          <w:sz w:val="28"/>
+          <w:szCs w:val="28"/>
+        </w:rPr>
+        <w:t xml:space="preserve"> </w:t>
+      </w:r>
+      <w:r>
+        <w:rPr>
+          <w:rFonts w:cs="Times New Roman"/>
+          <w:b/>
+          <w:bCs/>
+          <w:sz w:val="28"/>
+          <w:szCs w:val="28"/>
+        </w:rPr>
+        <w:t>Logical and Relational ER Diagrams</w:t>
+      </w:r>
+    </w:p>
+    <w:p>
+      <w:pPr>
+        <w:rPr>
+          <w:rFonts w:ascii="Times New Roman" w:hAnsi="Times New Roman" w:cs="Times New Roman"/>
+          <w:i/>
+          <w:iCs/>
+        </w:rPr>
+      </w:pPr>
+      <w:r>
+        <w:rPr>
+          <w:rFonts w:ascii="Times New Roman" w:hAnsi="Times New Roman" w:cs="Times New Roman"/>
+        </w:rPr>
+        <w:tab/>
+        <w:t xml:space="preserve">Textbook Reference: </w:t>
+      </w:r>
+      <w:r>
+        <w:rPr>
+          <w:rFonts w:ascii="Times New Roman" w:hAnsi="Times New Roman" w:cs="Times New Roman"/>
+          <w:i/>
+          <w:iCs/>
+        </w:rPr>
+        <w:t>Chapter 5; Understanding Entity Relationship Diagrams</w:t>
+      </w:r>
+    </w:p>
+    <w:p>
+      <w:pPr>
+        <w:rPr>
+          <w:rFonts w:cs="Times New Roman"/>
+          <w:b/>
+          <w:bCs/>
+          <w:color w:val="156082" w:themeColor="accent1"/>
+          <w:sz w:val="28"/>
+          <w:szCs w:val="28"/>
+        </w:rPr>
+      </w:pPr>
+      <w:r>
+        <w:rPr>
+          <w:rFonts w:cs="Times New Roman"/>
+          <w:b/>
+          <w:bCs/>
+          <w:color w:val="156082" w:themeColor="accent1"/>
+          <w:sz w:val="28"/>
+          <w:szCs w:val="28"/>
+        </w:rPr>
+        <w:t>Logical Model</w:t>
+      </w:r>
+    </w:p>
+    <w:p>
+      <w:pPr>
+        <w:rPr>
+          <w:rFonts w:ascii="Times New Roman" w:hAnsi="Times New Roman" w:cs="Times New Roman"/>
+        </w:rPr>
+      </w:pPr>
+      <w:r>
+        <w:rPr>
+          <w:rFonts w:ascii="Times New Roman" w:hAnsi="Times New Roman" w:cs="Times New Roman"/>
+        </w:rPr>
+        <w:t xml:space="preserve">The logical model outlines all the planned entities, their attributes, and the relationships between them. The key design decisions that I included while crafting the logical model includes: </w:t>
+      </w:r>
+    </w:p>
+    <w:p>
+      <w:pPr>
+        <w:pStyle w:val="ListParagraph"/>
+        <w:numPr>
+          <w:ilvl w:val="0"/>
+          <w:numId w:val="12"/>
+        </w:numPr>
+        <w:rPr>
+          <w:rFonts w:ascii="Times New Roman" w:hAnsi="Times New Roman" w:cs="Times New Roman"/>
+        </w:rPr>
+      </w:pPr>
+      <w:r>
+        <w:rPr>
+          <w:rFonts w:ascii="Times New Roman" w:hAnsi="Times New Roman" w:cs="Times New Roman"/>
+        </w:rPr>
+        <w:t>The Locations entity has a self-referencing relationship, enabling easy to establish and query hierarchical location structures where campground locations can be classified as children of state parks, national parks and other parent locations. This relationship is one-to-</w:t>
+      </w:r>
+      <w:r>
+        <w:rPr>
+          <w:rFonts w:ascii="Times New Roman" w:hAnsi="Times New Roman" w:cs="Times New Roman"/>
+        </w:rPr>
+        <w:t>many</w:t>
+      </w:r>
+      <w:r>
+        <w:rPr>
+          <w:rFonts w:ascii="Times New Roman" w:hAnsi="Times New Roman" w:cs="Times New Roman"/>
+        </w:rPr>
+        <w:t xml:space="preserve"> optional, meaning a location may </w:t>
+      </w:r>
+      <w:r>
+        <w:rPr>
+          <w:rFonts w:ascii="Times New Roman" w:hAnsi="Times New Roman" w:cs="Times New Roman"/>
+        </w:rPr>
+        <w:t xml:space="preserve">or may not have a parent or a child but a given parent location can be associate with many children locations. </w:t>
+      </w:r>
+    </w:p>
+    <w:p>
+      <w:pPr>
+        <w:pStyle w:val="ListParagraph"/>
+        <w:numPr>
+          <w:ilvl w:val="0"/>
+          <w:numId w:val="12"/>
+        </w:numPr>
+        <w:rPr>
+          <w:rFonts w:ascii="Times New Roman" w:hAnsi="Times New Roman" w:cs="Times New Roman"/>
+        </w:rPr>
+      </w:pPr>
+      <w:r>
+        <w:rPr>
+          <w:rFonts w:ascii="Times New Roman" w:hAnsi="Times New Roman" w:cs="Times New Roman"/>
+        </w:rPr>
+        <w:t>Data Source and Location Type entities are required associations for any location record. Meaning that a location cannot exist without both a data source and location type. However, both types can exist without any locations assigned to them.</w:t>
+      </w:r>
+    </w:p>
+    <w:p>
+      <w:pPr>
+        <w:pStyle w:val="ListParagraph"/>
+        <w:numPr>
+          <w:ilvl w:val="0"/>
+          <w:numId w:val="12"/>
+        </w:numPr>
+        <w:rPr>
+          <w:rFonts w:ascii="Times New Roman" w:hAnsi="Times New Roman" w:cs="Times New Roman"/>
+        </w:rPr>
+      </w:pPr>
+      <w:r>
+        <w:rPr>
+          <w:rFonts w:ascii="Times New Roman" w:hAnsi="Times New Roman" w:cs="Times New Roman"/>
+        </w:rPr>
+        <w:t xml:space="preserve">Websites, Addresses, Media, Phone Numbers, Email Addresses, and Operating Hours entities, all have a one-to-many relationship with the Locations entity. Each of these entities must belong to exactly one location, but a single location can have zero to many of each of these entities. </w:t>
+      </w:r>
+    </w:p>
+    <w:p>
+      <w:pPr>
+        <w:pStyle w:val="ListParagraph"/>
+        <w:numPr>
+          <w:ilvl w:val="0"/>
+          <w:numId w:val="12"/>
+        </w:numPr>
+        <w:rPr>
+          <w:rFonts w:ascii="Times New Roman" w:hAnsi="Times New Roman" w:cs="Times New Roman"/>
+        </w:rPr>
+      </w:pPr>
+      <w:r>
+        <w:rPr>
+          <w:rFonts w:ascii="Times New Roman" w:hAnsi="Times New Roman" w:cs="Times New Roman"/>
+        </w:rPr>
+        <w:t>Type tables for Websites, Addresses, and Media allow for deduplication of repeated type labels across hundreds of thousands of potential records, directly reducing data redundancy</w:t>
+      </w:r>
+    </w:p>
+    <w:p>
+      <w:pPr>
+        <w:pStyle w:val="ListParagraph"/>
+        <w:numPr>
+          <w:ilvl w:val="0"/>
+          <w:numId w:val="12"/>
+        </w:numPr>
+        <w:rPr>
+          <w:rFonts w:ascii="Times New Roman" w:hAnsi="Times New Roman" w:cs="Times New Roman"/>
+        </w:rPr>
+      </w:pPr>
+      <w:r>
+        <w:rPr>
+          <w:rFonts w:ascii="Times New Roman" w:hAnsi="Times New Roman" w:cs="Times New Roman"/>
+        </w:rPr>
+        <w:t xml:space="preserve">The Operating </w:t>
+      </w:r>
+      <w:proofErr w:type="spellStart"/>
+      <w:r>
+        <w:rPr>
+          <w:rFonts w:ascii="Times New Roman" w:hAnsi="Times New Roman" w:cs="Times New Roman"/>
+        </w:rPr>
+        <w:t>Hours Time</w:t>
+      </w:r>
+      <w:proofErr w:type="spellEnd"/>
+      <w:r>
+        <w:rPr>
+          <w:rFonts w:ascii="Times New Roman" w:hAnsi="Times New Roman" w:cs="Times New Roman"/>
+        </w:rPr>
+        <w:t xml:space="preserve"> table that associates to the Operating Hours entity stores individual day-level time records. This is more structured and queryable than storing a JSON column per day on the Operating Hours table directly. </w:t>
+      </w:r>
+    </w:p>
+    <w:p>
+      <w:pPr>
+        <w:rPr>
+          <w:rFonts w:ascii="Times New Roman" w:hAnsi="Times New Roman" w:cs="Times New Roman"/>
+        </w:rPr>
+      </w:pPr>
+      <w:r>
+        <w:rPr>
+          <w:noProof/>
+        </w:rPr>
+        <w:lastRenderedPageBreak/>
+        <w:drawing>
+          <wp:inline distT="0" distB="0" distL="0" distR="0" wp14:anchorId="47336DFF" wp14:editId="2FDFEE1F">
+            <wp:extent cx="5943600" cy="3634105"/>
+            <wp:effectExtent l="0" t="0" r="0" b="4445"/>
+            <wp:docPr id="880548771" name="Picture 1"/>
+            <wp:cNvGraphicFramePr>
+              <a:graphicFrameLocks xmlns:a="http://schemas.openxmlformats.org/drawingml/2006/main" noChangeAspect="1"/>
+            </wp:cNvGraphicFramePr>
+            <a:graphic xmlns:a="http://schemas.openxmlformats.org/drawingml/2006/main">
+              <a:graphicData uri="http://schemas.openxmlformats.org/drawingml/2006/picture">
+                <pic:pic xmlns:pic="http://schemas.openxmlformats.org/drawingml/2006/picture">
+                  <pic:nvPicPr>
+                    <pic:cNvPr id="880548771" name=""/>
+                    <pic:cNvPicPr/>
+                  </pic:nvPicPr>
+                  <pic:blipFill>
+                    <a:blip r:embed="rId19"/>
+                    <a:stretch>
+                      <a:fillRect/>
+                    </a:stretch>
+                  </pic:blipFill>
+                  <pic:spPr>
+                    <a:xfrm>
+                      <a:off x="0" y="0"/>
+                      <a:ext cx="5943600" cy="3634105"/>
+                    </a:xfrm>
+                    <a:prstGeom prst="rect">
+                      <a:avLst/>
+                    </a:prstGeom>
+                  </pic:spPr>
+                </pic:pic>
+              </a:graphicData>
+            </a:graphic>
+          </wp:inline>
+        </w:drawing>
+      </w:r>
+    </w:p>
+    <w:p>
+      <w:pPr>
+        <w:jc w:val="center"/>
+        <w:rPr>
+          <w:rFonts w:ascii="Times New Roman" w:hAnsi="Times New Roman" w:cs="Times New Roman"/>
+          <w:sz w:val="20"/>
+          <w:szCs w:val="20"/>
+        </w:rPr>
+      </w:pPr>
+      <w:r>
+        <w:rPr>
+          <w:rFonts w:ascii="Times New Roman" w:hAnsi="Times New Roman" w:cs="Times New Roman"/>
+          <w:sz w:val="20"/>
+          <w:szCs w:val="20"/>
+        </w:rPr>
+        <w:t>Logical</w:t>
+      </w:r>
+      <w:r>
+        <w:rPr>
+          <w:rFonts w:ascii="Times New Roman" w:hAnsi="Times New Roman" w:cs="Times New Roman"/>
+          <w:sz w:val="20"/>
+          <w:szCs w:val="20"/>
+        </w:rPr>
+        <w:t xml:space="preserve"> mod</w:t>
+      </w:r>
+      <w:r>
+        <w:rPr>
+          <w:rFonts w:ascii="Times New Roman" w:hAnsi="Times New Roman" w:cs="Times New Roman"/>
+          <w:sz w:val="20"/>
+          <w:szCs w:val="20"/>
+        </w:rPr>
+        <w:t>el</w:t>
+      </w:r>
+      <w:r>
+        <w:rPr>
+          <w:rFonts w:ascii="Times New Roman" w:hAnsi="Times New Roman" w:cs="Times New Roman"/>
+          <w:sz w:val="20"/>
+          <w:szCs w:val="20"/>
+        </w:rPr>
+        <w:t xml:space="preserve"> of normalized DuckDB database schema created to transform data from sources into.</w:t>
+      </w:r>
+    </w:p>
+    <w:p>
+      <w:pPr>
+        <w:rPr>
+          <w:rFonts w:cs="Times New Roman"/>
+          <w:b/>
+          <w:bCs/>
+          <w:color w:val="156082" w:themeColor="accent1"/>
+          <w:sz w:val="28"/>
+          <w:szCs w:val="28"/>
+        </w:rPr>
+      </w:pPr>
+      <w:r>
+        <w:rPr>
+          <w:rFonts w:cs="Times New Roman"/>
+          <w:b/>
+          <w:bCs/>
+          <w:color w:val="156082" w:themeColor="accent1"/>
+          <w:sz w:val="28"/>
+          <w:szCs w:val="28"/>
+        </w:rPr>
+        <w:t>Relational Model</w:t>
+      </w:r>
+    </w:p>
+    <w:p>
+      <w:pPr>
+        <w:rPr>
+          <w:rFonts w:ascii="Times New Roman" w:hAnsi="Times New Roman" w:cs="Times New Roman"/>
+        </w:rPr>
+      </w:pPr>
+      <w:r>
+        <w:rPr>
+          <w:rFonts w:ascii="Times New Roman" w:hAnsi="Times New Roman" w:cs="Times New Roman"/>
+        </w:rPr>
+        <w:t>The generated relational model shows that all the relationships established in the logical model were at the most one-to-many, which does not generate any connecting or junction tables. Foreign keys and foreign key constraint classifiers are also visible within the relational ER Diagram. In all its glory, this relational model was used as the exact design to code up the normalized DuckDB DDL code.</w:t>
+      </w:r>
+    </w:p>
+    <w:p>
+      <w:pPr>
+        <w:rPr>
+          <w:rFonts w:ascii="Times New Roman" w:hAnsi="Times New Roman" w:cs="Times New Roman"/>
+        </w:rPr>
+      </w:pPr>
+      <w:r>
+        <w:rPr>
+          <w:noProof/>
+        </w:rPr>
+        <w:lastRenderedPageBreak/>
+        <w:drawing>
+          <wp:inline distT="0" distB="0" distL="0" distR="0" wp14:anchorId="50C7F72B" wp14:editId="4D31F1D2">
+            <wp:extent cx="5943600" cy="2984500"/>
+            <wp:effectExtent l="0" t="0" r="0" b="6350"/>
+            <wp:docPr id="1308353292" name="Picture 1"/>
+            <wp:cNvGraphicFramePr>
+              <a:graphicFrameLocks xmlns:a="http://schemas.openxmlformats.org/drawingml/2006/main" noChangeAspect="1"/>
+            </wp:cNvGraphicFramePr>
+            <a:graphic xmlns:a="http://schemas.openxmlformats.org/drawingml/2006/main">
+              <a:graphicData uri="http://schemas.openxmlformats.org/drawingml/2006/picture">
+                <pic:pic xmlns:pic="http://schemas.openxmlformats.org/drawingml/2006/picture">
+                  <pic:nvPicPr>
+                    <pic:cNvPr id="1308353292" name=""/>
+                    <pic:cNvPicPr/>
+                  </pic:nvPicPr>
+                  <pic:blipFill>
+                    <a:blip r:embed="rId20"/>
+                    <a:stretch>
+                      <a:fillRect/>
+                    </a:stretch>
+                  </pic:blipFill>
+                  <pic:spPr>
+                    <a:xfrm>
+                      <a:off x="0" y="0"/>
+                      <a:ext cx="5943600" cy="2984500"/>
+                    </a:xfrm>
+                    <a:prstGeom prst="rect">
+                      <a:avLst/>
+                    </a:prstGeom>
+                  </pic:spPr>
+                </pic:pic>
+              </a:graphicData>
+            </a:graphic>
+          </wp:inline>
+        </w:drawing>
+      </w:r>
+    </w:p>
+    <w:p>
+      <w:pPr>
+        <w:jc w:val="center"/>
+        <w:rPr>
+          <w:rFonts w:ascii="Times New Roman" w:hAnsi="Times New Roman" w:cs="Times New Roman"/>
+          <w:sz w:val="20"/>
+          <w:szCs w:val="20"/>
+        </w:rPr>
+      </w:pPr>
+      <w:r>
+        <w:rPr>
+          <w:rFonts w:ascii="Times New Roman" w:hAnsi="Times New Roman" w:cs="Times New Roman"/>
+          <w:sz w:val="20"/>
+          <w:szCs w:val="20"/>
+        </w:rPr>
+        <w:t>Relational model of normalized DuckDB database schema created to transform data from sources into.</w:t>
+      </w:r>
+    </w:p>
+    <w:p>
+      <w:pPr>
+        <w:pStyle w:val="Heading2"/>
+        <w:rPr>
+          <w:rFonts w:ascii="Arial" w:eastAsia="Arial" w:hAnsi="Arial" w:cs="Arial"/>
+          <w:b/>
+          <w:bCs/>
+          <w:color w:val="156082" w:themeColor="accent1"/>
+          <w:sz w:val="26"/>
+          <w:szCs w:val="26"/>
+        </w:rPr>
+      </w:pPr>
+      <w:r>
+        <w:rPr>
+          <w:rFonts w:ascii="Arial" w:eastAsia="Arial" w:hAnsi="Arial" w:cs="Arial"/>
+          <w:b/>
+          <w:bCs/>
+          <w:color w:val="156082" w:themeColor="accent1"/>
+          <w:sz w:val="26"/>
+          <w:szCs w:val="26"/>
+        </w:rPr>
+        <w:t>DDL: Creating the Normalized Schema</w:t>
+      </w:r>
+    </w:p>
+    <w:p>
+      <w:pPr>
+        <w:rPr>
+          <w:rFonts w:cs="Times New Roman"/>
+          <w:b/>
+          <w:bCs/>
+          <w:color w:val="156082" w:themeColor="accent1"/>
+          <w:sz w:val="28"/>
+          <w:szCs w:val="28"/>
+        </w:rPr>
+      </w:pPr>
+      <w:r>
+        <w:rPr>
+          <w:rFonts w:cs="Times New Roman"/>
+          <w:b/>
+          <w:bCs/>
+          <w:color w:val="156082" w:themeColor="accent1"/>
+          <w:sz w:val="28"/>
+          <w:szCs w:val="28"/>
+        </w:rPr>
+        <w:t xml:space="preserve">Database Normalization </w:t>
+      </w:r>
+      <w:r>
+        <w:rPr>
+          <w:rFonts w:cs="Times New Roman"/>
+          <w:b/>
+          <w:bCs/>
+          <w:color w:val="156082" w:themeColor="accent1"/>
+          <w:sz w:val="28"/>
+          <w:szCs w:val="28"/>
+        </w:rPr>
+        <w:t xml:space="preserve">– </w:t>
+      </w:r>
+      <w:r>
+        <w:rPr>
+          <w:rFonts w:cs="Times New Roman"/>
+          <w:b/>
+          <w:bCs/>
+          <w:sz w:val="28"/>
+          <w:szCs w:val="28"/>
+        </w:rPr>
+        <w:t>Creating the Normalized Schema</w:t>
+      </w:r>
+    </w:p>
+    <w:p>
+      <w:pPr>
+        <w:rPr>
+          <w:rFonts w:ascii="Times New Roman" w:hAnsi="Times New Roman" w:cs="Times New Roman"/>
+          <w:i/>
+          <w:iCs/>
+        </w:rPr>
+      </w:pPr>
+      <w:r>
+        <w:rPr>
+          <w:rFonts w:ascii="Times New Roman" w:hAnsi="Times New Roman" w:cs="Times New Roman"/>
+        </w:rPr>
+        <w:tab/>
+        <w:t xml:space="preserve">Textbook Reference: </w:t>
+      </w:r>
+      <w:r>
+        <w:rPr>
+          <w:rFonts w:ascii="Times New Roman" w:hAnsi="Times New Roman" w:cs="Times New Roman"/>
+          <w:i/>
+          <w:iCs/>
+        </w:rPr>
+        <w:t xml:space="preserve">Chapter </w:t>
+      </w:r>
+      <w:r>
+        <w:rPr>
+          <w:rFonts w:ascii="Times New Roman" w:hAnsi="Times New Roman" w:cs="Times New Roman"/>
+          <w:i/>
+          <w:iCs/>
+        </w:rPr>
+        <w:t>7</w:t>
+      </w:r>
+      <w:r>
+        <w:rPr>
+          <w:rFonts w:ascii="Times New Roman" w:hAnsi="Times New Roman" w:cs="Times New Roman"/>
+          <w:i/>
+          <w:iCs/>
+        </w:rPr>
+        <w:t xml:space="preserve">; </w:t>
+      </w:r>
+      <w:r>
+        <w:rPr>
+          <w:rFonts w:ascii="Times New Roman" w:hAnsi="Times New Roman" w:cs="Times New Roman"/>
+          <w:i/>
+          <w:iCs/>
+        </w:rPr>
+        <w:t>Normalization Concepts and Processes</w:t>
+      </w:r>
+    </w:p>
+    <w:p>
+      <w:pPr>
+        <w:rPr>
+          <w:rFonts w:ascii="Times New Roman" w:hAnsi="Times New Roman" w:cs="Times New Roman"/>
+        </w:rPr>
+      </w:pPr>
+      <w:r>
+        <w:rPr>
+          <w:rFonts w:ascii="Times New Roman" w:hAnsi="Times New Roman" w:cs="Times New Roman"/>
+        </w:rPr>
+        <w:t xml:space="preserve">Most of the five data sources (except for the RIDB CSV source) arrived in a denormalized or inconsistently structured format. The NPS API returns nested JSON with operating hours, and other information embedded inside location objects. Another example is how the MN GIS shapefile combines geographic and attribute data into a single record per park. </w:t>
+      </w:r>
+    </w:p>
+    <w:p>
+      <w:pPr>
+        <w:rPr>
+          <w:rFonts w:ascii="Times New Roman" w:hAnsi="Times New Roman" w:cs="Times New Roman"/>
+        </w:rPr>
+      </w:pPr>
+      <w:r>
+        <w:rPr>
+          <w:rFonts w:ascii="Times New Roman" w:hAnsi="Times New Roman" w:cs="Times New Roman"/>
+        </w:rPr>
+        <w:t>The normalized schema created for this project addresses this by decomposing repeated data into type tables (</w:t>
+      </w:r>
+      <w:proofErr w:type="spellStart"/>
+      <w:r>
+        <w:rPr>
+          <w:rFonts w:ascii="Times New Roman" w:hAnsi="Times New Roman" w:cs="Times New Roman"/>
+        </w:rPr>
+        <w:t>WebsiteType</w:t>
+      </w:r>
+      <w:proofErr w:type="spellEnd"/>
+      <w:r>
+        <w:rPr>
+          <w:rFonts w:ascii="Times New Roman" w:hAnsi="Times New Roman" w:cs="Times New Roman"/>
+        </w:rPr>
+        <w:t xml:space="preserve">, </w:t>
+      </w:r>
+      <w:proofErr w:type="spellStart"/>
+      <w:r>
+        <w:rPr>
+          <w:rFonts w:ascii="Times New Roman" w:hAnsi="Times New Roman" w:cs="Times New Roman"/>
+        </w:rPr>
+        <w:t>AddressType</w:t>
+      </w:r>
+      <w:proofErr w:type="spellEnd"/>
+      <w:r>
+        <w:rPr>
+          <w:rFonts w:ascii="Times New Roman" w:hAnsi="Times New Roman" w:cs="Times New Roman"/>
+        </w:rPr>
+        <w:t xml:space="preserve">, and MediaType), separating contact information into dedicated entities and representing operating hours at a day-level granularity through the </w:t>
+      </w:r>
+      <w:proofErr w:type="spellStart"/>
+      <w:r>
+        <w:rPr>
+          <w:rFonts w:ascii="Times New Roman" w:hAnsi="Times New Roman" w:cs="Times New Roman"/>
+        </w:rPr>
+        <w:t>OperatingHoursTime</w:t>
+      </w:r>
+      <w:proofErr w:type="spellEnd"/>
+      <w:r>
+        <w:rPr>
+          <w:rFonts w:ascii="Times New Roman" w:hAnsi="Times New Roman" w:cs="Times New Roman"/>
+        </w:rPr>
+        <w:t xml:space="preserve"> child table. This design targets Third Normal Form (3NF), where each non-key attribute is functionally dependent only on the primary key and there are no transitive dependencies. </w:t>
+      </w:r>
+    </w:p>
+    <w:p>
+      <w:pPr>
+        <w:rPr>
+          <w:rFonts w:cs="Times New Roman"/>
+          <w:b/>
+          <w:bCs/>
+          <w:color w:val="156082" w:themeColor="accent1"/>
+          <w:sz w:val="28"/>
+          <w:szCs w:val="28"/>
+        </w:rPr>
+      </w:pPr>
+      <w:r>
+        <w:rPr>
+          <w:rFonts w:cs="Times New Roman"/>
+          <w:b/>
+          <w:bCs/>
+          <w:color w:val="156082" w:themeColor="accent1"/>
+          <w:sz w:val="28"/>
+          <w:szCs w:val="28"/>
+        </w:rPr>
+        <w:t xml:space="preserve">Project Specific Needs – </w:t>
+      </w:r>
+      <w:r>
+        <w:rPr>
+          <w:rFonts w:cs="Times New Roman"/>
+          <w:b/>
+          <w:bCs/>
+          <w:sz w:val="28"/>
+          <w:szCs w:val="28"/>
+        </w:rPr>
+        <w:t>Working against normalization</w:t>
+      </w:r>
+    </w:p>
+    <w:p>
+      <w:pPr>
+        <w:rPr>
+          <w:rFonts w:ascii="Times New Roman" w:hAnsi="Times New Roman" w:cs="Times New Roman"/>
+          <w:i/>
+          <w:iCs/>
+        </w:rPr>
+      </w:pPr>
+      <w:r>
+        <w:rPr>
+          <w:rFonts w:ascii="Times New Roman" w:hAnsi="Times New Roman" w:cs="Times New Roman"/>
+        </w:rPr>
+        <w:tab/>
+        <w:t xml:space="preserve">Textbook Reference: </w:t>
+      </w:r>
+      <w:r>
+        <w:rPr>
+          <w:rFonts w:ascii="Times New Roman" w:hAnsi="Times New Roman" w:cs="Times New Roman"/>
+          <w:i/>
+          <w:iCs/>
+        </w:rPr>
+        <w:t xml:space="preserve">Chapter </w:t>
+      </w:r>
+      <w:r>
+        <w:rPr>
+          <w:rFonts w:ascii="Times New Roman" w:hAnsi="Times New Roman" w:cs="Times New Roman"/>
+          <w:i/>
+          <w:iCs/>
+        </w:rPr>
+        <w:t>6</w:t>
+      </w:r>
+      <w:r>
+        <w:rPr>
+          <w:rFonts w:ascii="Times New Roman" w:hAnsi="Times New Roman" w:cs="Times New Roman"/>
+          <w:i/>
+          <w:iCs/>
+        </w:rPr>
+        <w:t xml:space="preserve">; </w:t>
+      </w:r>
+      <w:r>
+        <w:rPr>
+          <w:rFonts w:ascii="Times New Roman" w:hAnsi="Times New Roman" w:cs="Times New Roman"/>
+          <w:i/>
+          <w:iCs/>
+        </w:rPr>
+        <w:t>Developing Data Models for Business Databases</w:t>
+      </w:r>
+    </w:p>
+    <w:p>
+      <w:pPr>
+        <w:rPr>
+          <w:rFonts w:ascii="Times New Roman" w:hAnsi="Times New Roman" w:cs="Times New Roman"/>
+        </w:rPr>
+      </w:pPr>
+      <w:r>
+        <w:rPr>
+          <w:rFonts w:ascii="Times New Roman" w:hAnsi="Times New Roman" w:cs="Times New Roman"/>
+        </w:rPr>
+        <w:t xml:space="preserve">However, one notable outlier that I highlight is the aspect that the location entity still stores state related data. Based on the structure of these entities and </w:t>
+      </w:r>
+      <w:r>
+        <w:rPr>
+          <w:rFonts w:ascii="Times New Roman" w:hAnsi="Times New Roman" w:cs="Times New Roman"/>
+        </w:rPr>
+        <w:t>aligning</w:t>
+      </w:r>
+      <w:r>
+        <w:rPr>
+          <w:rFonts w:ascii="Times New Roman" w:hAnsi="Times New Roman" w:cs="Times New Roman"/>
+        </w:rPr>
+        <w:t xml:space="preserve"> with 3NF it would be proper to </w:t>
+      </w:r>
+      <w:r>
+        <w:rPr>
+          <w:rFonts w:ascii="Times New Roman" w:hAnsi="Times New Roman" w:cs="Times New Roman"/>
+        </w:rPr>
+        <w:lastRenderedPageBreak/>
+        <w:t>ensure that the state information only exists in the address entity. However, this wasn’t done due to some data sources not having address information available (MN GIS data source for example)</w:t>
+      </w:r>
+      <w:r>
+        <w:rPr>
+          <w:rFonts w:ascii="Times New Roman" w:hAnsi="Times New Roman" w:cs="Times New Roman"/>
+        </w:rPr>
+        <w:t xml:space="preserve">, </w:t>
+      </w:r>
+      <w:r>
+        <w:rPr>
+          <w:rFonts w:ascii="Times New Roman" w:hAnsi="Times New Roman" w:cs="Times New Roman"/>
+        </w:rPr>
+        <w:t>but knowing where the data was found, that the state can be derived</w:t>
+      </w:r>
+      <w:r>
+        <w:rPr>
+          <w:rFonts w:ascii="Times New Roman" w:hAnsi="Times New Roman" w:cs="Times New Roman"/>
+        </w:rPr>
+        <w:t xml:space="preserve">. </w:t>
+      </w:r>
+      <w:r>
+        <w:rPr>
+          <w:rFonts w:ascii="Times New Roman" w:hAnsi="Times New Roman" w:cs="Times New Roman"/>
+        </w:rPr>
+        <w:t xml:space="preserve">This highlights an important aspect of database creation and management. Normalization is good, but sometimes based on project and </w:t>
+      </w:r>
+      <w:r>
+        <w:rPr>
+          <w:rFonts w:ascii="Times New Roman" w:hAnsi="Times New Roman" w:cs="Times New Roman"/>
+        </w:rPr>
+        <w:t>how the database will be used</w:t>
+      </w:r>
+      <w:r>
+        <w:rPr>
+          <w:rFonts w:ascii="Times New Roman" w:hAnsi="Times New Roman" w:cs="Times New Roman"/>
+        </w:rPr>
+        <w:t xml:space="preserve">, proper normalization may work against you. In this case if I followed through with proper normalization I would end up with nearly entirely empty address records within the addresses table resulting in wasted space and the need for complex queries to resolve what state locations are located in. </w:t>
+      </w:r>
+    </w:p>
+    <w:p>
+      <w:pPr>
+        <w:rPr>
+          <w:rFonts w:ascii="Times New Roman" w:hAnsi="Times New Roman" w:cs="Times New Roman"/>
+        </w:rPr>
+      </w:pPr>
+      <w:r>
+        <w:rPr>
+          <w:rFonts w:ascii="Times New Roman" w:hAnsi="Times New Roman" w:cs="Times New Roman"/>
+        </w:rPr>
+        <w:t xml:space="preserve">This ties directly into what was discussed in chapter 6 when it comes to identifying business constraints and relationships between entities and what was mentioned in class when the following quote was discussed: </w:t>
+      </w:r>
+    </w:p>
+    <w:p>
+      <w:pPr>
+        <w:jc w:val="center"/>
+        <w:rPr>
+          <w:rFonts w:ascii="Times New Roman" w:hAnsi="Times New Roman" w:cs="Times New Roman"/>
+          <w:i/>
+          <w:iCs/>
+        </w:rPr>
+      </w:pPr>
+      <w:r>
+        <w:rPr>
+          <w:rFonts w:ascii="Times New Roman" w:hAnsi="Times New Roman" w:cs="Times New Roman"/>
+          <w:i/>
+          <w:iCs/>
+        </w:rPr>
+        <w:t>“</w:t>
+      </w:r>
+      <w:r>
+        <w:rPr>
+          <w:rFonts w:ascii="Times New Roman" w:hAnsi="Times New Roman" w:cs="Times New Roman"/>
+          <w:i/>
+          <w:iCs/>
+        </w:rPr>
+        <w:t>Normalize until it hurts than denormalize until it works.</w:t>
+      </w:r>
+      <w:r>
+        <w:rPr>
+          <w:rFonts w:ascii="Times New Roman" w:hAnsi="Times New Roman" w:cs="Times New Roman"/>
+          <w:i/>
+          <w:iCs/>
+        </w:rPr>
+        <w:t>”</w:t>
+      </w:r>
+    </w:p>
+    <w:p>
+      <w:pPr>
+        <w:pStyle w:val="Heading2"/>
+        <w:jc w:val="center"/>
+        <w:rPr>
+          <w:rFonts w:ascii="Times New Roman" w:hAnsi="Times New Roman" w:cs="Times New Roman"/>
+        </w:rPr>
+      </w:pPr>
+      <w:r>
+        <w:rPr>
+          <w:rFonts w:ascii="Times New Roman" w:hAnsi="Times New Roman" w:cs="Times New Roman"/>
+        </w:rPr>
+        <w:lastRenderedPageBreak/>
+        <w:drawing>
+          <wp:inline distT="0" distB="0" distL="0" distR="0" wp14:anchorId="42097084" wp14:editId="0DE9306E">
+            <wp:extent cx="2878372" cy="5392267"/>
+            <wp:effectExtent l="0" t="0" r="0" b="0"/>
+            <wp:docPr id="367684458" name="Picture 2"/>
+            <wp:cNvGraphicFramePr>
+              <a:graphicFrameLocks xmlns:a="http://schemas.openxmlformats.org/drawingml/2006/main" noChangeAspect="1"/>
+            </wp:cNvGraphicFramePr>
+            <a:graphic xmlns:a="http://schemas.openxmlformats.org/drawingml/2006/main">
+              <a:graphicData uri="http://schemas.openxmlformats.org/drawingml/2006/picture">
+                <pic:pic xmlns:pic="http://schemas.openxmlformats.org/drawingml/2006/picture">
+                  <pic:nvPicPr>
+                    <pic:cNvPr id="0" name="Picture 12"/>
+                    <pic:cNvPicPr>
+                      <a:picLocks noChangeAspect="1" noChangeArrowheads="1"/>
+                    </pic:cNvPicPr>
+                  </pic:nvPicPr>
+                  <pic:blipFill>
+                    <a:blip r:embed="rId21" cstate="print">
+                      <a:extLst>
+                        <a:ext uri="{28A0092B-C50C-407E-A947-70E740481C1C}">
+                          <a14:useLocalDpi xmlns:a14="http://schemas.microsoft.com/office/drawing/2010/main" val="0"/>
+                        </a:ext>
+                      </a:extLst>
+                    </a:blip>
+                    <a:srcRect/>
+                    <a:stretch>
+                      <a:fillRect/>
+                    </a:stretch>
+                  </pic:blipFill>
+                  <pic:spPr bwMode="auto">
+                    <a:xfrm>
+                      <a:off x="0" y="0"/>
+                      <a:ext cx="2883051" cy="5401032"/>
+                    </a:xfrm>
+                    <a:prstGeom prst="rect">
+                      <a:avLst/>
+                    </a:prstGeom>
+                    <a:noFill/>
+                    <a:ln>
+                      <a:noFill/>
+                    </a:ln>
+                  </pic:spPr>
+                </pic:pic>
+              </a:graphicData>
+            </a:graphic>
+          </wp:inline>
+        </w:drawing>
+      </w:r>
+    </w:p>
+    <w:p>
+      <w:pPr>
+        <w:jc w:val="center"/>
+        <w:rPr>
+          <w:rFonts w:ascii="Times New Roman" w:hAnsi="Times New Roman" w:cs="Times New Roman"/>
+          <w:sz w:val="20"/>
+          <w:szCs w:val="20"/>
+        </w:rPr>
+      </w:pPr>
+      <w:r>
+        <w:rPr>
+          <w:rFonts w:ascii="Times New Roman" w:hAnsi="Times New Roman" w:cs="Times New Roman"/>
+          <w:sz w:val="20"/>
+          <w:szCs w:val="20"/>
+        </w:rPr>
+        <w:t xml:space="preserve">Normalized schema diagram generated in </w:t>
+      </w:r>
+      <w:proofErr w:type="spellStart"/>
+      <w:r>
+        <w:rPr>
+          <w:rFonts w:ascii="Times New Roman" w:hAnsi="Times New Roman" w:cs="Times New Roman"/>
+          <w:sz w:val="20"/>
+          <w:szCs w:val="20"/>
+        </w:rPr>
+        <w:t>DBeaver</w:t>
+      </w:r>
+      <w:proofErr w:type="spellEnd"/>
+      <w:r>
+        <w:rPr>
+          <w:rFonts w:ascii="Times New Roman" w:hAnsi="Times New Roman" w:cs="Times New Roman"/>
+          <w:sz w:val="20"/>
+          <w:szCs w:val="20"/>
+        </w:rPr>
+        <w:t xml:space="preserve"> DBMS from the “normalized” schema </w:t>
+      </w:r>
+      <w:r>
+        <w:rPr>
+          <w:rFonts w:ascii="Times New Roman" w:hAnsi="Times New Roman" w:cs="Times New Roman"/>
+          <w:sz w:val="20"/>
+          <w:szCs w:val="20"/>
+        </w:rPr>
+        <w:t>in the DuckDB database</w:t>
+      </w:r>
+    </w:p>
+    <w:p>
+      <w:pPr>
+        <w:pStyle w:val="Heading2"/>
+        <w:rPr>
+          <w:color w:val="156082" w:themeColor="accent1"/>
+        </w:rPr>
+      </w:pPr>
+      <w:r>
+        <w:rPr>
+          <w:rFonts w:ascii="Arial" w:eastAsia="Arial" w:hAnsi="Arial" w:cs="Arial"/>
+          <w:b/>
+          <w:bCs/>
+          <w:color w:val="156082" w:themeColor="accent1"/>
+          <w:sz w:val="26"/>
+          <w:szCs w:val="26"/>
+        </w:rPr>
+        <w:t>Data Transformation: Views and INSERT Queries</w:t>
+      </w:r>
+    </w:p>
+    <w:p>
+      <w:pPr>
+        <w:rPr>
+          <w:rFonts w:cs="Times New Roman"/>
+          <w:b/>
+          <w:bCs/>
+          <w:color w:val="156082" w:themeColor="accent1"/>
+          <w:sz w:val="28"/>
+          <w:szCs w:val="28"/>
+        </w:rPr>
+      </w:pPr>
+      <w:r>
+        <w:rPr>
+          <w:rFonts w:cs="Times New Roman"/>
+          <w:b/>
+          <w:bCs/>
+          <w:color w:val="156082" w:themeColor="accent1"/>
+          <w:sz w:val="28"/>
+          <w:szCs w:val="28"/>
+        </w:rPr>
+        <w:t xml:space="preserve">Database Views </w:t>
+      </w:r>
+      <w:r>
+        <w:rPr>
+          <w:rFonts w:cs="Times New Roman"/>
+          <w:b/>
+          <w:bCs/>
+          <w:color w:val="156082" w:themeColor="accent1"/>
+          <w:sz w:val="28"/>
+          <w:szCs w:val="28"/>
+        </w:rPr>
+        <w:t>–</w:t>
+      </w:r>
+      <w:r>
+        <w:rPr>
+          <w:rFonts w:cs="Times New Roman"/>
+          <w:b/>
+          <w:bCs/>
+          <w:color w:val="156082" w:themeColor="accent1"/>
+          <w:sz w:val="28"/>
+          <w:szCs w:val="28"/>
+        </w:rPr>
+        <w:t xml:space="preserve"> </w:t>
+      </w:r>
+      <w:r>
+        <w:rPr>
+          <w:rFonts w:cs="Times New Roman"/>
+          <w:b/>
+          <w:bCs/>
+          <w:sz w:val="28"/>
+          <w:szCs w:val="28"/>
+        </w:rPr>
+        <w:t>Transforming Data Sources</w:t>
+      </w:r>
+    </w:p>
+    <w:p>
+      <w:pPr>
+        <w:rPr>
+          <w:rFonts w:ascii="Times New Roman" w:hAnsi="Times New Roman" w:cs="Times New Roman"/>
+          <w:i/>
+          <w:iCs/>
+        </w:rPr>
+      </w:pPr>
+      <w:r>
+        <w:rPr>
+          <w:rFonts w:ascii="Times New Roman" w:hAnsi="Times New Roman" w:cs="Times New Roman"/>
+        </w:rPr>
+        <w:tab/>
+        <w:t xml:space="preserve">Textbook Reference: </w:t>
+      </w:r>
+      <w:r>
+        <w:rPr>
+          <w:rFonts w:ascii="Times New Roman" w:hAnsi="Times New Roman" w:cs="Times New Roman"/>
+          <w:i/>
+          <w:iCs/>
+        </w:rPr>
+        <w:t xml:space="preserve">Chapter </w:t>
+      </w:r>
+      <w:r>
+        <w:rPr>
+          <w:rFonts w:ascii="Times New Roman" w:hAnsi="Times New Roman" w:cs="Times New Roman"/>
+          <w:i/>
+          <w:iCs/>
+        </w:rPr>
+        <w:t>10</w:t>
+      </w:r>
+      <w:r>
+        <w:rPr>
+          <w:rFonts w:ascii="Times New Roman" w:hAnsi="Times New Roman" w:cs="Times New Roman"/>
+          <w:i/>
+          <w:iCs/>
+        </w:rPr>
+        <w:t xml:space="preserve">; </w:t>
+      </w:r>
+      <w:r>
+        <w:rPr>
+          <w:rFonts w:ascii="Times New Roman" w:hAnsi="Times New Roman" w:cs="Times New Roman"/>
+          <w:i/>
+          <w:iCs/>
+        </w:rPr>
+        <w:t>Views, Null Values, and Hierarchical Queries</w:t>
+      </w:r>
+    </w:p>
+    <w:p>
+      <w:pPr>
+        <w:spacing w:after="120" w:line="240" w:lineRule="auto"/>
+        <w:rPr>
+          <w:rFonts w:ascii="Times New Roman" w:hAnsi="Times New Roman" w:cs="Times New Roman"/>
+        </w:rPr>
+      </w:pPr>
+      <w:r>
+        <w:rPr>
+          <w:rFonts w:ascii="Times New Roman" w:hAnsi="Times New Roman" w:cs="Times New Roman"/>
+        </w:rPr>
+        <w:t xml:space="preserve">The final step was to transform the raw source data into the normalized schema. Rather than using Python for this step, individual SQL views were created within each source’s schema namespace. These views allowed me to reshape the data from its source into the structure that nearly mirrors the normalized tables that were created in the previous steps. These views were then used in conjunction with insert queries to move the data from each of the source </w:t>
+      </w:r>
+      <w:r>
+        <w:rPr>
+          <w:rFonts w:ascii="Times New Roman" w:hAnsi="Times New Roman" w:cs="Times New Roman"/>
+        </w:rPr>
+        <w:lastRenderedPageBreak/>
+        <w:t xml:space="preserve">namespaces into the final normalized set of tables in a new namespace that I setup denoted as </w:t>
+      </w:r>
+      <w:r>
+        <w:rPr>
+          <w:rFonts w:ascii="Times New Roman" w:hAnsi="Times New Roman" w:cs="Times New Roman"/>
+          <w:b/>
+          <w:bCs/>
+        </w:rPr>
+        <w:t>normalized</w:t>
+      </w:r>
+      <w:r>
+        <w:rPr>
+          <w:rFonts w:ascii="Times New Roman" w:hAnsi="Times New Roman" w:cs="Times New Roman"/>
+        </w:rPr>
+        <w:t xml:space="preserve">. </w:t>
+      </w:r>
+    </w:p>
+    <w:p>
+      <w:pPr>
+        <w:spacing w:after="120" w:line="240" w:lineRule="auto"/>
+        <w:rPr>
+          <w:rFonts w:ascii="Times New Roman" w:hAnsi="Times New Roman" w:cs="Times New Roman"/>
+        </w:rPr>
+      </w:pPr>
+      <w:r>
+        <w:rPr>
+          <w:rFonts w:ascii="Times New Roman" w:hAnsi="Times New Roman" w:cs="Times New Roman"/>
+        </w:rPr>
+        <w:t>Using views for this step rather than inline queries or Python scripts provided many benefits. First, views are reusable and testable independently which allowed me to iteratively build and test to ensure that the proper and correctly structured data is retrieved and structured</w:t>
+      </w:r>
+      <w:r>
+        <w:rPr>
+          <w:rFonts w:ascii="Times New Roman" w:hAnsi="Times New Roman" w:cs="Times New Roman"/>
+        </w:rPr>
+        <w:t xml:space="preserve"> from each of the source’s table(s). Secondly, in conjunction with helping construct the proper normalized structure these views allow the encapsulation of all data transformation logic from the INSERT queries. If these views weren’t created, each INSERT query would have </w:t>
+      </w:r>
+      <w:r>
+        <w:rPr>
+          <w:rFonts w:ascii="Times New Roman" w:hAnsi="Times New Roman" w:cs="Times New Roman"/>
+        </w:rPr>
+        <w:t>a</w:t>
+      </w:r>
+      <w:r>
+        <w:rPr>
+          <w:rFonts w:ascii="Times New Roman" w:hAnsi="Times New Roman" w:cs="Times New Roman"/>
+        </w:rPr>
+        <w:t xml:space="preserve"> huge SELECT statement in tow. These kinds of SQL queries from my professional and personal experience can cause confusion and worry when it comes time to change </w:t>
+      </w:r>
+      <w:r>
+        <w:rPr>
+          <w:rFonts w:ascii="Times New Roman" w:hAnsi="Times New Roman" w:cs="Times New Roman"/>
+        </w:rPr>
+        <w:t>or refactor the code. For each data source, there was one SQL file created, each containing the transformation views and the INSERT…SELECT view statements that populate the normalized schema from them.</w:t>
+      </w:r>
+      <w:r>
+        <w:rPr>
+          <w:rFonts w:ascii="Times New Roman" w:hAnsi="Times New Roman" w:cs="Times New Roman"/>
+        </w:rPr>
+        <w:t xml:space="preserve"> </w:t>
+      </w:r>
+      <w:r>
+        <w:rPr>
+          <w:rFonts w:ascii="Times New Roman" w:hAnsi="Times New Roman" w:cs="Times New Roman"/>
+        </w:rPr>
+        <w:t xml:space="preserve">To be transparent, about 40% of the SQL code in these files were generated by AI. </w:t>
+      </w:r>
+    </w:p>
+    <w:p>
+      <w:pPr>
+        <w:spacing w:after="120" w:line="240" w:lineRule="auto"/>
+        <w:jc w:val="center"/>
+        <w:rPr>
+          <w:noProof/>
+        </w:rPr>
+      </w:pPr>
+      <w:r>
+        <w:rPr>
+          <w:noProof/>
+        </w:rPr>
+        <w:drawing>
+          <wp:inline distT="0" distB="0" distL="0" distR="0" wp14:anchorId="07D1BB2D" wp14:editId="5C8FA63C">
+            <wp:extent cx="5943600" cy="3799840"/>
+            <wp:effectExtent l="0" t="0" r="0" b="0"/>
+            <wp:docPr id="94320844" name="Picture 4"/>
+            <wp:cNvGraphicFramePr>
+              <a:graphicFrameLocks xmlns:a="http://schemas.openxmlformats.org/drawingml/2006/main" noChangeAspect="1"/>
+            </wp:cNvGraphicFramePr>
+            <a:graphic xmlns:a="http://schemas.openxmlformats.org/drawingml/2006/main">
+              <a:graphicData uri="http://schemas.openxmlformats.org/drawingml/2006/picture">
+                <pic:pic xmlns:pic="http://schemas.openxmlformats.org/drawingml/2006/picture">
+                  <pic:nvPicPr>
+                    <pic:cNvPr id="0" name="Picture 16"/>
+                    <pic:cNvPicPr>
+                      <a:picLocks noChangeAspect="1" noChangeArrowheads="1"/>
+                    </pic:cNvPicPr>
+                  </pic:nvPicPr>
+                  <pic:blipFill>
+                    <a:blip r:embed="rId22" cstate="print">
+                      <a:extLst>
+                        <a:ext uri="{28A0092B-C50C-407E-A947-70E740481C1C}">
+                          <a14:useLocalDpi xmlns:a14="http://schemas.microsoft.com/office/drawing/2010/main" val="0"/>
+                        </a:ext>
+                      </a:extLst>
+                    </a:blip>
+                    <a:srcRect/>
+                    <a:stretch>
+                      <a:fillRect/>
+                    </a:stretch>
+                  </pic:blipFill>
+                  <pic:spPr bwMode="auto">
+                    <a:xfrm>
+                      <a:off x="0" y="0"/>
+                      <a:ext cx="5943600" cy="3799840"/>
+                    </a:xfrm>
+                    <a:prstGeom prst="rect">
+                      <a:avLst/>
+                    </a:prstGeom>
+                    <a:noFill/>
+                    <a:ln>
+                      <a:noFill/>
+                    </a:ln>
+                  </pic:spPr>
+                </pic:pic>
+              </a:graphicData>
+            </a:graphic>
+          </wp:inline>
+        </w:drawing>
+      </w:r>
+    </w:p>
+    <w:p>
+      <w:pPr>
+        <w:spacing w:after="120" w:line="240" w:lineRule="auto"/>
+        <w:jc w:val="center"/>
+        <w:rPr>
+          <w:rFonts w:ascii="Times New Roman" w:hAnsi="Times New Roman" w:cs="Times New Roman"/>
+          <w:sz w:val="20"/>
+          <w:szCs w:val="20"/>
+        </w:rPr>
+      </w:pPr>
+      <w:r>
+        <w:rPr>
+          <w:rFonts w:ascii="Times New Roman" w:hAnsi="Times New Roman" w:cs="Times New Roman"/>
+          <w:noProof/>
+          <w:sz w:val="20"/>
+          <w:szCs w:val="20"/>
+        </w:rPr>
+        <w:t xml:space="preserve">View created to transform NPS location information collected from API into expected normalized structure | The activities and topics are getting the correct data from the normalized activities and topics tables and storing the information as arrays within the attributes JSON structure.  </w:t>
+      </w:r>
+    </w:p>
+    <w:p>
+      <w:pPr>
+        <w:pStyle w:val="Heading2"/>
+        <w:rPr>
+          <w:rFonts w:asciiTheme="minorHAnsi" w:hAnsiTheme="minorHAnsi"/>
+          <w:color w:val="156082" w:themeColor="accent1"/>
+          <w:sz w:val="28"/>
+          <w:szCs w:val="28"/>
+        </w:rPr>
+      </w:pPr>
+      <w:r>
+        <w:rPr>
+          <w:rFonts w:asciiTheme="minorHAnsi" w:eastAsia="Arial" w:hAnsiTheme="minorHAnsi" w:cs="Arial"/>
+          <w:b/>
+          <w:bCs/>
+          <w:color w:val="156082" w:themeColor="accent1"/>
+          <w:sz w:val="28"/>
+          <w:szCs w:val="28"/>
+        </w:rPr>
+        <w:t>Queries</w:t>
+      </w:r>
+    </w:p>
+    <w:p>
+      <w:pPr>
+        <w:rPr>
+          <w:rFonts w:cs="Times New Roman"/>
+          <w:b/>
+          <w:bCs/>
+          <w:color w:val="156082" w:themeColor="accent1"/>
+          <w:sz w:val="28"/>
+          <w:szCs w:val="28"/>
+        </w:rPr>
+      </w:pPr>
+      <w:r>
+        <w:rPr>
+          <w:rFonts w:cs="Times New Roman"/>
+          <w:b/>
+          <w:bCs/>
+          <w:color w:val="156082" w:themeColor="accent1"/>
+          <w:sz w:val="28"/>
+          <w:szCs w:val="28"/>
+        </w:rPr>
+        <w:t>Advanced and Other Queries</w:t>
+      </w:r>
+      <w:r>
+        <w:rPr>
+          <w:rFonts w:cs="Times New Roman"/>
+          <w:b/>
+          <w:bCs/>
+          <w:color w:val="156082" w:themeColor="accent1"/>
+          <w:sz w:val="28"/>
+          <w:szCs w:val="28"/>
+        </w:rPr>
+        <w:t xml:space="preserve"> – </w:t>
+      </w:r>
+      <w:r>
+        <w:rPr>
+          <w:rFonts w:cs="Times New Roman"/>
+          <w:b/>
+          <w:bCs/>
+          <w:sz w:val="28"/>
+          <w:szCs w:val="28"/>
+        </w:rPr>
+        <w:t>Hierarchical and JOIN Queries</w:t>
+      </w:r>
+    </w:p>
+    <w:p>
+      <w:pPr>
+        <w:ind w:left="720"/>
+        <w:rPr>
+          <w:rFonts w:ascii="Times New Roman" w:hAnsi="Times New Roman" w:cs="Times New Roman"/>
+          <w:i/>
+          <w:iCs/>
+        </w:rPr>
+      </w:pPr>
+      <w:r>
+        <w:rPr>
+          <w:rFonts w:ascii="Times New Roman" w:hAnsi="Times New Roman" w:cs="Times New Roman"/>
+        </w:rPr>
+        <w:lastRenderedPageBreak/>
+        <w:t xml:space="preserve">Textbook Reference: </w:t>
+      </w:r>
+      <w:r>
+        <w:rPr>
+          <w:rFonts w:ascii="Times New Roman" w:hAnsi="Times New Roman" w:cs="Times New Roman"/>
+          <w:i/>
+          <w:iCs/>
+        </w:rPr>
+        <w:t>Chapter</w:t>
+      </w:r>
+      <w:r>
+        <w:rPr>
+          <w:rFonts w:ascii="Times New Roman" w:hAnsi="Times New Roman" w:cs="Times New Roman"/>
+          <w:i/>
+          <w:iCs/>
+        </w:rPr>
+        <w:t>s</w:t>
+      </w:r>
+      <w:r>
+        <w:rPr>
+          <w:rFonts w:ascii="Times New Roman" w:hAnsi="Times New Roman" w:cs="Times New Roman"/>
+          <w:i/>
+          <w:iCs/>
+        </w:rPr>
+        <w:t xml:space="preserve"> </w:t>
+      </w:r>
+      <w:r>
+        <w:rPr>
+          <w:rFonts w:ascii="Times New Roman" w:hAnsi="Times New Roman" w:cs="Times New Roman"/>
+          <w:i/>
+          <w:iCs/>
+        </w:rPr>
+        <w:t>9 and 10</w:t>
+      </w:r>
+      <w:r>
+        <w:rPr>
+          <w:rFonts w:ascii="Times New Roman" w:hAnsi="Times New Roman" w:cs="Times New Roman"/>
+          <w:i/>
+          <w:iCs/>
+        </w:rPr>
+        <w:t xml:space="preserve">; </w:t>
+      </w:r>
+      <w:r>
+        <w:rPr>
+          <w:rFonts w:ascii="Times New Roman" w:hAnsi="Times New Roman" w:cs="Times New Roman"/>
+          <w:i/>
+          <w:iCs/>
+        </w:rPr>
+        <w:t xml:space="preserve">Advanced Matching Problems | Views, Null   </w:t>
+      </w:r>
+    </w:p>
+    <w:p>
+      <w:pPr>
+        <w:ind w:left="2160" w:firstLine="720"/>
+        <w:rPr>
+          <w:rFonts w:ascii="Times New Roman" w:hAnsi="Times New Roman" w:cs="Times New Roman"/>
+          <w:i/>
+          <w:iCs/>
+        </w:rPr>
+      </w:pPr>
+      <w:r>
+        <w:rPr>
+          <w:rFonts w:ascii="Times New Roman" w:hAnsi="Times New Roman" w:cs="Times New Roman"/>
+          <w:i/>
+          <w:iCs/>
+        </w:rPr>
+        <w:t>Values and Hierarchical Queries</w:t>
+      </w:r>
+    </w:p>
+    <w:p>
+      <w:pPr>
+        <w:spacing w:after="120" w:line="240" w:lineRule="auto"/>
+        <w:rPr>
+          <w:rFonts w:ascii="Times New Roman" w:hAnsi="Times New Roman" w:cs="Times New Roman"/>
+        </w:rPr>
+      </w:pPr>
+      <w:r>
+        <w:rPr>
+          <w:rFonts w:ascii="Times New Roman" w:hAnsi="Times New Roman" w:cs="Times New Roman"/>
+        </w:rPr>
+        <w:t>Hierarchical Queries</w:t>
+      </w:r>
+      <w:r>
+        <w:rPr>
+          <w:rFonts w:ascii="Times New Roman" w:hAnsi="Times New Roman" w:cs="Times New Roman"/>
+        </w:rPr>
+        <w:t xml:space="preserve"> - TODO</w:t>
+      </w:r>
+    </w:p>
+    <w:p>
+      <w:pPr>
+        <w:spacing w:after="120" w:line="240" w:lineRule="auto"/>
+        <w:rPr>
+          <w:rFonts w:ascii="Times New Roman" w:hAnsi="Times New Roman" w:cs="Times New Roman"/>
+        </w:rPr>
+      </w:pPr>
+      <w:r>
+        <w:rPr>
+          <w:rFonts w:ascii="Times New Roman" w:hAnsi="Times New Roman" w:cs="Times New Roman"/>
+        </w:rPr>
+        <w:t>Geospatial Queries</w:t>
+      </w:r>
+      <w:r>
+        <w:rPr>
+          <w:rFonts w:ascii="Times New Roman" w:hAnsi="Times New Roman" w:cs="Times New Roman"/>
+        </w:rPr>
+        <w:t xml:space="preserve"> - TODO</w:t>
+      </w:r>
+    </w:p>
+    <w:p>
+      <w:pPr>
+        <w:spacing w:after="120" w:line="240" w:lineRule="auto"/>
+        <w:rPr>
+          <w:rFonts w:ascii="Times New Roman" w:hAnsi="Times New Roman" w:cs="Times New Roman"/>
+        </w:rPr>
+      </w:pPr>
+      <w:r>
+        <w:rPr>
+          <w:rFonts w:ascii="Times New Roman" w:hAnsi="Times New Roman" w:cs="Times New Roman"/>
+        </w:rPr>
+        <w:t>General Join Queries</w:t>
+      </w:r>
+      <w:r>
+        <w:rPr>
+          <w:rFonts w:ascii="Times New Roman" w:hAnsi="Times New Roman" w:cs="Times New Roman"/>
+        </w:rPr>
+        <w:t xml:space="preserve"> - TODO</w:t>
+      </w:r>
+    </w:p>
+    <w:p>
+      <w:pPr>
+        <w:spacing w:after="120" w:line="240" w:lineRule="auto"/>
+        <w:rPr>
+          <w:rFonts w:ascii="Times New Roman" w:hAnsi="Times New Roman" w:cs="Times New Roman"/>
+        </w:rPr>
+      </w:pPr>
+    </w:p>
+    <w:p>
+      <w:pPr>
+        <w:rPr>
+          <w:rFonts w:cs="Times New Roman"/>
+          <w:b/>
+          <w:bCs/>
+          <w:color w:val="156082" w:themeColor="accent1"/>
+          <w:sz w:val="28"/>
+          <w:szCs w:val="28"/>
+        </w:rPr>
+      </w:pPr>
+      <w:r>
+        <w:rPr>
+          <w:rFonts w:cs="Times New Roman"/>
+          <w:b/>
+          <w:bCs/>
+          <w:color w:val="156082" w:themeColor="accent1"/>
+          <w:sz w:val="28"/>
+          <w:szCs w:val="28"/>
+        </w:rPr>
+        <w:t>Transactions</w:t>
+      </w:r>
+      <w:r>
+        <w:rPr>
+          <w:rFonts w:cs="Times New Roman"/>
+          <w:b/>
+          <w:bCs/>
+          <w:color w:val="156082" w:themeColor="accent1"/>
+          <w:sz w:val="28"/>
+          <w:szCs w:val="28"/>
+        </w:rPr>
+        <w:t xml:space="preserve"> – </w:t>
+      </w:r>
+      <w:r>
+        <w:rPr>
+          <w:rFonts w:cs="Times New Roman"/>
+          <w:b/>
+          <w:bCs/>
+          <w:color w:val="156082" w:themeColor="accent1"/>
+          <w:sz w:val="28"/>
+          <w:szCs w:val="28"/>
+        </w:rPr>
+        <w:t>Transactional Safety Built in &amp; ACID</w:t>
+      </w:r>
+    </w:p>
+    <w:p>
+      <w:pPr>
+        <w:ind w:left="720"/>
+        <w:rPr>
+          <w:rFonts w:ascii="Times New Roman" w:hAnsi="Times New Roman" w:cs="Times New Roman"/>
+          <w:i/>
+          <w:iCs/>
+        </w:rPr>
+      </w:pPr>
+      <w:r>
+        <w:rPr>
+          <w:rFonts w:ascii="Times New Roman" w:hAnsi="Times New Roman" w:cs="Times New Roman"/>
+        </w:rPr>
+        <w:t xml:space="preserve">Textbook Reference: </w:t>
+      </w:r>
+      <w:r>
+        <w:rPr>
+          <w:rFonts w:ascii="Times New Roman" w:hAnsi="Times New Roman" w:cs="Times New Roman"/>
+          <w:i/>
+          <w:iCs/>
+        </w:rPr>
+        <w:t xml:space="preserve">Chapter </w:t>
+      </w:r>
+      <w:r>
+        <w:rPr>
+          <w:rFonts w:ascii="Times New Roman" w:hAnsi="Times New Roman" w:cs="Times New Roman"/>
+          <w:i/>
+          <w:iCs/>
+        </w:rPr>
+        <w:t>17</w:t>
+      </w:r>
+      <w:r>
+        <w:rPr>
+          <w:rFonts w:ascii="Times New Roman" w:hAnsi="Times New Roman" w:cs="Times New Roman"/>
+          <w:i/>
+          <w:iCs/>
+        </w:rPr>
+        <w:t>;</w:t>
+      </w:r>
+      <w:r>
+        <w:rPr>
+          <w:rFonts w:ascii="Times New Roman" w:hAnsi="Times New Roman" w:cs="Times New Roman"/>
+          <w:i/>
+          <w:iCs/>
+        </w:rPr>
+        <w:t xml:space="preserve"> Transaction Management </w:t>
+      </w:r>
+      <w:r>
+        <w:rPr>
+          <w:rFonts w:ascii="Times New Roman" w:hAnsi="Times New Roman" w:cs="Times New Roman"/>
+          <w:i/>
+          <w:iCs/>
+        </w:rPr>
+        <w:t xml:space="preserve"> </w:t>
+      </w:r>
+    </w:p>
+    <w:p>
+      <w:pPr>
+        <w:rPr>
+          <w:rFonts w:ascii="Times New Roman" w:hAnsi="Times New Roman" w:cs="Times New Roman"/>
+        </w:rPr>
+      </w:pPr>
+      <w:r>
+        <w:rPr>
+          <w:rFonts w:ascii="Times New Roman" w:hAnsi="Times New Roman" w:cs="Times New Roman"/>
+        </w:rPr>
+        <w:t>Transactions with Rollback built into views</w:t>
+      </w:r>
+      <w:r>
+        <w:rPr>
+          <w:rFonts w:ascii="Times New Roman" w:hAnsi="Times New Roman" w:cs="Times New Roman"/>
+        </w:rPr>
+        <w:t xml:space="preserve"> - TODO</w:t>
+      </w:r>
+    </w:p>
+    <w:p>
+      <w:pPr>
+        <w:rPr>
+          <w:rFonts w:ascii="Times New Roman" w:hAnsi="Times New Roman" w:cs="Times New Roman"/>
+          <w:i/>
+          <w:iCs/>
+        </w:rPr>
+      </w:pPr>
+      <w:r>
+        <w:rPr>
+          <w:rFonts w:ascii="Times New Roman" w:hAnsi="Times New Roman" w:cs="Times New Roman"/>
+        </w:rPr>
+        <w:t>ACID compliance – Transaction properties</w:t>
+      </w:r>
+      <w:r>
+        <w:rPr>
+          <w:rFonts w:ascii="Times New Roman" w:hAnsi="Times New Roman" w:cs="Times New Roman"/>
+        </w:rPr>
+        <w:t xml:space="preserve"> - TODO</w:t>
+      </w:r>
+    </w:p>
+    <w:p>
+      <w:pPr>
+        <w:rPr>
           <w:b/>
           <w:bCs/>
           <w:color w:val="156082" w:themeColor="accent1"/>
@@ -794,6 +2955,244 @@
     </w:p>
     <w:p>
       <w:pPr>
+        <w:pStyle w:val="Heading2"/>
+        <w:rPr>
+          <w:rFonts w:asciiTheme="minorHAnsi" w:eastAsia="Arial" w:hAnsiTheme="minorHAnsi" w:cs="Arial"/>
+          <w:b/>
+          <w:bCs/>
+          <w:color w:val="156082" w:themeColor="accent1"/>
+          <w:sz w:val="28"/>
+          <w:szCs w:val="28"/>
+        </w:rPr>
+      </w:pPr>
+      <w:r>
+        <w:rPr>
+          <w:rFonts w:asciiTheme="minorHAnsi" w:eastAsia="Arial" w:hAnsiTheme="minorHAnsi" w:cs="Arial"/>
+          <w:b/>
+          <w:bCs/>
+          <w:color w:val="156082" w:themeColor="accent1"/>
+          <w:sz w:val="28"/>
+          <w:szCs w:val="28"/>
+        </w:rPr>
+        <w:t>What I Learned</w:t>
+      </w:r>
+    </w:p>
+    <w:p>
+      <w:pPr>
+        <w:rPr>
+          <w:rFonts w:ascii="Times New Roman" w:hAnsi="Times New Roman" w:cs="Times New Roman"/>
+        </w:rPr>
+      </w:pPr>
+      <w:r>
+        <w:rPr>
+          <w:rFonts w:ascii="Times New Roman" w:hAnsi="Times New Roman" w:cs="Times New Roman"/>
+        </w:rPr>
+        <w:t xml:space="preserve">I learned a lot from this project. First, I learned about DuckDB as a piece of technology mainly used for analytical purposes. Working with DuckDB was quick to setup, easy to interact with, and interesting to use when properly uploading and managing data from multiple different sources. </w:t>
+      </w:r>
+    </w:p>
+    <w:p>
+      <w:pPr>
+        <w:rPr>
+          <w:rFonts w:ascii="Times New Roman" w:hAnsi="Times New Roman" w:cs="Times New Roman"/>
+        </w:rPr>
+      </w:pPr>
+      <w:r>
+        <w:rPr>
+          <w:rFonts w:ascii="Times New Roman" w:hAnsi="Times New Roman" w:cs="Times New Roman"/>
+        </w:rPr>
+        <w:t xml:space="preserve">I also believe I strengthened my SQL querying skills throughout this project. Although it will still take time to learn all the different syntactical differences between the ‘flavors’ of SQL I will encounter at work and in personal projects, I believe I have strengthened my understanding of how database technology can be used to effectively manage data more efficiently than any spreadsheet ever could. </w:t>
+      </w:r>
+    </w:p>
+    <w:p>
+      <w:pPr>
+        <w:rPr>
+          <w:rFonts w:ascii="Times New Roman" w:hAnsi="Times New Roman" w:cs="Times New Roman"/>
+        </w:rPr>
+      </w:pPr>
+      <w:r>
+        <w:rPr>
+          <w:rFonts w:ascii="Times New Roman" w:hAnsi="Times New Roman" w:cs="Times New Roman"/>
+        </w:rPr>
+        <w:t>A third concept that I was able to develop throughout this project was the ability to structure an ER diagram and code it into actual SQL without relying on AI or the Data Modeler tool to generate it for me. There were limitations within DuckDB that I had to overcome, such as the absence of a out of box solution for an auto incrementing primary key constraint and the lack of trigger support – both in which exist in other database systems such as Oracle and Microsoft SQL. These</w:t>
+      </w:r>
+      <w:r>
+        <w:rPr>
+          <w:rFonts w:ascii="Times New Roman" w:hAnsi="Times New Roman" w:cs="Times New Roman"/>
+        </w:rPr>
+        <w:t xml:space="preserve"> limitations, although surprising to me, forced me to find different ways to ensure data integrity and validity. </w:t>
+      </w:r>
+    </w:p>
+    <w:p>
+      <w:pPr>
+        <w:pStyle w:val="Heading2"/>
+        <w:rPr>
+          <w:rFonts w:asciiTheme="minorHAnsi" w:eastAsia="Arial" w:hAnsiTheme="minorHAnsi" w:cs="Arial"/>
+          <w:b/>
+          <w:bCs/>
+          <w:color w:val="156082" w:themeColor="accent1"/>
+          <w:sz w:val="28"/>
+          <w:szCs w:val="28"/>
+        </w:rPr>
+      </w:pPr>
+      <w:r>
+        <w:rPr>
+          <w:rFonts w:asciiTheme="minorHAnsi" w:eastAsia="Arial" w:hAnsiTheme="minorHAnsi" w:cs="Arial"/>
+          <w:b/>
+          <w:bCs/>
+          <w:color w:val="156082" w:themeColor="accent1"/>
+          <w:sz w:val="28"/>
+          <w:szCs w:val="28"/>
+        </w:rPr>
+        <w:lastRenderedPageBreak/>
+        <w:t xml:space="preserve">What </w:t>
+      </w:r>
+      <w:r>
+        <w:rPr>
+          <w:rFonts w:asciiTheme="minorHAnsi" w:eastAsia="Arial" w:hAnsiTheme="minorHAnsi" w:cs="Arial"/>
+          <w:b/>
+          <w:bCs/>
+          <w:color w:val="156082" w:themeColor="accent1"/>
+          <w:sz w:val="28"/>
+          <w:szCs w:val="28"/>
+        </w:rPr>
+        <w:t>Didn’t Work or Wasn’t Completed</w:t>
+      </w:r>
+    </w:p>
+    <w:p>
+      <w:pPr>
+        <w:rPr>
+          <w:rFonts w:ascii="Times New Roman" w:hAnsi="Times New Roman" w:cs="Times New Roman"/>
+        </w:rPr>
+      </w:pPr>
+      <w:r>
+        <w:rPr>
+          <w:rFonts w:ascii="Times New Roman" w:eastAsia="Arial" w:hAnsi="Times New Roman" w:cs="Times New Roman"/>
+          <w:color w:val="1A1A1A"/>
+        </w:rPr>
+        <w:t>Although I learned a lot, I also discovered limitations that, as of writing this, have not allowed me to complete the API and frontend layers of this project.</w:t>
+      </w:r>
+    </w:p>
+    <w:p>
+      <w:pPr>
+        <w:rPr>
+          <w:rFonts w:ascii="Times New Roman" w:hAnsi="Times New Roman" w:cs="Times New Roman"/>
+        </w:rPr>
+      </w:pPr>
+      <w:r>
+        <w:rPr>
+          <w:rFonts w:ascii="Times New Roman" w:eastAsia="Arial" w:hAnsi="Times New Roman" w:cs="Times New Roman"/>
+          <w:color w:val="1A1A1A"/>
+        </w:rPr>
+        <w:t>First, not all data sources are equally complete. The NPS data source is the most comprehensive. However, the MN DNR and MN GIS data sources are only partial, and there is meaningful overlap between them that ideally would be merged. The next step for this project after the semester would be to create a process that analyzes locations by their latitude and longitude proximity and estimates which locations should be merged, made parent-child relationships, or treated as distinct entities.</w:t>
+      </w:r>
+    </w:p>
+    <w:p>
+      <w:pPr>
+        <w:rPr>
+          <w:rFonts w:ascii="Times New Roman" w:hAnsi="Times New Roman" w:cs="Times New Roman"/>
+        </w:rPr>
+      </w:pPr>
+      <w:r>
+        <w:rPr>
+          <w:rFonts w:ascii="Times New Roman" w:eastAsia="Arial" w:hAnsi="Times New Roman" w:cs="Times New Roman"/>
+          <w:color w:val="1A1A1A"/>
+        </w:rPr>
+        <w:t xml:space="preserve">Second, it was difficult to properly assign locations </w:t>
+      </w:r>
+      <w:r>
+        <w:rPr>
+          <w:rFonts w:ascii="Times New Roman" w:eastAsia="Arial" w:hAnsi="Times New Roman" w:cs="Times New Roman"/>
+          <w:color w:val="1A1A1A"/>
+        </w:rPr>
+        <w:t>as</w:t>
+      </w:r>
+      <w:r>
+        <w:rPr>
+          <w:rFonts w:ascii="Times New Roman" w:eastAsia="Arial" w:hAnsi="Times New Roman" w:cs="Times New Roman"/>
+          <w:color w:val="1A1A1A"/>
+        </w:rPr>
+        <w:t xml:space="preserve"> children of</w:t>
+      </w:r>
+      <w:r>
+        <w:rPr>
+          <w:rFonts w:ascii="Times New Roman" w:eastAsia="Arial" w:hAnsi="Times New Roman" w:cs="Times New Roman"/>
+          <w:color w:val="1A1A1A"/>
+        </w:rPr>
+        <w:t xml:space="preserve"> other</w:t>
+      </w:r>
+      <w:r>
+        <w:rPr>
+          <w:rFonts w:ascii="Times New Roman" w:eastAsia="Arial" w:hAnsi="Times New Roman" w:cs="Times New Roman"/>
+          <w:color w:val="1A1A1A"/>
+        </w:rPr>
+        <w:t xml:space="preserve"> parent locations without being able to visually see how they were positioned geographically on </w:t>
+      </w:r>
+      <w:r>
+        <w:rPr>
+          <w:rFonts w:ascii="Times New Roman" w:eastAsia="Arial" w:hAnsi="Times New Roman" w:cs="Times New Roman"/>
+          <w:color w:val="1A1A1A"/>
+        </w:rPr>
+        <w:t>a</w:t>
+      </w:r>
+      <w:r>
+        <w:rPr>
+          <w:rFonts w:ascii="Times New Roman" w:eastAsia="Arial" w:hAnsi="Times New Roman" w:cs="Times New Roman"/>
+          <w:color w:val="1A1A1A"/>
+        </w:rPr>
+        <w:t xml:space="preserve"> map. For instance, NPS campground data is well-structured enough to allow campgrounds to be assigned as children of their parent national park. The same was not as straightforward with </w:t>
+      </w:r>
+      <w:r>
+        <w:rPr>
+          <w:rFonts w:ascii="Times New Roman" w:eastAsia="Arial" w:hAnsi="Times New Roman" w:cs="Times New Roman"/>
+          <w:color w:val="1A1A1A"/>
+        </w:rPr>
+        <w:t>Google</w:t>
+      </w:r>
+      <w:r>
+        <w:rPr>
+          <w:rFonts w:ascii="Times New Roman" w:eastAsia="Arial" w:hAnsi="Times New Roman" w:cs="Times New Roman"/>
+          <w:color w:val="1A1A1A"/>
+        </w:rPr>
+        <w:t xml:space="preserve"> Places or MN GIS data.</w:t>
+      </w:r>
+    </w:p>
+    <w:p>
+      <w:pPr>
+        <w:rPr>
+          <w:rFonts w:ascii="Times New Roman" w:hAnsi="Times New Roman" w:cs="Times New Roman"/>
+        </w:rPr>
+      </w:pPr>
+      <w:r>
+        <w:rPr>
+          <w:rFonts w:ascii="Times New Roman" w:eastAsia="Arial" w:hAnsi="Times New Roman" w:cs="Times New Roman"/>
+          <w:color w:val="1A1A1A"/>
+        </w:rPr>
+        <w:t xml:space="preserve">Third, the non-completion of the optimistic goal — migrating data to PostgreSQL and building the API and frontend layers — was due to the minimum viable project turning out to be more involved than originally </w:t>
+      </w:r>
+      <w:r>
+        <w:rPr>
+          <w:rFonts w:ascii="Times New Roman" w:eastAsia="Arial" w:hAnsi="Times New Roman" w:cs="Times New Roman"/>
+          <w:color w:val="1A1A1A"/>
+        </w:rPr>
+        <w:t>thought</w:t>
+      </w:r>
+      <w:r>
+        <w:rPr>
+          <w:rFonts w:ascii="Times New Roman" w:eastAsia="Arial" w:hAnsi="Times New Roman" w:cs="Times New Roman"/>
+          <w:color w:val="1A1A1A"/>
+        </w:rPr>
+        <w:t xml:space="preserve">. Writing and validating the SQL transformation </w:t>
+      </w:r>
+      <w:r>
+        <w:rPr>
+          <w:rFonts w:ascii="Times New Roman" w:eastAsia="Arial" w:hAnsi="Times New Roman" w:cs="Times New Roman"/>
+          <w:color w:val="1A1A1A"/>
+        </w:rPr>
+        <w:t xml:space="preserve">scripts with views and insert queries took additional time to complete. </w:t>
+      </w:r>
+    </w:p>
+    <w:p>
+      <w:pPr>
         <w:rPr>
           <w:b/>
           <w:bCs/>
@@ -813,8 +3212,437 @@
         <w:t>Limitations</w:t>
       </w:r>
     </w:p>
+    <w:p>
+      <w:pPr>
+        <w:pStyle w:val="Heading2"/>
+        <w:rPr>
+          <w:rFonts w:asciiTheme="minorHAnsi" w:hAnsiTheme="minorHAnsi" w:cs="Times New Roman"/>
+          <w:color w:val="156082" w:themeColor="accent1"/>
+          <w:sz w:val="28"/>
+          <w:szCs w:val="28"/>
+        </w:rPr>
+      </w:pPr>
+      <w:r>
+        <w:rPr>
+          <w:rFonts w:asciiTheme="minorHAnsi" w:eastAsia="Arial" w:hAnsiTheme="minorHAnsi" w:cs="Times New Roman"/>
+          <w:b/>
+          <w:bCs/>
+          <w:color w:val="156082" w:themeColor="accent1"/>
+          <w:sz w:val="28"/>
+          <w:szCs w:val="28"/>
+        </w:rPr>
+        <w:t>Incomplete Data Sources</w:t>
+      </w:r>
+    </w:p>
+    <w:p>
+      <w:pPr>
+        <w:rPr>
+          <w:rFonts w:ascii="Times New Roman" w:hAnsi="Times New Roman" w:cs="Times New Roman"/>
+        </w:rPr>
+      </w:pPr>
+      <w:r>
+        <w:rPr>
+          <w:rFonts w:ascii="Times New Roman" w:eastAsia="Arial" w:hAnsi="Times New Roman" w:cs="Times New Roman"/>
+          <w:color w:val="1A1A1A"/>
+          <w:sz w:val="22"/>
+          <w:szCs w:val="22"/>
+        </w:rPr>
+        <w:t xml:space="preserve">The first limitation is that several data sources are not entirely complete. The RIDB and NPS data sources are the most comprehensive. However, the MN DNR and MN GIS sources are far from complete and likely contain overlapping location references to the same physical places. The next step will be to create a </w:t>
+      </w:r>
+      <w:r>
+        <w:rPr>
+          <w:rFonts w:ascii="Times New Roman" w:eastAsia="Arial" w:hAnsi="Times New Roman" w:cs="Times New Roman"/>
+          <w:color w:val="1A1A1A"/>
+          <w:sz w:val="22"/>
+          <w:szCs w:val="22"/>
+        </w:rPr>
+        <w:t>scripted</w:t>
+      </w:r>
+      <w:r>
+        <w:rPr>
+          <w:rFonts w:ascii="Times New Roman" w:eastAsia="Arial" w:hAnsi="Times New Roman" w:cs="Times New Roman"/>
+          <w:color w:val="1A1A1A"/>
+          <w:sz w:val="22"/>
+          <w:szCs w:val="22"/>
+        </w:rPr>
+        <w:t xml:space="preserve"> process that analyzes locations via their latitude and longitude proximity and estimates which should be merged, which should become parent-child relationships, and which are genuinely distinct locations.</w:t>
+      </w:r>
+    </w:p>
+    <w:p>
+      <w:pPr>
+        <w:pStyle w:val="Heading2"/>
+        <w:rPr>
+          <w:rFonts w:asciiTheme="minorHAnsi" w:hAnsiTheme="minorHAnsi" w:cs="Times New Roman"/>
+          <w:color w:val="156082" w:themeColor="accent1"/>
+          <w:sz w:val="28"/>
+          <w:szCs w:val="28"/>
+        </w:rPr>
+      </w:pPr>
+      <w:r>
+        <w:rPr>
+          <w:rFonts w:asciiTheme="minorHAnsi" w:eastAsia="Arial" w:hAnsiTheme="minorHAnsi" w:cs="Times New Roman"/>
+          <w:b/>
+          <w:bCs/>
+          <w:color w:val="156082" w:themeColor="accent1"/>
+          <w:sz w:val="28"/>
+          <w:szCs w:val="28"/>
+        </w:rPr>
+        <w:t>Geographic Scope</w:t>
+      </w:r>
+    </w:p>
+    <w:p>
+      <w:pPr>
+        <w:rPr>
+          <w:rFonts w:ascii="Times New Roman" w:eastAsia="Arial" w:hAnsi="Times New Roman" w:cs="Times New Roman"/>
+          <w:color w:val="1A1A1A"/>
+        </w:rPr>
+      </w:pPr>
+      <w:r>
+        <w:rPr>
+          <w:rFonts w:ascii="Times New Roman" w:eastAsia="Arial" w:hAnsi="Times New Roman" w:cs="Times New Roman"/>
+          <w:color w:val="1A1A1A"/>
+        </w:rPr>
+        <w:t xml:space="preserve">This project is currently limited to Minnesota state parks and US national parks. A more powerful and broadly useful </w:t>
+      </w:r>
+      <w:r>
+        <w:rPr>
+          <w:rFonts w:ascii="Times New Roman" w:eastAsia="Arial" w:hAnsi="Times New Roman" w:cs="Times New Roman"/>
+          <w:color w:val="1A1A1A"/>
+        </w:rPr>
+        <w:t xml:space="preserve">project would attempt to collect and manage data spanning the entire United States. Expanding the scope would require additional data sources and more robust normalization work across a wider variety of source formats. </w:t>
+      </w:r>
+    </w:p>
+    <w:p>
+      <w:pPr>
+        <w:pStyle w:val="Heading2"/>
+        <w:rPr>
+          <w:rFonts w:asciiTheme="minorHAnsi" w:hAnsiTheme="minorHAnsi" w:cs="Times New Roman"/>
+          <w:color w:val="156082" w:themeColor="accent1"/>
+          <w:sz w:val="28"/>
+          <w:szCs w:val="28"/>
+        </w:rPr>
+      </w:pPr>
+      <w:r>
+        <w:rPr>
+          <w:rFonts w:asciiTheme="minorHAnsi" w:eastAsia="Arial" w:hAnsiTheme="minorHAnsi" w:cs="Times New Roman"/>
+          <w:b/>
+          <w:bCs/>
+          <w:color w:val="156082" w:themeColor="accent1"/>
+          <w:sz w:val="28"/>
+          <w:szCs w:val="28"/>
+        </w:rPr>
+        <w:lastRenderedPageBreak/>
+        <w:t>Optimistic Goal Not Completed</w:t>
+      </w:r>
+    </w:p>
+    <w:p>
+      <w:pPr>
+        <w:rPr>
+          <w:rFonts w:ascii="Times New Roman" w:hAnsi="Times New Roman" w:cs="Times New Roman"/>
+        </w:rPr>
+      </w:pPr>
+      <w:r>
+        <w:rPr>
+          <w:rFonts w:ascii="Times New Roman" w:eastAsia="Arial" w:hAnsi="Times New Roman" w:cs="Times New Roman"/>
+          <w:color w:val="1A1A1A"/>
+        </w:rPr>
+        <w:t>The PostgreSQL migration, Django API, and React frontend were not completed within the scope of this semester. The minimum viable project took more time than originally estimated, leaving insufficient time for the full-stack layers. These remain planned next steps for the project beyond this class.</w:t>
+      </w:r>
+    </w:p>
+    <w:p>
+      <w:pPr>
+        <w:pStyle w:val="Heading2"/>
+        <w:rPr>
+          <w:rFonts w:asciiTheme="minorHAnsi" w:hAnsiTheme="minorHAnsi" w:cs="Times New Roman"/>
+          <w:color w:val="156082" w:themeColor="accent1"/>
+          <w:sz w:val="28"/>
+          <w:szCs w:val="28"/>
+        </w:rPr>
+      </w:pPr>
+      <w:r>
+        <w:rPr>
+          <w:rFonts w:asciiTheme="minorHAnsi" w:eastAsia="Arial" w:hAnsiTheme="minorHAnsi" w:cs="Times New Roman"/>
+          <w:b/>
+          <w:bCs/>
+          <w:color w:val="156082" w:themeColor="accent1"/>
+          <w:sz w:val="28"/>
+          <w:szCs w:val="28"/>
+        </w:rPr>
+        <w:t>Ethical Considerations</w:t>
+      </w:r>
+    </w:p>
+    <w:p>
+      <w:pPr>
+        <w:rPr>
+          <w:rFonts w:ascii="Times New Roman" w:hAnsi="Times New Roman" w:cs="Times New Roman"/>
+        </w:rPr>
+      </w:pPr>
+      <w:r>
+        <w:rPr>
+          <w:rFonts w:ascii="Times New Roman" w:eastAsia="Arial" w:hAnsi="Times New Roman" w:cs="Times New Roman"/>
+          <w:color w:val="1A1A1A"/>
+        </w:rPr>
+        <w:t>Working on this project raised a few ethical considerations worth noting:</w:t>
+      </w:r>
+    </w:p>
+    <w:p>
+      <w:pPr>
+        <w:pStyle w:val="ListParagraph"/>
+        <w:numPr>
+          <w:ilvl w:val="0"/>
+          <w:numId w:val="11"/>
+        </w:numPr>
+        <w:spacing w:after="100" w:line="240" w:lineRule="auto"/>
+        <w:contextualSpacing w:val="0"/>
+        <w:rPr>
+          <w:rFonts w:ascii="Times New Roman" w:hAnsi="Times New Roman" w:cs="Times New Roman"/>
+        </w:rPr>
+      </w:pPr>
+      <w:r>
+        <w:rPr>
+          <w:rFonts w:ascii="Times New Roman" w:eastAsia="Arial" w:hAnsi="Times New Roman" w:cs="Times New Roman"/>
+          <w:b/>
+          <w:bCs/>
+          <w:color w:val="1A1A1A"/>
+        </w:rPr>
+        <w:t>Data Licensing and Public Availability</w:t>
+      </w:r>
+      <w:r>
+        <w:rPr>
+          <w:rFonts w:ascii="Times New Roman" w:eastAsia="Arial" w:hAnsi="Times New Roman" w:cs="Times New Roman"/>
+          <w:color w:val="1A1A1A"/>
+        </w:rPr>
+        <w:t>: Most data collected for this project comes from state and federal government websites, which are generally considered publicly available. However, before publishing this project or its data publicly, I would need to confirm that the specific datasets used can be legally redistributed on a personal</w:t>
+      </w:r>
+      <w:r>
+        <w:rPr>
+          <w:rFonts w:ascii="Times New Roman" w:eastAsia="Arial" w:hAnsi="Times New Roman" w:cs="Times New Roman"/>
+          <w:color w:val="1A1A1A"/>
+        </w:rPr>
+        <w:t>ly managed</w:t>
+      </w:r>
+      <w:r>
+        <w:rPr>
+          <w:rFonts w:ascii="Times New Roman" w:eastAsia="Arial" w:hAnsi="Times New Roman" w:cs="Times New Roman"/>
+          <w:color w:val="1A1A1A"/>
+        </w:rPr>
+        <w:t xml:space="preserve"> website, particularly the Google Places API data, which has specific terms of service around caching and redistribution.</w:t>
+      </w:r>
+    </w:p>
+    <w:p>
+      <w:pPr>
+        <w:pStyle w:val="ListParagraph"/>
+        <w:numPr>
+          <w:ilvl w:val="0"/>
+          <w:numId w:val="11"/>
+        </w:numPr>
+        <w:spacing w:after="100" w:line="240" w:lineRule="auto"/>
+        <w:contextualSpacing w:val="0"/>
+        <w:rPr>
+          <w:rFonts w:ascii="Times New Roman" w:hAnsi="Times New Roman" w:cs="Times New Roman"/>
+        </w:rPr>
+      </w:pPr>
+      <w:r>
+        <w:rPr>
+          <w:rFonts w:ascii="Times New Roman" w:eastAsia="Arial" w:hAnsi="Times New Roman" w:cs="Times New Roman"/>
+          <w:b/>
+          <w:bCs/>
+          <w:color w:val="1A1A1A"/>
+        </w:rPr>
+        <w:t>Data Accuracy and Currency</w:t>
+      </w:r>
+      <w:r>
+        <w:rPr>
+          <w:rFonts w:ascii="Times New Roman" w:eastAsia="Arial" w:hAnsi="Times New Roman" w:cs="Times New Roman"/>
+          <w:color w:val="1A1A1A"/>
+        </w:rPr>
+        <w:t>: Without a regular automated pipeline to re-retrieve and compare data against</w:t>
+      </w:r>
+      <w:r>
+        <w:rPr>
+          <w:rFonts w:ascii="Times New Roman" w:eastAsia="Arial" w:hAnsi="Times New Roman" w:cs="Times New Roman"/>
+          <w:color w:val="1A1A1A"/>
+        </w:rPr>
+        <w:t xml:space="preserve"> current collected data</w:t>
+      </w:r>
+      <w:r>
+        <w:rPr>
+          <w:rFonts w:ascii="Times New Roman" w:eastAsia="Arial" w:hAnsi="Times New Roman" w:cs="Times New Roman"/>
+          <w:color w:val="1A1A1A"/>
+        </w:rPr>
+        <w:t>, I cannot guarantee that the information remains accurate over time. Any published version of the Explore More</w:t>
+      </w:r>
+      <w:r>
+        <w:rPr>
+          <w:rFonts w:ascii="Times New Roman" w:eastAsia="Arial" w:hAnsi="Times New Roman" w:cs="Times New Roman"/>
+          <w:color w:val="1A1A1A"/>
+        </w:rPr>
+        <w:t xml:space="preserve"> project</w:t>
+      </w:r>
+      <w:r>
+        <w:rPr>
+          <w:rFonts w:ascii="Times New Roman" w:eastAsia="Arial" w:hAnsi="Times New Roman" w:cs="Times New Roman"/>
+          <w:color w:val="1A1A1A"/>
+        </w:rPr>
+        <w:t xml:space="preserve"> would need to clearly communicate to users when the data was last verified.</w:t>
+      </w:r>
+    </w:p>
+    <w:p>
+      <w:pPr>
+        <w:pStyle w:val="ListParagraph"/>
+        <w:numPr>
+          <w:ilvl w:val="0"/>
+          <w:numId w:val="11"/>
+        </w:numPr>
+        <w:spacing w:after="100" w:line="240" w:lineRule="auto"/>
+        <w:contextualSpacing w:val="0"/>
+        <w:rPr>
+          <w:rFonts w:ascii="Times New Roman" w:hAnsi="Times New Roman" w:cs="Times New Roman"/>
+        </w:rPr>
+      </w:pPr>
+      <w:r>
+        <w:rPr>
+          <w:rFonts w:ascii="Times New Roman" w:eastAsia="Arial" w:hAnsi="Times New Roman" w:cs="Times New Roman"/>
+          <w:b/>
+          <w:bCs/>
+          <w:color w:val="1A1A1A"/>
+        </w:rPr>
+        <w:t>Third-Party Image Rights:</w:t>
+      </w:r>
+      <w:r>
+        <w:rPr>
+          <w:rFonts w:ascii="Times New Roman" w:eastAsia="Arial" w:hAnsi="Times New Roman" w:cs="Times New Roman"/>
+          <w:color w:val="1A1A1A"/>
+        </w:rPr>
+        <w:t xml:space="preserve"> If I want to display </w:t>
+      </w:r>
+      <w:r>
+        <w:rPr>
+          <w:rFonts w:ascii="Times New Roman" w:eastAsia="Arial" w:hAnsi="Times New Roman" w:cs="Times New Roman"/>
+          <w:color w:val="1A1A1A"/>
+        </w:rPr>
+        <w:t>media</w:t>
+      </w:r>
+      <w:r>
+        <w:rPr>
+          <w:rFonts w:ascii="Times New Roman" w:eastAsia="Arial" w:hAnsi="Times New Roman" w:cs="Times New Roman"/>
+          <w:color w:val="1A1A1A"/>
+        </w:rPr>
+        <w:t xml:space="preserve"> associated with park locations that come through the Google Places API, I would need to continue using the Google API and paying for its usage rather than downloading and re-hosting those images on my own media server, as doing otherwise would </w:t>
+      </w:r>
+      <w:r>
+        <w:rPr>
+          <w:rFonts w:ascii="Times New Roman" w:eastAsia="Arial" w:hAnsi="Times New Roman" w:cs="Times New Roman"/>
+          <w:color w:val="1A1A1A"/>
+        </w:rPr>
+        <w:t xml:space="preserve">likely </w:t>
+      </w:r>
+      <w:r>
+        <w:rPr>
+          <w:rFonts w:ascii="Times New Roman" w:eastAsia="Arial" w:hAnsi="Times New Roman" w:cs="Times New Roman"/>
+          <w:color w:val="1A1A1A"/>
+        </w:rPr>
+        <w:t>violate Google’s terms of service.</w:t>
+      </w:r>
+    </w:p>
+    <w:p>
+      <w:pPr>
+        <w:pStyle w:val="ListParagraph"/>
+        <w:numPr>
+          <w:ilvl w:val="0"/>
+          <w:numId w:val="11"/>
+        </w:numPr>
+        <w:spacing w:after="100" w:line="240" w:lineRule="auto"/>
+        <w:contextualSpacing w:val="0"/>
+        <w:rPr>
+          <w:rFonts w:ascii="Times New Roman" w:hAnsi="Times New Roman" w:cs="Times New Roman"/>
+        </w:rPr>
+      </w:pPr>
+      <w:r>
+        <w:rPr>
+          <w:rFonts w:ascii="Times New Roman" w:eastAsia="Arial" w:hAnsi="Times New Roman" w:cs="Times New Roman"/>
+          <w:b/>
+          <w:bCs/>
+          <w:color w:val="1A1A1A"/>
+        </w:rPr>
+        <w:t>Web Scraping Considerations</w:t>
+      </w:r>
+      <w:r>
+        <w:rPr>
+          <w:rFonts w:ascii="Times New Roman" w:eastAsia="Arial" w:hAnsi="Times New Roman" w:cs="Times New Roman"/>
+          <w:color w:val="1A1A1A"/>
+        </w:rPr>
+        <w:t>: If the project is extended by scraping additional sources such as Wikipedia, state websites, or third-party park information sites, I would need to review each source’s terms of service and robots.txt to ensure compliance before doing so.</w:t>
+      </w:r>
+    </w:p>
+    <w:p>
+      <w:pPr>
+        <w:spacing w:after="100" w:line="240" w:lineRule="auto"/>
+        <w:rPr>
+          <w:rFonts w:ascii="Times New Roman" w:hAnsi="Times New Roman" w:cs="Times New Roman"/>
+        </w:rPr>
+      </w:pPr>
+    </w:p>
+    <w:p>
+      <w:pPr>
+        <w:rPr>
+          <w:b/>
+          <w:bCs/>
+          <w:color w:val="156082" w:themeColor="accent1"/>
+          <w:sz w:val="32"/>
+          <w:szCs w:val="32"/>
+        </w:rPr>
+      </w:pPr>
+      <w:r>
+        <w:rPr>
+          <w:b/>
+          <w:bCs/>
+          <w:color w:val="156082" w:themeColor="accent1"/>
+          <w:sz w:val="32"/>
+          <w:szCs w:val="32"/>
+        </w:rPr>
+        <w:t>Conclusion</w:t>
+      </w:r>
+    </w:p>
+    <w:p>
+      <w:pPr>
+        <w:rPr>
+          <w:rFonts w:ascii="Times New Roman" w:hAnsi="Times New Roman" w:cs="Times New Roman"/>
+        </w:rPr>
+      </w:pPr>
+      <w:r>
+        <w:rPr>
+          <w:rFonts w:ascii="Times New Roman" w:hAnsi="Times New Roman" w:cs="Times New Roman"/>
+        </w:rPr>
+        <w:t>Although this project’s optimistic goals weren’t entirely complete as of writing this document,</w:t>
+      </w:r>
+      <w:r>
+        <w:rPr>
+          <w:rFonts w:ascii="Times New Roman" w:hAnsi="Times New Roman" w:cs="Times New Roman"/>
+        </w:rPr>
+        <w:t xml:space="preserve"> the foundation that has been built is one I’m proud of and plan to continue working on after the conclusion of this class. Working through this project has reinforced that building something meaningful with data requires more than just knowing the SQL or Python syntax. Rather it requires understanding the concepts well enough to make deliberate design decisions, like choosing how to model a self-referencing hierarchy, identification of different entities and the relationships between them, when to use a view versus a Python script or how to structure a transaction so that failures are recoverable. DuckDB proved to be an interesting and powerful </w:t>
+      </w:r>
+      <w:r>
+        <w:rPr>
+          <w:rFonts w:ascii="Times New Roman" w:hAnsi="Times New Roman" w:cs="Times New Roman"/>
+        </w:rPr>
+        <w:lastRenderedPageBreak/>
+        <w:t>tool for this kind of data management and transformation project, and this project gave me a real-world context to apply nearly everything covered in this course. Ultimately, what started as a side project I wanted to build for myself – a better way to access information about Minnesota’s parks, forests and campgrounds – has become something I now have a much stronger foundation to continue working on and eventually finish.</w:t>
+      </w:r>
+    </w:p>
+    <w:p>
+      <w:pPr>
+        <w:rPr>
+          <w:b/>
+          <w:bCs/>
+          <w:color w:val="156082" w:themeColor="accent1"/>
+          <w:sz w:val="32"/>
+          <w:szCs w:val="32"/>
+        </w:rPr>
+      </w:pPr>
+    </w:p>
     <w:sectPr>
-      <w:headerReference w:type="default" r:id="rId13"/>
+      <w:headerReference w:type="default" r:id="rId23"/>
       <w:pgSz w:w="12240" w:h="15840"/>
       <w:pgMar w:top="1440" w:right="1440" w:bottom="1440" w:left="1440" w:header="720" w:footer="720" w:gutter="0"/>
       <w:cols w:space="720"/>
@@ -1050,6 +3878,60 @@
 <file path=word/numbering.xml><?xml version="1.0" encoding="utf-8"?>
 <w:numbering xmlns:wpc="http://schemas.microsoft.com/office/word/2010/wordprocessingCanvas" xmlns:cx="http://schemas.microsoft.com/office/drawing/2014/chartex" xmlns:cx1="http://schemas.microsoft.com/office/drawing/2015/9/8/chartex" xmlns:cx2="http://schemas.microsoft.com/office/drawing/2015/10/21/chartex" xmlns:cx3="http://schemas.microsoft.com/office/drawing/2016/5/9/chartex" xmlns:cx4="http://schemas.microsoft.com/office/drawing/2016/5/10/chartex" xmlns:cx5="http://schemas.microsoft.com/office/drawing/2016/5/11/chartex" xmlns:cx6="http://schemas.microsoft.com/office/drawing/2016/5/12/chartex" xmlns:cx7="http://schemas.microsoft.com/office/drawing/2016/5/13/chartex" xmlns:cx8="http://schemas.microsoft.com/office/drawing/2016/5/14/chartex" xmlns:mc="http://schemas.openxmlformats.org/markup-compatibility/2006" xmlns:aink="http://schemas.microsoft.com/office/drawing/2016/ink" xmlns:am3d="http://schemas.microsoft.com/office/drawing/2017/model3d" xmlns:o="urn:schemas-microsoft-com:office:office" xmlns:oel="http://schemas.microsoft.com/office/2019/extlst" xmlns:r="http://schemas.openxmlformats.org/officeDocument/2006/relationships" xmlns:m="http://schemas.openxmlformats.org/officeDocument/2006/math" xmlns:v="urn:schemas-microsoft-com:vml" xmlns:wp14="http://schemas.microsoft.com/office/word/2010/wordprocessingDrawing" xmlns:wp="http://schemas.openxmlformats.org/drawingml/2006/wordprocessingDrawing" xmlns:w10="urn:schemas-microsoft-com:office:word" xmlns:w="http://schemas.openxmlformats.org/wordprocessingml/2006/main" xmlns:w14="http://schemas.microsoft.com/office/word/2010/wordml" xmlns:w15="http://schemas.microsoft.com/office/word/2012/wordml" xmlns:w16cex="http://schemas.microsoft.com/office/word/2018/wordml/cex" xmlns:w16cid="http://schemas.microsoft.com/office/word/2016/wordml/cid" xmlns:w16="http://schemas.microsoft.com/office/word/2018/wordml" xmlns:w16du="http://schemas.microsoft.com/office/word/2023/wordml/word16du" xmlns:w16sdtdh="http://schemas.microsoft.com/office/word/2020/wordml/sdtdatahash" xmlns:w16sdtfl="http://schemas.microsoft.com/office/word/2024/wordml/sdtformatlock" xmlns:w16se="http://schemas.microsoft.com/office/word/2015/wordml/symex" xmlns:wpg="http://schemas.microsoft.com/office/word/2010/wordprocessingGroup" xmlns:wpi="http://schemas.microsoft.com/office/word/2010/wordprocessingInk" xmlns:wne="http://schemas.microsoft.com/office/word/2006/wordml" xmlns:wps="http://schemas.microsoft.com/office/word/2010/wordprocessingShape" mc:Ignorable="w14 w15 w16se w16cid w16 w16cex w16sdtdh w16sdtfl w16du wp14">
   <w:abstractNum w:abstractNumId="0" w15:restartNumberingAfterBreak="0">
+    <w:nsid w:val="16BD7EC8"/>
+    <w:multiLevelType w:val="hybridMultilevel"/>
+    <w:tmpl w:val="018E0490"/>
+    <w:lvl w:ilvl="0" w:tplc="82C8C7E0">
+      <w:start w:val="1"/>
+      <w:numFmt w:val="decimal"/>
+      <w:lvlText w:val="%1."/>
+      <w:lvlJc w:val="left"/>
+      <w:pPr>
+        <w:ind w:left="720" w:hanging="360"/>
+      </w:pPr>
+    </w:lvl>
+    <w:lvl w:ilvl="1" w:tplc="825432D8">
+      <w:numFmt w:val="decimal"/>
+      <w:lvlText w:val=""/>
+      <w:lvlJc w:val="left"/>
+    </w:lvl>
+    <w:lvl w:ilvl="2" w:tplc="D50A933A">
+      <w:numFmt w:val="decimal"/>
+      <w:lvlText w:val=""/>
+      <w:lvlJc w:val="left"/>
+    </w:lvl>
+    <w:lvl w:ilvl="3" w:tplc="B5B6BD94">
+      <w:numFmt w:val="decimal"/>
+      <w:lvlText w:val=""/>
+      <w:lvlJc w:val="left"/>
+    </w:lvl>
+    <w:lvl w:ilvl="4" w:tplc="7526B89A">
+      <w:numFmt w:val="decimal"/>
+      <w:lvlText w:val=""/>
+      <w:lvlJc w:val="left"/>
+    </w:lvl>
+    <w:lvl w:ilvl="5" w:tplc="80C0DA24">
+      <w:numFmt w:val="decimal"/>
+      <w:lvlText w:val=""/>
+      <w:lvlJc w:val="left"/>
+    </w:lvl>
+    <w:lvl w:ilvl="6" w:tplc="51A0E7B4">
+      <w:numFmt w:val="decimal"/>
+      <w:lvlText w:val=""/>
+      <w:lvlJc w:val="left"/>
+    </w:lvl>
+    <w:lvl w:ilvl="7" w:tplc="983CAEB4">
+      <w:numFmt w:val="decimal"/>
+      <w:lvlText w:val=""/>
+      <w:lvlJc w:val="left"/>
+    </w:lvl>
+    <w:lvl w:ilvl="8" w:tplc="A60204A8">
+      <w:numFmt w:val="decimal"/>
+      <w:lvlText w:val=""/>
+      <w:lvlJc w:val="left"/>
+    </w:lvl>
+  </w:abstractNum>
+  <w:abstractNum w:abstractNumId="1" w15:restartNumberingAfterBreak="0">
     <w:nsid w:val="16F26798"/>
     <w:multiLevelType w:val="multilevel"/>
     <w:tmpl w:val="F456297A"/>
@@ -1198,10 +4080,10 @@
       </w:rPr>
     </w:lvl>
   </w:abstractNum>
-  <w:abstractNum w:abstractNumId="1" w15:restartNumberingAfterBreak="0">
+  <w:abstractNum w:abstractNumId="2" w15:restartNumberingAfterBreak="0">
     <w:nsid w:val="17125227"/>
     <w:multiLevelType w:val="hybridMultilevel"/>
-    <w:tmpl w:val="9C9C9FC6"/>
+    <w:tmpl w:val="F9F60072"/>
     <w:lvl w:ilvl="0" w:tplc="04090001">
       <w:start w:val="1"/>
       <w:numFmt w:val="bullet"/>
@@ -1312,7 +4194,7 @@
       </w:rPr>
     </w:lvl>
   </w:abstractNum>
-  <w:abstractNum w:abstractNumId="2" w15:restartNumberingAfterBreak="0">
+  <w:abstractNum w:abstractNumId="3" w15:restartNumberingAfterBreak="0">
     <w:nsid w:val="22F54E4E"/>
     <w:multiLevelType w:val="hybridMultilevel"/>
     <w:tmpl w:val="7E7CB80A"/>
@@ -1401,7 +4283,7 @@
       </w:pPr>
     </w:lvl>
   </w:abstractNum>
-  <w:abstractNum w:abstractNumId="3" w15:restartNumberingAfterBreak="0">
+  <w:abstractNum w:abstractNumId="4" w15:restartNumberingAfterBreak="0">
     <w:nsid w:val="28AF08E9"/>
     <w:multiLevelType w:val="hybridMultilevel"/>
     <w:tmpl w:val="FBD6CB54"/>
@@ -1513,7 +4395,7 @@
       </w:rPr>
     </w:lvl>
   </w:abstractNum>
-  <w:abstractNum w:abstractNumId="4" w15:restartNumberingAfterBreak="0">
+  <w:abstractNum w:abstractNumId="5" w15:restartNumberingAfterBreak="0">
     <w:nsid w:val="3D1C24D0"/>
     <w:multiLevelType w:val="multilevel"/>
     <w:tmpl w:val="E2BE3D90"/>
@@ -1630,7 +4512,7 @@
       </w:pPr>
     </w:lvl>
   </w:abstractNum>
-  <w:abstractNum w:abstractNumId="5" w15:restartNumberingAfterBreak="0">
+  <w:abstractNum w:abstractNumId="6" w15:restartNumberingAfterBreak="0">
     <w:nsid w:val="41FB05F4"/>
     <w:multiLevelType w:val="multilevel"/>
     <w:tmpl w:val="1DA6D3D4"/>
@@ -1779,7 +4661,7 @@
       </w:rPr>
     </w:lvl>
   </w:abstractNum>
-  <w:abstractNum w:abstractNumId="6" w15:restartNumberingAfterBreak="0">
+  <w:abstractNum w:abstractNumId="7" w15:restartNumberingAfterBreak="0">
     <w:nsid w:val="429D3B52"/>
     <w:multiLevelType w:val="multilevel"/>
     <w:tmpl w:val="D54416BA"/>
@@ -1928,7 +4810,7 @@
       </w:rPr>
     </w:lvl>
   </w:abstractNum>
-  <w:abstractNum w:abstractNumId="7" w15:restartNumberingAfterBreak="0">
+  <w:abstractNum w:abstractNumId="8" w15:restartNumberingAfterBreak="0">
     <w:nsid w:val="57662766"/>
     <w:multiLevelType w:val="hybridMultilevel"/>
     <w:tmpl w:val="7112394E"/>
@@ -2017,7 +4899,7 @@
       </w:pPr>
     </w:lvl>
   </w:abstractNum>
-  <w:abstractNum w:abstractNumId="8" w15:restartNumberingAfterBreak="0">
+  <w:abstractNum w:abstractNumId="9" w15:restartNumberingAfterBreak="0">
     <w:nsid w:val="604506D9"/>
     <w:multiLevelType w:val="hybridMultilevel"/>
     <w:tmpl w:val="BAC24A30"/>
@@ -2075,7 +4957,7 @@
       <w:lvlJc w:val="left"/>
     </w:lvl>
   </w:abstractNum>
-  <w:abstractNum w:abstractNumId="9" w15:restartNumberingAfterBreak="0">
+  <w:abstractNum w:abstractNumId="10" w15:restartNumberingAfterBreak="0">
     <w:nsid w:val="693614E1"/>
     <w:multiLevelType w:val="multilevel"/>
     <w:tmpl w:val="6BC27D4C"/>
@@ -2224,7 +5106,7 @@
       </w:rPr>
     </w:lvl>
   </w:abstractNum>
-  <w:abstractNum w:abstractNumId="10" w15:restartNumberingAfterBreak="0">
+  <w:abstractNum w:abstractNumId="11" w15:restartNumberingAfterBreak="0">
     <w:nsid w:val="6B3B7654"/>
     <w:multiLevelType w:val="multilevel"/>
     <w:tmpl w:val="6F36EB6C"/>
@@ -2337,7 +5219,7 @@
       </w:pPr>
     </w:lvl>
   </w:abstractNum>
-  <w:abstractNum w:abstractNumId="11" w15:restartNumberingAfterBreak="0">
+  <w:abstractNum w:abstractNumId="12" w15:restartNumberingAfterBreak="0">
     <w:nsid w:val="7408184C"/>
     <w:multiLevelType w:val="multilevel"/>
     <w:tmpl w:val="C3A402AA"/>
@@ -2487,43 +5369,49 @@
     </w:lvl>
   </w:abstractNum>
   <w:num w:numId="1" w16cid:durableId="1297493801">
+    <w:abstractNumId w:val="12"/>
+  </w:num>
+  <w:num w:numId="2" w16cid:durableId="899749146">
+    <w:abstractNumId w:val="10"/>
+  </w:num>
+  <w:num w:numId="3" w16cid:durableId="666859799">
+    <w:abstractNumId w:val="7"/>
+  </w:num>
+  <w:num w:numId="4" w16cid:durableId="170224052">
+    <w:abstractNumId w:val="6"/>
+  </w:num>
+  <w:num w:numId="5" w16cid:durableId="613244917">
     <w:abstractNumId w:val="11"/>
   </w:num>
-  <w:num w:numId="2" w16cid:durableId="899749146">
-    <w:abstractNumId w:val="9"/>
+  <w:num w:numId="6" w16cid:durableId="1133331838">
+    <w:abstractNumId w:val="1"/>
   </w:num>
-  <w:num w:numId="3" w16cid:durableId="666859799">
-    <w:abstractNumId w:val="6"/>
-  </w:num>
-  <w:num w:numId="4" w16cid:durableId="170224052">
+  <w:num w:numId="7" w16cid:durableId="116337041">
     <w:abstractNumId w:val="5"/>
   </w:num>
-  <w:num w:numId="5" w16cid:durableId="613244917">
-    <w:abstractNumId w:val="10"/>
-  </w:num>
-  <w:num w:numId="6" w16cid:durableId="1133331838">
-    <w:abstractNumId w:val="0"/>
-  </w:num>
-  <w:num w:numId="7" w16cid:durableId="116337041">
+  <w:num w:numId="8" w16cid:durableId="34744792">
     <w:abstractNumId w:val="4"/>
   </w:num>
-  <w:num w:numId="8" w16cid:durableId="34744792">
+  <w:num w:numId="9" w16cid:durableId="437796160">
     <w:abstractNumId w:val="3"/>
   </w:num>
-  <w:num w:numId="9" w16cid:durableId="437796160">
-    <w:abstractNumId w:val="2"/>
-  </w:num>
   <w:num w:numId="10" w16cid:durableId="799569860">
-    <w:abstractNumId w:val="7"/>
+    <w:abstractNumId w:val="8"/>
   </w:num>
   <w:num w:numId="11" w16cid:durableId="1717504843">
-    <w:abstractNumId w:val="8"/>
+    <w:abstractNumId w:val="9"/>
     <w:lvlOverride w:ilvl="0">
       <w:startOverride w:val="1"/>
     </w:lvlOverride>
   </w:num>
   <w:num w:numId="12" w16cid:durableId="1021854010">
-    <w:abstractNumId w:val="1"/>
+    <w:abstractNumId w:val="2"/>
+  </w:num>
+  <w:num w:numId="13" w16cid:durableId="144905478">
+    <w:abstractNumId w:val="0"/>
+    <w:lvlOverride w:ilvl="0">
+      <w:startOverride w:val="1"/>
+    </w:lvlOverride>
   </w:num>
 </w:numbering>
 </file>
@@ -2928,6 +5816,7 @@
   <w:style w:type="paragraph" w:default="1" w:styleId="Normal">
     <w:name w:val="Normal"/>
     <w:qFormat/>
+    <w:rsid w:val="00CB5A35"/>
   </w:style>
   <w:style w:type="paragraph" w:styleId="Heading1">
     <w:name w:val="heading 1"/>

</xml_diff>

<commit_message>
updated remainder TODOS I have to finish within the final project document rough draft. Nearly complete.
</commit_message>
<xml_diff>
--- a/GIS-Data-Migration-Project/Assignment Documents/Final Project - Part 2 - Final Project Rough Draft.docx
+++ b/GIS-Data-Migration-Project/Assignment Documents/Final Project - Part 2 - Final Project Rough Draft.docx
@@ -267,23 +267,7 @@
           <w:rFonts w:ascii="Times New Roman" w:eastAsia="Arial" w:hAnsi="Times New Roman" w:cs="Times New Roman"/>
           <w:color w:val="1A1A1A"/>
         </w:rPr>
-        <w:t xml:space="preserve">My optimistic goal for this project is to build on top of my minimal goals by creating a mini demo web application where the DuckDB data is migrated into a PostgreSQL database with the </w:t>
-      </w:r>
-      <w:proofErr w:type="spellStart"/>
-      <w:r>
-        <w:rPr>
-          <w:rFonts w:ascii="Times New Roman" w:eastAsia="Arial" w:hAnsi="Times New Roman" w:cs="Times New Roman"/>
-          <w:color w:val="1A1A1A"/>
-        </w:rPr>
-        <w:t>PostGIS</w:t>
-      </w:r>
-      <w:proofErr w:type="spellEnd"/>
-      <w:r>
-        <w:rPr>
-          <w:rFonts w:ascii="Times New Roman" w:eastAsia="Arial" w:hAnsi="Times New Roman" w:cs="Times New Roman"/>
-          <w:color w:val="1A1A1A"/>
-        </w:rPr>
-        <w:t xml:space="preserve"> extension for geospatial data installed. The front end would utilize React as a mapping UI with a similar feel to Google Maps. The backend would be a simple Django/Python API layer that would serve the data from the database to the frontend, following the pattern that we discussed in class where data doesn’t travel directly from the database to the client. </w:t>
+        <w:t xml:space="preserve">My optimistic goal for this project is to build on top of my minimal goals by creating a mini demo web application where the DuckDB data is migrated into a PostgreSQL database with the PostGIS extension for geospatial data installed. The front end would utilize React as a mapping UI with a similar feel to Google Maps. The backend would be a simple Django/Python API layer that would serve the data from the database to the frontend, following the pattern that we discussed in class where data doesn’t travel directly from the database to the client. </w:t>
       </w:r>
     </w:p>
     <w:p>
@@ -1127,49 +1111,283 @@
     <w:p>
       <w:pPr>
         <w:spacing w:after="120" w:line="240" w:lineRule="auto"/>
-        <w:rPr>
-          <w:rFonts w:ascii="Times New Roman" w:hAnsi="Times New Roman" w:cs="Times New Roman"/>
-        </w:rPr>
-      </w:pPr>
-      <w:r>
-        <w:rPr>
-          <w:rFonts w:ascii="Times New Roman" w:hAnsi="Times New Roman" w:cs="Times New Roman"/>
-        </w:rPr>
-        <w:t>TODO: Image here</w:t>
+        <w:jc w:val="center"/>
+        <w:rPr>
+          <w:rFonts w:ascii="Times New Roman" w:hAnsi="Times New Roman" w:cs="Times New Roman"/>
+        </w:rPr>
+      </w:pPr>
+      <w:r>
+        <w:rPr>
+          <w:noProof/>
+        </w:rPr>
+        <w:drawing>
+          <wp:inline distT="0" distB="0" distL="0" distR="0" wp14:anchorId="39DB9317" wp14:editId="0F13ED75">
+            <wp:extent cx="5943600" cy="2310130"/>
+            <wp:effectExtent l="0" t="0" r="0" b="0"/>
+            <wp:docPr id="1724953029" name="Picture 1"/>
+            <wp:cNvGraphicFramePr>
+              <a:graphicFrameLocks xmlns:a="http://schemas.openxmlformats.org/drawingml/2006/main" noChangeAspect="1"/>
+            </wp:cNvGraphicFramePr>
+            <a:graphic xmlns:a="http://schemas.openxmlformats.org/drawingml/2006/main">
+              <a:graphicData uri="http://schemas.openxmlformats.org/drawingml/2006/picture">
+                <pic:pic xmlns:pic="http://schemas.openxmlformats.org/drawingml/2006/picture">
+                  <pic:nvPicPr>
+                    <pic:cNvPr id="0" name="Picture 1"/>
+                    <pic:cNvPicPr>
+                      <a:picLocks noChangeAspect="1" noChangeArrowheads="1"/>
+                    </pic:cNvPicPr>
+                  </pic:nvPicPr>
+                  <pic:blipFill>
+                    <a:blip r:embed="rId17" cstate="print">
+                      <a:extLst>
+                        <a:ext uri="{28A0092B-C50C-407E-A947-70E740481C1C}">
+                          <a14:useLocalDpi xmlns:a14="http://schemas.microsoft.com/office/drawing/2010/main" val="0"/>
+                        </a:ext>
+                      </a:extLst>
+                    </a:blip>
+                    <a:srcRect/>
+                    <a:stretch>
+                      <a:fillRect/>
+                    </a:stretch>
+                  </pic:blipFill>
+                  <pic:spPr bwMode="auto">
+                    <a:xfrm>
+                      <a:off x="0" y="0"/>
+                      <a:ext cx="5943600" cy="2310130"/>
+                    </a:xfrm>
+                    <a:prstGeom prst="rect">
+                      <a:avLst/>
+                    </a:prstGeom>
+                    <a:noFill/>
+                    <a:ln>
+                      <a:noFill/>
+                    </a:ln>
+                  </pic:spPr>
+                </pic:pic>
+              </a:graphicData>
+            </a:graphic>
+          </wp:inline>
+        </w:drawing>
       </w:r>
     </w:p>
     <w:p>
       <w:pPr>
         <w:spacing w:after="120" w:line="240" w:lineRule="auto"/>
-        <w:rPr>
-          <w:rFonts w:ascii="Times New Roman" w:hAnsi="Times New Roman" w:cs="Times New Roman"/>
-        </w:rPr>
-      </w:pPr>
-      <w:r>
-        <w:rPr>
-          <w:rFonts w:ascii="Times New Roman" w:hAnsi="Times New Roman" w:cs="Times New Roman"/>
-        </w:rPr>
+        <w:jc w:val="center"/>
+        <w:rPr>
+          <w:rFonts w:ascii="Times New Roman" w:hAnsi="Times New Roman" w:cs="Times New Roman"/>
+          <w:sz w:val="20"/>
+          <w:szCs w:val="20"/>
+        </w:rPr>
+      </w:pPr>
+      <w:r>
+        <w:rPr>
+          <w:rFonts w:ascii="Times New Roman" w:hAnsi="Times New Roman" w:cs="Times New Roman"/>
+          <w:sz w:val="20"/>
+          <w:szCs w:val="20"/>
+        </w:rPr>
+        <w:t>Python commands to run in Shell Command Line to start data importing process</w:t>
+      </w:r>
+    </w:p>
+    <w:p>
+      <w:pPr>
+        <w:spacing w:after="120" w:line="240" w:lineRule="auto"/>
+        <w:jc w:val="center"/>
+        <w:rPr>
+          <w:rFonts w:ascii="Times New Roman" w:hAnsi="Times New Roman" w:cs="Times New Roman"/>
+        </w:rPr>
+      </w:pPr>
+      <w:r>
+        <w:rPr>
+          <w:noProof/>
+        </w:rPr>
+        <w:lastRenderedPageBreak/>
+        <w:drawing>
+          <wp:inline distT="0" distB="0" distL="0" distR="0" wp14:anchorId="76559ACE" wp14:editId="44B92D84">
+            <wp:extent cx="5943600" cy="3788410"/>
+            <wp:effectExtent l="0" t="0" r="0" b="2540"/>
+            <wp:docPr id="1942489024" name="Picture 2"/>
+            <wp:cNvGraphicFramePr>
+              <a:graphicFrameLocks xmlns:a="http://schemas.openxmlformats.org/drawingml/2006/main" noChangeAspect="1"/>
+            </wp:cNvGraphicFramePr>
+            <a:graphic xmlns:a="http://schemas.openxmlformats.org/drawingml/2006/main">
+              <a:graphicData uri="http://schemas.openxmlformats.org/drawingml/2006/picture">
+                <pic:pic xmlns:pic="http://schemas.openxmlformats.org/drawingml/2006/picture">
+                  <pic:nvPicPr>
+                    <pic:cNvPr id="0" name="Picture 3"/>
+                    <pic:cNvPicPr>
+                      <a:picLocks noChangeAspect="1" noChangeArrowheads="1"/>
+                    </pic:cNvPicPr>
+                  </pic:nvPicPr>
+                  <pic:blipFill>
+                    <a:blip r:embed="rId18" cstate="print">
+                      <a:extLst>
+                        <a:ext uri="{28A0092B-C50C-407E-A947-70E740481C1C}">
+                          <a14:useLocalDpi xmlns:a14="http://schemas.microsoft.com/office/drawing/2010/main" val="0"/>
+                        </a:ext>
+                      </a:extLst>
+                    </a:blip>
+                    <a:srcRect/>
+                    <a:stretch>
+                      <a:fillRect/>
+                    </a:stretch>
+                  </pic:blipFill>
+                  <pic:spPr bwMode="auto">
+                    <a:xfrm>
+                      <a:off x="0" y="0"/>
+                      <a:ext cx="5943600" cy="3788410"/>
+                    </a:xfrm>
+                    <a:prstGeom prst="rect">
+                      <a:avLst/>
+                    </a:prstGeom>
+                    <a:noFill/>
+                    <a:ln>
+                      <a:noFill/>
+                    </a:ln>
+                  </pic:spPr>
+                </pic:pic>
+              </a:graphicData>
+            </a:graphic>
+          </wp:inline>
+        </w:drawing>
+      </w:r>
+    </w:p>
+    <w:p>
+      <w:pPr>
+        <w:spacing w:after="120" w:line="240" w:lineRule="auto"/>
+        <w:jc w:val="center"/>
+        <w:rPr>
+          <w:rFonts w:ascii="Times New Roman" w:hAnsi="Times New Roman" w:cs="Times New Roman"/>
+          <w:sz w:val="20"/>
+          <w:szCs w:val="20"/>
+        </w:rPr>
+      </w:pPr>
+      <w:r>
+        <w:rPr>
+          <w:rFonts w:ascii="Times New Roman" w:hAnsi="Times New Roman" w:cs="Times New Roman"/>
+          <w:sz w:val="20"/>
+          <w:szCs w:val="20"/>
+        </w:rPr>
+        <w:t xml:space="preserve">Python </w:t>
+      </w:r>
+      <w:r>
+        <w:rPr>
+          <w:rFonts w:ascii="Times New Roman" w:hAnsi="Times New Roman" w:cs="Times New Roman"/>
+          <w:sz w:val="20"/>
+          <w:szCs w:val="20"/>
+        </w:rPr>
+        <w:t>script code exemplifies how to create a DuckDB under the nps schema namespace</w:t>
+      </w:r>
+    </w:p>
+    <w:p>
+      <w:pPr>
+        <w:spacing w:after="120" w:line="240" w:lineRule="auto"/>
+        <w:jc w:val="center"/>
+        <w:rPr>
+          <w:rFonts w:ascii="Times New Roman" w:hAnsi="Times New Roman" w:cs="Times New Roman"/>
+        </w:rPr>
+      </w:pPr>
+      <w:r>
+        <w:rPr>
+          <w:noProof/>
+        </w:rPr>
+        <w:lastRenderedPageBreak/>
+        <w:drawing>
+          <wp:inline distT="0" distB="0" distL="0" distR="0" wp14:anchorId="531D9282" wp14:editId="4DE77D27">
+            <wp:extent cx="5943600" cy="7339965"/>
+            <wp:effectExtent l="0" t="0" r="0" b="0"/>
+            <wp:docPr id="1526133757" name="Picture 3"/>
+            <wp:cNvGraphicFramePr>
+              <a:graphicFrameLocks xmlns:a="http://schemas.openxmlformats.org/drawingml/2006/main" noChangeAspect="1"/>
+            </wp:cNvGraphicFramePr>
+            <a:graphic xmlns:a="http://schemas.openxmlformats.org/drawingml/2006/main">
+              <a:graphicData uri="http://schemas.openxmlformats.org/drawingml/2006/picture">
+                <pic:pic xmlns:pic="http://schemas.openxmlformats.org/drawingml/2006/picture">
+                  <pic:nvPicPr>
+                    <pic:cNvPr id="0" name="Picture 5"/>
+                    <pic:cNvPicPr>
+                      <a:picLocks noChangeAspect="1" noChangeArrowheads="1"/>
+                    </pic:cNvPicPr>
+                  </pic:nvPicPr>
+                  <pic:blipFill>
+                    <a:blip r:embed="rId19" cstate="print">
+                      <a:extLst>
+                        <a:ext uri="{28A0092B-C50C-407E-A947-70E740481C1C}">
+                          <a14:useLocalDpi xmlns:a14="http://schemas.microsoft.com/office/drawing/2010/main" val="0"/>
+                        </a:ext>
+                      </a:extLst>
+                    </a:blip>
+                    <a:srcRect/>
+                    <a:stretch>
+                      <a:fillRect/>
+                    </a:stretch>
+                  </pic:blipFill>
+                  <pic:spPr bwMode="auto">
+                    <a:xfrm>
+                      <a:off x="0" y="0"/>
+                      <a:ext cx="5943600" cy="7339965"/>
+                    </a:xfrm>
+                    <a:prstGeom prst="rect">
+                      <a:avLst/>
+                    </a:prstGeom>
+                    <a:noFill/>
+                    <a:ln>
+                      <a:noFill/>
+                    </a:ln>
+                  </pic:spPr>
+                </pic:pic>
+              </a:graphicData>
+            </a:graphic>
+          </wp:inline>
+        </w:drawing>
+      </w:r>
+    </w:p>
+    <w:p>
+      <w:pPr>
+        <w:spacing w:after="120" w:line="240" w:lineRule="auto"/>
+        <w:jc w:val="center"/>
+        <w:rPr>
+          <w:rFonts w:ascii="Times New Roman" w:hAnsi="Times New Roman" w:cs="Times New Roman"/>
+          <w:sz w:val="20"/>
+          <w:szCs w:val="20"/>
+        </w:rPr>
+      </w:pPr>
+      <w:r>
+        <w:rPr>
+          <w:rFonts w:ascii="Times New Roman" w:hAnsi="Times New Roman" w:cs="Times New Roman"/>
+          <w:sz w:val="20"/>
+          <w:szCs w:val="20"/>
+        </w:rPr>
+        <w:t xml:space="preserve">Python script </w:t>
+      </w:r>
+      <w:r>
+        <w:rPr>
+          <w:rFonts w:ascii="Times New Roman" w:hAnsi="Times New Roman" w:cs="Times New Roman"/>
+          <w:sz w:val="20"/>
+          <w:szCs w:val="20"/>
+        </w:rPr>
+        <w:t>example of inserting extracted data from source into DuckDB database nps namespace parks table</w:t>
+      </w:r>
+    </w:p>
+    <w:p>
+      <w:pPr>
+        <w:spacing w:after="120" w:line="240" w:lineRule="auto"/>
+        <w:rPr>
+          <w:rFonts w:ascii="Times New Roman" w:hAnsi="Times New Roman" w:cs="Times New Roman"/>
+        </w:rPr>
+      </w:pPr>
+      <w:r>
+        <w:rPr>
+          <w:rFonts w:ascii="Times New Roman" w:hAnsi="Times New Roman" w:cs="Times New Roman"/>
+        </w:rPr>
+        <w:lastRenderedPageBreak/>
         <w:t xml:space="preserve">One important DuckDB concept that is important to note here </w:t>
       </w:r>
       <w:r>
         <w:rPr>
           <w:rFonts w:ascii="Times New Roman" w:hAnsi="Times New Roman" w:cs="Times New Roman"/>
         </w:rPr>
-        <w:t xml:space="preserve">is </w:t>
-      </w:r>
-      <w:proofErr w:type="spellStart"/>
-      <w:r>
-        <w:rPr>
-          <w:rFonts w:ascii="Times New Roman" w:hAnsi="Times New Roman" w:cs="Times New Roman"/>
-        </w:rPr>
-        <w:t>DuckDB’s</w:t>
-      </w:r>
-      <w:proofErr w:type="spellEnd"/>
-      <w:r>
-        <w:rPr>
-          <w:rFonts w:ascii="Times New Roman" w:hAnsi="Times New Roman" w:cs="Times New Roman"/>
-        </w:rPr>
-        <w:t xml:space="preserve"> SCHEMA feature. This feature allowed me to organize the data from all the different sources into individual namespaces. All I needed to do then with these namespaces was include the namespace definition when created ahead of each table when querying that specific data source. </w:t>
+        <w:t xml:space="preserve">is DuckDB’s SCHEMA feature. This feature allowed me to organize the data from all the different sources into individual namespaces. All I needed to do then with these namespaces was include the namespace definition when created ahead of each table when querying that specific data source. </w:t>
       </w:r>
       <w:r>
         <w:rPr>
@@ -1177,7 +1395,6 @@
         </w:rPr>
         <w:t xml:space="preserve">I set up the Python scripts to create a unique and associable namespace within the same DuckDB database for each data source which allowed me to efficiently and easily manage all the tables across all five sources efficiently without naming conflicts or confusion. For example, the NPS source data lives under a </w:t>
       </w:r>
-      <w:proofErr w:type="spellStart"/>
       <w:r>
         <w:rPr>
           <w:rFonts w:ascii="Times New Roman" w:hAnsi="Times New Roman" w:cs="Times New Roman"/>
@@ -1186,14 +1403,12 @@
         </w:rPr>
         <w:t>nps</w:t>
       </w:r>
-      <w:proofErr w:type="spellEnd"/>
       <w:r>
         <w:rPr>
           <w:rFonts w:ascii="Times New Roman" w:hAnsi="Times New Roman" w:cs="Times New Roman"/>
         </w:rPr>
         <w:t xml:space="preserve"> schema, while the MN GIS data lives under a </w:t>
       </w:r>
-      <w:proofErr w:type="spellStart"/>
       <w:r>
         <w:rPr>
           <w:rFonts w:ascii="Times New Roman" w:hAnsi="Times New Roman" w:cs="Times New Roman"/>
@@ -1202,7 +1417,6 @@
         </w:rPr>
         <w:t>mn_gis</w:t>
       </w:r>
-      <w:proofErr w:type="spellEnd"/>
       <w:r>
         <w:rPr>
           <w:rFonts w:ascii="Times New Roman" w:hAnsi="Times New Roman" w:cs="Times New Roman"/>
@@ -1246,7 +1460,7 @@
                     <pic:cNvPicPr/>
                   </pic:nvPicPr>
                   <pic:blipFill>
-                    <a:blip r:embed="rId17"/>
+                    <a:blip r:embed="rId20"/>
                     <a:stretch>
                       <a:fillRect/>
                     </a:stretch>
@@ -1284,27 +1498,7 @@
           <w:sz w:val="20"/>
           <w:szCs w:val="20"/>
         </w:rPr>
-        <w:t xml:space="preserve">DuckDB Database structure view within </w:t>
-      </w:r>
-      <w:proofErr w:type="spellStart"/>
-      <w:r>
-        <w:rPr>
-          <w:rFonts w:ascii="Times New Roman" w:eastAsia="Arial" w:hAnsi="Times New Roman" w:cs="Times New Roman"/>
-          <w:color w:val="1A1A1A"/>
-          <w:sz w:val="20"/>
-          <w:szCs w:val="20"/>
-        </w:rPr>
-        <w:t>DBeaver</w:t>
-      </w:r>
-      <w:proofErr w:type="spellEnd"/>
-      <w:r>
-        <w:rPr>
-          <w:rFonts w:ascii="Times New Roman" w:eastAsia="Arial" w:hAnsi="Times New Roman" w:cs="Times New Roman"/>
-          <w:color w:val="1A1A1A"/>
-          <w:sz w:val="20"/>
-          <w:szCs w:val="20"/>
-        </w:rPr>
-        <w:t xml:space="preserve"> DBMS</w:t>
+        <w:t>DuckDB Database structure view within DBeaver DBMS</w:t>
       </w:r>
     </w:p>
     <w:p>
@@ -1320,7 +1514,7 @@
         </w:rPr>
         <w:t xml:space="preserve">Reference: </w:t>
       </w:r>
-      <w:hyperlink r:id="rId18" w:history="1">
+      <w:hyperlink r:id="rId21" w:history="1">
         <w:r>
           <w:rPr>
             <w:rFonts w:ascii="Times New Roman" w:eastAsia="Arial" w:hAnsi="Times New Roman" w:cs="Times New Roman"/>
@@ -1352,7 +1546,6 @@
           <w:sz w:val="26"/>
           <w:szCs w:val="26"/>
         </w:rPr>
-        <w:lastRenderedPageBreak/>
         <w:t>Normalized Database Design</w:t>
       </w:r>
     </w:p>
@@ -1389,29 +1582,7 @@
           <w:sz w:val="28"/>
           <w:szCs w:val="28"/>
         </w:rPr>
-        <w:t xml:space="preserve">Data Modeling </w:t>
-      </w:r>
-      <w:r>
-        <w:rPr>
-          <w:rFonts w:cs="Times New Roman"/>
-          <w:b/>
-          <w:bCs/>
-          <w:color w:val="156082" w:themeColor="accent1"/>
-          <w:sz w:val="28"/>
-          <w:szCs w:val="28"/>
-        </w:rPr>
-        <w:t>–</w:t>
-      </w:r>
-      <w:r>
-        <w:rPr>
-          <w:rFonts w:cs="Times New Roman"/>
-          <w:b/>
-          <w:bCs/>
-          <w:color w:val="156082" w:themeColor="accent1"/>
-          <w:sz w:val="28"/>
-          <w:szCs w:val="28"/>
-        </w:rPr>
-        <w:t xml:space="preserve"> </w:t>
+        <w:t xml:space="preserve">Data Modeling – </w:t>
       </w:r>
       <w:r>
         <w:rPr>
@@ -1499,6 +1670,7 @@
         <w:rPr>
           <w:rFonts w:ascii="Times New Roman" w:hAnsi="Times New Roman" w:cs="Times New Roman"/>
         </w:rPr>
+        <w:lastRenderedPageBreak/>
         <w:t>The Locations entity has a self-referencing relationship, enabling easy to establish and query hierarchical location structures where campground locations can be classified as children of state parks, national parks and other parent locations. This relationship is one-to-</w:t>
       </w:r>
       <w:r>
@@ -1589,21 +1761,7 @@
         <w:rPr>
           <w:rFonts w:ascii="Times New Roman" w:hAnsi="Times New Roman" w:cs="Times New Roman"/>
         </w:rPr>
-        <w:t xml:space="preserve">The Operating </w:t>
-      </w:r>
-      <w:proofErr w:type="spellStart"/>
-      <w:r>
-        <w:rPr>
-          <w:rFonts w:ascii="Times New Roman" w:hAnsi="Times New Roman" w:cs="Times New Roman"/>
-        </w:rPr>
-        <w:t>Hours Time</w:t>
-      </w:r>
-      <w:proofErr w:type="spellEnd"/>
-      <w:r>
-        <w:rPr>
-          <w:rFonts w:ascii="Times New Roman" w:hAnsi="Times New Roman" w:cs="Times New Roman"/>
-        </w:rPr>
-        <w:t xml:space="preserve"> table that associates to the Operating Hours entity stores individual day-level time records. This is more structured and queryable than storing a JSON column per day on the Operating Hours table directly. </w:t>
+        <w:t xml:space="preserve">The Operating Hours Time table that associates to the Operating Hours entity stores individual day-level time records. This is more structured and queryable than storing a JSON column per day on the Operating Hours table directly. </w:t>
       </w:r>
     </w:p>
     <w:p>
@@ -1616,7 +1774,6 @@
         <w:rPr>
           <w:noProof/>
         </w:rPr>
-        <w:lastRenderedPageBreak/>
         <w:drawing>
           <wp:inline distT="0" distB="0" distL="0" distR="0" wp14:anchorId="47336DFF" wp14:editId="2FDFEE1F">
             <wp:extent cx="5943600" cy="3634105"/>
@@ -1633,7 +1790,7 @@
                     <pic:cNvPicPr/>
                   </pic:nvPicPr>
                   <pic:blipFill>
-                    <a:blip r:embed="rId19"/>
+                    <a:blip r:embed="rId22"/>
                     <a:stretch>
                       <a:fillRect/>
                     </a:stretch>
@@ -1669,31 +1826,8 @@
           <w:sz w:val="20"/>
           <w:szCs w:val="20"/>
         </w:rPr>
-        <w:t>Logical</w:t>
-      </w:r>
-      <w:r>
-        <w:rPr>
-          <w:rFonts w:ascii="Times New Roman" w:hAnsi="Times New Roman" w:cs="Times New Roman"/>
-          <w:sz w:val="20"/>
-          <w:szCs w:val="20"/>
-        </w:rPr>
-        <w:t xml:space="preserve"> mod</w:t>
-      </w:r>
-      <w:r>
-        <w:rPr>
-          <w:rFonts w:ascii="Times New Roman" w:hAnsi="Times New Roman" w:cs="Times New Roman"/>
-          <w:sz w:val="20"/>
-          <w:szCs w:val="20"/>
-        </w:rPr>
-        <w:t>el</w:t>
-      </w:r>
-      <w:r>
-        <w:rPr>
-          <w:rFonts w:ascii="Times New Roman" w:hAnsi="Times New Roman" w:cs="Times New Roman"/>
-          <w:sz w:val="20"/>
-          <w:szCs w:val="20"/>
-        </w:rPr>
-        <w:t xml:space="preserve"> of normalized DuckDB database schema created to transform data from sources into.</w:t>
+        <w:lastRenderedPageBreak/>
+        <w:t>Logical model of normalized DuckDB database schema created to transform data from sources into.</w:t>
       </w:r>
     </w:p>
     <w:p>
@@ -1742,7 +1876,6 @@
         <w:rPr>
           <w:noProof/>
         </w:rPr>
-        <w:lastRenderedPageBreak/>
         <w:drawing>
           <wp:inline distT="0" distB="0" distL="0" distR="0" wp14:anchorId="50C7F72B" wp14:editId="4D31F1D2">
             <wp:extent cx="5943600" cy="2984500"/>
@@ -1759,7 +1892,7 @@
                     <pic:cNvPicPr/>
                   </pic:nvPicPr>
                   <pic:blipFill>
-                    <a:blip r:embed="rId20"/>
+                    <a:blip r:embed="rId23"/>
                     <a:stretch>
                       <a:fillRect/>
                     </a:stretch>
@@ -1842,28 +1975,107 @@
           <w:sz w:val="28"/>
           <w:szCs w:val="28"/>
         </w:rPr>
-        <w:t xml:space="preserve">Database Normalization </w:t>
+        <w:t xml:space="preserve">Database Normalization – </w:t>
       </w:r>
       <w:r>
         <w:rPr>
           <w:rFonts w:cs="Times New Roman"/>
           <w:b/>
           <w:bCs/>
-          <w:color w:val="156082" w:themeColor="accent1"/>
           <w:sz w:val="28"/>
           <w:szCs w:val="28"/>
         </w:rPr>
-        <w:t xml:space="preserve">– </w:t>
-      </w:r>
-      <w:r>
+        <w:t>Creating the Normalized Schema</w:t>
+      </w:r>
+    </w:p>
+    <w:p>
+      <w:pPr>
+        <w:rPr>
+          <w:rFonts w:ascii="Times New Roman" w:hAnsi="Times New Roman" w:cs="Times New Roman"/>
+          <w:i/>
+          <w:iCs/>
+        </w:rPr>
+      </w:pPr>
+      <w:r>
+        <w:rPr>
+          <w:rFonts w:ascii="Times New Roman" w:hAnsi="Times New Roman" w:cs="Times New Roman"/>
+        </w:rPr>
+        <w:tab/>
+        <w:t xml:space="preserve">Textbook Reference: </w:t>
+      </w:r>
+      <w:r>
+        <w:rPr>
+          <w:rFonts w:ascii="Times New Roman" w:hAnsi="Times New Roman" w:cs="Times New Roman"/>
+          <w:i/>
+          <w:iCs/>
+        </w:rPr>
+        <w:t>Chapter 7; Normalization Concepts and Processes</w:t>
+      </w:r>
+    </w:p>
+    <w:p>
+      <w:pPr>
+        <w:rPr>
+          <w:rFonts w:ascii="Times New Roman" w:hAnsi="Times New Roman" w:cs="Times New Roman"/>
+        </w:rPr>
+      </w:pPr>
+      <w:r>
+        <w:rPr>
+          <w:rFonts w:ascii="Times New Roman" w:hAnsi="Times New Roman" w:cs="Times New Roman"/>
+        </w:rPr>
+        <w:t xml:space="preserve">Most of the five data sources (except for the RIDB CSV source) arrived in a denormalized or inconsistently structured format. The NPS API returns nested JSON with operating hours, and other information embedded inside location objects. Another example is how the MN GIS shapefile combines geographic and attribute data into a single record per park. </w:t>
+      </w:r>
+    </w:p>
+    <w:p>
+      <w:pPr>
+        <w:rPr>
+          <w:rFonts w:ascii="Times New Roman" w:hAnsi="Times New Roman" w:cs="Times New Roman"/>
+        </w:rPr>
+      </w:pPr>
+      <w:r>
+        <w:rPr>
+          <w:rFonts w:ascii="Times New Roman" w:hAnsi="Times New Roman" w:cs="Times New Roman"/>
+        </w:rPr>
+        <w:t xml:space="preserve">The normalized schema created for this project addresses this by decomposing repeated data into type tables (WebsiteType, AddressType, and MediaType), separating contact information into dedicated entities and representing operating hours at a day-level granularity through the </w:t>
+      </w:r>
+      <w:r>
+        <w:rPr>
+          <w:rFonts w:ascii="Times New Roman" w:hAnsi="Times New Roman" w:cs="Times New Roman"/>
+        </w:rPr>
+        <w:lastRenderedPageBreak/>
+        <w:t xml:space="preserve">OperatingHoursTime child table. This design targets Third Normal Form (3NF), where each non-key attribute is functionally dependent only on the primary key and there are no transitive dependencies. </w:t>
+      </w:r>
+    </w:p>
+    <w:p>
+      <w:pPr>
         <w:rPr>
           <w:rFonts w:cs="Times New Roman"/>
           <w:b/>
           <w:bCs/>
+          <w:color w:val="156082" w:themeColor="accent1"/>
           <w:sz w:val="28"/>
           <w:szCs w:val="28"/>
         </w:rPr>
-        <w:t>Creating the Normalized Schema</w:t>
+      </w:pPr>
+      <w:r>
+        <w:rPr>
+          <w:rFonts w:cs="Times New Roman"/>
+          <w:b/>
+          <w:bCs/>
+          <w:color w:val="156082" w:themeColor="accent1"/>
+          <w:sz w:val="28"/>
+          <w:szCs w:val="28"/>
+        </w:rPr>
+        <w:t xml:space="preserve">Project Specific Needs – </w:t>
+      </w:r>
+      <w:r>
+        <w:rPr>
+          <w:rFonts w:cs="Times New Roman"/>
+          <w:b/>
+          <w:bCs/>
+          <w:sz w:val="28"/>
+          <w:szCs w:val="28"/>
+        </w:rPr>
+        <w:t>Working against normalization</w:t>
       </w:r>
     </w:p>
     <w:p>
@@ -1887,23 +2099,99 @@
           <w:i/>
           <w:iCs/>
         </w:rPr>
-        <w:t xml:space="preserve">Chapter </w:t>
-      </w:r>
-      <w:r>
+        <w:t>Chapter 6; Developing Data Models for Business Databases</w:t>
+      </w:r>
+    </w:p>
+    <w:p>
+      <w:pPr>
+        <w:rPr>
+          <w:rFonts w:ascii="Times New Roman" w:hAnsi="Times New Roman" w:cs="Times New Roman"/>
+        </w:rPr>
+      </w:pPr>
+      <w:r>
+        <w:rPr>
+          <w:rFonts w:ascii="Times New Roman" w:hAnsi="Times New Roman" w:cs="Times New Roman"/>
+        </w:rPr>
+        <w:t xml:space="preserve">However, one notable outlier that I highlight is the aspect that the location entity still stores state related data. Based on the structure of these entities and </w:t>
+      </w:r>
+      <w:r>
+        <w:rPr>
+          <w:rFonts w:ascii="Times New Roman" w:hAnsi="Times New Roman" w:cs="Times New Roman"/>
+        </w:rPr>
+        <w:t>aligning</w:t>
+      </w:r>
+      <w:r>
+        <w:rPr>
+          <w:rFonts w:ascii="Times New Roman" w:hAnsi="Times New Roman" w:cs="Times New Roman"/>
+        </w:rPr>
+        <w:t xml:space="preserve"> with 3NF it would be proper to ensure that the state information only exists in the address entity. However, this wasn’t done due to some data sources not having address information available (MN GIS data source for example)</w:t>
+      </w:r>
+      <w:r>
+        <w:rPr>
+          <w:rFonts w:ascii="Times New Roman" w:hAnsi="Times New Roman" w:cs="Times New Roman"/>
+        </w:rPr>
+        <w:t xml:space="preserve">, </w:t>
+      </w:r>
+      <w:r>
+        <w:rPr>
+          <w:rFonts w:ascii="Times New Roman" w:hAnsi="Times New Roman" w:cs="Times New Roman"/>
+        </w:rPr>
+        <w:t>but knowing where the data was found, that the state can be derived</w:t>
+      </w:r>
+      <w:r>
+        <w:rPr>
+          <w:rFonts w:ascii="Times New Roman" w:hAnsi="Times New Roman" w:cs="Times New Roman"/>
+        </w:rPr>
+        <w:t xml:space="preserve">. </w:t>
+      </w:r>
+      <w:r>
+        <w:rPr>
+          <w:rFonts w:ascii="Times New Roman" w:hAnsi="Times New Roman" w:cs="Times New Roman"/>
+        </w:rPr>
+        <w:t xml:space="preserve">This highlights an important aspect of database creation and management. Normalization is good, but sometimes based on project and </w:t>
+      </w:r>
+      <w:r>
+        <w:rPr>
+          <w:rFonts w:ascii="Times New Roman" w:hAnsi="Times New Roman" w:cs="Times New Roman"/>
+        </w:rPr>
+        <w:t>how the database will be used</w:t>
+      </w:r>
+      <w:r>
+        <w:rPr>
+          <w:rFonts w:ascii="Times New Roman" w:hAnsi="Times New Roman" w:cs="Times New Roman"/>
+        </w:rPr>
+        <w:t xml:space="preserve">, proper normalization may work against you. In this case if I followed through with proper normalization I would end up with nearly entirely empty address records within the addresses table resulting in wasted space and the need for complex queries to resolve what state locations are located in. </w:t>
+      </w:r>
+    </w:p>
+    <w:p>
+      <w:pPr>
+        <w:rPr>
+          <w:rFonts w:ascii="Times New Roman" w:hAnsi="Times New Roman" w:cs="Times New Roman"/>
+        </w:rPr>
+      </w:pPr>
+      <w:r>
+        <w:rPr>
+          <w:rFonts w:ascii="Times New Roman" w:hAnsi="Times New Roman" w:cs="Times New Roman"/>
+        </w:rPr>
+        <w:t xml:space="preserve">This ties directly into what was discussed in chapter 6 when it comes to identifying business constraints and relationships between entities and what was mentioned in class when the following quote was discussed: </w:t>
+      </w:r>
+    </w:p>
+    <w:p>
+      <w:pPr>
+        <w:jc w:val="center"/>
         <w:rPr>
           <w:rFonts w:ascii="Times New Roman" w:hAnsi="Times New Roman" w:cs="Times New Roman"/>
           <w:i/>
           <w:iCs/>
         </w:rPr>
-        <w:t>7</w:t>
-      </w:r>
+      </w:pPr>
       <w:r>
         <w:rPr>
           <w:rFonts w:ascii="Times New Roman" w:hAnsi="Times New Roman" w:cs="Times New Roman"/>
           <w:i/>
           <w:iCs/>
         </w:rPr>
-        <w:t xml:space="preserve">; </w:t>
+        <w:t>“</w:t>
       </w:r>
       <w:r>
         <w:rPr>
@@ -1911,270 +2199,14 @@
           <w:i/>
           <w:iCs/>
         </w:rPr>
-        <w:t>Normalization Concepts and Processes</w:t>
-      </w:r>
-    </w:p>
-    <w:p>
-      <w:pPr>
-        <w:rPr>
-          <w:rFonts w:ascii="Times New Roman" w:hAnsi="Times New Roman" w:cs="Times New Roman"/>
-        </w:rPr>
-      </w:pPr>
-      <w:r>
-        <w:rPr>
-          <w:rFonts w:ascii="Times New Roman" w:hAnsi="Times New Roman" w:cs="Times New Roman"/>
-        </w:rPr>
-        <w:t xml:space="preserve">Most of the five data sources (except for the RIDB CSV source) arrived in a denormalized or inconsistently structured format. The NPS API returns nested JSON with operating hours, and other information embedded inside location objects. Another example is how the MN GIS shapefile combines geographic and attribute data into a single record per park. </w:t>
-      </w:r>
-    </w:p>
-    <w:p>
-      <w:pPr>
-        <w:rPr>
-          <w:rFonts w:ascii="Times New Roman" w:hAnsi="Times New Roman" w:cs="Times New Roman"/>
-        </w:rPr>
-      </w:pPr>
-      <w:r>
-        <w:rPr>
-          <w:rFonts w:ascii="Times New Roman" w:hAnsi="Times New Roman" w:cs="Times New Roman"/>
-        </w:rPr>
-        <w:t>The normalized schema created for this project addresses this by decomposing repeated data into type tables (</w:t>
-      </w:r>
-      <w:proofErr w:type="spellStart"/>
-      <w:r>
-        <w:rPr>
-          <w:rFonts w:ascii="Times New Roman" w:hAnsi="Times New Roman" w:cs="Times New Roman"/>
-        </w:rPr>
-        <w:t>WebsiteType</w:t>
-      </w:r>
-      <w:proofErr w:type="spellEnd"/>
-      <w:r>
-        <w:rPr>
-          <w:rFonts w:ascii="Times New Roman" w:hAnsi="Times New Roman" w:cs="Times New Roman"/>
-        </w:rPr>
-        <w:t xml:space="preserve">, </w:t>
-      </w:r>
-      <w:proofErr w:type="spellStart"/>
-      <w:r>
-        <w:rPr>
-          <w:rFonts w:ascii="Times New Roman" w:hAnsi="Times New Roman" w:cs="Times New Roman"/>
-        </w:rPr>
-        <w:t>AddressType</w:t>
-      </w:r>
-      <w:proofErr w:type="spellEnd"/>
-      <w:r>
-        <w:rPr>
-          <w:rFonts w:ascii="Times New Roman" w:hAnsi="Times New Roman" w:cs="Times New Roman"/>
-        </w:rPr>
-        <w:t xml:space="preserve">, and MediaType), separating contact information into dedicated entities and representing operating hours at a day-level granularity through the </w:t>
-      </w:r>
-      <w:proofErr w:type="spellStart"/>
-      <w:r>
-        <w:rPr>
-          <w:rFonts w:ascii="Times New Roman" w:hAnsi="Times New Roman" w:cs="Times New Roman"/>
-        </w:rPr>
-        <w:t>OperatingHoursTime</w:t>
-      </w:r>
-      <w:proofErr w:type="spellEnd"/>
-      <w:r>
-        <w:rPr>
-          <w:rFonts w:ascii="Times New Roman" w:hAnsi="Times New Roman" w:cs="Times New Roman"/>
-        </w:rPr>
-        <w:t xml:space="preserve"> child table. This design targets Third Normal Form (3NF), where each non-key attribute is functionally dependent only on the primary key and there are no transitive dependencies. </w:t>
-      </w:r>
-    </w:p>
-    <w:p>
-      <w:pPr>
-        <w:rPr>
-          <w:rFonts w:cs="Times New Roman"/>
-          <w:b/>
-          <w:bCs/>
-          <w:color w:val="156082" w:themeColor="accent1"/>
-          <w:sz w:val="28"/>
-          <w:szCs w:val="28"/>
-        </w:rPr>
-      </w:pPr>
-      <w:r>
-        <w:rPr>
-          <w:rFonts w:cs="Times New Roman"/>
-          <w:b/>
-          <w:bCs/>
-          <w:color w:val="156082" w:themeColor="accent1"/>
-          <w:sz w:val="28"/>
-          <w:szCs w:val="28"/>
-        </w:rPr>
-        <w:t xml:space="preserve">Project Specific Needs – </w:t>
-      </w:r>
-      <w:r>
-        <w:rPr>
-          <w:rFonts w:cs="Times New Roman"/>
-          <w:b/>
-          <w:bCs/>
-          <w:sz w:val="28"/>
-          <w:szCs w:val="28"/>
-        </w:rPr>
-        <w:t>Working against normalization</w:t>
-      </w:r>
-    </w:p>
-    <w:p>
-      <w:pPr>
+        <w:t>Normalize until it hurts than denormalize until it works.</w:t>
+      </w:r>
+      <w:r>
         <w:rPr>
           <w:rFonts w:ascii="Times New Roman" w:hAnsi="Times New Roman" w:cs="Times New Roman"/>
           <w:i/>
           <w:iCs/>
         </w:rPr>
-      </w:pPr>
-      <w:r>
-        <w:rPr>
-          <w:rFonts w:ascii="Times New Roman" w:hAnsi="Times New Roman" w:cs="Times New Roman"/>
-        </w:rPr>
-        <w:tab/>
-        <w:t xml:space="preserve">Textbook Reference: </w:t>
-      </w:r>
-      <w:r>
-        <w:rPr>
-          <w:rFonts w:ascii="Times New Roman" w:hAnsi="Times New Roman" w:cs="Times New Roman"/>
-          <w:i/>
-          <w:iCs/>
-        </w:rPr>
-        <w:t xml:space="preserve">Chapter </w:t>
-      </w:r>
-      <w:r>
-        <w:rPr>
-          <w:rFonts w:ascii="Times New Roman" w:hAnsi="Times New Roman" w:cs="Times New Roman"/>
-          <w:i/>
-          <w:iCs/>
-        </w:rPr>
-        <w:t>6</w:t>
-      </w:r>
-      <w:r>
-        <w:rPr>
-          <w:rFonts w:ascii="Times New Roman" w:hAnsi="Times New Roman" w:cs="Times New Roman"/>
-          <w:i/>
-          <w:iCs/>
-        </w:rPr>
-        <w:t xml:space="preserve">; </w:t>
-      </w:r>
-      <w:r>
-        <w:rPr>
-          <w:rFonts w:ascii="Times New Roman" w:hAnsi="Times New Roman" w:cs="Times New Roman"/>
-          <w:i/>
-          <w:iCs/>
-        </w:rPr>
-        <w:t>Developing Data Models for Business Databases</w:t>
-      </w:r>
-    </w:p>
-    <w:p>
-      <w:pPr>
-        <w:rPr>
-          <w:rFonts w:ascii="Times New Roman" w:hAnsi="Times New Roman" w:cs="Times New Roman"/>
-        </w:rPr>
-      </w:pPr>
-      <w:r>
-        <w:rPr>
-          <w:rFonts w:ascii="Times New Roman" w:hAnsi="Times New Roman" w:cs="Times New Roman"/>
-        </w:rPr>
-        <w:t xml:space="preserve">However, one notable outlier that I highlight is the aspect that the location entity still stores state related data. Based on the structure of these entities and </w:t>
-      </w:r>
-      <w:r>
-        <w:rPr>
-          <w:rFonts w:ascii="Times New Roman" w:hAnsi="Times New Roman" w:cs="Times New Roman"/>
-        </w:rPr>
-        <w:t>aligning</w:t>
-      </w:r>
-      <w:r>
-        <w:rPr>
-          <w:rFonts w:ascii="Times New Roman" w:hAnsi="Times New Roman" w:cs="Times New Roman"/>
-        </w:rPr>
-        <w:t xml:space="preserve"> with 3NF it would be proper to </w:t>
-      </w:r>
-      <w:r>
-        <w:rPr>
-          <w:rFonts w:ascii="Times New Roman" w:hAnsi="Times New Roman" w:cs="Times New Roman"/>
-        </w:rPr>
-        <w:lastRenderedPageBreak/>
-        <w:t>ensure that the state information only exists in the address entity. However, this wasn’t done due to some data sources not having address information available (MN GIS data source for example)</w:t>
-      </w:r>
-      <w:r>
-        <w:rPr>
-          <w:rFonts w:ascii="Times New Roman" w:hAnsi="Times New Roman" w:cs="Times New Roman"/>
-        </w:rPr>
-        <w:t xml:space="preserve">, </w:t>
-      </w:r>
-      <w:r>
-        <w:rPr>
-          <w:rFonts w:ascii="Times New Roman" w:hAnsi="Times New Roman" w:cs="Times New Roman"/>
-        </w:rPr>
-        <w:t>but knowing where the data was found, that the state can be derived</w:t>
-      </w:r>
-      <w:r>
-        <w:rPr>
-          <w:rFonts w:ascii="Times New Roman" w:hAnsi="Times New Roman" w:cs="Times New Roman"/>
-        </w:rPr>
-        <w:t xml:space="preserve">. </w:t>
-      </w:r>
-      <w:r>
-        <w:rPr>
-          <w:rFonts w:ascii="Times New Roman" w:hAnsi="Times New Roman" w:cs="Times New Roman"/>
-        </w:rPr>
-        <w:t xml:space="preserve">This highlights an important aspect of database creation and management. Normalization is good, but sometimes based on project and </w:t>
-      </w:r>
-      <w:r>
-        <w:rPr>
-          <w:rFonts w:ascii="Times New Roman" w:hAnsi="Times New Roman" w:cs="Times New Roman"/>
-        </w:rPr>
-        <w:t>how the database will be used</w:t>
-      </w:r>
-      <w:r>
-        <w:rPr>
-          <w:rFonts w:ascii="Times New Roman" w:hAnsi="Times New Roman" w:cs="Times New Roman"/>
-        </w:rPr>
-        <w:t xml:space="preserve">, proper normalization may work against you. In this case if I followed through with proper normalization I would end up with nearly entirely empty address records within the addresses table resulting in wasted space and the need for complex queries to resolve what state locations are located in. </w:t>
-      </w:r>
-    </w:p>
-    <w:p>
-      <w:pPr>
-        <w:rPr>
-          <w:rFonts w:ascii="Times New Roman" w:hAnsi="Times New Roman" w:cs="Times New Roman"/>
-        </w:rPr>
-      </w:pPr>
-      <w:r>
-        <w:rPr>
-          <w:rFonts w:ascii="Times New Roman" w:hAnsi="Times New Roman" w:cs="Times New Roman"/>
-        </w:rPr>
-        <w:t xml:space="preserve">This ties directly into what was discussed in chapter 6 when it comes to identifying business constraints and relationships between entities and what was mentioned in class when the following quote was discussed: </w:t>
-      </w:r>
-    </w:p>
-    <w:p>
-      <w:pPr>
-        <w:jc w:val="center"/>
-        <w:rPr>
-          <w:rFonts w:ascii="Times New Roman" w:hAnsi="Times New Roman" w:cs="Times New Roman"/>
-          <w:i/>
-          <w:iCs/>
-        </w:rPr>
-      </w:pPr>
-      <w:r>
-        <w:rPr>
-          <w:rFonts w:ascii="Times New Roman" w:hAnsi="Times New Roman" w:cs="Times New Roman"/>
-          <w:i/>
-          <w:iCs/>
-        </w:rPr>
-        <w:t>“</w:t>
-      </w:r>
-      <w:r>
-        <w:rPr>
-          <w:rFonts w:ascii="Times New Roman" w:hAnsi="Times New Roman" w:cs="Times New Roman"/>
-          <w:i/>
-          <w:iCs/>
-        </w:rPr>
-        <w:t>Normalize until it hurts than denormalize until it works.</w:t>
-      </w:r>
-      <w:r>
-        <w:rPr>
-          <w:rFonts w:ascii="Times New Roman" w:hAnsi="Times New Roman" w:cs="Times New Roman"/>
-          <w:i/>
-          <w:iCs/>
-        </w:rPr>
         <w:t>”</w:t>
       </w:r>
     </w:p>
@@ -2189,10 +2221,11 @@
       <w:r>
         <w:rPr>
           <w:rFonts w:ascii="Times New Roman" w:hAnsi="Times New Roman" w:cs="Times New Roman"/>
+          <w:noProof/>
         </w:rPr>
         <w:lastRenderedPageBreak/>
         <w:drawing>
-          <wp:inline distT="0" distB="0" distL="0" distR="0" wp14:anchorId="42097084" wp14:editId="0DE9306E">
+          <wp:inline distT="0" distB="0" distL="0" distR="0" wp14:anchorId="42097084" wp14:editId="1883257E">
             <wp:extent cx="2878372" cy="5392267"/>
             <wp:effectExtent l="0" t="0" r="0" b="0"/>
             <wp:docPr id="367684458" name="Picture 2"/>
@@ -2209,7 +2242,7 @@
                     </pic:cNvPicPr>
                   </pic:nvPicPr>
                   <pic:blipFill>
-                    <a:blip r:embed="rId21" cstate="print">
+                    <a:blip r:embed="rId24" cstate="print">
                       <a:extLst>
                         <a:ext uri="{28A0092B-C50C-407E-A947-70E740481C1C}">
                           <a14:useLocalDpi xmlns:a14="http://schemas.microsoft.com/office/drawing/2010/main" val="0"/>
@@ -2256,32 +2289,14 @@
           <w:sz w:val="20"/>
           <w:szCs w:val="20"/>
         </w:rPr>
-        <w:t xml:space="preserve">Normalized schema diagram generated in </w:t>
-      </w:r>
-      <w:proofErr w:type="spellStart"/>
+        <w:t xml:space="preserve">Normalized schema diagram generated in DBeaver DBMS from the “normalized” schema </w:t>
+      </w:r>
       <w:r>
         <w:rPr>
           <w:rFonts w:ascii="Times New Roman" w:hAnsi="Times New Roman" w:cs="Times New Roman"/>
           <w:sz w:val="20"/>
           <w:szCs w:val="20"/>
         </w:rPr>
-        <w:t>DBeaver</w:t>
-      </w:r>
-      <w:proofErr w:type="spellEnd"/>
-      <w:r>
-        <w:rPr>
-          <w:rFonts w:ascii="Times New Roman" w:hAnsi="Times New Roman" w:cs="Times New Roman"/>
-          <w:sz w:val="20"/>
-          <w:szCs w:val="20"/>
-        </w:rPr>
-        <w:t xml:space="preserve"> DBMS from the “normalized” schema </w:t>
-      </w:r>
-      <w:r>
-        <w:rPr>
-          <w:rFonts w:ascii="Times New Roman" w:hAnsi="Times New Roman" w:cs="Times New Roman"/>
-          <w:sz w:val="20"/>
-          <w:szCs w:val="20"/>
-        </w:rPr>
         <w:t>in the DuckDB database</w:t>
       </w:r>
     </w:p>
@@ -2324,29 +2339,7 @@
           <w:sz w:val="28"/>
           <w:szCs w:val="28"/>
         </w:rPr>
-        <w:t xml:space="preserve">Database Views </w:t>
-      </w:r>
-      <w:r>
-        <w:rPr>
-          <w:rFonts w:cs="Times New Roman"/>
-          <w:b/>
-          <w:bCs/>
-          <w:color w:val="156082" w:themeColor="accent1"/>
-          <w:sz w:val="28"/>
-          <w:szCs w:val="28"/>
-        </w:rPr>
-        <w:t>–</w:t>
-      </w:r>
-      <w:r>
-        <w:rPr>
-          <w:rFonts w:cs="Times New Roman"/>
-          <w:b/>
-          <w:bCs/>
-          <w:color w:val="156082" w:themeColor="accent1"/>
-          <w:sz w:val="28"/>
-          <w:szCs w:val="28"/>
-        </w:rPr>
-        <w:t xml:space="preserve"> </w:t>
+        <w:t xml:space="preserve">Database Views – </w:t>
       </w:r>
       <w:r>
         <w:rPr>
@@ -2522,7 +2515,7 @@
                     </pic:cNvPicPr>
                   </pic:nvPicPr>
                   <pic:blipFill>
-                    <a:blip r:embed="rId22" cstate="print">
+                    <a:blip r:embed="rId25" cstate="print">
                       <a:extLst>
                         <a:ext uri="{28A0092B-C50C-407E-A947-70E740481C1C}">
                           <a14:useLocalDpi xmlns:a14="http://schemas.microsoft.com/office/drawing/2010/main" val="0"/>
@@ -2616,28 +2609,197 @@
           <w:sz w:val="28"/>
           <w:szCs w:val="28"/>
         </w:rPr>
-        <w:t>Advanced and Other Queries</w:t>
+        <w:t xml:space="preserve">Advanced and Other Queries – </w:t>
       </w:r>
       <w:r>
         <w:rPr>
           <w:rFonts w:cs="Times New Roman"/>
           <w:b/>
           <w:bCs/>
-          <w:color w:val="156082" w:themeColor="accent1"/>
           <w:sz w:val="28"/>
           <w:szCs w:val="28"/>
         </w:rPr>
-        <w:t xml:space="preserve"> – </w:t>
-      </w:r>
-      <w:r>
-        <w:rPr>
-          <w:rFonts w:cs="Times New Roman"/>
-          <w:b/>
-          <w:bCs/>
+        <w:t>Hierarchical and JOIN Queries</w:t>
+      </w:r>
+    </w:p>
+    <w:p>
+      <w:pPr>
+        <w:ind w:left="720"/>
+        <w:rPr>
+          <w:rFonts w:ascii="Times New Roman" w:hAnsi="Times New Roman" w:cs="Times New Roman"/>
+          <w:i/>
+          <w:iCs/>
+        </w:rPr>
+      </w:pPr>
+      <w:r>
+        <w:rPr>
+          <w:rFonts w:ascii="Times New Roman" w:hAnsi="Times New Roman" w:cs="Times New Roman"/>
+        </w:rPr>
+        <w:lastRenderedPageBreak/>
+        <w:t xml:space="preserve">Textbook Reference: </w:t>
+      </w:r>
+      <w:r>
+        <w:rPr>
+          <w:rFonts w:ascii="Times New Roman" w:hAnsi="Times New Roman" w:cs="Times New Roman"/>
+          <w:i/>
+          <w:iCs/>
+        </w:rPr>
+        <w:t xml:space="preserve">Chapters 9 and 10; Advanced Matching Problems | Views, Null   </w:t>
+      </w:r>
+    </w:p>
+    <w:p>
+      <w:pPr>
+        <w:ind w:left="2160" w:firstLine="720"/>
+        <w:rPr>
+          <w:rFonts w:ascii="Times New Roman" w:hAnsi="Times New Roman" w:cs="Times New Roman"/>
+          <w:i/>
+          <w:iCs/>
+        </w:rPr>
+      </w:pPr>
+      <w:r>
+        <w:rPr>
+          <w:rFonts w:ascii="Times New Roman" w:hAnsi="Times New Roman" w:cs="Times New Roman"/>
+          <w:i/>
+          <w:iCs/>
+        </w:rPr>
+        <w:t>Values and Hierarchical Queries</w:t>
+      </w:r>
+    </w:p>
+    <w:p>
+      <w:pPr>
+        <w:pStyle w:val="Heading2"/>
+        <w:rPr>
+          <w:rFonts w:asciiTheme="minorHAnsi" w:eastAsia="Arial" w:hAnsiTheme="minorHAnsi" w:cs="Arial"/>
+          <w:b/>
+          <w:bCs/>
+          <w:color w:val="156082" w:themeColor="accent1"/>
           <w:sz w:val="28"/>
           <w:szCs w:val="28"/>
         </w:rPr>
-        <w:t>Hierarchical and JOIN Queries</w:t>
+      </w:pPr>
+      <w:r>
+        <w:rPr>
+          <w:rFonts w:asciiTheme="minorHAnsi" w:eastAsia="Arial" w:hAnsiTheme="minorHAnsi" w:cs="Arial"/>
+          <w:b/>
+          <w:bCs/>
+          <w:color w:val="156082" w:themeColor="accent1"/>
+          <w:sz w:val="28"/>
+          <w:szCs w:val="28"/>
+        </w:rPr>
+        <w:t>Hierarchical Queries</w:t>
+      </w:r>
+    </w:p>
+    <w:p>
+      <w:r>
+        <w:t xml:space="preserve">The Locations table was designed with a  self-referencing parent_location_key foreign key, which creates a natural hierarchy where locations like campgrounds can be nested under a parent location such as a state park or state forest. </w:t>
+      </w:r>
+    </w:p>
+    <w:p>
+      <w:r>
+        <w:t>TODO: Create Recursive query that works and create it as a view that can be easily called whenever I want with very little code</w:t>
+      </w:r>
+    </w:p>
+    <w:p>
+      <w:r>
+        <w:t>TODO: snapshot of the view that is created</w:t>
+      </w:r>
+    </w:p>
+    <w:p>
+      <w:pPr>
+        <w:pStyle w:val="Heading2"/>
+        <w:rPr>
+          <w:rFonts w:asciiTheme="minorHAnsi" w:eastAsia="Arial" w:hAnsiTheme="minorHAnsi" w:cs="Arial"/>
+          <w:b/>
+          <w:bCs/>
+          <w:color w:val="156082" w:themeColor="accent1"/>
+          <w:sz w:val="28"/>
+          <w:szCs w:val="28"/>
+        </w:rPr>
+      </w:pPr>
+      <w:r>
+        <w:rPr>
+          <w:rFonts w:asciiTheme="minorHAnsi" w:eastAsia="Arial" w:hAnsiTheme="minorHAnsi" w:cs="Arial"/>
+          <w:b/>
+          <w:bCs/>
+          <w:color w:val="156082" w:themeColor="accent1"/>
+          <w:sz w:val="28"/>
+          <w:szCs w:val="28"/>
+        </w:rPr>
+        <w:t>Geospatial Queries</w:t>
+      </w:r>
+    </w:p>
+    <w:p>
+      <w:r>
+        <w:t>TODO: mention the geospatial duckdb plugin along with showing a query that I created to find all locations within a given distance of a coordinate pair (using St. Thomas coordinate pair for example and create queries that query my data to pull up locations that are 10, 20, and 50 miles within the St. Thomas coordinate)</w:t>
+      </w:r>
+    </w:p>
+    <w:p>
+      <w:pPr>
+        <w:pStyle w:val="Heading2"/>
+        <w:rPr>
+          <w:rFonts w:asciiTheme="minorHAnsi" w:eastAsia="Arial" w:hAnsiTheme="minorHAnsi" w:cs="Arial"/>
+          <w:b/>
+          <w:bCs/>
+          <w:color w:val="156082" w:themeColor="accent1"/>
+          <w:sz w:val="28"/>
+          <w:szCs w:val="28"/>
+        </w:rPr>
+      </w:pPr>
+      <w:r>
+        <w:rPr>
+          <w:rFonts w:asciiTheme="minorHAnsi" w:eastAsia="Arial" w:hAnsiTheme="minorHAnsi" w:cs="Arial"/>
+          <w:b/>
+          <w:bCs/>
+          <w:color w:val="156082" w:themeColor="accent1"/>
+          <w:sz w:val="28"/>
+          <w:szCs w:val="28"/>
+        </w:rPr>
+        <w:t>General Join Queries</w:t>
+      </w:r>
+    </w:p>
+    <w:p>
+      <w:pPr>
+        <w:spacing w:after="120" w:line="240" w:lineRule="auto"/>
+        <w:rPr>
+          <w:rFonts w:ascii="Times New Roman" w:hAnsi="Times New Roman" w:cs="Times New Roman"/>
+        </w:rPr>
+      </w:pPr>
+      <w:r>
+        <w:rPr>
+          <w:rFonts w:ascii="Times New Roman" w:hAnsi="Times New Roman" w:cs="Times New Roman"/>
+        </w:rPr>
+        <w:t xml:space="preserve">TODO: create general join query to join all the tables together. This can become a view that I show. </w:t>
+      </w:r>
+    </w:p>
+    <w:p>
+      <w:pPr>
+        <w:spacing w:after="120" w:line="240" w:lineRule="auto"/>
+        <w:rPr>
+          <w:rFonts w:ascii="Times New Roman" w:hAnsi="Times New Roman" w:cs="Times New Roman"/>
+        </w:rPr>
+      </w:pPr>
+    </w:p>
+    <w:p>
+      <w:pPr>
+        <w:rPr>
+          <w:rFonts w:cs="Times New Roman"/>
+          <w:b/>
+          <w:bCs/>
+          <w:color w:val="156082" w:themeColor="accent1"/>
+          <w:sz w:val="28"/>
+          <w:szCs w:val="28"/>
+        </w:rPr>
+      </w:pPr>
+      <w:r>
+        <w:rPr>
+          <w:rFonts w:cs="Times New Roman"/>
+          <w:b/>
+          <w:bCs/>
+          <w:color w:val="156082" w:themeColor="accent1"/>
+          <w:sz w:val="28"/>
+          <w:szCs w:val="28"/>
+        </w:rPr>
+        <w:t>Transactions – Transactional Safety Built in &amp; ACID</w:t>
       </w:r>
     </w:p>
     <w:p>
@@ -2653,7 +2815,6 @@
         <w:rPr>
           <w:rFonts w:ascii="Times New Roman" w:hAnsi="Times New Roman" w:cs="Times New Roman"/>
         </w:rPr>
-        <w:lastRenderedPageBreak/>
         <w:t xml:space="preserve">Textbook Reference: </w:t>
       </w:r>
       <w:r>
@@ -2662,7 +2823,7 @@
           <w:i/>
           <w:iCs/>
         </w:rPr>
-        <w:t>Chapter</w:t>
+        <w:t xml:space="preserve">Chapter </w:t>
       </w:r>
       <w:r>
         <w:rPr>
@@ -2670,7 +2831,7 @@
           <w:i/>
           <w:iCs/>
         </w:rPr>
-        <w:t>s</w:t>
+        <w:t>17;</w:t>
       </w:r>
       <w:r>
         <w:rPr>
@@ -2678,7 +2839,7 @@
           <w:i/>
           <w:iCs/>
         </w:rPr>
-        <w:t xml:space="preserve"> </w:t>
+        <w:t xml:space="preserve"> Transaction Management </w:t>
       </w:r>
       <w:r>
         <w:rPr>
@@ -2686,115 +2847,174 @@
           <w:i/>
           <w:iCs/>
         </w:rPr>
-        <w:t>9 and 10</w:t>
-      </w:r>
-      <w:r>
+        <w:t xml:space="preserve"> </w:t>
+      </w:r>
+    </w:p>
+    <w:p>
+      <w:pPr>
+        <w:pStyle w:val="Heading2"/>
+        <w:rPr>
+          <w:rFonts w:asciiTheme="minorHAnsi" w:eastAsia="Arial" w:hAnsiTheme="minorHAnsi" w:cs="Arial"/>
+          <w:b/>
+          <w:bCs/>
+          <w:color w:val="156082" w:themeColor="accent1"/>
+          <w:sz w:val="28"/>
+          <w:szCs w:val="28"/>
+        </w:rPr>
+      </w:pPr>
+      <w:r>
+        <w:rPr>
+          <w:rFonts w:asciiTheme="minorHAnsi" w:eastAsia="Arial" w:hAnsiTheme="minorHAnsi" w:cs="Arial"/>
+          <w:b/>
+          <w:bCs/>
+          <w:color w:val="156082" w:themeColor="accent1"/>
+          <w:sz w:val="28"/>
+          <w:szCs w:val="28"/>
+        </w:rPr>
+        <w:t>Transactions</w:t>
+      </w:r>
+    </w:p>
+    <w:p>
+      <w:pPr>
+        <w:rPr>
+          <w:rFonts w:ascii="Times New Roman" w:hAnsi="Times New Roman" w:cs="Times New Roman"/>
+        </w:rPr>
+      </w:pPr>
+      <w:r>
+        <w:rPr>
+          <w:rFonts w:ascii="Times New Roman" w:hAnsi="Times New Roman" w:cs="Times New Roman"/>
+        </w:rPr>
+        <w:t>Transactions with Rollback built into views</w:t>
+      </w:r>
+      <w:r>
+        <w:rPr>
+          <w:rFonts w:ascii="Times New Roman" w:hAnsi="Times New Roman" w:cs="Times New Roman"/>
+        </w:rPr>
+        <w:t xml:space="preserve"> </w:t>
+      </w:r>
+      <w:r>
+        <w:rPr>
+          <w:rFonts w:ascii="Times New Roman" w:hAnsi="Times New Roman" w:cs="Times New Roman"/>
+        </w:rPr>
+        <w:t>–</w:t>
+      </w:r>
+      <w:r>
+        <w:rPr>
+          <w:rFonts w:ascii="Times New Roman" w:hAnsi="Times New Roman" w:cs="Times New Roman"/>
+        </w:rPr>
+        <w:t xml:space="preserve"> TODO</w:t>
+      </w:r>
+    </w:p>
+    <w:p>
+      <w:pPr>
+        <w:rPr>
+          <w:rFonts w:ascii="Times New Roman" w:hAnsi="Times New Roman" w:cs="Times New Roman"/>
+        </w:rPr>
+      </w:pPr>
+      <w:r>
+        <w:rPr>
+          <w:rFonts w:ascii="Times New Roman" w:hAnsi="Times New Roman" w:cs="Times New Roman"/>
+        </w:rPr>
+        <w:t>TODO: discuss how each script is created and explain why it was created with the being transaction and commit and explain the automatic rollback on a failure</w:t>
+      </w:r>
+    </w:p>
+    <w:p>
+      <w:pPr>
+        <w:pStyle w:val="Heading2"/>
+        <w:rPr>
+          <w:rFonts w:asciiTheme="minorHAnsi" w:eastAsia="Arial" w:hAnsiTheme="minorHAnsi" w:cs="Arial"/>
+          <w:b/>
+          <w:bCs/>
+          <w:color w:val="156082" w:themeColor="accent1"/>
+          <w:sz w:val="28"/>
+          <w:szCs w:val="28"/>
+        </w:rPr>
+      </w:pPr>
+      <w:r>
+        <w:rPr>
+          <w:rFonts w:asciiTheme="minorHAnsi" w:eastAsia="Arial" w:hAnsiTheme="minorHAnsi" w:cs="Arial"/>
+          <w:b/>
+          <w:bCs/>
+          <w:color w:val="156082" w:themeColor="accent1"/>
+          <w:sz w:val="28"/>
+          <w:szCs w:val="28"/>
+        </w:rPr>
+        <w:t>ACID Compliance</w:t>
+      </w:r>
+    </w:p>
+    <w:p>
+      <w:pPr>
+        <w:rPr>
+          <w:rFonts w:ascii="Times New Roman" w:hAnsi="Times New Roman" w:cs="Times New Roman"/>
+        </w:rPr>
+      </w:pPr>
+      <w:r>
+        <w:rPr>
+          <w:rFonts w:ascii="Times New Roman" w:hAnsi="Times New Roman" w:cs="Times New Roman"/>
+        </w:rPr>
+        <w:t>ACID compliance – Transaction properties</w:t>
+      </w:r>
+      <w:r>
+        <w:rPr>
+          <w:rFonts w:ascii="Times New Roman" w:hAnsi="Times New Roman" w:cs="Times New Roman"/>
+        </w:rPr>
+        <w:t xml:space="preserve"> </w:t>
+      </w:r>
+      <w:r>
+        <w:rPr>
+          <w:rFonts w:ascii="Times New Roman" w:hAnsi="Times New Roman" w:cs="Times New Roman"/>
+        </w:rPr>
+        <w:t>–</w:t>
+      </w:r>
+      <w:r>
+        <w:rPr>
+          <w:rFonts w:ascii="Times New Roman" w:hAnsi="Times New Roman" w:cs="Times New Roman"/>
+        </w:rPr>
+        <w:t xml:space="preserve"> TODO</w:t>
+      </w:r>
+    </w:p>
+    <w:p>
+      <w:pPr>
         <w:rPr>
           <w:rFonts w:ascii="Times New Roman" w:hAnsi="Times New Roman" w:cs="Times New Roman"/>
           <w:i/>
           <w:iCs/>
         </w:rPr>
-        <w:t xml:space="preserve">; </w:t>
-      </w:r>
-      <w:r>
-        <w:rPr>
-          <w:rFonts w:ascii="Times New Roman" w:hAnsi="Times New Roman" w:cs="Times New Roman"/>
-          <w:i/>
-          <w:iCs/>
-        </w:rPr>
-        <w:t xml:space="preserve">Advanced Matching Problems | Views, Null   </w:t>
-      </w:r>
-    </w:p>
-    <w:p>
-      <w:pPr>
-        <w:ind w:left="2160" w:firstLine="720"/>
-        <w:rPr>
-          <w:rFonts w:ascii="Times New Roman" w:hAnsi="Times New Roman" w:cs="Times New Roman"/>
-          <w:i/>
-          <w:iCs/>
-        </w:rPr>
-      </w:pPr>
-      <w:r>
-        <w:rPr>
-          <w:rFonts w:ascii="Times New Roman" w:hAnsi="Times New Roman" w:cs="Times New Roman"/>
-          <w:i/>
-          <w:iCs/>
-        </w:rPr>
-        <w:t>Values and Hierarchical Queries</w:t>
-      </w:r>
-    </w:p>
-    <w:p>
-      <w:pPr>
-        <w:spacing w:after="120" w:line="240" w:lineRule="auto"/>
-        <w:rPr>
-          <w:rFonts w:ascii="Times New Roman" w:hAnsi="Times New Roman" w:cs="Times New Roman"/>
-        </w:rPr>
-      </w:pPr>
-      <w:r>
-        <w:rPr>
-          <w:rFonts w:ascii="Times New Roman" w:hAnsi="Times New Roman" w:cs="Times New Roman"/>
-        </w:rPr>
-        <w:t>Hierarchical Queries</w:t>
-      </w:r>
-      <w:r>
-        <w:rPr>
-          <w:rFonts w:ascii="Times New Roman" w:hAnsi="Times New Roman" w:cs="Times New Roman"/>
-        </w:rPr>
-        <w:t xml:space="preserve"> - TODO</w:t>
-      </w:r>
-    </w:p>
-    <w:p>
-      <w:pPr>
-        <w:spacing w:after="120" w:line="240" w:lineRule="auto"/>
-        <w:rPr>
-          <w:rFonts w:ascii="Times New Roman" w:hAnsi="Times New Roman" w:cs="Times New Roman"/>
-        </w:rPr>
-      </w:pPr>
-      <w:r>
-        <w:rPr>
-          <w:rFonts w:ascii="Times New Roman" w:hAnsi="Times New Roman" w:cs="Times New Roman"/>
-        </w:rPr>
-        <w:t>Geospatial Queries</w:t>
-      </w:r>
-      <w:r>
-        <w:rPr>
-          <w:rFonts w:ascii="Times New Roman" w:hAnsi="Times New Roman" w:cs="Times New Roman"/>
-        </w:rPr>
-        <w:t xml:space="preserve"> - TODO</w:t>
-      </w:r>
-    </w:p>
-    <w:p>
-      <w:pPr>
-        <w:spacing w:after="120" w:line="240" w:lineRule="auto"/>
-        <w:rPr>
-          <w:rFonts w:ascii="Times New Roman" w:hAnsi="Times New Roman" w:cs="Times New Roman"/>
-        </w:rPr>
-      </w:pPr>
-      <w:r>
-        <w:rPr>
-          <w:rFonts w:ascii="Times New Roman" w:hAnsi="Times New Roman" w:cs="Times New Roman"/>
-        </w:rPr>
-        <w:t>General Join Queries</w:t>
-      </w:r>
-      <w:r>
-        <w:rPr>
-          <w:rFonts w:ascii="Times New Roman" w:hAnsi="Times New Roman" w:cs="Times New Roman"/>
-        </w:rPr>
-        <w:t xml:space="preserve"> - TODO</w:t>
-      </w:r>
-    </w:p>
-    <w:p>
-      <w:pPr>
-        <w:spacing w:after="120" w:line="240" w:lineRule="auto"/>
-        <w:rPr>
-          <w:rFonts w:ascii="Times New Roman" w:hAnsi="Times New Roman" w:cs="Times New Roman"/>
-        </w:rPr>
-      </w:pPr>
-    </w:p>
-    <w:p>
-      <w:pPr>
-        <w:rPr>
-          <w:rFonts w:cs="Times New Roman"/>
+      </w:pPr>
+      <w:r>
+        <w:rPr>
+          <w:rFonts w:ascii="Times New Roman" w:hAnsi="Times New Roman" w:cs="Times New Roman"/>
+        </w:rPr>
+        <w:t>TODO: outline the ACID Compliance and how it helps out this project</w:t>
+      </w:r>
+    </w:p>
+    <w:p>
+      <w:pPr>
+        <w:rPr>
+          <w:b/>
+          <w:bCs/>
+          <w:color w:val="156082" w:themeColor="accent1"/>
+          <w:sz w:val="32"/>
+          <w:szCs w:val="32"/>
+        </w:rPr>
+      </w:pPr>
+      <w:r>
+        <w:rPr>
+          <w:b/>
+          <w:bCs/>
+          <w:color w:val="156082" w:themeColor="accent1"/>
+          <w:sz w:val="32"/>
+          <w:szCs w:val="32"/>
+        </w:rPr>
+        <w:lastRenderedPageBreak/>
+        <w:t>Discovering</w:t>
+      </w:r>
+    </w:p>
+    <w:p>
+      <w:pPr>
+        <w:pStyle w:val="Heading2"/>
+        <w:rPr>
+          <w:rFonts w:asciiTheme="minorHAnsi" w:eastAsia="Arial" w:hAnsiTheme="minorHAnsi" w:cs="Arial"/>
           <w:b/>
           <w:bCs/>
           <w:color w:val="156082" w:themeColor="accent1"/>
@@ -2804,132 +3024,214 @@
       </w:pPr>
       <w:r>
         <w:rPr>
-          <w:rFonts w:cs="Times New Roman"/>
+          <w:rFonts w:asciiTheme="minorHAnsi" w:eastAsia="Arial" w:hAnsiTheme="minorHAnsi" w:cs="Arial"/>
           <w:b/>
           <w:bCs/>
           <w:color w:val="156082" w:themeColor="accent1"/>
           <w:sz w:val="28"/>
           <w:szCs w:val="28"/>
         </w:rPr>
-        <w:t>Transactions</w:t>
-      </w:r>
-      <w:r>
-        <w:rPr>
-          <w:rFonts w:cs="Times New Roman"/>
+        <w:t>What I Learned</w:t>
+      </w:r>
+    </w:p>
+    <w:p>
+      <w:pPr>
+        <w:rPr>
+          <w:rFonts w:ascii="Times New Roman" w:hAnsi="Times New Roman" w:cs="Times New Roman"/>
+        </w:rPr>
+      </w:pPr>
+      <w:r>
+        <w:rPr>
+          <w:rFonts w:ascii="Times New Roman" w:hAnsi="Times New Roman" w:cs="Times New Roman"/>
+        </w:rPr>
+        <w:t xml:space="preserve">I learned a lot from this project. First, I learned about DuckDB as a piece of technology mainly used for analytical purposes. Working with DuckDB was quick to setup, easy to interact with, and interesting to use when properly uploading and managing data from multiple different sources. </w:t>
+      </w:r>
+    </w:p>
+    <w:p>
+      <w:pPr>
+        <w:rPr>
+          <w:rFonts w:ascii="Times New Roman" w:hAnsi="Times New Roman" w:cs="Times New Roman"/>
+        </w:rPr>
+      </w:pPr>
+      <w:r>
+        <w:rPr>
+          <w:rFonts w:ascii="Times New Roman" w:hAnsi="Times New Roman" w:cs="Times New Roman"/>
+        </w:rPr>
+        <w:t xml:space="preserve">I also believe I strengthened my SQL querying skills throughout this project. Although it will still take time to learn all the different syntactical differences between the ‘flavors’ of SQL I will encounter at work and in personal projects, I believe I have strengthened my understanding of how database technology can be used to effectively manage data more efficiently than any spreadsheet ever could. </w:t>
+      </w:r>
+    </w:p>
+    <w:p>
+      <w:pPr>
+        <w:rPr>
+          <w:rFonts w:ascii="Times New Roman" w:hAnsi="Times New Roman" w:cs="Times New Roman"/>
+        </w:rPr>
+      </w:pPr>
+      <w:r>
+        <w:rPr>
+          <w:rFonts w:ascii="Times New Roman" w:hAnsi="Times New Roman" w:cs="Times New Roman"/>
+        </w:rPr>
+        <w:t>A third concept that I was able to develop throughout this project was the ability to structure an ER diagram and code it into actual SQL without relying on AI or the Data Modeler tool to generate it for me. There were limitations within DuckDB that I had to overcome, such as the absence of a out of box solution for an auto incrementing primary key constraint and the lack of trigger support – both in which exist in other database systems such as Oracle and Microsoft SQL. These</w:t>
+      </w:r>
+      <w:r>
+        <w:rPr>
+          <w:rFonts w:ascii="Times New Roman" w:hAnsi="Times New Roman" w:cs="Times New Roman"/>
+        </w:rPr>
+        <w:t xml:space="preserve"> limitations, although surprising to me, forced me to find different ways to ensure data integrity and validity. </w:t>
+      </w:r>
+    </w:p>
+    <w:p>
+      <w:pPr>
+        <w:pStyle w:val="Heading2"/>
+        <w:rPr>
+          <w:rFonts w:asciiTheme="minorHAnsi" w:eastAsia="Arial" w:hAnsiTheme="minorHAnsi" w:cs="Arial"/>
           <w:b/>
           <w:bCs/>
           <w:color w:val="156082" w:themeColor="accent1"/>
           <w:sz w:val="28"/>
           <w:szCs w:val="28"/>
         </w:rPr>
-        <w:t xml:space="preserve"> – </w:t>
-      </w:r>
-      <w:r>
-        <w:rPr>
-          <w:rFonts w:cs="Times New Roman"/>
+      </w:pPr>
+      <w:r>
+        <w:rPr>
+          <w:rFonts w:asciiTheme="minorHAnsi" w:eastAsia="Arial" w:hAnsiTheme="minorHAnsi" w:cs="Arial"/>
           <w:b/>
           <w:bCs/>
           <w:color w:val="156082" w:themeColor="accent1"/>
           <w:sz w:val="28"/>
           <w:szCs w:val="28"/>
         </w:rPr>
-        <w:t>Transactional Safety Built in &amp; ACID</w:t>
-      </w:r>
-    </w:p>
-    <w:p>
-      <w:pPr>
-        <w:ind w:left="720"/>
-        <w:rPr>
-          <w:rFonts w:ascii="Times New Roman" w:hAnsi="Times New Roman" w:cs="Times New Roman"/>
-          <w:i/>
-          <w:iCs/>
-        </w:rPr>
-      </w:pPr>
-      <w:r>
-        <w:rPr>
-          <w:rFonts w:ascii="Times New Roman" w:hAnsi="Times New Roman" w:cs="Times New Roman"/>
-        </w:rPr>
-        <w:t xml:space="preserve">Textbook Reference: </w:t>
-      </w:r>
-      <w:r>
-        <w:rPr>
-          <w:rFonts w:ascii="Times New Roman" w:hAnsi="Times New Roman" w:cs="Times New Roman"/>
-          <w:i/>
-          <w:iCs/>
-        </w:rPr>
-        <w:t xml:space="preserve">Chapter </w:t>
-      </w:r>
-      <w:r>
-        <w:rPr>
-          <w:rFonts w:ascii="Times New Roman" w:hAnsi="Times New Roman" w:cs="Times New Roman"/>
-          <w:i/>
-          <w:iCs/>
-        </w:rPr>
-        <w:t>17</w:t>
-      </w:r>
-      <w:r>
-        <w:rPr>
-          <w:rFonts w:ascii="Times New Roman" w:hAnsi="Times New Roman" w:cs="Times New Roman"/>
-          <w:i/>
-          <w:iCs/>
-        </w:rPr>
-        <w:t>;</w:t>
-      </w:r>
-      <w:r>
-        <w:rPr>
-          <w:rFonts w:ascii="Times New Roman" w:hAnsi="Times New Roman" w:cs="Times New Roman"/>
-          <w:i/>
-          <w:iCs/>
-        </w:rPr>
-        <w:t xml:space="preserve"> Transaction Management </w:t>
-      </w:r>
-      <w:r>
-        <w:rPr>
-          <w:rFonts w:ascii="Times New Roman" w:hAnsi="Times New Roman" w:cs="Times New Roman"/>
-          <w:i/>
-          <w:iCs/>
-        </w:rPr>
-        <w:t xml:space="preserve"> </w:t>
-      </w:r>
-    </w:p>
-    <w:p>
-      <w:pPr>
-        <w:rPr>
-          <w:rFonts w:ascii="Times New Roman" w:hAnsi="Times New Roman" w:cs="Times New Roman"/>
-        </w:rPr>
-      </w:pPr>
-      <w:r>
-        <w:rPr>
-          <w:rFonts w:ascii="Times New Roman" w:hAnsi="Times New Roman" w:cs="Times New Roman"/>
-        </w:rPr>
-        <w:t>Transactions with Rollback built into views</w:t>
-      </w:r>
-      <w:r>
-        <w:rPr>
-          <w:rFonts w:ascii="Times New Roman" w:hAnsi="Times New Roman" w:cs="Times New Roman"/>
-        </w:rPr>
-        <w:t xml:space="preserve"> - TODO</w:t>
-      </w:r>
-    </w:p>
-    <w:p>
-      <w:pPr>
-        <w:rPr>
-          <w:rFonts w:ascii="Times New Roman" w:hAnsi="Times New Roman" w:cs="Times New Roman"/>
-          <w:i/>
-          <w:iCs/>
-        </w:rPr>
-      </w:pPr>
-      <w:r>
-        <w:rPr>
-          <w:rFonts w:ascii="Times New Roman" w:hAnsi="Times New Roman" w:cs="Times New Roman"/>
-        </w:rPr>
-        <w:t>ACID compliance – Transaction properties</w:t>
-      </w:r>
-      <w:r>
-        <w:rPr>
-          <w:rFonts w:ascii="Times New Roman" w:hAnsi="Times New Roman" w:cs="Times New Roman"/>
-        </w:rPr>
-        <w:t xml:space="preserve"> - TODO</w:t>
+        <w:t xml:space="preserve">What </w:t>
+      </w:r>
+      <w:r>
+        <w:rPr>
+          <w:rFonts w:asciiTheme="minorHAnsi" w:eastAsia="Arial" w:hAnsiTheme="minorHAnsi" w:cs="Arial"/>
+          <w:b/>
+          <w:bCs/>
+          <w:color w:val="156082" w:themeColor="accent1"/>
+          <w:sz w:val="28"/>
+          <w:szCs w:val="28"/>
+        </w:rPr>
+        <w:t>Didn’t Work or Wasn’t Completed</w:t>
+      </w:r>
+    </w:p>
+    <w:p>
+      <w:pPr>
+        <w:rPr>
+          <w:rFonts w:ascii="Times New Roman" w:hAnsi="Times New Roman" w:cs="Times New Roman"/>
+        </w:rPr>
+      </w:pPr>
+      <w:r>
+        <w:rPr>
+          <w:rFonts w:ascii="Times New Roman" w:eastAsia="Arial" w:hAnsi="Times New Roman" w:cs="Times New Roman"/>
+          <w:color w:val="1A1A1A"/>
+        </w:rPr>
+        <w:t>Although I learned a lot, I also discovered limitations that, as of writing this, have not allowed me to complete the API and frontend layers of this project.</w:t>
+      </w:r>
+    </w:p>
+    <w:p>
+      <w:pPr>
+        <w:rPr>
+          <w:rFonts w:ascii="Times New Roman" w:hAnsi="Times New Roman" w:cs="Times New Roman"/>
+        </w:rPr>
+      </w:pPr>
+      <w:r>
+        <w:rPr>
+          <w:rFonts w:ascii="Times New Roman" w:eastAsia="Arial" w:hAnsi="Times New Roman" w:cs="Times New Roman"/>
+          <w:color w:val="1A1A1A"/>
+        </w:rPr>
+        <w:t>First, not all data sources are equally complete. The NPS data source is the most comprehensive. However, the MN DNR and MN GIS data sources are only partial, and there is meaningful overlap between them that ideally would be merged. The next step for this project after the semester would be to create a process that analyzes locations by their latitude and longitude proximity and estimates which locations should be merged, made parent-child relationships, or treated as distinct entities.</w:t>
+      </w:r>
+    </w:p>
+    <w:p>
+      <w:pPr>
+        <w:rPr>
+          <w:rFonts w:ascii="Times New Roman" w:hAnsi="Times New Roman" w:cs="Times New Roman"/>
+        </w:rPr>
+      </w:pPr>
+      <w:r>
+        <w:rPr>
+          <w:rFonts w:ascii="Times New Roman" w:eastAsia="Arial" w:hAnsi="Times New Roman" w:cs="Times New Roman"/>
+          <w:color w:val="1A1A1A"/>
+        </w:rPr>
+        <w:t xml:space="preserve">Second, it was difficult to properly assign locations </w:t>
+      </w:r>
+      <w:r>
+        <w:rPr>
+          <w:rFonts w:ascii="Times New Roman" w:eastAsia="Arial" w:hAnsi="Times New Roman" w:cs="Times New Roman"/>
+          <w:color w:val="1A1A1A"/>
+        </w:rPr>
+        <w:t>as</w:t>
+      </w:r>
+      <w:r>
+        <w:rPr>
+          <w:rFonts w:ascii="Times New Roman" w:eastAsia="Arial" w:hAnsi="Times New Roman" w:cs="Times New Roman"/>
+          <w:color w:val="1A1A1A"/>
+        </w:rPr>
+        <w:t xml:space="preserve"> children of</w:t>
+      </w:r>
+      <w:r>
+        <w:rPr>
+          <w:rFonts w:ascii="Times New Roman" w:eastAsia="Arial" w:hAnsi="Times New Roman" w:cs="Times New Roman"/>
+          <w:color w:val="1A1A1A"/>
+        </w:rPr>
+        <w:t xml:space="preserve"> other</w:t>
+      </w:r>
+      <w:r>
+        <w:rPr>
+          <w:rFonts w:ascii="Times New Roman" w:eastAsia="Arial" w:hAnsi="Times New Roman" w:cs="Times New Roman"/>
+          <w:color w:val="1A1A1A"/>
+        </w:rPr>
+        <w:t xml:space="preserve"> parent locations without being able to visually see how they were positioned geographically on </w:t>
+      </w:r>
+      <w:r>
+        <w:rPr>
+          <w:rFonts w:ascii="Times New Roman" w:eastAsia="Arial" w:hAnsi="Times New Roman" w:cs="Times New Roman"/>
+          <w:color w:val="1A1A1A"/>
+        </w:rPr>
+        <w:t>a</w:t>
+      </w:r>
+      <w:r>
+        <w:rPr>
+          <w:rFonts w:ascii="Times New Roman" w:eastAsia="Arial" w:hAnsi="Times New Roman" w:cs="Times New Roman"/>
+          <w:color w:val="1A1A1A"/>
+        </w:rPr>
+        <w:t xml:space="preserve"> map. For instance, NPS campground data is well-structured enough to allow campgrounds to be assigned as children of their parent national park. The same was not as straightforward with Google Places or MN GIS data.</w:t>
+      </w:r>
+    </w:p>
+    <w:p>
+      <w:pPr>
+        <w:rPr>
+          <w:rFonts w:ascii="Times New Roman" w:hAnsi="Times New Roman" w:cs="Times New Roman"/>
+        </w:rPr>
+      </w:pPr>
+      <w:r>
+        <w:rPr>
+          <w:rFonts w:ascii="Times New Roman" w:eastAsia="Arial" w:hAnsi="Times New Roman" w:cs="Times New Roman"/>
+          <w:color w:val="1A1A1A"/>
+        </w:rPr>
+        <w:lastRenderedPageBreak/>
+        <w:t xml:space="preserve">Third, the non-completion of the optimistic goal — migrating data to PostgreSQL and building the API and frontend layers — was due to the minimum viable project turning out to be more involved than originally </w:t>
+      </w:r>
+      <w:r>
+        <w:rPr>
+          <w:rFonts w:ascii="Times New Roman" w:eastAsia="Arial" w:hAnsi="Times New Roman" w:cs="Times New Roman"/>
+          <w:color w:val="1A1A1A"/>
+        </w:rPr>
+        <w:t>thought</w:t>
+      </w:r>
+      <w:r>
+        <w:rPr>
+          <w:rFonts w:ascii="Times New Roman" w:eastAsia="Arial" w:hAnsi="Times New Roman" w:cs="Times New Roman"/>
+          <w:color w:val="1A1A1A"/>
+        </w:rPr>
+        <w:t xml:space="preserve">. Writing and validating the SQL transformation </w:t>
+      </w:r>
+      <w:r>
+        <w:rPr>
+          <w:rFonts w:ascii="Times New Roman" w:eastAsia="Arial" w:hAnsi="Times New Roman" w:cs="Times New Roman"/>
+          <w:color w:val="1A1A1A"/>
+        </w:rPr>
+        <w:t xml:space="preserve">scripts with views and insert queries took additional time to complete. </w:t>
       </w:r>
     </w:p>
     <w:p>
@@ -2950,16 +3252,14 @@
           <w:sz w:val="32"/>
           <w:szCs w:val="32"/>
         </w:rPr>
-        <w:t>Discovering</w:t>
+        <w:t>Limitations</w:t>
       </w:r>
     </w:p>
     <w:p>
       <w:pPr>
         <w:pStyle w:val="Heading2"/>
         <w:rPr>
-          <w:rFonts w:asciiTheme="minorHAnsi" w:eastAsia="Arial" w:hAnsiTheme="minorHAnsi" w:cs="Arial"/>
-          <w:b/>
-          <w:bCs/>
+          <w:rFonts w:asciiTheme="minorHAnsi" w:hAnsiTheme="minorHAnsi" w:cs="Times New Roman"/>
           <w:color w:val="156082" w:themeColor="accent1"/>
           <w:sz w:val="28"/>
           <w:szCs w:val="28"/>
@@ -2967,68 +3267,55 @@
       </w:pPr>
       <w:r>
         <w:rPr>
-          <w:rFonts w:asciiTheme="minorHAnsi" w:eastAsia="Arial" w:hAnsiTheme="minorHAnsi" w:cs="Arial"/>
+          <w:rFonts w:asciiTheme="minorHAnsi" w:eastAsia="Arial" w:hAnsiTheme="minorHAnsi" w:cs="Times New Roman"/>
           <w:b/>
           <w:bCs/>
           <w:color w:val="156082" w:themeColor="accent1"/>
           <w:sz w:val="28"/>
           <w:szCs w:val="28"/>
         </w:rPr>
-        <w:t>What I Learned</w:t>
-      </w:r>
-    </w:p>
-    <w:p>
-      <w:pPr>
-        <w:rPr>
-          <w:rFonts w:ascii="Times New Roman" w:hAnsi="Times New Roman" w:cs="Times New Roman"/>
-        </w:rPr>
-      </w:pPr>
-      <w:r>
-        <w:rPr>
-          <w:rFonts w:ascii="Times New Roman" w:hAnsi="Times New Roman" w:cs="Times New Roman"/>
-        </w:rPr>
-        <w:t xml:space="preserve">I learned a lot from this project. First, I learned about DuckDB as a piece of technology mainly used for analytical purposes. Working with DuckDB was quick to setup, easy to interact with, and interesting to use when properly uploading and managing data from multiple different sources. </w:t>
-      </w:r>
-    </w:p>
-    <w:p>
-      <w:pPr>
-        <w:rPr>
-          <w:rFonts w:ascii="Times New Roman" w:hAnsi="Times New Roman" w:cs="Times New Roman"/>
-        </w:rPr>
-      </w:pPr>
-      <w:r>
-        <w:rPr>
-          <w:rFonts w:ascii="Times New Roman" w:hAnsi="Times New Roman" w:cs="Times New Roman"/>
-        </w:rPr>
-        <w:t xml:space="preserve">I also believe I strengthened my SQL querying skills throughout this project. Although it will still take time to learn all the different syntactical differences between the ‘flavors’ of SQL I will encounter at work and in personal projects, I believe I have strengthened my understanding of how database technology can be used to effectively manage data more efficiently than any spreadsheet ever could. </w:t>
-      </w:r>
-    </w:p>
-    <w:p>
-      <w:pPr>
-        <w:rPr>
-          <w:rFonts w:ascii="Times New Roman" w:hAnsi="Times New Roman" w:cs="Times New Roman"/>
-        </w:rPr>
-      </w:pPr>
-      <w:r>
-        <w:rPr>
-          <w:rFonts w:ascii="Times New Roman" w:hAnsi="Times New Roman" w:cs="Times New Roman"/>
-        </w:rPr>
-        <w:t>A third concept that I was able to develop throughout this project was the ability to structure an ER diagram and code it into actual SQL without relying on AI or the Data Modeler tool to generate it for me. There were limitations within DuckDB that I had to overcome, such as the absence of a out of box solution for an auto incrementing primary key constraint and the lack of trigger support – both in which exist in other database systems such as Oracle and Microsoft SQL. These</w:t>
-      </w:r>
-      <w:r>
-        <w:rPr>
-          <w:rFonts w:ascii="Times New Roman" w:hAnsi="Times New Roman" w:cs="Times New Roman"/>
-        </w:rPr>
-        <w:t xml:space="preserve"> limitations, although surprising to me, forced me to find different ways to ensure data integrity and validity. </w:t>
+        <w:t>Incomplete Data Sources</w:t>
+      </w:r>
+    </w:p>
+    <w:p>
+      <w:pPr>
+        <w:rPr>
+          <w:rFonts w:ascii="Times New Roman" w:hAnsi="Times New Roman" w:cs="Times New Roman"/>
+        </w:rPr>
+      </w:pPr>
+      <w:r>
+        <w:rPr>
+          <w:rFonts w:ascii="Times New Roman" w:eastAsia="Arial" w:hAnsi="Times New Roman" w:cs="Times New Roman"/>
+          <w:color w:val="1A1A1A"/>
+          <w:sz w:val="22"/>
+          <w:szCs w:val="22"/>
+        </w:rPr>
+        <w:t xml:space="preserve">The first limitation is that several data sources are not entirely complete. The RIDB and NPS data sources are the most comprehensive. However, the MN DNR and MN GIS sources are far from complete and likely contain overlapping location references to the same physical places. The next step will be to create a </w:t>
+      </w:r>
+      <w:r>
+        <w:rPr>
+          <w:rFonts w:ascii="Times New Roman" w:eastAsia="Arial" w:hAnsi="Times New Roman" w:cs="Times New Roman"/>
+          <w:color w:val="1A1A1A"/>
+          <w:sz w:val="22"/>
+          <w:szCs w:val="22"/>
+        </w:rPr>
+        <w:t>scripted</w:t>
+      </w:r>
+      <w:r>
+        <w:rPr>
+          <w:rFonts w:ascii="Times New Roman" w:eastAsia="Arial" w:hAnsi="Times New Roman" w:cs="Times New Roman"/>
+          <w:color w:val="1A1A1A"/>
+          <w:sz w:val="22"/>
+          <w:szCs w:val="22"/>
+        </w:rPr>
+        <w:t xml:space="preserve"> process that analyzes locations via their latitude and longitude proximity and estimates which should be merged, which should become parent-child relationships, and which are genuinely distinct locations.</w:t>
       </w:r>
     </w:p>
     <w:p>
       <w:pPr>
         <w:pStyle w:val="Heading2"/>
         <w:rPr>
-          <w:rFonts w:asciiTheme="minorHAnsi" w:eastAsia="Arial" w:hAnsiTheme="minorHAnsi" w:cs="Arial"/>
-          <w:b/>
-          <w:bCs/>
+          <w:rFonts w:asciiTheme="minorHAnsi" w:hAnsiTheme="minorHAnsi" w:cs="Times New Roman"/>
           <w:color w:val="156082" w:themeColor="accent1"/>
           <w:sz w:val="28"/>
           <w:szCs w:val="28"/>
@@ -3036,302 +3323,50 @@
       </w:pPr>
       <w:r>
         <w:rPr>
-          <w:rFonts w:asciiTheme="minorHAnsi" w:eastAsia="Arial" w:hAnsiTheme="minorHAnsi" w:cs="Arial"/>
+          <w:rFonts w:asciiTheme="minorHAnsi" w:eastAsia="Arial" w:hAnsiTheme="minorHAnsi" w:cs="Times New Roman"/>
           <w:b/>
           <w:bCs/>
           <w:color w:val="156082" w:themeColor="accent1"/>
           <w:sz w:val="28"/>
           <w:szCs w:val="28"/>
         </w:rPr>
-        <w:lastRenderedPageBreak/>
-        <w:t xml:space="preserve">What </w:t>
-      </w:r>
-      <w:r>
-        <w:rPr>
-          <w:rFonts w:asciiTheme="minorHAnsi" w:eastAsia="Arial" w:hAnsiTheme="minorHAnsi" w:cs="Arial"/>
-          <w:b/>
-          <w:bCs/>
+        <w:t>Geographic Scope</w:t>
+      </w:r>
+    </w:p>
+    <w:p>
+      <w:pPr>
+        <w:rPr>
+          <w:rFonts w:ascii="Times New Roman" w:eastAsia="Arial" w:hAnsi="Times New Roman" w:cs="Times New Roman"/>
+          <w:color w:val="1A1A1A"/>
+        </w:rPr>
+      </w:pPr>
+      <w:r>
+        <w:rPr>
+          <w:rFonts w:ascii="Times New Roman" w:eastAsia="Arial" w:hAnsi="Times New Roman" w:cs="Times New Roman"/>
+          <w:color w:val="1A1A1A"/>
+        </w:rPr>
+        <w:t xml:space="preserve">This project is currently limited to Minnesota state parks and US national parks. A more powerful and broadly useful project would attempt to collect and manage data spanning the entire United States. Expanding the scope would require additional data sources and more robust normalization work across a wider variety of source formats. </w:t>
+      </w:r>
+    </w:p>
+    <w:p>
+      <w:pPr>
+        <w:pStyle w:val="Heading2"/>
+        <w:rPr>
+          <w:rFonts w:asciiTheme="minorHAnsi" w:hAnsiTheme="minorHAnsi" w:cs="Times New Roman"/>
           <w:color w:val="156082" w:themeColor="accent1"/>
           <w:sz w:val="28"/>
           <w:szCs w:val="28"/>
         </w:rPr>
-        <w:t>Didn’t Work or Wasn’t Completed</w:t>
-      </w:r>
-    </w:p>
-    <w:p>
-      <w:pPr>
-        <w:rPr>
-          <w:rFonts w:ascii="Times New Roman" w:hAnsi="Times New Roman" w:cs="Times New Roman"/>
-        </w:rPr>
-      </w:pPr>
-      <w:r>
-        <w:rPr>
-          <w:rFonts w:ascii="Times New Roman" w:eastAsia="Arial" w:hAnsi="Times New Roman" w:cs="Times New Roman"/>
-          <w:color w:val="1A1A1A"/>
-        </w:rPr>
-        <w:t>Although I learned a lot, I also discovered limitations that, as of writing this, have not allowed me to complete the API and frontend layers of this project.</w:t>
-      </w:r>
-    </w:p>
-    <w:p>
-      <w:pPr>
-        <w:rPr>
-          <w:rFonts w:ascii="Times New Roman" w:hAnsi="Times New Roman" w:cs="Times New Roman"/>
-        </w:rPr>
-      </w:pPr>
-      <w:r>
-        <w:rPr>
-          <w:rFonts w:ascii="Times New Roman" w:eastAsia="Arial" w:hAnsi="Times New Roman" w:cs="Times New Roman"/>
-          <w:color w:val="1A1A1A"/>
-        </w:rPr>
-        <w:t>First, not all data sources are equally complete. The NPS data source is the most comprehensive. However, the MN DNR and MN GIS data sources are only partial, and there is meaningful overlap between them that ideally would be merged. The next step for this project after the semester would be to create a process that analyzes locations by their latitude and longitude proximity and estimates which locations should be merged, made parent-child relationships, or treated as distinct entities.</w:t>
-      </w:r>
-    </w:p>
-    <w:p>
-      <w:pPr>
-        <w:rPr>
-          <w:rFonts w:ascii="Times New Roman" w:hAnsi="Times New Roman" w:cs="Times New Roman"/>
-        </w:rPr>
-      </w:pPr>
-      <w:r>
-        <w:rPr>
-          <w:rFonts w:ascii="Times New Roman" w:eastAsia="Arial" w:hAnsi="Times New Roman" w:cs="Times New Roman"/>
-          <w:color w:val="1A1A1A"/>
-        </w:rPr>
-        <w:t xml:space="preserve">Second, it was difficult to properly assign locations </w:t>
-      </w:r>
-      <w:r>
-        <w:rPr>
-          <w:rFonts w:ascii="Times New Roman" w:eastAsia="Arial" w:hAnsi="Times New Roman" w:cs="Times New Roman"/>
-          <w:color w:val="1A1A1A"/>
-        </w:rPr>
-        <w:t>as</w:t>
-      </w:r>
-      <w:r>
-        <w:rPr>
-          <w:rFonts w:ascii="Times New Roman" w:eastAsia="Arial" w:hAnsi="Times New Roman" w:cs="Times New Roman"/>
-          <w:color w:val="1A1A1A"/>
-        </w:rPr>
-        <w:t xml:space="preserve"> children of</w:t>
-      </w:r>
-      <w:r>
-        <w:rPr>
-          <w:rFonts w:ascii="Times New Roman" w:eastAsia="Arial" w:hAnsi="Times New Roman" w:cs="Times New Roman"/>
-          <w:color w:val="1A1A1A"/>
-        </w:rPr>
-        <w:t xml:space="preserve"> other</w:t>
-      </w:r>
-      <w:r>
-        <w:rPr>
-          <w:rFonts w:ascii="Times New Roman" w:eastAsia="Arial" w:hAnsi="Times New Roman" w:cs="Times New Roman"/>
-          <w:color w:val="1A1A1A"/>
-        </w:rPr>
-        <w:t xml:space="preserve"> parent locations without being able to visually see how they were positioned geographically on </w:t>
-      </w:r>
-      <w:r>
-        <w:rPr>
-          <w:rFonts w:ascii="Times New Roman" w:eastAsia="Arial" w:hAnsi="Times New Roman" w:cs="Times New Roman"/>
-          <w:color w:val="1A1A1A"/>
-        </w:rPr>
-        <w:t>a</w:t>
-      </w:r>
-      <w:r>
-        <w:rPr>
-          <w:rFonts w:ascii="Times New Roman" w:eastAsia="Arial" w:hAnsi="Times New Roman" w:cs="Times New Roman"/>
-          <w:color w:val="1A1A1A"/>
-        </w:rPr>
-        <w:t xml:space="preserve"> map. For instance, NPS campground data is well-structured enough to allow campgrounds to be assigned as children of their parent national park. The same was not as straightforward with </w:t>
-      </w:r>
-      <w:r>
-        <w:rPr>
-          <w:rFonts w:ascii="Times New Roman" w:eastAsia="Arial" w:hAnsi="Times New Roman" w:cs="Times New Roman"/>
-          <w:color w:val="1A1A1A"/>
-        </w:rPr>
-        <w:t>Google</w:t>
-      </w:r>
-      <w:r>
-        <w:rPr>
-          <w:rFonts w:ascii="Times New Roman" w:eastAsia="Arial" w:hAnsi="Times New Roman" w:cs="Times New Roman"/>
-          <w:color w:val="1A1A1A"/>
-        </w:rPr>
-        <w:t xml:space="preserve"> Places or MN GIS data.</w:t>
-      </w:r>
-    </w:p>
-    <w:p>
-      <w:pPr>
-        <w:rPr>
-          <w:rFonts w:ascii="Times New Roman" w:hAnsi="Times New Roman" w:cs="Times New Roman"/>
-        </w:rPr>
-      </w:pPr>
-      <w:r>
-        <w:rPr>
-          <w:rFonts w:ascii="Times New Roman" w:eastAsia="Arial" w:hAnsi="Times New Roman" w:cs="Times New Roman"/>
-          <w:color w:val="1A1A1A"/>
-        </w:rPr>
-        <w:t xml:space="preserve">Third, the non-completion of the optimistic goal — migrating data to PostgreSQL and building the API and frontend layers — was due to the minimum viable project turning out to be more involved than originally </w:t>
-      </w:r>
-      <w:r>
-        <w:rPr>
-          <w:rFonts w:ascii="Times New Roman" w:eastAsia="Arial" w:hAnsi="Times New Roman" w:cs="Times New Roman"/>
-          <w:color w:val="1A1A1A"/>
-        </w:rPr>
-        <w:t>thought</w:t>
-      </w:r>
-      <w:r>
-        <w:rPr>
-          <w:rFonts w:ascii="Times New Roman" w:eastAsia="Arial" w:hAnsi="Times New Roman" w:cs="Times New Roman"/>
-          <w:color w:val="1A1A1A"/>
-        </w:rPr>
-        <w:t xml:space="preserve">. Writing and validating the SQL transformation </w:t>
-      </w:r>
-      <w:r>
-        <w:rPr>
-          <w:rFonts w:ascii="Times New Roman" w:eastAsia="Arial" w:hAnsi="Times New Roman" w:cs="Times New Roman"/>
-          <w:color w:val="1A1A1A"/>
-        </w:rPr>
-        <w:t xml:space="preserve">scripts with views and insert queries took additional time to complete. </w:t>
-      </w:r>
-    </w:p>
-    <w:p>
-      <w:pPr>
-        <w:rPr>
-          <w:b/>
-          <w:bCs/>
-          <w:color w:val="156082" w:themeColor="accent1"/>
-          <w:sz w:val="32"/>
-          <w:szCs w:val="32"/>
-        </w:rPr>
-      </w:pPr>
-      <w:r>
-        <w:rPr>
-          <w:b/>
-          <w:bCs/>
-          <w:color w:val="156082" w:themeColor="accent1"/>
-          <w:sz w:val="32"/>
-          <w:szCs w:val="32"/>
-        </w:rPr>
-        <w:t>Limitations</w:t>
-      </w:r>
-    </w:p>
-    <w:p>
-      <w:pPr>
-        <w:pStyle w:val="Heading2"/>
-        <w:rPr>
-          <w:rFonts w:asciiTheme="minorHAnsi" w:hAnsiTheme="minorHAnsi" w:cs="Times New Roman"/>
+      </w:pPr>
+      <w:r>
+        <w:rPr>
+          <w:rFonts w:asciiTheme="minorHAnsi" w:eastAsia="Arial" w:hAnsiTheme="minorHAnsi" w:cs="Times New Roman"/>
+          <w:b/>
+          <w:bCs/>
           <w:color w:val="156082" w:themeColor="accent1"/>
           <w:sz w:val="28"/>
           <w:szCs w:val="28"/>
         </w:rPr>
-      </w:pPr>
-      <w:r>
-        <w:rPr>
-          <w:rFonts w:asciiTheme="minorHAnsi" w:eastAsia="Arial" w:hAnsiTheme="minorHAnsi" w:cs="Times New Roman"/>
-          <w:b/>
-          <w:bCs/>
-          <w:color w:val="156082" w:themeColor="accent1"/>
-          <w:sz w:val="28"/>
-          <w:szCs w:val="28"/>
-        </w:rPr>
-        <w:t>Incomplete Data Sources</w:t>
-      </w:r>
-    </w:p>
-    <w:p>
-      <w:pPr>
-        <w:rPr>
-          <w:rFonts w:ascii="Times New Roman" w:hAnsi="Times New Roman" w:cs="Times New Roman"/>
-        </w:rPr>
-      </w:pPr>
-      <w:r>
-        <w:rPr>
-          <w:rFonts w:ascii="Times New Roman" w:eastAsia="Arial" w:hAnsi="Times New Roman" w:cs="Times New Roman"/>
-          <w:color w:val="1A1A1A"/>
-          <w:sz w:val="22"/>
-          <w:szCs w:val="22"/>
-        </w:rPr>
-        <w:t xml:space="preserve">The first limitation is that several data sources are not entirely complete. The RIDB and NPS data sources are the most comprehensive. However, the MN DNR and MN GIS sources are far from complete and likely contain overlapping location references to the same physical places. The next step will be to create a </w:t>
-      </w:r>
-      <w:r>
-        <w:rPr>
-          <w:rFonts w:ascii="Times New Roman" w:eastAsia="Arial" w:hAnsi="Times New Roman" w:cs="Times New Roman"/>
-          <w:color w:val="1A1A1A"/>
-          <w:sz w:val="22"/>
-          <w:szCs w:val="22"/>
-        </w:rPr>
-        <w:t>scripted</w:t>
-      </w:r>
-      <w:r>
-        <w:rPr>
-          <w:rFonts w:ascii="Times New Roman" w:eastAsia="Arial" w:hAnsi="Times New Roman" w:cs="Times New Roman"/>
-          <w:color w:val="1A1A1A"/>
-          <w:sz w:val="22"/>
-          <w:szCs w:val="22"/>
-        </w:rPr>
-        <w:t xml:space="preserve"> process that analyzes locations via their latitude and longitude proximity and estimates which should be merged, which should become parent-child relationships, and which are genuinely distinct locations.</w:t>
-      </w:r>
-    </w:p>
-    <w:p>
-      <w:pPr>
-        <w:pStyle w:val="Heading2"/>
-        <w:rPr>
-          <w:rFonts w:asciiTheme="minorHAnsi" w:hAnsiTheme="minorHAnsi" w:cs="Times New Roman"/>
-          <w:color w:val="156082" w:themeColor="accent1"/>
-          <w:sz w:val="28"/>
-          <w:szCs w:val="28"/>
-        </w:rPr>
-      </w:pPr>
-      <w:r>
-        <w:rPr>
-          <w:rFonts w:asciiTheme="minorHAnsi" w:eastAsia="Arial" w:hAnsiTheme="minorHAnsi" w:cs="Times New Roman"/>
-          <w:b/>
-          <w:bCs/>
-          <w:color w:val="156082" w:themeColor="accent1"/>
-          <w:sz w:val="28"/>
-          <w:szCs w:val="28"/>
-        </w:rPr>
-        <w:t>Geographic Scope</w:t>
-      </w:r>
-    </w:p>
-    <w:p>
-      <w:pPr>
-        <w:rPr>
-          <w:rFonts w:ascii="Times New Roman" w:eastAsia="Arial" w:hAnsi="Times New Roman" w:cs="Times New Roman"/>
-          <w:color w:val="1A1A1A"/>
-        </w:rPr>
-      </w:pPr>
-      <w:r>
-        <w:rPr>
-          <w:rFonts w:ascii="Times New Roman" w:eastAsia="Arial" w:hAnsi="Times New Roman" w:cs="Times New Roman"/>
-          <w:color w:val="1A1A1A"/>
-        </w:rPr>
-        <w:t xml:space="preserve">This project is currently limited to Minnesota state parks and US national parks. A more powerful and broadly useful </w:t>
-      </w:r>
-      <w:r>
-        <w:rPr>
-          <w:rFonts w:ascii="Times New Roman" w:eastAsia="Arial" w:hAnsi="Times New Roman" w:cs="Times New Roman"/>
-          <w:color w:val="1A1A1A"/>
-        </w:rPr>
-        <w:t xml:space="preserve">project would attempt to collect and manage data spanning the entire United States. Expanding the scope would require additional data sources and more robust normalization work across a wider variety of source formats. </w:t>
-      </w:r>
-    </w:p>
-    <w:p>
-      <w:pPr>
-        <w:pStyle w:val="Heading2"/>
-        <w:rPr>
-          <w:rFonts w:asciiTheme="minorHAnsi" w:hAnsiTheme="minorHAnsi" w:cs="Times New Roman"/>
-          <w:color w:val="156082" w:themeColor="accent1"/>
-          <w:sz w:val="28"/>
-          <w:szCs w:val="28"/>
-        </w:rPr>
-      </w:pPr>
-      <w:r>
-        <w:rPr>
-          <w:rFonts w:asciiTheme="minorHAnsi" w:eastAsia="Arial" w:hAnsiTheme="minorHAnsi" w:cs="Times New Roman"/>
-          <w:b/>
-          <w:bCs/>
-          <w:color w:val="156082" w:themeColor="accent1"/>
-          <w:sz w:val="28"/>
-          <w:szCs w:val="28"/>
-        </w:rPr>
-        <w:lastRenderedPageBreak/>
         <w:t>Optimistic Goal Not Completed</w:t>
       </w:r>
     </w:p>
@@ -3470,7 +3505,15 @@
           <w:rFonts w:ascii="Times New Roman" w:eastAsia="Arial" w:hAnsi="Times New Roman" w:cs="Times New Roman"/>
           <w:color w:val="1A1A1A"/>
         </w:rPr>
-        <w:t>, I cannot guarantee that the information remains accurate over time. Any published version of the Explore More</w:t>
+        <w:t xml:space="preserve">, I cannot guarantee that the information </w:t>
+      </w:r>
+      <w:r>
+        <w:rPr>
+          <w:rFonts w:ascii="Times New Roman" w:eastAsia="Arial" w:hAnsi="Times New Roman" w:cs="Times New Roman"/>
+          <w:color w:val="1A1A1A"/>
+        </w:rPr>
+        <w:lastRenderedPageBreak/>
+        <w:t>remains accurate over time. Any published version of the Explore More</w:t>
       </w:r>
       <w:r>
         <w:rPr>
@@ -3620,14 +3663,7 @@
         <w:rPr>
           <w:rFonts w:ascii="Times New Roman" w:hAnsi="Times New Roman" w:cs="Times New Roman"/>
         </w:rPr>
-        <w:t xml:space="preserve"> the foundation that has been built is one I’m proud of and plan to continue working on after the conclusion of this class. Working through this project has reinforced that building something meaningful with data requires more than just knowing the SQL or Python syntax. Rather it requires understanding the concepts well enough to make deliberate design decisions, like choosing how to model a self-referencing hierarchy, identification of different entities and the relationships between them, when to use a view versus a Python script or how to structure a transaction so that failures are recoverable. DuckDB proved to be an interesting and powerful </w:t>
-      </w:r>
-      <w:r>
-        <w:rPr>
-          <w:rFonts w:ascii="Times New Roman" w:hAnsi="Times New Roman" w:cs="Times New Roman"/>
-        </w:rPr>
-        <w:lastRenderedPageBreak/>
-        <w:t>tool for this kind of data management and transformation project, and this project gave me a real-world context to apply nearly everything covered in this course. Ultimately, what started as a side project I wanted to build for myself – a better way to access information about Minnesota’s parks, forests and campgrounds – has become something I now have a much stronger foundation to continue working on and eventually finish.</w:t>
+        <w:t xml:space="preserve"> the foundation that has been built is one I’m proud of and plan to continue working on after the conclusion of this class. Working through this project has reinforced that building something meaningful with data requires more than just knowing the SQL or Python syntax. Rather it requires understanding the concepts well enough to make deliberate design decisions, like choosing how to model a self-referencing hierarchy, identification of different entities and the relationships between them, when to use a view versus a Python script or how to structure a transaction so that failures are recoverable. DuckDB proved to be an interesting and powerful tool for this kind of data management and transformation project, and this project gave me a real-world context to apply nearly everything covered in this course. Ultimately, what started as a side project I wanted to build for myself – a better way to access information about Minnesota’s parks, forests and campgrounds – has become something I now have a much stronger foundation to continue working on and eventually finish.</w:t>
       </w:r>
     </w:p>
     <w:p>
@@ -3642,7 +3678,7 @@
       </w:pPr>
     </w:p>
     <w:sectPr>
-      <w:headerReference w:type="default" r:id="rId23"/>
+      <w:headerReference w:type="default" r:id="rId26"/>
       <w:pgSz w:w="12240" w:h="15840"/>
       <w:pgMar w:top="1440" w:right="1440" w:bottom="1440" w:left="1440" w:header="720" w:footer="720" w:gutter="0"/>
       <w:cols w:space="720"/>
@@ -5816,7 +5852,7 @@
   <w:style w:type="paragraph" w:default="1" w:styleId="Normal">
     <w:name w:val="Normal"/>
     <w:qFormat/>
-    <w:rsid w:val="00CB5A35"/>
+    <w:rsid w:val="00F62FD8"/>
   </w:style>
   <w:style w:type="paragraph" w:styleId="Heading1">
     <w:name w:val="heading 1"/>
@@ -6019,6 +6055,7 @@
   <w:style w:type="character" w:default="1" w:styleId="DefaultParagraphFont">
     <w:name w:val="Default Paragraph Font"/>
     <w:uiPriority w:val="1"/>
+    <w:semiHidden/>
     <w:unhideWhenUsed/>
   </w:style>
   <w:style w:type="table" w:default="1" w:styleId="TableNormal">

</xml_diff>

<commit_message>
Final document draft progress
</commit_message>
<xml_diff>
--- a/GIS-Data-Migration-Project/Assignment Documents/Final Project - Part 2 - Final Project Rough Draft.docx
+++ b/GIS-Data-Migration-Project/Assignment Documents/Final Project - Part 2 - Final Project Rough Draft.docx
@@ -48,21 +48,21 @@
           <w:rFonts w:ascii="Times New Roman" w:eastAsia="Arial" w:hAnsi="Times New Roman" w:cs="Times New Roman"/>
           <w:color w:val="1A1A1A"/>
         </w:rPr>
-        <w:t xml:space="preserve"> with data and retain organizational or ‘domain’ knowledge are those who are harder to replace within an organization. It is this mindset that I brought into this project, where I wanted to focus not just on developing a database schema, but on managing, transforming, and organizing data into a clear, understandable, flexible, and easy-to-manage data layer that can be utilized by any application — from a mobile app to a web application.</w:t>
-      </w:r>
-    </w:p>
-    <w:p>
-      <w:pPr>
-        <w:rPr>
-          <w:rFonts w:ascii="Times New Roman" w:hAnsi="Times New Roman" w:cs="Times New Roman"/>
-        </w:rPr>
-      </w:pPr>
-      <w:r>
-        <w:rPr>
-          <w:rFonts w:ascii="Times New Roman" w:eastAsia="Arial" w:hAnsi="Times New Roman" w:cs="Times New Roman"/>
-          <w:color w:val="1A1A1A"/>
-        </w:rPr>
-        <w:t>One such application that I have done some frontend work on, but so far have no meaningful data layer for, I call “Explore More.” Up to this point it is a web application</w:t>
+        <w:t xml:space="preserve"> with data and retain organizational or ‘domain’ knowledge are those who are harder to replace within an organization. It is this mindset that I brought into this project, where I wanted to focus not just developing a database schema, but managing, transforming, and organizing data into a clear, understandable, flexible, and easy-to-manage data layer that can be utilized by any application — from a mobile app to a web application.</w:t>
+      </w:r>
+    </w:p>
+    <w:p>
+      <w:pPr>
+        <w:rPr>
+          <w:rFonts w:ascii="Times New Roman" w:hAnsi="Times New Roman" w:cs="Times New Roman"/>
+        </w:rPr>
+      </w:pPr>
+      <w:r>
+        <w:rPr>
+          <w:rFonts w:ascii="Times New Roman" w:eastAsia="Arial" w:hAnsi="Times New Roman" w:cs="Times New Roman"/>
+          <w:color w:val="1A1A1A"/>
+        </w:rPr>
+        <w:t>One such application that I have done some frontend work on, but so far have no meaningful data layer, I call “Explore More.” Up to this point it is a web application</w:t>
       </w:r>
       <w:r>
         <w:rPr>
@@ -155,7 +155,21 @@
           <w:rFonts w:ascii="Times New Roman" w:eastAsia="Arial" w:hAnsi="Times New Roman" w:cs="Times New Roman"/>
           <w:color w:val="1A1A1A"/>
         </w:rPr>
-        <w:t xml:space="preserve">From my description for this project, one can assume that the sky is the limit… and it is! I have ambitious plans for this project that I’ll continue working on even after the conclusion of this class. However, to keep myself on track for this class I have defined some minimal and optimistic goals. </w:t>
+        <w:t>From my description for this project, one can assume that the sky is the limit… and it is! I have ambitious plans for this project that I’ll continue working on</w:t>
+      </w:r>
+      <w:r>
+        <w:rPr>
+          <w:rFonts w:ascii="Times New Roman" w:eastAsia="Arial" w:hAnsi="Times New Roman" w:cs="Times New Roman"/>
+          <w:color w:val="1A1A1A"/>
+        </w:rPr>
+        <w:t xml:space="preserve"> it</w:t>
+      </w:r>
+      <w:r>
+        <w:rPr>
+          <w:rFonts w:ascii="Times New Roman" w:eastAsia="Arial" w:hAnsi="Times New Roman" w:cs="Times New Roman"/>
+          <w:color w:val="1A1A1A"/>
+        </w:rPr>
+        <w:t xml:space="preserve"> even after the conclusion of this class. However, to keep myself on track for this class I have defined some minimal and optimistic goals. </w:t>
       </w:r>
     </w:p>
     <w:p>
@@ -228,7 +242,21 @@
           <w:rFonts w:ascii="Times New Roman" w:eastAsia="Arial" w:hAnsi="Times New Roman" w:cs="Times New Roman"/>
           <w:color w:val="1A1A1A"/>
         </w:rPr>
-        <w:t>s.</w:t>
+        <w:t>s</w:t>
+      </w:r>
+      <w:r>
+        <w:rPr>
+          <w:rFonts w:ascii="Times New Roman" w:eastAsia="Arial" w:hAnsi="Times New Roman" w:cs="Times New Roman"/>
+          <w:color w:val="1A1A1A"/>
+        </w:rPr>
+        <w:t xml:space="preserve"> that are federally managed</w:t>
+      </w:r>
+      <w:r>
+        <w:rPr>
+          <w:rFonts w:ascii="Times New Roman" w:eastAsia="Arial" w:hAnsi="Times New Roman" w:cs="Times New Roman"/>
+          <w:color w:val="1A1A1A"/>
+        </w:rPr>
+        <w:t>.</w:t>
       </w:r>
     </w:p>
     <w:p>
@@ -267,7 +295,37 @@
           <w:rFonts w:ascii="Times New Roman" w:eastAsia="Arial" w:hAnsi="Times New Roman" w:cs="Times New Roman"/>
           <w:color w:val="1A1A1A"/>
         </w:rPr>
-        <w:t xml:space="preserve">My optimistic goal for this project is to build on top of my minimal goals by creating a mini demo web application where the DuckDB data is migrated into a PostgreSQL database with the PostGIS extension for geospatial data installed. The front end would utilize React as a mapping UI with a similar feel to Google Maps. The backend would be a simple Django/Python API layer that would serve the data from the database to the frontend, following the pattern that we discussed in class where data doesn’t travel directly from the database to the client. </w:t>
+        <w:t xml:space="preserve">My optimistic goal for this project is to build on top of my minimal goals by creating a mini demo web application where the DuckDB data is migrated into a PostgreSQL database with the </w:t>
+      </w:r>
+      <w:proofErr w:type="spellStart"/>
+      <w:r>
+        <w:rPr>
+          <w:rFonts w:ascii="Times New Roman" w:eastAsia="Arial" w:hAnsi="Times New Roman" w:cs="Times New Roman"/>
+          <w:color w:val="1A1A1A"/>
+        </w:rPr>
+        <w:t>PostGIS</w:t>
+      </w:r>
+      <w:proofErr w:type="spellEnd"/>
+      <w:r>
+        <w:rPr>
+          <w:rFonts w:ascii="Times New Roman" w:eastAsia="Arial" w:hAnsi="Times New Roman" w:cs="Times New Roman"/>
+          <w:color w:val="1A1A1A"/>
+        </w:rPr>
+        <w:t xml:space="preserve"> extension for geospatial data installed. The front end would utilize React as a mapping UI with a similar feel to Google Maps. The backend would be a simple Django/Python API layer that would serve the data from the database to the frontend, following the pattern that we discussed in class where data doesn’t travel directly from the database to the client</w:t>
+      </w:r>
+      <w:r>
+        <w:rPr>
+          <w:rFonts w:ascii="Times New Roman" w:eastAsia="Arial" w:hAnsi="Times New Roman" w:cs="Times New Roman"/>
+          <w:color w:val="1A1A1A"/>
+        </w:rPr>
+        <w:t xml:space="preserve"> (aka web browser or mobile app)</w:t>
+      </w:r>
+      <w:r>
+        <w:rPr>
+          <w:rFonts w:ascii="Times New Roman" w:eastAsia="Arial" w:hAnsi="Times New Roman" w:cs="Times New Roman"/>
+          <w:color w:val="1A1A1A"/>
+        </w:rPr>
+        <w:t xml:space="preserve">. </w:t>
       </w:r>
     </w:p>
     <w:p>
@@ -331,14 +389,35 @@
           <w:rFonts w:ascii="Times New Roman" w:eastAsia="Arial" w:hAnsi="Times New Roman" w:cs="Times New Roman"/>
           <w:color w:val="1A1A1A"/>
         </w:rPr>
-        <w:t xml:space="preserve"> outlined in our textbook as </w:t>
-      </w:r>
-      <w:r>
-        <w:rPr>
-          <w:rFonts w:ascii="Times New Roman" w:eastAsia="Arial" w:hAnsi="Times New Roman" w:cs="Times New Roman"/>
-          <w:color w:val="1A1A1A"/>
-        </w:rPr>
-        <w:t>application user — mainly writing SELECT and occasionally UPDATE or ALTER TABLE queries to help manage the database and fix bugs that come up during application use. After graduating from St. Thomas, I also</w:t>
+        <w:t xml:space="preserve"> outlined in our textbook as</w:t>
+      </w:r>
+      <w:r>
+        <w:rPr>
+          <w:rFonts w:ascii="Times New Roman" w:eastAsia="Arial" w:hAnsi="Times New Roman" w:cs="Times New Roman"/>
+          <w:color w:val="1A1A1A"/>
+        </w:rPr>
+        <w:t xml:space="preserve"> a</w:t>
+      </w:r>
+      <w:r>
+        <w:rPr>
+          <w:rFonts w:ascii="Times New Roman" w:eastAsia="Arial" w:hAnsi="Times New Roman" w:cs="Times New Roman"/>
+          <w:color w:val="1A1A1A"/>
+        </w:rPr>
+        <w:t xml:space="preserve"> </w:t>
+      </w:r>
+      <w:r>
+        <w:rPr>
+          <w:rFonts w:ascii="Times New Roman" w:eastAsia="Arial" w:hAnsi="Times New Roman" w:cs="Times New Roman"/>
+          <w:color w:val="1A1A1A"/>
+        </w:rPr>
+        <w:t>programmer</w:t>
+      </w:r>
+      <w:r>
+        <w:rPr>
+          <w:rFonts w:ascii="Times New Roman" w:eastAsia="Arial" w:hAnsi="Times New Roman" w:cs="Times New Roman"/>
+          <w:color w:val="1A1A1A"/>
+        </w:rPr>
+        <w:t xml:space="preserve"> — mainly writing SELECT and occasionally UPDATE or ALTER TABLE queries to help manage the database and fix bugs that come up during application use. After graduating from St. Thomas, I also</w:t>
       </w:r>
       <w:r>
         <w:rPr>
@@ -352,7 +431,7 @@
           <w:rFonts w:ascii="Times New Roman" w:eastAsia="Arial" w:hAnsi="Times New Roman" w:cs="Times New Roman"/>
           <w:color w:val="1A1A1A"/>
         </w:rPr>
-        <w:t xml:space="preserve"> did some personal projects that allowed me to experiment with SQLite, PostgreSQL, and Microsoft SQL. Where I lack database experience is in database administration and data normalization techniques, which is what brought me to this class.</w:t>
+        <w:t xml:space="preserve"> some personal projects that allowed me to experiment with SQLite, PostgreSQL, and Microsoft SQL. Where I lack database experience is in database administration and data normalization techniques, which is what brought me to this class.</w:t>
       </w:r>
     </w:p>
     <w:p>
@@ -396,6 +475,13 @@
           <w:color w:val="1A1A1A"/>
         </w:rPr>
         <w:t>deciding</w:t>
+      </w:r>
+      <w:r>
+        <w:rPr>
+          <w:rFonts w:ascii="Times New Roman" w:eastAsia="Arial" w:hAnsi="Times New Roman" w:cs="Times New Roman"/>
+          <w:color w:val="1A1A1A"/>
+        </w:rPr>
+        <w:t xml:space="preserve"> which include</w:t>
       </w:r>
       <w:r>
         <w:rPr>
@@ -430,7 +516,21 @@
           <w:rFonts w:ascii="Times New Roman" w:eastAsia="Arial" w:hAnsi="Times New Roman" w:cs="Times New Roman"/>
           <w:color w:val="1A1A1A"/>
         </w:rPr>
-        <w:t xml:space="preserve">. I was also thinking of expanding this project to create a application that would allow users to journal and log which Disney experiences, restaurants and shows they have experienced on their visit. I would find this extremely useful for my nearly </w:t>
+        <w:t>. I was also thinking of expanding this project to create a</w:t>
+      </w:r>
+      <w:r>
+        <w:rPr>
+          <w:rFonts w:ascii="Times New Roman" w:eastAsia="Arial" w:hAnsi="Times New Roman" w:cs="Times New Roman"/>
+          <w:color w:val="1A1A1A"/>
+        </w:rPr>
+        <w:t>n</w:t>
+      </w:r>
+      <w:r>
+        <w:rPr>
+          <w:rFonts w:ascii="Times New Roman" w:eastAsia="Arial" w:hAnsi="Times New Roman" w:cs="Times New Roman"/>
+          <w:color w:val="1A1A1A"/>
+        </w:rPr>
+        <w:t xml:space="preserve"> application that would allow users to journal and log which Disney experiences, restaurants and shows they have experienced on their visit. I would find this extremely useful for my nearly </w:t>
       </w:r>
       <w:r>
         <w:rPr>
@@ -520,6 +620,7 @@
         <w:rPr>
           <w:rFonts w:ascii="Times New Roman" w:hAnsi="Times New Roman" w:cs="Times New Roman"/>
         </w:rPr>
+        <w:lastRenderedPageBreak/>
         <w:t xml:space="preserve">Build the data layer for my “Explore More” application, focused on aggregating park and recreation location data from multiple public sources into one normalized schema. </w:t>
       </w:r>
     </w:p>
@@ -535,7 +636,6 @@
           <w:rFonts w:ascii="Times New Roman" w:eastAsia="Arial" w:hAnsi="Times New Roman" w:cs="Times New Roman"/>
           <w:color w:val="1A1A1A"/>
         </w:rPr>
-        <w:lastRenderedPageBreak/>
         <w:t>Ultimately,</w:t>
       </w:r>
       <w:r>
@@ -843,7 +943,35 @@
           <w:rFonts w:ascii="Times New Roman" w:eastAsia="Arial" w:hAnsi="Times New Roman" w:cs="Times New Roman"/>
           <w:color w:val="1A1A1A"/>
         </w:rPr>
-        <w:t xml:space="preserve"> — Publicly accessible (up to 1,000 requests/day), this API provides park descriptions, operating hours, contact information, addresses, activities, and entrance fees for all NPS-managed lands across the United States. (</w:t>
+        <w:t xml:space="preserve"> — Publicly accessible (up to 1,000 requests/day), this API provides park descriptions, operating hours, contact information, addresses, activities, entrance fees</w:t>
+      </w:r>
+      <w:r>
+        <w:rPr>
+          <w:rFonts w:ascii="Times New Roman" w:eastAsia="Arial" w:hAnsi="Times New Roman" w:cs="Times New Roman"/>
+          <w:color w:val="1A1A1A"/>
+        </w:rPr>
+        <w:t xml:space="preserve"> and campground information</w:t>
+      </w:r>
+      <w:r>
+        <w:rPr>
+          <w:rFonts w:ascii="Times New Roman" w:eastAsia="Arial" w:hAnsi="Times New Roman" w:cs="Times New Roman"/>
+          <w:color w:val="1A1A1A"/>
+        </w:rPr>
+        <w:t xml:space="preserve"> for all NPS-managed </w:t>
+      </w:r>
+      <w:r>
+        <w:rPr>
+          <w:rFonts w:ascii="Times New Roman" w:eastAsia="Arial" w:hAnsi="Times New Roman" w:cs="Times New Roman"/>
+          <w:color w:val="1A1A1A"/>
+        </w:rPr>
+        <w:t>lands and properties</w:t>
+      </w:r>
+      <w:r>
+        <w:rPr>
+          <w:rFonts w:ascii="Times New Roman" w:eastAsia="Arial" w:hAnsi="Times New Roman" w:cs="Times New Roman"/>
+          <w:color w:val="1A1A1A"/>
+        </w:rPr>
+        <w:t xml:space="preserve"> across the United States. (</w:t>
       </w:r>
       <w:hyperlink r:id="rId13" w:history="1">
         <w:r>
@@ -920,6 +1048,7 @@
           <w:bCs/>
           <w:color w:val="1A1A1A"/>
         </w:rPr>
+        <w:lastRenderedPageBreak/>
         <w:t>MN Geospatial Commons</w:t>
       </w:r>
       <w:r>
@@ -967,7 +1096,6 @@
           <w:bCs/>
           <w:color w:val="1A1A1A"/>
         </w:rPr>
-        <w:lastRenderedPageBreak/>
         <w:t>Recreation.gov (RIDB)</w:t>
       </w:r>
       <w:r>
@@ -1268,7 +1396,7 @@
           <w:sz w:val="20"/>
           <w:szCs w:val="20"/>
         </w:rPr>
-        <w:t xml:space="preserve">Python </w:t>
+        <w:t xml:space="preserve">Python script code exemplifies how to create a DuckDB </w:t>
       </w:r>
       <w:r>
         <w:rPr>
@@ -1276,7 +1404,33 @@
           <w:sz w:val="20"/>
           <w:szCs w:val="20"/>
         </w:rPr>
-        <w:t>script code exemplifies how to create a DuckDB under the nps schema namespace</w:t>
+        <w:t xml:space="preserve">table </w:t>
+      </w:r>
+      <w:r>
+        <w:rPr>
+          <w:rFonts w:ascii="Times New Roman" w:hAnsi="Times New Roman" w:cs="Times New Roman"/>
+          <w:sz w:val="20"/>
+          <w:szCs w:val="20"/>
+        </w:rPr>
+        <w:t xml:space="preserve">under the </w:t>
+      </w:r>
+      <w:proofErr w:type="spellStart"/>
+      <w:r>
+        <w:rPr>
+          <w:rFonts w:ascii="Times New Roman" w:hAnsi="Times New Roman" w:cs="Times New Roman"/>
+          <w:sz w:val="20"/>
+          <w:szCs w:val="20"/>
+        </w:rPr>
+        <w:t>nps</w:t>
+      </w:r>
+      <w:proofErr w:type="spellEnd"/>
+      <w:r>
+        <w:rPr>
+          <w:rFonts w:ascii="Times New Roman" w:hAnsi="Times New Roman" w:cs="Times New Roman"/>
+          <w:sz w:val="20"/>
+          <w:szCs w:val="20"/>
+        </w:rPr>
+        <w:t xml:space="preserve"> schema namespace</w:t>
       </w:r>
     </w:p>
     <w:p>
@@ -1366,7 +1520,25 @@
           <w:sz w:val="20"/>
           <w:szCs w:val="20"/>
         </w:rPr>
-        <w:t>example of inserting extracted data from source into DuckDB database nps namespace parks table</w:t>
+        <w:t xml:space="preserve">example of inserting extracted data from source into DuckDB database </w:t>
+      </w:r>
+      <w:proofErr w:type="spellStart"/>
+      <w:r>
+        <w:rPr>
+          <w:rFonts w:ascii="Times New Roman" w:hAnsi="Times New Roman" w:cs="Times New Roman"/>
+          <w:sz w:val="20"/>
+          <w:szCs w:val="20"/>
+        </w:rPr>
+        <w:t>nps</w:t>
+      </w:r>
+      <w:proofErr w:type="spellEnd"/>
+      <w:r>
+        <w:rPr>
+          <w:rFonts w:ascii="Times New Roman" w:hAnsi="Times New Roman" w:cs="Times New Roman"/>
+          <w:sz w:val="20"/>
+          <w:szCs w:val="20"/>
+        </w:rPr>
+        <w:t xml:space="preserve"> namespace parks table</w:t>
       </w:r>
     </w:p>
     <w:p>
@@ -1381,20 +1553,159 @@
           <w:rFonts w:ascii="Times New Roman" w:hAnsi="Times New Roman" w:cs="Times New Roman"/>
         </w:rPr>
         <w:lastRenderedPageBreak/>
-        <w:t xml:space="preserve">One important DuckDB concept that is important to note here </w:t>
-      </w:r>
-      <w:r>
-        <w:rPr>
-          <w:rFonts w:ascii="Times New Roman" w:hAnsi="Times New Roman" w:cs="Times New Roman"/>
-        </w:rPr>
-        <w:t xml:space="preserve">is DuckDB’s SCHEMA feature. This feature allowed me to organize the data from all the different sources into individual namespaces. All I needed to do then with these namespaces was include the namespace definition when created ahead of each table when querying that specific data source. </w:t>
-      </w:r>
-      <w:r>
-        <w:rPr>
-          <w:rFonts w:ascii="Times New Roman" w:hAnsi="Times New Roman" w:cs="Times New Roman"/>
-        </w:rPr>
-        <w:t xml:space="preserve">I set up the Python scripts to create a unique and associable namespace within the same DuckDB database for each data source which allowed me to efficiently and easily manage all the tables across all five sources efficiently without naming conflicts or confusion. For example, the NPS source data lives under a </w:t>
-      </w:r>
+        <w:t xml:space="preserve">One DuckDB concept that is important to note here </w:t>
+      </w:r>
+      <w:r>
+        <w:rPr>
+          <w:rFonts w:ascii="Times New Roman" w:hAnsi="Times New Roman" w:cs="Times New Roman"/>
+        </w:rPr>
+        <w:t xml:space="preserve">is DuckDB’s SCHEMA feature. This feature allowed me </w:t>
+      </w:r>
+      <w:r>
+        <w:rPr>
+          <w:rFonts w:ascii="Times New Roman" w:hAnsi="Times New Roman" w:cs="Times New Roman"/>
+        </w:rPr>
+        <w:t xml:space="preserve">the ability to organize data from all different sources into individual namespaces. These namespaces are essentially a container </w:t>
+      </w:r>
+      <w:r>
+        <w:rPr>
+          <w:rFonts w:ascii="Times New Roman" w:hAnsi="Times New Roman" w:cs="Times New Roman"/>
+        </w:rPr>
+        <w:t>“that defines how data is organized within a database” (</w:t>
+      </w:r>
+      <w:r>
+        <w:rPr>
+          <w:rFonts w:ascii="Times New Roman" w:hAnsi="Times New Roman" w:cs="Times New Roman"/>
+          <w:highlight w:val="yellow"/>
+        </w:rPr>
+        <w:t>website attribution here</w:t>
+      </w:r>
+      <w:r>
+        <w:rPr>
+          <w:rFonts w:ascii="Times New Roman" w:hAnsi="Times New Roman" w:cs="Times New Roman"/>
+        </w:rPr>
+        <w:t xml:space="preserve">). I specifically utilized this to have a namespace created for each data source to help reduce the cognitive load of managing many different tables and views that quite possibly could have naming overlap between different sources. Then to query and create tables in each SCHEMA namespace all I needed to add to my queries was the namespace name followed by a period before the table name. For the most part it is managed within my Python scripts where towards the top of each script there is the needed SQL in place to create a SCHEMA namespace in the database. Then all following </w:t>
+      </w:r>
+      <w:r>
+        <w:rPr>
+          <w:rFonts w:ascii="Times New Roman" w:hAnsi="Times New Roman" w:cs="Times New Roman"/>
+        </w:rPr>
+        <w:t xml:space="preserve">CREATE </w:t>
+      </w:r>
+      <w:r>
+        <w:rPr>
+          <w:rFonts w:ascii="Times New Roman" w:hAnsi="Times New Roman" w:cs="Times New Roman"/>
+        </w:rPr>
+        <w:t>table</w:t>
+      </w:r>
+      <w:r>
+        <w:rPr>
+          <w:rFonts w:ascii="Times New Roman" w:hAnsi="Times New Roman" w:cs="Times New Roman"/>
+        </w:rPr>
+        <w:t xml:space="preserve"> queries</w:t>
+      </w:r>
+      <w:r>
+        <w:rPr>
+          <w:rFonts w:ascii="Times New Roman" w:hAnsi="Times New Roman" w:cs="Times New Roman"/>
+        </w:rPr>
+        <w:t xml:space="preserve"> within the same script use that defined namespace. </w:t>
+      </w:r>
+    </w:p>
+    <w:p>
+      <w:pPr>
+        <w:spacing w:after="120" w:line="240" w:lineRule="auto"/>
+        <w:rPr>
+          <w:rFonts w:ascii="Times New Roman" w:hAnsi="Times New Roman" w:cs="Times New Roman"/>
+        </w:rPr>
+      </w:pPr>
+      <w:r>
+        <w:rPr>
+          <w:noProof/>
+        </w:rPr>
+        <w:drawing>
+          <wp:inline distT="0" distB="0" distL="0" distR="0" wp14:anchorId="2A19B197" wp14:editId="3435BA12">
+            <wp:extent cx="5943600" cy="1099820"/>
+            <wp:effectExtent l="0" t="0" r="0" b="5080"/>
+            <wp:docPr id="1412392024" name="Picture 1"/>
+            <wp:cNvGraphicFramePr>
+              <a:graphicFrameLocks xmlns:a="http://schemas.openxmlformats.org/drawingml/2006/main" noChangeAspect="1"/>
+            </wp:cNvGraphicFramePr>
+            <a:graphic xmlns:a="http://schemas.openxmlformats.org/drawingml/2006/main">
+              <a:graphicData uri="http://schemas.openxmlformats.org/drawingml/2006/picture">
+                <pic:pic xmlns:pic="http://schemas.openxmlformats.org/drawingml/2006/picture">
+                  <pic:nvPicPr>
+                    <pic:cNvPr id="0" name="Picture 1"/>
+                    <pic:cNvPicPr>
+                      <a:picLocks noChangeAspect="1" noChangeArrowheads="1"/>
+                    </pic:cNvPicPr>
+                  </pic:nvPicPr>
+                  <pic:blipFill>
+                    <a:blip r:embed="rId20" cstate="print">
+                      <a:extLst>
+                        <a:ext uri="{28A0092B-C50C-407E-A947-70E740481C1C}">
+                          <a14:useLocalDpi xmlns:a14="http://schemas.microsoft.com/office/drawing/2010/main" val="0"/>
+                        </a:ext>
+                      </a:extLst>
+                    </a:blip>
+                    <a:srcRect/>
+                    <a:stretch>
+                      <a:fillRect/>
+                    </a:stretch>
+                  </pic:blipFill>
+                  <pic:spPr bwMode="auto">
+                    <a:xfrm>
+                      <a:off x="0" y="0"/>
+                      <a:ext cx="5943600" cy="1099820"/>
+                    </a:xfrm>
+                    <a:prstGeom prst="rect">
+                      <a:avLst/>
+                    </a:prstGeom>
+                    <a:noFill/>
+                    <a:ln>
+                      <a:noFill/>
+                    </a:ln>
+                  </pic:spPr>
+                </pic:pic>
+              </a:graphicData>
+            </a:graphic>
+          </wp:inline>
+        </w:drawing>
+      </w:r>
+    </w:p>
+    <w:p>
+      <w:pPr>
+        <w:jc w:val="center"/>
+        <w:rPr>
+          <w:rFonts w:ascii="Times New Roman" w:eastAsia="Arial" w:hAnsi="Times New Roman" w:cs="Times New Roman"/>
+          <w:color w:val="1A1A1A"/>
+          <w:sz w:val="20"/>
+          <w:szCs w:val="20"/>
+        </w:rPr>
+      </w:pPr>
+      <w:r>
+        <w:rPr>
+          <w:rFonts w:ascii="Times New Roman" w:eastAsia="Arial" w:hAnsi="Times New Roman" w:cs="Times New Roman"/>
+          <w:color w:val="1A1A1A"/>
+          <w:sz w:val="20"/>
+          <w:szCs w:val="20"/>
+        </w:rPr>
+        <w:t>Python script snapshot showing how to create a DuckDB SCHEMA namespace</w:t>
+      </w:r>
+    </w:p>
+    <w:p>
+      <w:pPr>
+        <w:spacing w:after="120" w:line="240" w:lineRule="auto"/>
+        <w:rPr>
+          <w:rFonts w:ascii="Times New Roman" w:hAnsi="Times New Roman" w:cs="Times New Roman"/>
+        </w:rPr>
+      </w:pPr>
+      <w:r>
+        <w:rPr>
+          <w:rFonts w:ascii="Times New Roman" w:hAnsi="Times New Roman" w:cs="Times New Roman"/>
+        </w:rPr>
+        <w:t xml:space="preserve">After the scripts run, I then have an individual SCHEMA namespace setup for each source with the tables created and data imported. An example image below shows how the NPS data retrieved from the API lives within the </w:t>
+      </w:r>
+      <w:proofErr w:type="spellStart"/>
       <w:r>
         <w:rPr>
           <w:rFonts w:ascii="Times New Roman" w:hAnsi="Times New Roman" w:cs="Times New Roman"/>
@@ -1403,12 +1714,14 @@
         </w:rPr>
         <w:t>nps</w:t>
       </w:r>
-      <w:r>
-        <w:rPr>
-          <w:rFonts w:ascii="Times New Roman" w:hAnsi="Times New Roman" w:cs="Times New Roman"/>
-        </w:rPr>
-        <w:t xml:space="preserve"> schema, while the MN GIS data lives under a </w:t>
-      </w:r>
+      <w:proofErr w:type="spellEnd"/>
+      <w:r>
+        <w:rPr>
+          <w:rFonts w:ascii="Times New Roman" w:hAnsi="Times New Roman" w:cs="Times New Roman"/>
+        </w:rPr>
+        <w:t xml:space="preserve"> schema, while the MN GIS data lives under the </w:t>
+      </w:r>
+      <w:proofErr w:type="spellStart"/>
       <w:r>
         <w:rPr>
           <w:rFonts w:ascii="Times New Roman" w:hAnsi="Times New Roman" w:cs="Times New Roman"/>
@@ -1417,20 +1730,41 @@
         </w:rPr>
         <w:t>mn_gis</w:t>
       </w:r>
-      <w:r>
-        <w:rPr>
-          <w:rFonts w:ascii="Times New Roman" w:hAnsi="Times New Roman" w:cs="Times New Roman"/>
-        </w:rPr>
-        <w:t xml:space="preserve"> schema. </w:t>
-      </w:r>
-    </w:p>
-    <w:p>
-      <w:pPr>
-        <w:spacing w:after="120" w:line="240" w:lineRule="auto"/>
-        <w:rPr>
-          <w:rFonts w:ascii="Times New Roman" w:hAnsi="Times New Roman" w:cs="Times New Roman"/>
-        </w:rPr>
-      </w:pPr>
+      <w:proofErr w:type="spellEnd"/>
+      <w:r>
+        <w:rPr>
+          <w:rFonts w:ascii="Times New Roman" w:hAnsi="Times New Roman" w:cs="Times New Roman"/>
+        </w:rPr>
+        <w:t xml:space="preserve"> schema. The normalized schema represents my entities that I intend to transform all the data collected into and isn’t created by a Python script but rather exists as a standalone .</w:t>
+      </w:r>
+      <w:proofErr w:type="spellStart"/>
+      <w:r>
+        <w:rPr>
+          <w:rFonts w:ascii="Times New Roman" w:hAnsi="Times New Roman" w:cs="Times New Roman"/>
+        </w:rPr>
+        <w:t>sql</w:t>
+      </w:r>
+      <w:proofErr w:type="spellEnd"/>
+      <w:r>
+        <w:rPr>
+          <w:rFonts w:ascii="Times New Roman" w:hAnsi="Times New Roman" w:cs="Times New Roman"/>
+        </w:rPr>
+        <w:t xml:space="preserve"> file that I would run in a Database Management System (DBMS) software like </w:t>
+      </w:r>
+      <w:proofErr w:type="spellStart"/>
+      <w:r>
+        <w:rPr>
+          <w:rFonts w:ascii="Times New Roman" w:hAnsi="Times New Roman" w:cs="Times New Roman"/>
+        </w:rPr>
+        <w:t>DBeaver</w:t>
+      </w:r>
+      <w:proofErr w:type="spellEnd"/>
+      <w:r>
+        <w:rPr>
+          <w:rFonts w:ascii="Times New Roman" w:hAnsi="Times New Roman" w:cs="Times New Roman"/>
+        </w:rPr>
+        <w:t>.</w:t>
+      </w:r>
     </w:p>
     <w:p>
       <w:pPr>
@@ -1460,7 +1794,7 @@
                     <pic:cNvPicPr/>
                   </pic:nvPicPr>
                   <pic:blipFill>
-                    <a:blip r:embed="rId20"/>
+                    <a:blip r:embed="rId21"/>
                     <a:stretch>
                       <a:fillRect/>
                     </a:stretch>
@@ -1498,7 +1832,27 @@
           <w:sz w:val="20"/>
           <w:szCs w:val="20"/>
         </w:rPr>
-        <w:t>DuckDB Database structure view within DBeaver DBMS</w:t>
+        <w:t xml:space="preserve">DuckDB Database structure view within </w:t>
+      </w:r>
+      <w:proofErr w:type="spellStart"/>
+      <w:r>
+        <w:rPr>
+          <w:rFonts w:ascii="Times New Roman" w:eastAsia="Arial" w:hAnsi="Times New Roman" w:cs="Times New Roman"/>
+          <w:color w:val="1A1A1A"/>
+          <w:sz w:val="20"/>
+          <w:szCs w:val="20"/>
+        </w:rPr>
+        <w:t>DBeaver</w:t>
+      </w:r>
+      <w:proofErr w:type="spellEnd"/>
+      <w:r>
+        <w:rPr>
+          <w:rFonts w:ascii="Times New Roman" w:eastAsia="Arial" w:hAnsi="Times New Roman" w:cs="Times New Roman"/>
+          <w:color w:val="1A1A1A"/>
+          <w:sz w:val="20"/>
+          <w:szCs w:val="20"/>
+        </w:rPr>
+        <w:t xml:space="preserve"> DBMS</w:t>
       </w:r>
     </w:p>
     <w:p>
@@ -1514,7 +1868,7 @@
         </w:rPr>
         <w:t xml:space="preserve">Reference: </w:t>
       </w:r>
-      <w:hyperlink r:id="rId21" w:history="1">
+      <w:hyperlink r:id="rId22" w:history="1">
         <w:r>
           <w:rPr>
             <w:rFonts w:ascii="Times New Roman" w:eastAsia="Arial" w:hAnsi="Times New Roman" w:cs="Times New Roman"/>
@@ -1559,7 +1913,26 @@
         <w:rPr>
           <w:rFonts w:ascii="Times New Roman" w:hAnsi="Times New Roman" w:cs="Times New Roman"/>
         </w:rPr>
-        <w:t>Once all data was imported and organized into the source-specific schema namespaces within DuckDB, the next step was to create a normalized database schema to transform all the source data into. Before writing any SQL code for this normalized database schema, I used Oracle’s SQL Data Modeler tool to design a comprehensive, intuitive, and normalized database managing the following entities: Locations, Operating Hours, Operating Hours Times, Media, Phone Numbers, Email Addresses, Addresses and Websites, some with their own corresponding type tables.</w:t>
+        <w:t xml:space="preserve">Once all data was imported and organized into the source-specific </w:t>
+      </w:r>
+      <w:r>
+        <w:rPr>
+          <w:rFonts w:ascii="Times New Roman" w:hAnsi="Times New Roman" w:cs="Times New Roman"/>
+        </w:rPr>
+        <w:t>SCHEMA</w:t>
+      </w:r>
+      <w:r>
+        <w:rPr>
+          <w:rFonts w:ascii="Times New Roman" w:hAnsi="Times New Roman" w:cs="Times New Roman"/>
+        </w:rPr>
+        <w:t xml:space="preserve"> namespaces within DuckDB, the next step was to create a normalized database schema to transform all the source </w:t>
+      </w:r>
+      <w:r>
+        <w:rPr>
+          <w:rFonts w:ascii="Times New Roman" w:hAnsi="Times New Roman" w:cs="Times New Roman"/>
+        </w:rPr>
+        <w:lastRenderedPageBreak/>
+        <w:t>data into. Before writing any SQL code for this normalized database schema, I used Oracle’s SQL Data Modeler tool to design a comprehensive, intuitive, and normalized database managing the following entities: Locations, Operating Hours, Operating Hours Times, Media, Phone Numbers, Email Addresses, Addresses and Websites, some with their own corresponding type tables.</w:t>
       </w:r>
     </w:p>
     <w:p>
@@ -1652,7 +2025,19 @@
         <w:rPr>
           <w:rFonts w:ascii="Times New Roman" w:hAnsi="Times New Roman" w:cs="Times New Roman"/>
         </w:rPr>
-        <w:t xml:space="preserve">The logical model outlines all the planned entities, their attributes, and the relationships between them. The key design decisions that I included while crafting the logical model includes: </w:t>
+        <w:t xml:space="preserve">The logical model outlines all the planned entities, their attributes, and the relationships between them. The key design decisions that I included while crafting the logical model </w:t>
+      </w:r>
+      <w:r>
+        <w:rPr>
+          <w:rFonts w:ascii="Times New Roman" w:hAnsi="Times New Roman" w:cs="Times New Roman"/>
+        </w:rPr>
+        <w:t>include</w:t>
+      </w:r>
+      <w:r>
+        <w:rPr>
+          <w:rFonts w:ascii="Times New Roman" w:hAnsi="Times New Roman" w:cs="Times New Roman"/>
+        </w:rPr>
+        <w:t xml:space="preserve">: </w:t>
       </w:r>
     </w:p>
     <w:p>
@@ -1670,7 +2055,6 @@
         <w:rPr>
           <w:rFonts w:ascii="Times New Roman" w:hAnsi="Times New Roman" w:cs="Times New Roman"/>
         </w:rPr>
-        <w:lastRenderedPageBreak/>
         <w:t>The Locations entity has a self-referencing relationship, enabling easy to establish and query hierarchical location structures where campground locations can be classified as children of state parks, national parks and other parent locations. This relationship is one-to-</w:t>
       </w:r>
       <w:r>
@@ -1689,7 +2073,19 @@
         <w:rPr>
           <w:rFonts w:ascii="Times New Roman" w:hAnsi="Times New Roman" w:cs="Times New Roman"/>
         </w:rPr>
-        <w:t xml:space="preserve">or may not have a parent or a child but a given parent location can be associate with many children locations. </w:t>
+        <w:t xml:space="preserve">or may not have a parent or a child but a given parent location can be </w:t>
+      </w:r>
+      <w:r>
+        <w:rPr>
+          <w:rFonts w:ascii="Times New Roman" w:hAnsi="Times New Roman" w:cs="Times New Roman"/>
+        </w:rPr>
+        <w:t>associated</w:t>
+      </w:r>
+      <w:r>
+        <w:rPr>
+          <w:rFonts w:ascii="Times New Roman" w:hAnsi="Times New Roman" w:cs="Times New Roman"/>
+        </w:rPr>
+        <w:t xml:space="preserve"> with many children locations. </w:t>
       </w:r>
     </w:p>
     <w:p>
@@ -1743,7 +2139,19 @@
         <w:rPr>
           <w:rFonts w:ascii="Times New Roman" w:hAnsi="Times New Roman" w:cs="Times New Roman"/>
         </w:rPr>
-        <w:t>Type tables for Websites, Addresses, and Media allow for deduplication of repeated type labels across hundreds of thousands of potential records, directly reducing data redundancy</w:t>
+        <w:t>Type tables for Websites, Addresses, and Media allow for deduplication of repeated type labels across</w:t>
+      </w:r>
+      <w:r>
+        <w:rPr>
+          <w:rFonts w:ascii="Times New Roman" w:hAnsi="Times New Roman" w:cs="Times New Roman"/>
+        </w:rPr>
+        <w:t xml:space="preserve"> potentially</w:t>
+      </w:r>
+      <w:r>
+        <w:rPr>
+          <w:rFonts w:ascii="Times New Roman" w:hAnsi="Times New Roman" w:cs="Times New Roman"/>
+        </w:rPr>
+        <w:t xml:space="preserve"> hundreds of thousands of potential records, directly reducing data redundancy</w:t>
       </w:r>
     </w:p>
     <w:p>
@@ -1761,7 +2169,21 @@
         <w:rPr>
           <w:rFonts w:ascii="Times New Roman" w:hAnsi="Times New Roman" w:cs="Times New Roman"/>
         </w:rPr>
-        <w:t xml:space="preserve">The Operating Hours Time table that associates to the Operating Hours entity stores individual day-level time records. This is more structured and queryable than storing a JSON column per day on the Operating Hours table directly. </w:t>
+        <w:t xml:space="preserve">The Operating </w:t>
+      </w:r>
+      <w:proofErr w:type="spellStart"/>
+      <w:r>
+        <w:rPr>
+          <w:rFonts w:ascii="Times New Roman" w:hAnsi="Times New Roman" w:cs="Times New Roman"/>
+        </w:rPr>
+        <w:t>Hours Time</w:t>
+      </w:r>
+      <w:proofErr w:type="spellEnd"/>
+      <w:r>
+        <w:rPr>
+          <w:rFonts w:ascii="Times New Roman" w:hAnsi="Times New Roman" w:cs="Times New Roman"/>
+        </w:rPr>
+        <w:t xml:space="preserve"> table that associates to the Operating Hours entity stores individual day-level time records. This is more structured and queryable than storing a JSON column per day on the Operating Hours table directly. </w:t>
       </w:r>
     </w:p>
     <w:p>
@@ -1774,6 +2196,7 @@
         <w:rPr>
           <w:noProof/>
         </w:rPr>
+        <w:lastRenderedPageBreak/>
         <w:drawing>
           <wp:inline distT="0" distB="0" distL="0" distR="0" wp14:anchorId="47336DFF" wp14:editId="2FDFEE1F">
             <wp:extent cx="5943600" cy="3634105"/>
@@ -1790,7 +2213,7 @@
                     <pic:cNvPicPr/>
                   </pic:nvPicPr>
                   <pic:blipFill>
-                    <a:blip r:embed="rId22"/>
+                    <a:blip r:embed="rId23"/>
                     <a:stretch>
                       <a:fillRect/>
                     </a:stretch>
@@ -1826,8 +2249,7 @@
           <w:sz w:val="20"/>
           <w:szCs w:val="20"/>
         </w:rPr>
-        <w:lastRenderedPageBreak/>
-        <w:t>Logical model of normalized DuckDB database schema created to transform data from sources into.</w:t>
+        <w:t>Logical model of normalized DuckDB database schema created to transform data from sources into</w:t>
       </w:r>
     </w:p>
     <w:p>
@@ -1863,7 +2285,51 @@
         <w:rPr>
           <w:rFonts w:ascii="Times New Roman" w:hAnsi="Times New Roman" w:cs="Times New Roman"/>
         </w:rPr>
-        <w:t>The generated relational model shows that all the relationships established in the logical model were at the most one-to-many, which does not generate any connecting or junction tables. Foreign keys and foreign key constraint classifiers are also visible within the relational ER Diagram. In all its glory, this relational model was used as the exact design to code up the normalized DuckDB DDL code.</w:t>
+        <w:t>The generated relational model shows that all the relationships established in the logical model were at the most one-to-many, which does not generate any connecting or junction tables. Foreign keys and foreign key constraint classifiers are also visible within the relational ER Diagram. In all its glory, this relational model was used as the exact design to code up the normalized DuckDB DDL cod</w:t>
+      </w:r>
+      <w:r>
+        <w:rPr>
+          <w:rFonts w:ascii="Times New Roman" w:hAnsi="Times New Roman" w:cs="Times New Roman"/>
+        </w:rPr>
+        <w:t xml:space="preserve">e that exists in the </w:t>
+      </w:r>
+      <w:r>
+        <w:rPr>
+          <w:rFonts w:ascii="Times New Roman" w:hAnsi="Times New Roman" w:cs="Times New Roman"/>
+          <w:b/>
+          <w:bCs/>
+        </w:rPr>
+        <w:t xml:space="preserve">DuckDB SQL Queries - Create Normalized </w:t>
+      </w:r>
+      <w:proofErr w:type="spellStart"/>
+      <w:r>
+        <w:rPr>
+          <w:rFonts w:ascii="Times New Roman" w:hAnsi="Times New Roman" w:cs="Times New Roman"/>
+          <w:b/>
+          <w:bCs/>
+        </w:rPr>
+        <w:t>Tables.sql</w:t>
+      </w:r>
+      <w:proofErr w:type="spellEnd"/>
+      <w:r>
+        <w:rPr>
+          <w:rFonts w:ascii="Times New Roman" w:hAnsi="Times New Roman" w:cs="Times New Roman"/>
+          <w:b/>
+          <w:bCs/>
+        </w:rPr>
+        <w:t xml:space="preserve"> </w:t>
+      </w:r>
+      <w:r>
+        <w:rPr>
+          <w:rFonts w:ascii="Times New Roman" w:hAnsi="Times New Roman" w:cs="Times New Roman"/>
+        </w:rPr>
+        <w:t>file within the GitHub repository that is referenced in this document</w:t>
+      </w:r>
+      <w:r>
+        <w:rPr>
+          <w:rFonts w:ascii="Times New Roman" w:hAnsi="Times New Roman" w:cs="Times New Roman"/>
+        </w:rPr>
+        <w:t>.</w:t>
       </w:r>
     </w:p>
     <w:p>
@@ -1876,6 +2342,7 @@
         <w:rPr>
           <w:noProof/>
         </w:rPr>
+        <w:lastRenderedPageBreak/>
         <w:drawing>
           <wp:inline distT="0" distB="0" distL="0" distR="0" wp14:anchorId="50C7F72B" wp14:editId="4D31F1D2">
             <wp:extent cx="5943600" cy="2984500"/>
@@ -1892,7 +2359,7 @@
                     <pic:cNvPicPr/>
                   </pic:nvPicPr>
                   <pic:blipFill>
-                    <a:blip r:embed="rId23"/>
+                    <a:blip r:embed="rId24"/>
                     <a:stretch>
                       <a:fillRect/>
                     </a:stretch>
@@ -2035,14 +2502,49 @@
         <w:rPr>
           <w:rFonts w:ascii="Times New Roman" w:hAnsi="Times New Roman" w:cs="Times New Roman"/>
         </w:rPr>
-        <w:t xml:space="preserve">The normalized schema created for this project addresses this by decomposing repeated data into type tables (WebsiteType, AddressType, and MediaType), separating contact information into dedicated entities and representing operating hours at a day-level granularity through the </w:t>
-      </w:r>
-      <w:r>
-        <w:rPr>
-          <w:rFonts w:ascii="Times New Roman" w:hAnsi="Times New Roman" w:cs="Times New Roman"/>
-        </w:rPr>
-        <w:lastRenderedPageBreak/>
-        <w:t xml:space="preserve">OperatingHoursTime child table. This design targets Third Normal Form (3NF), where each non-key attribute is functionally dependent only on the primary key and there are no transitive dependencies. </w:t>
+        <w:t>The normalized schema created for this project addresses this by decomposing repeated data into type tables (</w:t>
+      </w:r>
+      <w:proofErr w:type="spellStart"/>
+      <w:r>
+        <w:rPr>
+          <w:rFonts w:ascii="Times New Roman" w:hAnsi="Times New Roman" w:cs="Times New Roman"/>
+        </w:rPr>
+        <w:t>WebsiteType</w:t>
+      </w:r>
+      <w:proofErr w:type="spellEnd"/>
+      <w:r>
+        <w:rPr>
+          <w:rFonts w:ascii="Times New Roman" w:hAnsi="Times New Roman" w:cs="Times New Roman"/>
+        </w:rPr>
+        <w:t xml:space="preserve">, </w:t>
+      </w:r>
+      <w:proofErr w:type="spellStart"/>
+      <w:r>
+        <w:rPr>
+          <w:rFonts w:ascii="Times New Roman" w:hAnsi="Times New Roman" w:cs="Times New Roman"/>
+        </w:rPr>
+        <w:t>AddressType</w:t>
+      </w:r>
+      <w:proofErr w:type="spellEnd"/>
+      <w:r>
+        <w:rPr>
+          <w:rFonts w:ascii="Times New Roman" w:hAnsi="Times New Roman" w:cs="Times New Roman"/>
+        </w:rPr>
+        <w:t xml:space="preserve">, and MediaType), separating contact information into dedicated entities and representing operating hours at a day-level granularity through the </w:t>
+      </w:r>
+      <w:proofErr w:type="spellStart"/>
+      <w:r>
+        <w:rPr>
+          <w:rFonts w:ascii="Times New Roman" w:hAnsi="Times New Roman" w:cs="Times New Roman"/>
+        </w:rPr>
+        <w:t>OperatingHoursTime</w:t>
+      </w:r>
+      <w:proofErr w:type="spellEnd"/>
+      <w:r>
+        <w:rPr>
+          <w:rFonts w:ascii="Times New Roman" w:hAnsi="Times New Roman" w:cs="Times New Roman"/>
+        </w:rPr>
+        <w:t xml:space="preserve"> child table. This design targets Third Normal Form (3NF), where each non-key attribute is functionally dependent only on the primary key and there are no transitive dependencies. </w:t>
       </w:r>
     </w:p>
     <w:p>
@@ -2124,7 +2626,14 @@
         <w:rPr>
           <w:rFonts w:ascii="Times New Roman" w:hAnsi="Times New Roman" w:cs="Times New Roman"/>
         </w:rPr>
-        <w:t xml:space="preserve"> with 3NF it would be proper to ensure that the state information only exists in the address entity. However, this wasn’t done due to some data sources not having address information available (MN GIS data source for example)</w:t>
+        <w:t xml:space="preserve"> with 3NF it would be proper to </w:t>
+      </w:r>
+      <w:r>
+        <w:rPr>
+          <w:rFonts w:ascii="Times New Roman" w:hAnsi="Times New Roman" w:cs="Times New Roman"/>
+        </w:rPr>
+        <w:lastRenderedPageBreak/>
+        <w:t>ensure that the state information only exists in the address entity. However, this wasn’t done due to some data sources not having address information available (MN GIS data source for example)</w:t>
       </w:r>
       <w:r>
         <w:rPr>
@@ -2136,7 +2645,7 @@
         <w:rPr>
           <w:rFonts w:ascii="Times New Roman" w:hAnsi="Times New Roman" w:cs="Times New Roman"/>
         </w:rPr>
-        <w:t>but knowing where the data was found, that the state can be derived</w:t>
+        <w:t>but knowing where the data was found, the state can be derived</w:t>
       </w:r>
       <w:r>
         <w:rPr>
@@ -2148,7 +2657,49 @@
         <w:rPr>
           <w:rFonts w:ascii="Times New Roman" w:hAnsi="Times New Roman" w:cs="Times New Roman"/>
         </w:rPr>
-        <w:t xml:space="preserve">This highlights an important aspect of database creation and management. Normalization is good, but sometimes based on project and </w:t>
+        <w:t>This highlights an important aspect of database creation and management. Normalization is</w:t>
+      </w:r>
+      <w:r>
+        <w:rPr>
+          <w:rFonts w:ascii="Times New Roman" w:hAnsi="Times New Roman" w:cs="Times New Roman"/>
+        </w:rPr>
+        <w:t xml:space="preserve"> great</w:t>
+      </w:r>
+      <w:r>
+        <w:rPr>
+          <w:rFonts w:ascii="Times New Roman" w:hAnsi="Times New Roman" w:cs="Times New Roman"/>
+        </w:rPr>
+        <w:t xml:space="preserve">, </w:t>
+      </w:r>
+      <w:r>
+        <w:rPr>
+          <w:rFonts w:ascii="Times New Roman" w:hAnsi="Times New Roman" w:cs="Times New Roman"/>
+        </w:rPr>
+        <w:t>however,</w:t>
+      </w:r>
+      <w:r>
+        <w:rPr>
+          <w:rFonts w:ascii="Times New Roman" w:hAnsi="Times New Roman" w:cs="Times New Roman"/>
+        </w:rPr>
+        <w:t xml:space="preserve"> </w:t>
+      </w:r>
+      <w:r>
+        <w:rPr>
+          <w:rFonts w:ascii="Times New Roman" w:hAnsi="Times New Roman" w:cs="Times New Roman"/>
+        </w:rPr>
+        <w:t>sometimes based on</w:t>
+      </w:r>
+      <w:r>
+        <w:rPr>
+          <w:rFonts w:ascii="Times New Roman" w:hAnsi="Times New Roman" w:cs="Times New Roman"/>
+        </w:rPr>
+        <w:t xml:space="preserve"> the</w:t>
+      </w:r>
+      <w:r>
+        <w:rPr>
+          <w:rFonts w:ascii="Times New Roman" w:hAnsi="Times New Roman" w:cs="Times New Roman"/>
+        </w:rPr>
+        <w:t xml:space="preserve"> project and </w:t>
       </w:r>
       <w:r>
         <w:rPr>
@@ -2160,7 +2711,67 @@
         <w:rPr>
           <w:rFonts w:ascii="Times New Roman" w:hAnsi="Times New Roman" w:cs="Times New Roman"/>
         </w:rPr>
-        <w:t xml:space="preserve">, proper normalization may work against you. In this case if I followed through with proper normalization I would end up with nearly entirely empty address records within the addresses table resulting in wasted space and the need for complex queries to resolve what state locations are located in. </w:t>
+        <w:t>, proper normalization may work against you. In this case if I followed through with proper normalization I would</w:t>
+      </w:r>
+      <w:r>
+        <w:rPr>
+          <w:rFonts w:ascii="Times New Roman" w:hAnsi="Times New Roman" w:cs="Times New Roman"/>
+        </w:rPr>
+        <w:t xml:space="preserve"> have</w:t>
+      </w:r>
+      <w:r>
+        <w:rPr>
+          <w:rFonts w:ascii="Times New Roman" w:hAnsi="Times New Roman" w:cs="Times New Roman"/>
+        </w:rPr>
+        <w:t xml:space="preserve"> end</w:t>
+      </w:r>
+      <w:r>
+        <w:rPr>
+          <w:rFonts w:ascii="Times New Roman" w:hAnsi="Times New Roman" w:cs="Times New Roman"/>
+        </w:rPr>
+        <w:t>ed</w:t>
+      </w:r>
+      <w:r>
+        <w:rPr>
+          <w:rFonts w:ascii="Times New Roman" w:hAnsi="Times New Roman" w:cs="Times New Roman"/>
+        </w:rPr>
+        <w:t xml:space="preserve"> up with nearly entirely empty address records within the addresses table</w:t>
+      </w:r>
+      <w:r>
+        <w:rPr>
+          <w:rFonts w:ascii="Times New Roman" w:hAnsi="Times New Roman" w:cs="Times New Roman"/>
+        </w:rPr>
+        <w:t xml:space="preserve"> just to store state information about a given location which results in </w:t>
+      </w:r>
+      <w:r>
+        <w:rPr>
+          <w:rFonts w:ascii="Times New Roman" w:hAnsi="Times New Roman" w:cs="Times New Roman"/>
+        </w:rPr>
+        <w:t>wasted space and the need for</w:t>
+      </w:r>
+      <w:r>
+        <w:rPr>
+          <w:rFonts w:ascii="Times New Roman" w:hAnsi="Times New Roman" w:cs="Times New Roman"/>
+        </w:rPr>
+        <w:t xml:space="preserve"> more</w:t>
+      </w:r>
+      <w:r>
+        <w:rPr>
+          <w:rFonts w:ascii="Times New Roman" w:hAnsi="Times New Roman" w:cs="Times New Roman"/>
+        </w:rPr>
+        <w:t xml:space="preserve"> complex </w:t>
+      </w:r>
+      <w:r>
+        <w:rPr>
+          <w:rFonts w:ascii="Times New Roman" w:hAnsi="Times New Roman" w:cs="Times New Roman"/>
+        </w:rPr>
+        <w:t xml:space="preserve">JOIN table </w:t>
+      </w:r>
+      <w:r>
+        <w:rPr>
+          <w:rFonts w:ascii="Times New Roman" w:hAnsi="Times New Roman" w:cs="Times New Roman"/>
+        </w:rPr>
+        <w:t xml:space="preserve">queries to resolve what state locations are located in. </w:t>
       </w:r>
     </w:p>
     <w:p>
@@ -2225,7 +2836,7 @@
         </w:rPr>
         <w:lastRenderedPageBreak/>
         <w:drawing>
-          <wp:inline distT="0" distB="0" distL="0" distR="0" wp14:anchorId="42097084" wp14:editId="1883257E">
+          <wp:inline distT="0" distB="0" distL="0" distR="0" wp14:anchorId="42097084" wp14:editId="71E8E8B4">
             <wp:extent cx="2878372" cy="5392267"/>
             <wp:effectExtent l="0" t="0" r="0" b="0"/>
             <wp:docPr id="367684458" name="Picture 2"/>
@@ -2242,7 +2853,7 @@
                     </pic:cNvPicPr>
                   </pic:nvPicPr>
                   <pic:blipFill>
-                    <a:blip r:embed="rId24" cstate="print">
+                    <a:blip r:embed="rId25" cstate="print">
                       <a:extLst>
                         <a:ext uri="{28A0092B-C50C-407E-A947-70E740481C1C}">
                           <a14:useLocalDpi xmlns:a14="http://schemas.microsoft.com/office/drawing/2010/main" val="0"/>
@@ -2289,7 +2900,25 @@
           <w:sz w:val="20"/>
           <w:szCs w:val="20"/>
         </w:rPr>
-        <w:t xml:space="preserve">Normalized schema diagram generated in DBeaver DBMS from the “normalized” schema </w:t>
+        <w:t xml:space="preserve">Normalized schema diagram generated in </w:t>
+      </w:r>
+      <w:proofErr w:type="spellStart"/>
+      <w:r>
+        <w:rPr>
+          <w:rFonts w:ascii="Times New Roman" w:hAnsi="Times New Roman" w:cs="Times New Roman"/>
+          <w:sz w:val="20"/>
+          <w:szCs w:val="20"/>
+        </w:rPr>
+        <w:t>DBeaver</w:t>
+      </w:r>
+      <w:proofErr w:type="spellEnd"/>
+      <w:r>
+        <w:rPr>
+          <w:rFonts w:ascii="Times New Roman" w:hAnsi="Times New Roman" w:cs="Times New Roman"/>
+          <w:sz w:val="20"/>
+          <w:szCs w:val="20"/>
+        </w:rPr>
+        <w:t xml:space="preserve"> DBMS from the “normalized” schema </w:t>
       </w:r>
       <w:r>
         <w:rPr>
@@ -2411,14 +3040,50 @@
         <w:rPr>
           <w:rFonts w:ascii="Times New Roman" w:hAnsi="Times New Roman" w:cs="Times New Roman"/>
         </w:rPr>
-        <w:t xml:space="preserve">The final step was to transform the raw source data into the normalized schema. Rather than using Python for this step, individual SQL views were created within each source’s schema namespace. These views allowed me to reshape the data from its source into the structure that nearly mirrors the normalized tables that were created in the previous steps. These views were then used in conjunction with insert queries to move the data from each of the source </w:t>
+        <w:t xml:space="preserve">The final step was to transform the raw source data into the normalized schema. Rather than using Python for this step, individual SQL views were created within each source’s schema namespace. These views allowed me to reshape the data from its source into the structure that nearly mirrors the normalized tables that were created in the previous steps. These views were then used in conjunction with </w:t>
+      </w:r>
+      <w:r>
+        <w:rPr>
+          <w:rFonts w:ascii="Times New Roman" w:hAnsi="Times New Roman" w:cs="Times New Roman"/>
+        </w:rPr>
+        <w:t>INSERT</w:t>
+      </w:r>
+      <w:r>
+        <w:rPr>
+          <w:rFonts w:ascii="Times New Roman" w:hAnsi="Times New Roman" w:cs="Times New Roman"/>
+        </w:rPr>
+        <w:t xml:space="preserve"> queries to move the data from each of the source </w:t>
       </w:r>
       <w:r>
         <w:rPr>
           <w:rFonts w:ascii="Times New Roman" w:hAnsi="Times New Roman" w:cs="Times New Roman"/>
         </w:rPr>
         <w:lastRenderedPageBreak/>
-        <w:t xml:space="preserve">namespaces into the final normalized set of tables in a new namespace that I setup denoted as </w:t>
+        <w:t xml:space="preserve">namespaces into the final normalized set of tables in a new </w:t>
+      </w:r>
+      <w:r>
+        <w:rPr>
+          <w:rFonts w:ascii="Times New Roman" w:hAnsi="Times New Roman" w:cs="Times New Roman"/>
+        </w:rPr>
+        <w:t xml:space="preserve">SCHEMA </w:t>
+      </w:r>
+      <w:r>
+        <w:rPr>
+          <w:rFonts w:ascii="Times New Roman" w:hAnsi="Times New Roman" w:cs="Times New Roman"/>
+        </w:rPr>
+        <w:t xml:space="preserve">namespace that I </w:t>
+      </w:r>
+      <w:r>
+        <w:rPr>
+          <w:rFonts w:ascii="Times New Roman" w:hAnsi="Times New Roman" w:cs="Times New Roman"/>
+        </w:rPr>
+        <w:t xml:space="preserve">named </w:t>
+      </w:r>
+      <w:r>
+        <w:rPr>
+          <w:rFonts w:ascii="Times New Roman" w:hAnsi="Times New Roman" w:cs="Times New Roman"/>
+        </w:rPr>
+        <w:t xml:space="preserve">as </w:t>
       </w:r>
       <w:r>
         <w:rPr>
@@ -2464,7 +3129,19 @@
         <w:rPr>
           <w:rFonts w:ascii="Times New Roman" w:hAnsi="Times New Roman" w:cs="Times New Roman"/>
         </w:rPr>
-        <w:t xml:space="preserve"> huge SELECT statement in tow. These kinds of SQL queries from my professional and personal experience can cause confusion and worry when it comes time to change </w:t>
+        <w:t xml:space="preserve"> huge SELECT statement </w:t>
+      </w:r>
+      <w:r>
+        <w:rPr>
+          <w:rFonts w:ascii="Times New Roman" w:hAnsi="Times New Roman" w:cs="Times New Roman"/>
+        </w:rPr>
+        <w:t>that would be hard to debug</w:t>
+      </w:r>
+      <w:r>
+        <w:rPr>
+          <w:rFonts w:ascii="Times New Roman" w:hAnsi="Times New Roman" w:cs="Times New Roman"/>
+        </w:rPr>
+        <w:t xml:space="preserve">. These kinds of SQL queries from my professional and personal experience can cause confusion and worry when it comes time to change </w:t>
       </w:r>
       <w:r>
         <w:rPr>
@@ -2483,6 +3160,48 @@
           <w:rFonts w:ascii="Times New Roman" w:hAnsi="Times New Roman" w:cs="Times New Roman"/>
         </w:rPr>
         <w:t xml:space="preserve">To be transparent, about 40% of the SQL code in these files were generated by AI. </w:t>
+      </w:r>
+      <w:r>
+        <w:rPr>
+          <w:rFonts w:ascii="Times New Roman" w:hAnsi="Times New Roman" w:cs="Times New Roman"/>
+        </w:rPr>
+        <w:t xml:space="preserve">These files can be found within the </w:t>
+      </w:r>
+      <w:proofErr w:type="spellStart"/>
+      <w:r>
+        <w:rPr>
+          <w:rFonts w:ascii="Times New Roman" w:hAnsi="Times New Roman" w:cs="Times New Roman"/>
+          <w:b/>
+          <w:bCs/>
+        </w:rPr>
+        <w:t>duckdb</w:t>
+      </w:r>
+      <w:proofErr w:type="spellEnd"/>
+      <w:r>
+        <w:rPr>
+          <w:rFonts w:ascii="Times New Roman" w:hAnsi="Times New Roman" w:cs="Times New Roman"/>
+          <w:b/>
+          <w:bCs/>
+        </w:rPr>
+        <w:t>-ingestion/SQL Scripts</w:t>
+      </w:r>
+      <w:r>
+        <w:rPr>
+          <w:rFonts w:ascii="Times New Roman" w:hAnsi="Times New Roman" w:cs="Times New Roman"/>
+        </w:rPr>
+        <w:t xml:space="preserve"> directory within the </w:t>
+      </w:r>
+      <w:r>
+        <w:rPr>
+          <w:rFonts w:ascii="Times New Roman" w:hAnsi="Times New Roman" w:cs="Times New Roman"/>
+        </w:rPr>
+        <w:t>GitHub repository that is referenced in this document</w:t>
+      </w:r>
+      <w:r>
+        <w:rPr>
+          <w:rFonts w:ascii="Times New Roman" w:hAnsi="Times New Roman" w:cs="Times New Roman"/>
+        </w:rPr>
+        <w:t xml:space="preserve">.  </w:t>
       </w:r>
     </w:p>
     <w:p>
@@ -2515,7 +3234,7 @@
                     </pic:cNvPicPr>
                   </pic:nvPicPr>
                   <pic:blipFill>
-                    <a:blip r:embed="rId25" cstate="print">
+                    <a:blip r:embed="rId26" cstate="print">
                       <a:extLst>
                         <a:ext uri="{28A0092B-C50C-407E-A947-70E740481C1C}">
                           <a14:useLocalDpi xmlns:a14="http://schemas.microsoft.com/office/drawing/2010/main" val="0"/>
@@ -2586,6 +3305,7 @@
           <w:sz w:val="28"/>
           <w:szCs w:val="28"/>
         </w:rPr>
+        <w:lastRenderedPageBreak/>
         <w:t>Queries</w:t>
       </w:r>
     </w:p>
@@ -2635,7 +3355,6 @@
         <w:rPr>
           <w:rFonts w:ascii="Times New Roman" w:hAnsi="Times New Roman" w:cs="Times New Roman"/>
         </w:rPr>
-        <w:lastRenderedPageBreak/>
         <w:t xml:space="preserve">Textbook Reference: </w:t>
       </w:r>
       <w:r>
@@ -2691,7 +3410,15 @@
     </w:p>
     <w:p>
       <w:r>
-        <w:t xml:space="preserve">The Locations table was designed with a  self-referencing parent_location_key foreign key, which creates a natural hierarchy where locations like campgrounds can be nested under a parent location such as a state park or state forest. </w:t>
+        <w:t xml:space="preserve">The Locations table was designed with a  self-referencing </w:t>
+      </w:r>
+      <w:proofErr w:type="spellStart"/>
+      <w:r>
+        <w:t>parent_location_key</w:t>
+      </w:r>
+      <w:proofErr w:type="spellEnd"/>
+      <w:r>
+        <w:t xml:space="preserve"> foreign key, which creates a natural hierarchy where locations like campgrounds can be nested under a parent location such as a state park or state forest. </w:t>
       </w:r>
     </w:p>
     <w:p>
@@ -2730,7 +3457,15 @@
     </w:p>
     <w:p>
       <w:r>
-        <w:t>TODO: mention the geospatial duckdb plugin along with showing a query that I created to find all locations within a given distance of a coordinate pair (using St. Thomas coordinate pair for example and create queries that query my data to pull up locations that are 10, 20, and 50 miles within the St. Thomas coordinate)</w:t>
+        <w:t xml:space="preserve">TODO: mention the geospatial </w:t>
+      </w:r>
+      <w:proofErr w:type="spellStart"/>
+      <w:r>
+        <w:t>duckdb</w:t>
+      </w:r>
+      <w:proofErr w:type="spellEnd"/>
+      <w:r>
+        <w:t xml:space="preserve"> plugin along with showing a query that I created to find all locations within a given distance of a coordinate pair (using St. Thomas coordinate pair for example and create queries that query my data to pull up locations that are 10, 20, and 50 miles within the St. Thomas coordinate)</w:t>
       </w:r>
     </w:p>
     <w:p>
@@ -2939,6 +3674,7 @@
           <w:sz w:val="28"/>
           <w:szCs w:val="28"/>
         </w:rPr>
+        <w:lastRenderedPageBreak/>
         <w:t>ACID Compliance</w:t>
       </w:r>
     </w:p>
@@ -3006,7 +3742,6 @@
           <w:sz w:val="32"/>
           <w:szCs w:val="32"/>
         </w:rPr>
-        <w:lastRenderedPageBreak/>
         <w:t>Discovering</w:t>
       </w:r>
     </w:p>
@@ -3070,7 +3805,43 @@
         <w:rPr>
           <w:rFonts w:ascii="Times New Roman" w:hAnsi="Times New Roman" w:cs="Times New Roman"/>
         </w:rPr>
-        <w:t>A third concept that I was able to develop throughout this project was the ability to structure an ER diagram and code it into actual SQL without relying on AI or the Data Modeler tool to generate it for me. There were limitations within DuckDB that I had to overcome, such as the absence of a out of box solution for an auto incrementing primary key constraint and the lack of trigger support – both in which exist in other database systems such as Oracle and Microsoft SQL. These</w:t>
+        <w:t>A third concept that I was able to develop throughout this project was the ability to structure an ER diagram and code it into actual SQL without relying on AI or the Data Modeler tool to generate it for me. There were limitations within DuckDB that I had to overcome, such as the absence of a</w:t>
+      </w:r>
+      <w:r>
+        <w:rPr>
+          <w:rFonts w:ascii="Times New Roman" w:hAnsi="Times New Roman" w:cs="Times New Roman"/>
+        </w:rPr>
+        <w:t>n</w:t>
+      </w:r>
+      <w:r>
+        <w:rPr>
+          <w:rFonts w:ascii="Times New Roman" w:hAnsi="Times New Roman" w:cs="Times New Roman"/>
+        </w:rPr>
+        <w:t xml:space="preserve"> out</w:t>
+      </w:r>
+      <w:r>
+        <w:rPr>
+          <w:rFonts w:ascii="Times New Roman" w:hAnsi="Times New Roman" w:cs="Times New Roman"/>
+        </w:rPr>
+        <w:t>-</w:t>
+      </w:r>
+      <w:r>
+        <w:rPr>
+          <w:rFonts w:ascii="Times New Roman" w:hAnsi="Times New Roman" w:cs="Times New Roman"/>
+        </w:rPr>
+        <w:t>of</w:t>
+      </w:r>
+      <w:r>
+        <w:rPr>
+          <w:rFonts w:ascii="Times New Roman" w:hAnsi="Times New Roman" w:cs="Times New Roman"/>
+        </w:rPr>
+        <w:t>-the-box</w:t>
+      </w:r>
+      <w:r>
+        <w:rPr>
+          <w:rFonts w:ascii="Times New Roman" w:hAnsi="Times New Roman" w:cs="Times New Roman"/>
+        </w:rPr>
+        <w:t xml:space="preserve"> solution for an auto incrementing primary key constraint and the lack of trigger support – both in which exist in other database systems such as Oracle and Microsoft SQL. These</w:t>
       </w:r>
       <w:r>
         <w:rPr>
@@ -3153,6 +3924,7 @@
           <w:rFonts w:ascii="Times New Roman" w:eastAsia="Arial" w:hAnsi="Times New Roman" w:cs="Times New Roman"/>
           <w:color w:val="1A1A1A"/>
         </w:rPr>
+        <w:lastRenderedPageBreak/>
         <w:t xml:space="preserve">Second, it was difficult to properly assign locations </w:t>
       </w:r>
       <w:r>
@@ -3195,21 +3967,34 @@
           <w:rFonts w:ascii="Times New Roman" w:eastAsia="Arial" w:hAnsi="Times New Roman" w:cs="Times New Roman"/>
           <w:color w:val="1A1A1A"/>
         </w:rPr>
-        <w:t xml:space="preserve"> map. For instance, NPS campground data is well-structured enough to allow campgrounds to be assigned as children of their parent national park. The same was not as straightforward with Google Places or MN GIS data.</w:t>
-      </w:r>
-    </w:p>
-    <w:p>
-      <w:pPr>
-        <w:rPr>
-          <w:rFonts w:ascii="Times New Roman" w:hAnsi="Times New Roman" w:cs="Times New Roman"/>
-        </w:rPr>
-      </w:pPr>
-      <w:r>
-        <w:rPr>
-          <w:rFonts w:ascii="Times New Roman" w:eastAsia="Arial" w:hAnsi="Times New Roman" w:cs="Times New Roman"/>
-          <w:color w:val="1A1A1A"/>
-        </w:rPr>
-        <w:lastRenderedPageBreak/>
+        <w:t xml:space="preserve"> map. For instance, NPS campground data is well-structured enough to allow campgrounds to be assigned as children of their parent national park</w:t>
+      </w:r>
+      <w:r>
+        <w:rPr>
+          <w:rFonts w:ascii="Times New Roman" w:eastAsia="Arial" w:hAnsi="Times New Roman" w:cs="Times New Roman"/>
+          <w:color w:val="1A1A1A"/>
+        </w:rPr>
+        <w:t xml:space="preserve"> locations</w:t>
+      </w:r>
+      <w:r>
+        <w:rPr>
+          <w:rFonts w:ascii="Times New Roman" w:eastAsia="Arial" w:hAnsi="Times New Roman" w:cs="Times New Roman"/>
+          <w:color w:val="1A1A1A"/>
+        </w:rPr>
+        <w:t>. The same was not as straightforward with Google Places or MN GIS data.</w:t>
+      </w:r>
+    </w:p>
+    <w:p>
+      <w:pPr>
+        <w:rPr>
+          <w:rFonts w:ascii="Times New Roman" w:hAnsi="Times New Roman" w:cs="Times New Roman"/>
+        </w:rPr>
+      </w:pPr>
+      <w:r>
+        <w:rPr>
+          <w:rFonts w:ascii="Times New Roman" w:eastAsia="Arial" w:hAnsi="Times New Roman" w:cs="Times New Roman"/>
+          <w:color w:val="1A1A1A"/>
+        </w:rPr>
         <w:t xml:space="preserve">Third, the non-completion of the optimistic goal — migrating data to PostgreSQL and building the API and frontend layers — was due to the minimum viable project turning out to be more involved than originally </w:t>
       </w:r>
       <w:r>
@@ -3231,7 +4016,21 @@
           <w:rFonts w:ascii="Times New Roman" w:eastAsia="Arial" w:hAnsi="Times New Roman" w:cs="Times New Roman"/>
           <w:color w:val="1A1A1A"/>
         </w:rPr>
-        <w:t xml:space="preserve">scripts with views and insert queries took additional time to complete. </w:t>
+        <w:t xml:space="preserve">scripts with views and </w:t>
+      </w:r>
+      <w:r>
+        <w:rPr>
+          <w:rFonts w:ascii="Times New Roman" w:eastAsia="Arial" w:hAnsi="Times New Roman" w:cs="Times New Roman"/>
+          <w:color w:val="1A1A1A"/>
+        </w:rPr>
+        <w:t>INSERT</w:t>
+      </w:r>
+      <w:r>
+        <w:rPr>
+          <w:rFonts w:ascii="Times New Roman" w:eastAsia="Arial" w:hAnsi="Times New Roman" w:cs="Times New Roman"/>
+          <w:color w:val="1A1A1A"/>
+        </w:rPr>
+        <w:t xml:space="preserve"> queries took additional time to complete. </w:t>
       </w:r>
     </w:p>
     <w:p>
@@ -3447,7 +4246,15 @@
           <w:rFonts w:ascii="Times New Roman" w:eastAsia="Arial" w:hAnsi="Times New Roman" w:cs="Times New Roman"/>
           <w:color w:val="1A1A1A"/>
         </w:rPr>
-        <w:t>: Most data collected for this project comes from state and federal government websites, which are generally considered publicly available. However, before publishing this project or its data publicly, I would need to confirm that the specific datasets used can be legally redistributed on a personal</w:t>
+        <w:t xml:space="preserve">: Most data collected for this project comes from state and federal government websites, which are generally considered publicly available. However, before publishing this project or its data publicly, I would need to confirm that </w:t>
+      </w:r>
+      <w:r>
+        <w:rPr>
+          <w:rFonts w:ascii="Times New Roman" w:eastAsia="Arial" w:hAnsi="Times New Roman" w:cs="Times New Roman"/>
+          <w:color w:val="1A1A1A"/>
+        </w:rPr>
+        <w:lastRenderedPageBreak/>
+        <w:t>the specific datasets used can be legally redistributed on a personal</w:t>
       </w:r>
       <w:r>
         <w:rPr>
@@ -3462,6 +4269,13 @@
           <w:color w:val="1A1A1A"/>
         </w:rPr>
         <w:t xml:space="preserve"> website, particularly the Google Places API data, which has specific terms of service around caching and redistribution.</w:t>
+      </w:r>
+      <w:r>
+        <w:rPr>
+          <w:rFonts w:ascii="Times New Roman" w:eastAsia="Arial" w:hAnsi="Times New Roman" w:cs="Times New Roman"/>
+          <w:color w:val="1A1A1A"/>
+        </w:rPr>
+        <w:t xml:space="preserve"> Especially around the photos users publish on their platform.</w:t>
       </w:r>
     </w:p>
     <w:p>
@@ -3505,15 +4319,7 @@
           <w:rFonts w:ascii="Times New Roman" w:eastAsia="Arial" w:hAnsi="Times New Roman" w:cs="Times New Roman"/>
           <w:color w:val="1A1A1A"/>
         </w:rPr>
-        <w:t xml:space="preserve">, I cannot guarantee that the information </w:t>
-      </w:r>
-      <w:r>
-        <w:rPr>
-          <w:rFonts w:ascii="Times New Roman" w:eastAsia="Arial" w:hAnsi="Times New Roman" w:cs="Times New Roman"/>
-          <w:color w:val="1A1A1A"/>
-        </w:rPr>
-        <w:lastRenderedPageBreak/>
-        <w:t>remains accurate over time. Any published version of the Explore More</w:t>
+        <w:t>, I cannot guarantee that the information remains accurate over time. Any published version of the Explore More</w:t>
       </w:r>
       <w:r>
         <w:rPr>
@@ -3665,6 +4471,12 @@
         </w:rPr>
         <w:t xml:space="preserve"> the foundation that has been built is one I’m proud of and plan to continue working on after the conclusion of this class. Working through this project has reinforced that building something meaningful with data requires more than just knowing the SQL or Python syntax. Rather it requires understanding the concepts well enough to make deliberate design decisions, like choosing how to model a self-referencing hierarchy, identification of different entities and the relationships between them, when to use a view versus a Python script or how to structure a transaction so that failures are recoverable. DuckDB proved to be an interesting and powerful tool for this kind of data management and transformation project, and this project gave me a real-world context to apply nearly everything covered in this course. Ultimately, what started as a side project I wanted to build for myself – a better way to access information about Minnesota’s parks, forests and campgrounds – has become something I now have a much stronger foundation to continue working on and eventually finish.</w:t>
       </w:r>
+      <w:r>
+        <w:rPr>
+          <w:rFonts w:ascii="Times New Roman" w:hAnsi="Times New Roman" w:cs="Times New Roman"/>
+        </w:rPr>
+        <w:t xml:space="preserve"> Thank you for reading. </w:t>
+      </w:r>
     </w:p>
     <w:p>
       <w:pPr>
@@ -3678,7 +4490,7 @@
       </w:pPr>
     </w:p>
     <w:sectPr>
-      <w:headerReference w:type="default" r:id="rId26"/>
+      <w:headerReference w:type="default" r:id="rId27"/>
       <w:pgSz w:w="12240" w:h="15840"/>
       <w:pgMar w:top="1440" w:right="1440" w:bottom="1440" w:left="1440" w:header="720" w:footer="720" w:gutter="0"/>
       <w:cols w:space="720"/>
@@ -5852,7 +6664,7 @@
   <w:style w:type="paragraph" w:default="1" w:styleId="Normal">
     <w:name w:val="Normal"/>
     <w:qFormat/>
-    <w:rsid w:val="00F62FD8"/>
+    <w:rsid w:val="00C47237"/>
   </w:style>
   <w:style w:type="paragraph" w:styleId="Heading1">
     <w:name w:val="heading 1"/>

</xml_diff>

<commit_message>
final assignment part 4 paper done for now, normalized queries script done, and migrate data to postgresql script updated to send views from duckdb to postgres.
Co-authored-by: Copilot <copilot@github.com>
</commit_message>
<xml_diff>
--- a/GIS-Data-Migration-Project/Assignment Documents/Final Project - Part 2 - Final Project Rough Draft.docx
+++ b/GIS-Data-Migration-Project/Assignment Documents/Final Project - Part 2 - Final Project Rough Draft.docx
@@ -155,7 +155,15 @@
           <w:rFonts w:ascii="Times New Roman" w:eastAsia="Arial" w:hAnsi="Times New Roman" w:cs="Times New Roman"/>
           <w:color w:val="1A1A1A"/>
         </w:rPr>
-        <w:t>From my description for this project, one can assume that the sky is the limit… and it is! I have ambitious plans for this project that I’ll continue working on</w:t>
+        <w:t xml:space="preserve">From my description for this project, one can assume that the sky is the limit… and it is! I have ambitious plans for this project that I’ll continue working </w:t>
+      </w:r>
+      <w:proofErr w:type="gramStart"/>
+      <w:r>
+        <w:rPr>
+          <w:rFonts w:ascii="Times New Roman" w:eastAsia="Arial" w:hAnsi="Times New Roman" w:cs="Times New Roman"/>
+          <w:color w:val="1A1A1A"/>
+        </w:rPr>
+        <w:t>on</w:t>
       </w:r>
       <w:r>
         <w:rPr>
@@ -164,6 +172,7 @@
         </w:rPr>
         <w:t xml:space="preserve"> it</w:t>
       </w:r>
+      <w:proofErr w:type="gramEnd"/>
       <w:r>
         <w:rPr>
           <w:rFonts w:ascii="Times New Roman" w:eastAsia="Arial" w:hAnsi="Times New Roman" w:cs="Times New Roman"/>
@@ -207,14 +216,46 @@
           <w:rFonts w:ascii="Times New Roman" w:eastAsia="Arial" w:hAnsi="Times New Roman" w:cs="Times New Roman"/>
           <w:color w:val="1A1A1A"/>
         </w:rPr>
-        <w:t xml:space="preserve">For my minimal goals within this project, I focused on developing just the data layer for my explore more project. Specifically, I wanted to focus on how I would collect and manage data from multiple sources and learn how to properly transform the data into one normalized source. The technologies that I chose to work with include Python for scripting and DuckDB for managing the data. The outcome goal is to have </w:t>
-      </w:r>
-      <w:r>
-        <w:rPr>
-          <w:rFonts w:ascii="Times New Roman" w:eastAsia="Arial" w:hAnsi="Times New Roman" w:cs="Times New Roman"/>
-          <w:color w:val="1A1A1A"/>
-        </w:rPr>
-        <w:t xml:space="preserve">a set of Python and SQL scripts that would successfully allow me to import and transform data from multiple sources into one normalized database schema. Specifically, data that represents </w:t>
+        <w:t xml:space="preserve">For my minimal goals within this project, I focused on developing just the data layer for </w:t>
+      </w:r>
+      <w:proofErr w:type="gramStart"/>
+      <w:r>
+        <w:rPr>
+          <w:rFonts w:ascii="Times New Roman" w:eastAsia="Arial" w:hAnsi="Times New Roman" w:cs="Times New Roman"/>
+          <w:color w:val="1A1A1A"/>
+        </w:rPr>
+        <w:t>my</w:t>
+      </w:r>
+      <w:proofErr w:type="gramEnd"/>
+      <w:r>
+        <w:rPr>
+          <w:rFonts w:ascii="Times New Roman" w:eastAsia="Arial" w:hAnsi="Times New Roman" w:cs="Times New Roman"/>
+          <w:color w:val="1A1A1A"/>
+        </w:rPr>
+        <w:t xml:space="preserve"> explore more project. Specifically, I wanted to focus on how I would collect and manage data from multiple sources and learn how to properly transform the data into one normalized source. The technologies that I chose to work with include Python for scripting and DuckDB for managing the data. The outcome goal is to have </w:t>
+      </w:r>
+      <w:r>
+        <w:rPr>
+          <w:rFonts w:ascii="Times New Roman" w:eastAsia="Arial" w:hAnsi="Times New Roman" w:cs="Times New Roman"/>
+          <w:color w:val="1A1A1A"/>
+        </w:rPr>
+        <w:t xml:space="preserve">a set of Python and SQL scripts that would successfully allow me to import and transform data from multiple sources into one normalized database schema. Specifically, </w:t>
+      </w:r>
+      <w:proofErr w:type="gramStart"/>
+      <w:r>
+        <w:rPr>
+          <w:rFonts w:ascii="Times New Roman" w:eastAsia="Arial" w:hAnsi="Times New Roman" w:cs="Times New Roman"/>
+          <w:color w:val="1A1A1A"/>
+        </w:rPr>
+        <w:t>data that</w:t>
+      </w:r>
+      <w:proofErr w:type="gramEnd"/>
+      <w:r>
+        <w:rPr>
+          <w:rFonts w:ascii="Times New Roman" w:eastAsia="Arial" w:hAnsi="Times New Roman" w:cs="Times New Roman"/>
+          <w:color w:val="1A1A1A"/>
+        </w:rPr>
+        <w:t xml:space="preserve"> represents </w:t>
       </w:r>
       <w:r>
         <w:rPr>
@@ -295,23 +336,23 @@
           <w:rFonts w:ascii="Times New Roman" w:eastAsia="Arial" w:hAnsi="Times New Roman" w:cs="Times New Roman"/>
           <w:color w:val="1A1A1A"/>
         </w:rPr>
-        <w:t xml:space="preserve">My optimistic goal for this project is to build on top of my minimal goals by creating a mini demo web application where the DuckDB data is migrated into a PostgreSQL database with the </w:t>
-      </w:r>
-      <w:proofErr w:type="spellStart"/>
-      <w:r>
-        <w:rPr>
-          <w:rFonts w:ascii="Times New Roman" w:eastAsia="Arial" w:hAnsi="Times New Roman" w:cs="Times New Roman"/>
-          <w:color w:val="1A1A1A"/>
-        </w:rPr>
-        <w:t>PostGIS</w:t>
-      </w:r>
-      <w:proofErr w:type="spellEnd"/>
-      <w:r>
-        <w:rPr>
-          <w:rFonts w:ascii="Times New Roman" w:eastAsia="Arial" w:hAnsi="Times New Roman" w:cs="Times New Roman"/>
-          <w:color w:val="1A1A1A"/>
-        </w:rPr>
-        <w:t xml:space="preserve"> extension for geospatial data installed. The front end would utilize React as a mapping UI with a similar feel to Google Maps. The backend would be a simple Django/Python API layer that would serve the data from the database to the frontend, following the pattern that we discussed in class where data doesn’t travel directly from the database to the client</w:t>
+        <w:t xml:space="preserve">My optimistic goal for this project is to build on top of my minimal goals by creating a mini demo web application where the DuckDB data is migrated into a PostgreSQL database with the PostGIS extension for geospatial data installed. The front end would utilize React as a mapping UI with a similar feel to Google Maps. The backend would be a simple Django/Python API layer that would serve the data from the database to the </w:t>
+      </w:r>
+      <w:proofErr w:type="gramStart"/>
+      <w:r>
+        <w:rPr>
+          <w:rFonts w:ascii="Times New Roman" w:eastAsia="Arial" w:hAnsi="Times New Roman" w:cs="Times New Roman"/>
+          <w:color w:val="1A1A1A"/>
+        </w:rPr>
+        <w:t>frontend</w:t>
+      </w:r>
+      <w:proofErr w:type="gramEnd"/>
+      <w:r>
+        <w:rPr>
+          <w:rFonts w:ascii="Times New Roman" w:eastAsia="Arial" w:hAnsi="Times New Roman" w:cs="Times New Roman"/>
+          <w:color w:val="1A1A1A"/>
+        </w:rPr>
+        <w:t>, following the pattern that we discussed in class where data doesn’t travel directly from the database to the client</w:t>
       </w:r>
       <w:r>
         <w:rPr>
@@ -530,7 +571,23 @@
           <w:rFonts w:ascii="Times New Roman" w:eastAsia="Arial" w:hAnsi="Times New Roman" w:cs="Times New Roman"/>
           <w:color w:val="1A1A1A"/>
         </w:rPr>
-        <w:t xml:space="preserve"> application that would allow users to journal and log which Disney experiences, restaurants and shows they have experienced on their visit. I would find this extremely useful for my nearly </w:t>
+        <w:t xml:space="preserve"> application that would allow users to journal and </w:t>
+      </w:r>
+      <w:proofErr w:type="gramStart"/>
+      <w:r>
+        <w:rPr>
+          <w:rFonts w:ascii="Times New Roman" w:eastAsia="Arial" w:hAnsi="Times New Roman" w:cs="Times New Roman"/>
+          <w:color w:val="1A1A1A"/>
+        </w:rPr>
+        <w:t>log</w:t>
+      </w:r>
+      <w:proofErr w:type="gramEnd"/>
+      <w:r>
+        <w:rPr>
+          <w:rFonts w:ascii="Times New Roman" w:eastAsia="Arial" w:hAnsi="Times New Roman" w:cs="Times New Roman"/>
+          <w:color w:val="1A1A1A"/>
+        </w:rPr>
+        <w:t xml:space="preserve"> which Disney experiences, restaurants and shows they have experienced on their visit. I would find this extremely useful for my nearly </w:t>
       </w:r>
       <w:r>
         <w:rPr>
@@ -565,7 +622,23 @@
           <w:rFonts w:ascii="Times New Roman" w:eastAsia="Arial" w:hAnsi="Times New Roman" w:cs="Times New Roman"/>
           <w:color w:val="1A1A1A"/>
         </w:rPr>
-        <w:t>Build the data layer for a developer documentation tool that would allow developers to describe and understand their database schemas across different database platforms (Oracle, Microsoft SQL, SQLite, etc.), similar to how column comments work in PostgreSQL but more universal.</w:t>
+        <w:t xml:space="preserve">Build the data layer for a developer documentation tool that would allow developers to describe and understand their database schemas across different database platforms (Oracle, Microsoft SQL, SQLite, etc.), </w:t>
+      </w:r>
+      <w:proofErr w:type="gramStart"/>
+      <w:r>
+        <w:rPr>
+          <w:rFonts w:ascii="Times New Roman" w:eastAsia="Arial" w:hAnsi="Times New Roman" w:cs="Times New Roman"/>
+          <w:color w:val="1A1A1A"/>
+        </w:rPr>
+        <w:t>similar to</w:t>
+      </w:r>
+      <w:proofErr w:type="gramEnd"/>
+      <w:r>
+        <w:rPr>
+          <w:rFonts w:ascii="Times New Roman" w:eastAsia="Arial" w:hAnsi="Times New Roman" w:cs="Times New Roman"/>
+          <w:color w:val="1A1A1A"/>
+        </w:rPr>
+        <w:t xml:space="preserve"> how column comments work in PostgreSQL but more universal.</w:t>
       </w:r>
       <w:r>
         <w:rPr>
@@ -600,7 +673,23 @@
           <w:rFonts w:ascii="Times New Roman" w:eastAsia="Arial" w:hAnsi="Times New Roman" w:cs="Times New Roman"/>
           <w:color w:val="1A1A1A"/>
         </w:rPr>
-        <w:t xml:space="preserve"> similar to how bank branches are managed by a regional hub which in turn can be managed by a parent bank branch.</w:t>
+        <w:t xml:space="preserve"> </w:t>
+      </w:r>
+      <w:proofErr w:type="gramStart"/>
+      <w:r>
+        <w:rPr>
+          <w:rFonts w:ascii="Times New Roman" w:eastAsia="Arial" w:hAnsi="Times New Roman" w:cs="Times New Roman"/>
+          <w:color w:val="1A1A1A"/>
+        </w:rPr>
+        <w:t>similar to</w:t>
+      </w:r>
+      <w:proofErr w:type="gramEnd"/>
+      <w:r>
+        <w:rPr>
+          <w:rFonts w:ascii="Times New Roman" w:eastAsia="Arial" w:hAnsi="Times New Roman" w:cs="Times New Roman"/>
+          <w:color w:val="1A1A1A"/>
+        </w:rPr>
+        <w:t xml:space="preserve"> how bank branches are managed by a regional hub which in turn can be managed by a parent bank branch.</w:t>
       </w:r>
     </w:p>
     <w:p>
@@ -694,134 +783,77 @@
           <w:rFonts w:ascii="Times New Roman" w:eastAsia="Arial" w:hAnsi="Times New Roman" w:cs="Times New Roman"/>
           <w:color w:val="1A1A1A"/>
         </w:rPr>
-        <w:t>while researching and deciding on a topic was influenced by personal experiences as well as with conversations with colleagues at work, family and friends who share similar and conflicting experiences. I ultimately decided on the Explore More project due to learning in some of the articles noted below how organizations like Salesforce have issues with properly transforming data out of one system into another successfully. Other research focused on my interest in Geospatial data management in different databases and how DuckDB and PostgreSQL are different and solve different user requirements.</w:t>
-      </w:r>
-    </w:p>
-    <w:p>
-      <w:pPr>
-        <w:pStyle w:val="ListParagraph"/>
-        <w:numPr>
-          <w:ilvl w:val="0"/>
-          <w:numId w:val="12"/>
-        </w:numPr>
-        <w:spacing w:after="100" w:line="240" w:lineRule="auto"/>
-        <w:rPr>
-          <w:rFonts w:ascii="Times New Roman" w:hAnsi="Times New Roman" w:cs="Times New Roman"/>
-        </w:rPr>
-      </w:pPr>
-      <w:r>
-        <w:rPr>
-          <w:rFonts w:ascii="Times New Roman" w:eastAsia="Arial" w:hAnsi="Times New Roman" w:cs="Times New Roman"/>
-          <w:color w:val="1A1A1A"/>
-        </w:rPr>
-        <w:t xml:space="preserve">Data migration pitfalls when moving between systems: </w:t>
-      </w:r>
-      <w:hyperlink r:id="rId7" w:history="1">
-        <w:r>
-          <w:rPr>
-            <w:rFonts w:ascii="Times New Roman" w:eastAsia="Arial" w:hAnsi="Times New Roman" w:cs="Times New Roman"/>
-            <w:color w:val="0563C1"/>
-            <w:u w:val="single"/>
-          </w:rPr>
-          <w:t>salesforceben.com</w:t>
-        </w:r>
-      </w:hyperlink>
-      <w:r>
-        <w:rPr>
-          <w:rFonts w:ascii="Times New Roman" w:eastAsia="Arial" w:hAnsi="Times New Roman" w:cs="Times New Roman"/>
-          <w:color w:val="1A1A1A"/>
-        </w:rPr>
-        <w:t xml:space="preserve"> and </w:t>
-      </w:r>
-      <w:hyperlink r:id="rId8" w:history="1">
-        <w:r>
-          <w:rPr>
-            <w:rFonts w:ascii="Times New Roman" w:eastAsia="Arial" w:hAnsi="Times New Roman" w:cs="Times New Roman"/>
-            <w:color w:val="0563C1"/>
-            <w:u w:val="single"/>
-          </w:rPr>
-          <w:t>minusculetechnologies.com</w:t>
-        </w:r>
-      </w:hyperlink>
-    </w:p>
-    <w:p>
-      <w:pPr>
-        <w:pStyle w:val="ListParagraph"/>
-        <w:numPr>
-          <w:ilvl w:val="0"/>
-          <w:numId w:val="11"/>
-        </w:numPr>
-        <w:spacing w:after="100" w:line="240" w:lineRule="auto"/>
-        <w:contextualSpacing w:val="0"/>
-        <w:rPr>
-          <w:rFonts w:ascii="Times New Roman" w:hAnsi="Times New Roman" w:cs="Times New Roman"/>
-        </w:rPr>
-      </w:pPr>
-      <w:r>
-        <w:rPr>
-          <w:rFonts w:ascii="Times New Roman" w:eastAsia="Arial" w:hAnsi="Times New Roman" w:cs="Times New Roman"/>
-          <w:color w:val="1A1A1A"/>
-        </w:rPr>
-        <w:t xml:space="preserve">DuckDB vs. PostgreSQL use cases: </w:t>
-      </w:r>
-      <w:hyperlink r:id="rId9" w:history="1">
-        <w:r>
-          <w:rPr>
-            <w:rFonts w:ascii="Times New Roman" w:eastAsia="Arial" w:hAnsi="Times New Roman" w:cs="Times New Roman"/>
-            <w:color w:val="0563C1"/>
-            <w:u w:val="single"/>
-          </w:rPr>
-          <w:t>digitalogy.co</w:t>
-        </w:r>
-      </w:hyperlink>
-      <w:r>
-        <w:rPr>
-          <w:rFonts w:ascii="Times New Roman" w:eastAsia="Arial" w:hAnsi="Times New Roman" w:cs="Times New Roman"/>
-          <w:color w:val="1A1A1A"/>
+        <w:t xml:space="preserve">while researching and deciding on a topic was influenced by personal experiences as well as with conversations with colleagues at work, family and friends who share similar and conflicting experiences. I ultimately decided on the Explore More project due to learning in </w:t>
+      </w:r>
+      <w:r>
+        <w:rPr>
+          <w:rFonts w:ascii="Times New Roman" w:eastAsia="Arial" w:hAnsi="Times New Roman" w:cs="Times New Roman"/>
+          <w:color w:val="1A1A1A"/>
+        </w:rPr>
+        <w:t>a couple</w:t>
+      </w:r>
+      <w:r>
+        <w:rPr>
+          <w:rFonts w:ascii="Times New Roman" w:eastAsia="Arial" w:hAnsi="Times New Roman" w:cs="Times New Roman"/>
+          <w:color w:val="1A1A1A"/>
+        </w:rPr>
+        <w:t xml:space="preserve"> of articles how organizations like Salesforce have issues with properly transforming data out of one system into another successfully</w:t>
+      </w:r>
+      <w:r>
+        <w:rPr>
+          <w:rFonts w:ascii="Times New Roman" w:eastAsia="Arial" w:hAnsi="Times New Roman" w:cs="Times New Roman"/>
+          <w:color w:val="1A1A1A"/>
+        </w:rPr>
+        <w:t xml:space="preserve"> (</w:t>
+      </w:r>
+      <w:r>
+        <w:rPr>
+          <w:rFonts w:ascii="Times New Roman" w:hAnsi="Times New Roman" w:cs="Times New Roman"/>
+        </w:rPr>
+        <w:t>Rolli</w:t>
+      </w:r>
+      <w:r>
+        <w:rPr>
+          <w:rFonts w:ascii="Times New Roman" w:hAnsi="Times New Roman" w:cs="Times New Roman"/>
         </w:rPr>
         <w:t xml:space="preserve">, </w:t>
       </w:r>
-      <w:hyperlink r:id="rId10" w:history="1">
-        <w:r>
-          <w:rPr>
-            <w:rFonts w:ascii="Times New Roman" w:eastAsia="Arial" w:hAnsi="Times New Roman" w:cs="Times New Roman"/>
-            <w:color w:val="0563C1"/>
-            <w:u w:val="single"/>
-          </w:rPr>
-          <w:t>motherduck.com</w:t>
-        </w:r>
-      </w:hyperlink>
-    </w:p>
-    <w:p>
-      <w:pPr>
-        <w:pStyle w:val="ListParagraph"/>
-        <w:numPr>
-          <w:ilvl w:val="0"/>
-          <w:numId w:val="11"/>
-        </w:numPr>
-        <w:spacing w:after="100" w:line="240" w:lineRule="auto"/>
-        <w:contextualSpacing w:val="0"/>
-        <w:rPr>
-          <w:rFonts w:ascii="Times New Roman" w:hAnsi="Times New Roman" w:cs="Times New Roman"/>
-        </w:rPr>
-      </w:pPr>
-      <w:r>
-        <w:rPr>
-          <w:rFonts w:ascii="Times New Roman" w:eastAsia="Arial" w:hAnsi="Times New Roman" w:cs="Times New Roman"/>
-          <w:color w:val="1A1A1A"/>
-        </w:rPr>
-        <w:t xml:space="preserve">Geospatial database options: </w:t>
-      </w:r>
-      <w:hyperlink r:id="rId11" w:history="1">
-        <w:r>
-          <w:rPr>
-            <w:rFonts w:ascii="Times New Roman" w:eastAsia="Arial" w:hAnsi="Times New Roman" w:cs="Times New Roman"/>
-            <w:color w:val="0563C1"/>
-            <w:u w:val="single"/>
-          </w:rPr>
-          <w:t>maplibrary.org</w:t>
-        </w:r>
-      </w:hyperlink>
+      <w:r>
+        <w:rPr>
+          <w:rFonts w:ascii="Times New Roman" w:hAnsi="Times New Roman" w:cs="Times New Roman"/>
+        </w:rPr>
+        <w:t>Veeraraghavan</w:t>
+      </w:r>
+      <w:r>
+        <w:rPr>
+          <w:rFonts w:ascii="Times New Roman" w:eastAsia="Arial" w:hAnsi="Times New Roman" w:cs="Times New Roman"/>
+          <w:color w:val="1A1A1A"/>
+        </w:rPr>
+        <w:t>)</w:t>
+      </w:r>
+      <w:r>
+        <w:rPr>
+          <w:rFonts w:ascii="Times New Roman" w:eastAsia="Arial" w:hAnsi="Times New Roman" w:cs="Times New Roman"/>
+          <w:color w:val="1A1A1A"/>
+        </w:rPr>
+        <w:t>. Other research focused on my interest in Geospatial data management in different databases and how DuckDB and PostgreSQL are different and solve different user requirements</w:t>
+      </w:r>
+      <w:r>
+        <w:rPr>
+          <w:rFonts w:ascii="Times New Roman" w:eastAsia="Arial" w:hAnsi="Times New Roman" w:cs="Times New Roman"/>
+          <w:color w:val="1A1A1A"/>
+        </w:rPr>
+        <w:t xml:space="preserve"> (</w:t>
+      </w:r>
+      <w:proofErr w:type="spellStart"/>
+      <w:r>
+        <w:rPr>
+          <w:rFonts w:ascii="Times New Roman" w:eastAsia="Arial" w:hAnsi="Times New Roman" w:cs="Times New Roman"/>
+          <w:color w:val="1A1A1A"/>
+        </w:rPr>
+        <w:t>Digitalogy</w:t>
+      </w:r>
+      <w:proofErr w:type="spellEnd"/>
       <w:r>
         <w:rPr>
           <w:rFonts w:ascii="Times New Roman" w:eastAsia="Arial" w:hAnsi="Times New Roman" w:cs="Times New Roman"/>
@@ -829,16 +861,57 @@
         </w:rPr>
         <w:t xml:space="preserve">, </w:t>
       </w:r>
-      <w:hyperlink r:id="rId12" w:history="1">
-        <w:r>
-          <w:rPr>
-            <w:rFonts w:ascii="Times New Roman" w:eastAsia="Arial" w:hAnsi="Times New Roman" w:cs="Times New Roman"/>
-            <w:color w:val="0563C1"/>
-            <w:u w:val="single"/>
-          </w:rPr>
-          <w:t>geodatainsights.com</w:t>
-        </w:r>
-      </w:hyperlink>
+      <w:proofErr w:type="spellStart"/>
+      <w:r>
+        <w:rPr>
+          <w:rFonts w:ascii="Times New Roman" w:eastAsia="Arial" w:hAnsi="Times New Roman" w:cs="Times New Roman"/>
+          <w:color w:val="1A1A1A"/>
+        </w:rPr>
+        <w:t>MotherDuck</w:t>
+      </w:r>
+      <w:proofErr w:type="spellEnd"/>
+      <w:r>
+        <w:rPr>
+          <w:rFonts w:ascii="Times New Roman" w:eastAsia="Arial" w:hAnsi="Times New Roman" w:cs="Times New Roman"/>
+          <w:color w:val="1A1A1A"/>
+        </w:rPr>
+        <w:t xml:space="preserve">, </w:t>
+      </w:r>
+      <w:r>
+        <w:rPr>
+          <w:rFonts w:ascii="Times New Roman" w:eastAsia="Arial" w:hAnsi="Times New Roman" w:cs="Times New Roman"/>
+          <w:color w:val="1A1A1A"/>
+        </w:rPr>
+        <w:t>Geodata Insights</w:t>
+      </w:r>
+      <w:r>
+        <w:rPr>
+          <w:rFonts w:ascii="Times New Roman" w:eastAsia="Arial" w:hAnsi="Times New Roman" w:cs="Times New Roman"/>
+          <w:color w:val="1A1A1A"/>
+        </w:rPr>
+        <w:t xml:space="preserve">, </w:t>
+      </w:r>
+      <w:r>
+        <w:rPr>
+          <w:rFonts w:ascii="Times New Roman" w:eastAsia="Arial" w:hAnsi="Times New Roman" w:cs="Times New Roman"/>
+          <w:color w:val="1A1A1A"/>
+        </w:rPr>
+        <w:t>Map Library</w:t>
+      </w:r>
+      <w:r>
+        <w:rPr>
+          <w:rFonts w:ascii="Times New Roman" w:eastAsia="Arial" w:hAnsi="Times New Roman" w:cs="Times New Roman"/>
+          <w:color w:val="1A1A1A"/>
+        </w:rPr>
+        <w:t>)</w:t>
+      </w:r>
+      <w:r>
+        <w:rPr>
+          <w:rFonts w:ascii="Times New Roman" w:eastAsia="Arial" w:hAnsi="Times New Roman" w:cs="Times New Roman"/>
+          <w:color w:val="1A1A1A"/>
+        </w:rPr>
+        <w:t>.</w:t>
+      </w:r>
     </w:p>
     <w:p>
       <w:pPr>
@@ -973,7 +1046,7 @@
         </w:rPr>
         <w:t xml:space="preserve"> across the United States. (</w:t>
       </w:r>
-      <w:hyperlink r:id="rId13" w:history="1">
+      <w:hyperlink r:id="rId7" w:history="1">
         <w:r>
           <w:rPr>
             <w:rFonts w:ascii="Times New Roman" w:eastAsia="Arial" w:hAnsi="Times New Roman" w:cs="Times New Roman"/>
@@ -1048,7 +1121,6 @@
           <w:bCs/>
           <w:color w:val="1A1A1A"/>
         </w:rPr>
-        <w:lastRenderedPageBreak/>
         <w:t>MN Geospatial Commons</w:t>
       </w:r>
       <w:r>
@@ -1058,7 +1130,7 @@
         </w:rPr>
         <w:t xml:space="preserve"> — Managed by the State of Minnesota, this source provided the State Parks, Recreation Areas and Waysides dataset in shapefile format — a geospatial vector data format used in GIS software. (</w:t>
       </w:r>
-      <w:hyperlink r:id="rId14" w:history="1">
+      <w:hyperlink r:id="rId8" w:history="1">
         <w:r>
           <w:rPr>
             <w:rFonts w:ascii="Times New Roman" w:eastAsia="Arial" w:hAnsi="Times New Roman" w:cs="Times New Roman"/>
@@ -1096,6 +1168,7 @@
           <w:bCs/>
           <w:color w:val="1A1A1A"/>
         </w:rPr>
+        <w:lastRenderedPageBreak/>
         <w:t>Recreation.gov (RIDB)</w:t>
       </w:r>
       <w:r>
@@ -1105,7 +1178,7 @@
         </w:rPr>
         <w:t xml:space="preserve"> — A dataset representing campgrounds and recreation areas managed by federal agencies across the United States, provided as downloadable CSV files. (</w:t>
       </w:r>
-      <w:hyperlink r:id="rId15" w:history="1">
+      <w:hyperlink r:id="rId9" w:history="1">
         <w:r>
           <w:rPr>
             <w:rFonts w:ascii="Times New Roman" w:eastAsia="Arial" w:hAnsi="Times New Roman" w:cs="Times New Roman"/>
@@ -1152,7 +1225,7 @@
         </w:rPr>
         <w:t xml:space="preserve"> — A map published and updated annually by the Minnesota DNR that outlines attribute-based information for every State Park and Recreational Area in Minnesota. (</w:t>
       </w:r>
-      <w:hyperlink r:id="rId16" w:history="1">
+      <w:hyperlink r:id="rId10" w:history="1">
         <w:r>
           <w:rPr>
             <w:rFonts w:ascii="Times New Roman" w:eastAsia="Arial" w:hAnsi="Times New Roman" w:cs="Times New Roman"/>
@@ -1233,7 +1306,21 @@
         <w:rPr>
           <w:rFonts w:ascii="Times New Roman" w:hAnsi="Times New Roman" w:cs="Times New Roman"/>
         </w:rPr>
-        <w:t xml:space="preserve"> When this iterative process was complete, I simply ran the orchestrator script with the ‘--all’ flag to import all sources successfully into one single DuckDB database. For transparency purposes AI was used to create about 60% of these Python scripts. </w:t>
+        <w:t xml:space="preserve"> When this iterative process was complete, I simply ran the orchestrator script with </w:t>
+      </w:r>
+      <w:proofErr w:type="gramStart"/>
+      <w:r>
+        <w:rPr>
+          <w:rFonts w:ascii="Times New Roman" w:hAnsi="Times New Roman" w:cs="Times New Roman"/>
+        </w:rPr>
+        <w:t>the ‘-</w:t>
+      </w:r>
+      <w:proofErr w:type="gramEnd"/>
+      <w:r>
+        <w:rPr>
+          <w:rFonts w:ascii="Times New Roman" w:hAnsi="Times New Roman" w:cs="Times New Roman"/>
+        </w:rPr>
+        <w:t xml:space="preserve">-all’ flag to import all sources successfully into one single DuckDB database. For transparency purposes AI was used to create about 60% of these Python scripts. </w:t>
       </w:r>
     </w:p>
     <w:p>
@@ -1266,7 +1353,7 @@
                     </pic:cNvPicPr>
                   </pic:nvPicPr>
                   <pic:blipFill>
-                    <a:blip r:embed="rId17" cstate="print">
+                    <a:blip r:embed="rId11" cstate="print">
                       <a:extLst>
                         <a:ext uri="{28A0092B-C50C-407E-A947-70E740481C1C}">
                           <a14:useLocalDpi xmlns:a14="http://schemas.microsoft.com/office/drawing/2010/main" val="0"/>
@@ -1348,7 +1435,7 @@
                     </pic:cNvPicPr>
                   </pic:nvPicPr>
                   <pic:blipFill>
-                    <a:blip r:embed="rId18" cstate="print">
+                    <a:blip r:embed="rId12" cstate="print">
                       <a:extLst>
                         <a:ext uri="{28A0092B-C50C-407E-A947-70E740481C1C}">
                           <a14:useLocalDpi xmlns:a14="http://schemas.microsoft.com/office/drawing/2010/main" val="0"/>
@@ -1464,7 +1551,7 @@
                     </pic:cNvPicPr>
                   </pic:nvPicPr>
                   <pic:blipFill>
-                    <a:blip r:embed="rId19" cstate="print">
+                    <a:blip r:embed="rId13" cstate="print">
                       <a:extLst>
                         <a:ext uri="{28A0092B-C50C-407E-A947-70E740481C1C}">
                           <a14:useLocalDpi xmlns:a14="http://schemas.microsoft.com/office/drawing/2010/main" val="0"/>
@@ -1576,9 +1663,8 @@
       <w:r>
         <w:rPr>
           <w:rFonts w:ascii="Times New Roman" w:hAnsi="Times New Roman" w:cs="Times New Roman"/>
-          <w:highlight w:val="yellow"/>
-        </w:rPr>
-        <w:t>website attribution here</w:t>
+        </w:rPr>
+        <w:t>Schema</w:t>
       </w:r>
       <w:r>
         <w:rPr>
@@ -1640,7 +1726,7 @@
                     </pic:cNvPicPr>
                   </pic:nvPicPr>
                   <pic:blipFill>
-                    <a:blip r:embed="rId20" cstate="print">
+                    <a:blip r:embed="rId14" cstate="print">
                       <a:extLst>
                         <a:ext uri="{28A0092B-C50C-407E-A947-70E740481C1C}">
                           <a14:useLocalDpi xmlns:a14="http://schemas.microsoft.com/office/drawing/2010/main" val="0"/>
@@ -1794,7 +1880,7 @@
                     <pic:cNvPicPr/>
                   </pic:nvPicPr>
                   <pic:blipFill>
-                    <a:blip r:embed="rId21"/>
+                    <a:blip r:embed="rId15"/>
                     <a:stretch>
                       <a:fillRect/>
                     </a:stretch>
@@ -1857,30 +1943,6 @@
     </w:p>
     <w:p>
       <w:pPr>
-        <w:rPr>
-          <w:rFonts w:ascii="Times New Roman" w:hAnsi="Times New Roman" w:cs="Times New Roman"/>
-        </w:rPr>
-      </w:pPr>
-      <w:r>
-        <w:rPr>
-          <w:rFonts w:ascii="Times New Roman" w:eastAsia="Arial" w:hAnsi="Times New Roman" w:cs="Times New Roman"/>
-          <w:color w:val="1A1A1A"/>
-        </w:rPr>
-        <w:t xml:space="preserve">Reference: </w:t>
-      </w:r>
-      <w:hyperlink r:id="rId22" w:history="1">
-        <w:r>
-          <w:rPr>
-            <w:rFonts w:ascii="Times New Roman" w:eastAsia="Arial" w:hAnsi="Times New Roman" w:cs="Times New Roman"/>
-            <w:color w:val="0563C1"/>
-            <w:u w:val="single"/>
-          </w:rPr>
-          <w:t>DuckDB Schema Documentation</w:t>
-        </w:r>
-      </w:hyperlink>
-    </w:p>
-    <w:p>
-      <w:pPr>
         <w:pStyle w:val="Heading2"/>
         <w:rPr>
           <w:rFonts w:ascii="Arial" w:eastAsia="Arial" w:hAnsi="Arial" w:cs="Arial"/>
@@ -1925,14 +1987,14 @@
         <w:rPr>
           <w:rFonts w:ascii="Times New Roman" w:hAnsi="Times New Roman" w:cs="Times New Roman"/>
         </w:rPr>
-        <w:t xml:space="preserve"> namespaces within DuckDB, the next step was to create a normalized database schema to transform all the source </w:t>
+        <w:t xml:space="preserve"> namespaces within DuckDB, the next step was to create a normalized database schema to transform all the source data into. Before writing any SQL code for this normalized database schema, I used Oracle’s SQL Data Modeler tool to design a comprehensive, intuitive, and normalized database managing </w:t>
       </w:r>
       <w:r>
         <w:rPr>
           <w:rFonts w:ascii="Times New Roman" w:hAnsi="Times New Roman" w:cs="Times New Roman"/>
         </w:rPr>
         <w:lastRenderedPageBreak/>
-        <w:t>data into. Before writing any SQL code for this normalized database schema, I used Oracle’s SQL Data Modeler tool to design a comprehensive, intuitive, and normalized database managing the following entities: Locations, Operating Hours, Operating Hours Times, Media, Phone Numbers, Email Addresses, Addresses and Websites, some with their own corresponding type tables.</w:t>
+        <w:t>the following entities: Locations, Operating Hours, Operating Hours Times, Media, Phone Numbers, Email Addresses, Addresses and Websites, some with their own corresponding type tables.</w:t>
       </w:r>
     </w:p>
     <w:p>
@@ -2085,7 +2147,21 @@
         <w:rPr>
           <w:rFonts w:ascii="Times New Roman" w:hAnsi="Times New Roman" w:cs="Times New Roman"/>
         </w:rPr>
-        <w:t xml:space="preserve"> with many children locations. </w:t>
+        <w:t xml:space="preserve"> with many </w:t>
+      </w:r>
+      <w:proofErr w:type="gramStart"/>
+      <w:r>
+        <w:rPr>
+          <w:rFonts w:ascii="Times New Roman" w:hAnsi="Times New Roman" w:cs="Times New Roman"/>
+        </w:rPr>
+        <w:t>children</w:t>
+      </w:r>
+      <w:proofErr w:type="gramEnd"/>
+      <w:r>
+        <w:rPr>
+          <w:rFonts w:ascii="Times New Roman" w:hAnsi="Times New Roman" w:cs="Times New Roman"/>
+        </w:rPr>
+        <w:t xml:space="preserve"> locations. </w:t>
       </w:r>
     </w:p>
     <w:p>
@@ -2176,14 +2252,28 @@
         <w:rPr>
           <w:rFonts w:ascii="Times New Roman" w:hAnsi="Times New Roman" w:cs="Times New Roman"/>
         </w:rPr>
-        <w:t>Hours Time</w:t>
+        <w:t xml:space="preserve">Hours </w:t>
+      </w:r>
+      <w:proofErr w:type="gramStart"/>
+      <w:r>
+        <w:rPr>
+          <w:rFonts w:ascii="Times New Roman" w:hAnsi="Times New Roman" w:cs="Times New Roman"/>
+        </w:rPr>
+        <w:t>Time</w:t>
       </w:r>
       <w:proofErr w:type="spellEnd"/>
       <w:r>
         <w:rPr>
           <w:rFonts w:ascii="Times New Roman" w:hAnsi="Times New Roman" w:cs="Times New Roman"/>
         </w:rPr>
-        <w:t xml:space="preserve"> table that associates to the Operating Hours entity stores individual day-level time records. This is more structured and queryable than storing a JSON column per day on the Operating Hours table directly. </w:t>
+        <w:t xml:space="preserve"> table</w:t>
+      </w:r>
+      <w:proofErr w:type="gramEnd"/>
+      <w:r>
+        <w:rPr>
+          <w:rFonts w:ascii="Times New Roman" w:hAnsi="Times New Roman" w:cs="Times New Roman"/>
+        </w:rPr>
+        <w:t xml:space="preserve"> that associates to the Operating Hours entity stores individual day-level time records. This is more structured and queryable than storing a JSON column per day on the Operating Hours table directly. </w:t>
       </w:r>
     </w:p>
     <w:p>
@@ -2213,7 +2303,7 @@
                     <pic:cNvPicPr/>
                   </pic:nvPicPr>
                   <pic:blipFill>
-                    <a:blip r:embed="rId23"/>
+                    <a:blip r:embed="rId16"/>
                     <a:stretch>
                       <a:fillRect/>
                     </a:stretch>
@@ -2359,7 +2449,7 @@
                     <pic:cNvPicPr/>
                   </pic:nvPicPr>
                   <pic:blipFill>
-                    <a:blip r:embed="rId24"/>
+                    <a:blip r:embed="rId17"/>
                     <a:stretch>
                       <a:fillRect/>
                     </a:stretch>
@@ -2395,7 +2485,25 @@
           <w:sz w:val="20"/>
           <w:szCs w:val="20"/>
         </w:rPr>
-        <w:t>Relational model of normalized DuckDB database schema created to transform data from sources into.</w:t>
+        <w:t xml:space="preserve">Relational </w:t>
+      </w:r>
+      <w:proofErr w:type="gramStart"/>
+      <w:r>
+        <w:rPr>
+          <w:rFonts w:ascii="Times New Roman" w:hAnsi="Times New Roman" w:cs="Times New Roman"/>
+          <w:sz w:val="20"/>
+          <w:szCs w:val="20"/>
+        </w:rPr>
+        <w:t>model</w:t>
+      </w:r>
+      <w:proofErr w:type="gramEnd"/>
+      <w:r>
+        <w:rPr>
+          <w:rFonts w:ascii="Times New Roman" w:hAnsi="Times New Roman" w:cs="Times New Roman"/>
+          <w:sz w:val="20"/>
+          <w:szCs w:val="20"/>
+        </w:rPr>
+        <w:t xml:space="preserve"> of normalized DuckDB database schema created to transform data from sources into.</w:t>
       </w:r>
     </w:p>
     <w:p>
@@ -2424,6 +2532,17 @@
     </w:p>
     <w:p>
       <w:pPr>
+        <w:pStyle w:val="Heading2"/>
+        <w:rPr>
+          <w:rFonts w:ascii="Arial" w:eastAsia="Arial" w:hAnsi="Arial" w:cs="Arial"/>
+          <w:b/>
+          <w:bCs/>
+          <w:color w:val="156082" w:themeColor="accent1"/>
+          <w:sz w:val="26"/>
+          <w:szCs w:val="26"/>
+        </w:rPr>
+      </w:pPr>
+      <w:r>
         <w:rPr>
           <w:rFonts w:cs="Times New Roman"/>
           <w:b/>
@@ -2432,8 +2551,127 @@
           <w:sz w:val="28"/>
           <w:szCs w:val="28"/>
         </w:rPr>
-      </w:pPr>
-      <w:r>
+        <w:t xml:space="preserve">Database Normalization – </w:t>
+      </w:r>
+      <w:r>
+        <w:rPr>
+          <w:rFonts w:cs="Times New Roman"/>
+          <w:b/>
+          <w:bCs/>
+          <w:sz w:val="28"/>
+          <w:szCs w:val="28"/>
+        </w:rPr>
+        <w:t>Creating the Normalized Schema</w:t>
+      </w:r>
+    </w:p>
+    <w:p>
+      <w:pPr>
+        <w:rPr>
+          <w:rFonts w:ascii="Times New Roman" w:hAnsi="Times New Roman" w:cs="Times New Roman"/>
+          <w:i/>
+          <w:iCs/>
+        </w:rPr>
+      </w:pPr>
+      <w:r>
+        <w:rPr>
+          <w:rFonts w:ascii="Times New Roman" w:hAnsi="Times New Roman" w:cs="Times New Roman"/>
+        </w:rPr>
+        <w:tab/>
+        <w:t xml:space="preserve">Textbook Reference: </w:t>
+      </w:r>
+      <w:r>
+        <w:rPr>
+          <w:rFonts w:ascii="Times New Roman" w:hAnsi="Times New Roman" w:cs="Times New Roman"/>
+          <w:i/>
+          <w:iCs/>
+        </w:rPr>
+        <w:t>Chapter 7; Normalization Concepts and Processes</w:t>
+      </w:r>
+    </w:p>
+    <w:p>
+      <w:pPr>
+        <w:rPr>
+          <w:rFonts w:ascii="Times New Roman" w:hAnsi="Times New Roman" w:cs="Times New Roman"/>
+        </w:rPr>
+      </w:pPr>
+      <w:r>
+        <w:rPr>
+          <w:rFonts w:ascii="Times New Roman" w:hAnsi="Times New Roman" w:cs="Times New Roman"/>
+        </w:rPr>
+        <w:t xml:space="preserve">Most of the five data sources (except for the RIDB CSV source) arrived in a denormalized or inconsistently structured format. The NPS API returns nested JSON with operating hours, and other information embedded inside location objects. Another example is how the MN GIS shapefile combines </w:t>
+      </w:r>
+      <w:proofErr w:type="gramStart"/>
+      <w:r>
+        <w:rPr>
+          <w:rFonts w:ascii="Times New Roman" w:hAnsi="Times New Roman" w:cs="Times New Roman"/>
+        </w:rPr>
+        <w:t>geographic</w:t>
+      </w:r>
+      <w:proofErr w:type="gramEnd"/>
+      <w:r>
+        <w:rPr>
+          <w:rFonts w:ascii="Times New Roman" w:hAnsi="Times New Roman" w:cs="Times New Roman"/>
+        </w:rPr>
+        <w:t xml:space="preserve"> and attribute data into a single record per park. </w:t>
+      </w:r>
+    </w:p>
+    <w:p>
+      <w:pPr>
+        <w:rPr>
+          <w:rFonts w:ascii="Times New Roman" w:hAnsi="Times New Roman" w:cs="Times New Roman"/>
+        </w:rPr>
+      </w:pPr>
+      <w:r>
+        <w:rPr>
+          <w:rFonts w:ascii="Times New Roman" w:hAnsi="Times New Roman" w:cs="Times New Roman"/>
+        </w:rPr>
+        <w:t>The normalized schema created for this project addresses this by decomposing repeated data into type tables (</w:t>
+      </w:r>
+      <w:proofErr w:type="spellStart"/>
+      <w:r>
+        <w:rPr>
+          <w:rFonts w:ascii="Times New Roman" w:hAnsi="Times New Roman" w:cs="Times New Roman"/>
+        </w:rPr>
+        <w:t>WebsiteType</w:t>
+      </w:r>
+      <w:proofErr w:type="spellEnd"/>
+      <w:r>
+        <w:rPr>
+          <w:rFonts w:ascii="Times New Roman" w:hAnsi="Times New Roman" w:cs="Times New Roman"/>
+        </w:rPr>
+        <w:t xml:space="preserve">, </w:t>
+      </w:r>
+      <w:proofErr w:type="spellStart"/>
+      <w:r>
+        <w:rPr>
+          <w:rFonts w:ascii="Times New Roman" w:hAnsi="Times New Roman" w:cs="Times New Roman"/>
+        </w:rPr>
+        <w:t>AddressType</w:t>
+      </w:r>
+      <w:proofErr w:type="spellEnd"/>
+      <w:r>
+        <w:rPr>
+          <w:rFonts w:ascii="Times New Roman" w:hAnsi="Times New Roman" w:cs="Times New Roman"/>
+        </w:rPr>
+        <w:t xml:space="preserve">, and MediaType), separating contact information into dedicated entities and representing operating hours at a day-level granularity through the </w:t>
+      </w:r>
+      <w:proofErr w:type="spellStart"/>
+      <w:r>
+        <w:rPr>
+          <w:rFonts w:ascii="Times New Roman" w:hAnsi="Times New Roman" w:cs="Times New Roman"/>
+        </w:rPr>
+        <w:t>OperatingHoursTime</w:t>
+      </w:r>
+      <w:proofErr w:type="spellEnd"/>
+      <w:r>
+        <w:rPr>
+          <w:rFonts w:ascii="Times New Roman" w:hAnsi="Times New Roman" w:cs="Times New Roman"/>
+        </w:rPr>
+        <w:t xml:space="preserve"> child table. This design targets Third Normal Form (3NF), where each non-key attribute is functionally dependent only on the primary key and there are no transitive dependencies. </w:t>
+      </w:r>
+    </w:p>
+    <w:p>
+      <w:pPr>
         <w:rPr>
           <w:rFonts w:cs="Times New Roman"/>
           <w:b/>
@@ -2442,113 +2680,8 @@
           <w:sz w:val="28"/>
           <w:szCs w:val="28"/>
         </w:rPr>
-        <w:t xml:space="preserve">Database Normalization – </w:t>
-      </w:r>
-      <w:r>
-        <w:rPr>
-          <w:rFonts w:cs="Times New Roman"/>
-          <w:b/>
-          <w:bCs/>
-          <w:sz w:val="28"/>
-          <w:szCs w:val="28"/>
-        </w:rPr>
-        <w:t>Creating the Normalized Schema</w:t>
-      </w:r>
-    </w:p>
-    <w:p>
-      <w:pPr>
-        <w:rPr>
-          <w:rFonts w:ascii="Times New Roman" w:hAnsi="Times New Roman" w:cs="Times New Roman"/>
-          <w:i/>
-          <w:iCs/>
-        </w:rPr>
-      </w:pPr>
-      <w:r>
-        <w:rPr>
-          <w:rFonts w:ascii="Times New Roman" w:hAnsi="Times New Roman" w:cs="Times New Roman"/>
-        </w:rPr>
-        <w:tab/>
-        <w:t xml:space="preserve">Textbook Reference: </w:t>
-      </w:r>
-      <w:r>
-        <w:rPr>
-          <w:rFonts w:ascii="Times New Roman" w:hAnsi="Times New Roman" w:cs="Times New Roman"/>
-          <w:i/>
-          <w:iCs/>
-        </w:rPr>
-        <w:t>Chapter 7; Normalization Concepts and Processes</w:t>
-      </w:r>
-    </w:p>
-    <w:p>
-      <w:pPr>
-        <w:rPr>
-          <w:rFonts w:ascii="Times New Roman" w:hAnsi="Times New Roman" w:cs="Times New Roman"/>
-        </w:rPr>
-      </w:pPr>
-      <w:r>
-        <w:rPr>
-          <w:rFonts w:ascii="Times New Roman" w:hAnsi="Times New Roman" w:cs="Times New Roman"/>
-        </w:rPr>
-        <w:t xml:space="preserve">Most of the five data sources (except for the RIDB CSV source) arrived in a denormalized or inconsistently structured format. The NPS API returns nested JSON with operating hours, and other information embedded inside location objects. Another example is how the MN GIS shapefile combines geographic and attribute data into a single record per park. </w:t>
-      </w:r>
-    </w:p>
-    <w:p>
-      <w:pPr>
-        <w:rPr>
-          <w:rFonts w:ascii="Times New Roman" w:hAnsi="Times New Roman" w:cs="Times New Roman"/>
-        </w:rPr>
-      </w:pPr>
-      <w:r>
-        <w:rPr>
-          <w:rFonts w:ascii="Times New Roman" w:hAnsi="Times New Roman" w:cs="Times New Roman"/>
-        </w:rPr>
-        <w:t>The normalized schema created for this project addresses this by decomposing repeated data into type tables (</w:t>
-      </w:r>
-      <w:proofErr w:type="spellStart"/>
-      <w:r>
-        <w:rPr>
-          <w:rFonts w:ascii="Times New Roman" w:hAnsi="Times New Roman" w:cs="Times New Roman"/>
-        </w:rPr>
-        <w:t>WebsiteType</w:t>
-      </w:r>
-      <w:proofErr w:type="spellEnd"/>
-      <w:r>
-        <w:rPr>
-          <w:rFonts w:ascii="Times New Roman" w:hAnsi="Times New Roman" w:cs="Times New Roman"/>
-        </w:rPr>
-        <w:t xml:space="preserve">, </w:t>
-      </w:r>
-      <w:proofErr w:type="spellStart"/>
-      <w:r>
-        <w:rPr>
-          <w:rFonts w:ascii="Times New Roman" w:hAnsi="Times New Roman" w:cs="Times New Roman"/>
-        </w:rPr>
-        <w:t>AddressType</w:t>
-      </w:r>
-      <w:proofErr w:type="spellEnd"/>
-      <w:r>
-        <w:rPr>
-          <w:rFonts w:ascii="Times New Roman" w:hAnsi="Times New Roman" w:cs="Times New Roman"/>
-        </w:rPr>
-        <w:t xml:space="preserve">, and MediaType), separating contact information into dedicated entities and representing operating hours at a day-level granularity through the </w:t>
-      </w:r>
-      <w:proofErr w:type="spellStart"/>
-      <w:r>
-        <w:rPr>
-          <w:rFonts w:ascii="Times New Roman" w:hAnsi="Times New Roman" w:cs="Times New Roman"/>
-        </w:rPr>
-        <w:t>OperatingHoursTime</w:t>
-      </w:r>
-      <w:proofErr w:type="spellEnd"/>
-      <w:r>
-        <w:rPr>
-          <w:rFonts w:ascii="Times New Roman" w:hAnsi="Times New Roman" w:cs="Times New Roman"/>
-        </w:rPr>
-        <w:t xml:space="preserve"> child table. This design targets Third Normal Form (3NF), where each non-key attribute is functionally dependent only on the primary key and there are no transitive dependencies. </w:t>
-      </w:r>
-    </w:p>
-    <w:p>
-      <w:pPr>
+      </w:pPr>
+      <w:r>
         <w:rPr>
           <w:rFonts w:cs="Times New Roman"/>
           <w:b/>
@@ -2557,26 +2690,16 @@
           <w:sz w:val="28"/>
           <w:szCs w:val="28"/>
         </w:rPr>
-      </w:pPr>
+        <w:t xml:space="preserve">Project Specific Needs – </w:t>
+      </w:r>
       <w:r>
         <w:rPr>
           <w:rFonts w:cs="Times New Roman"/>
           <w:b/>
           <w:bCs/>
-          <w:color w:val="156082" w:themeColor="accent1"/>
           <w:sz w:val="28"/>
           <w:szCs w:val="28"/>
         </w:rPr>
-        <w:t xml:space="preserve">Project Specific Needs – </w:t>
-      </w:r>
-      <w:r>
-        <w:rPr>
-          <w:rFonts w:cs="Times New Roman"/>
-          <w:b/>
-          <w:bCs/>
-          <w:sz w:val="28"/>
-          <w:szCs w:val="28"/>
-        </w:rPr>
         <w:t>Working against normalization</w:t>
       </w:r>
     </w:p>
@@ -2823,10 +2946,11 @@
     </w:p>
     <w:p>
       <w:pPr>
-        <w:pStyle w:val="Heading2"/>
         <w:jc w:val="center"/>
         <w:rPr>
           <w:rFonts w:ascii="Times New Roman" w:hAnsi="Times New Roman" w:cs="Times New Roman"/>
+          <w:i/>
+          <w:iCs/>
         </w:rPr>
       </w:pPr>
       <w:r>
@@ -2836,9 +2960,9 @@
         </w:rPr>
         <w:lastRenderedPageBreak/>
         <w:drawing>
-          <wp:inline distT="0" distB="0" distL="0" distR="0" wp14:anchorId="42097084" wp14:editId="71E8E8B4">
+          <wp:inline distT="0" distB="0" distL="0" distR="0" wp14:anchorId="198E54F9" wp14:editId="4AFFF2D1">
             <wp:extent cx="2878372" cy="5392267"/>
-            <wp:effectExtent l="0" t="0" r="0" b="0"/>
+            <wp:effectExtent l="0" t="0" r="7620" b="7620"/>
             <wp:docPr id="367684458" name="Picture 2"/>
             <wp:cNvGraphicFramePr>
               <a:graphicFrameLocks xmlns:a="http://schemas.openxmlformats.org/drawingml/2006/main" noChangeAspect="1"/>
@@ -2853,7 +2977,7 @@
                     </pic:cNvPicPr>
                   </pic:nvPicPr>
                   <pic:blipFill>
-                    <a:blip r:embed="rId25" cstate="print">
+                    <a:blip r:embed="rId18" cstate="print">
                       <a:extLst>
                         <a:ext uri="{28A0092B-C50C-407E-A947-70E740481C1C}">
                           <a14:useLocalDpi xmlns:a14="http://schemas.microsoft.com/office/drawing/2010/main" val="0"/>
@@ -2868,7 +2992,7 @@
                   <pic:spPr bwMode="auto">
                     <a:xfrm>
                       <a:off x="0" y="0"/>
-                      <a:ext cx="2883051" cy="5401032"/>
+                      <a:ext cx="2878372" cy="5392267"/>
                     </a:xfrm>
                     <a:prstGeom prst="rect">
                       <a:avLst/>
@@ -3189,19 +3313,7 @@
         <w:rPr>
           <w:rFonts w:ascii="Times New Roman" w:hAnsi="Times New Roman" w:cs="Times New Roman"/>
         </w:rPr>
-        <w:t xml:space="preserve"> directory within the </w:t>
-      </w:r>
-      <w:r>
-        <w:rPr>
-          <w:rFonts w:ascii="Times New Roman" w:hAnsi="Times New Roman" w:cs="Times New Roman"/>
-        </w:rPr>
-        <w:t>GitHub repository that is referenced in this document</w:t>
-      </w:r>
-      <w:r>
-        <w:rPr>
-          <w:rFonts w:ascii="Times New Roman" w:hAnsi="Times New Roman" w:cs="Times New Roman"/>
-        </w:rPr>
-        <w:t xml:space="preserve">.  </w:t>
+        <w:t xml:space="preserve"> directory within the GitHub repository that is referenced in this document.  </w:t>
       </w:r>
     </w:p>
     <w:p>
@@ -3234,7 +3346,7 @@
                     </pic:cNvPicPr>
                   </pic:nvPicPr>
                   <pic:blipFill>
-                    <a:blip r:embed="rId26" cstate="print">
+                    <a:blip r:embed="rId19" cstate="print">
                       <a:extLst>
                         <a:ext uri="{28A0092B-C50C-407E-A947-70E740481C1C}">
                           <a14:useLocalDpi xmlns:a14="http://schemas.microsoft.com/office/drawing/2010/main" val="0"/>
@@ -3410,25 +3522,134 @@
     </w:p>
     <w:p>
       <w:r>
-        <w:t xml:space="preserve">The Locations table was designed with a  self-referencing </w:t>
+        <w:t xml:space="preserve">The Locations table was designed with a self-referencing </w:t>
       </w:r>
       <w:proofErr w:type="spellStart"/>
       <w:r>
+        <w:rPr>
+          <w:b/>
+          <w:bCs/>
+        </w:rPr>
         <w:t>parent_location_key</w:t>
       </w:r>
       <w:proofErr w:type="spellEnd"/>
       <w:r>
-        <w:t xml:space="preserve"> foreign key, which creates a natural hierarchy where locations like campgrounds can be nested under a parent location such as a state park or state forest. </w:t>
-      </w:r>
-    </w:p>
-    <w:p>
-      <w:r>
-        <w:t>TODO: Create Recursive query that works and create it as a view that can be easily called whenever I want with very little code</w:t>
-      </w:r>
-    </w:p>
-    <w:p>
-      <w:r>
-        <w:t>TODO: snapshot of the view that is created</w:t>
+        <w:t xml:space="preserve"> foreign key, which creates a natural hierarchy where locations like campgrounds can be nested under a parent location such as a state park</w:t>
+      </w:r>
+      <w:r>
+        <w:t>,</w:t>
+      </w:r>
+      <w:r>
+        <w:t xml:space="preserve"> state forest</w:t>
+      </w:r>
+      <w:r>
+        <w:t>, or national park</w:t>
+      </w:r>
+      <w:r>
+        <w:t>.</w:t>
+      </w:r>
+      <w:r>
+        <w:t xml:space="preserve"> The query shown in the image below is recursive in nature to handle full hierarchy depth. </w:t>
+      </w:r>
+      <w:r>
+        <w:t xml:space="preserve">One thing to note that would be worth implementing in the future is a check to ensure that top-level parent locations cannot be assigned as a child of any of its children or grandchildren locations, since this would create a recursive loop without a terminating base case. </w:t>
+      </w:r>
+      <w:r>
+        <w:t xml:space="preserve">This query was created based on the hierarchical query common table expression (CTE) approach noted in chapter 10. I went with this approach as it is supported in both PostgreSQL and DuckDB with similar syntax and behavior making it a query/view that will port over easily later. </w:t>
+      </w:r>
+    </w:p>
+    <w:p>
+      <w:r>
+        <w:rPr>
+          <w:noProof/>
+        </w:rPr>
+        <w:lastRenderedPageBreak/>
+        <w:drawing>
+          <wp:inline distT="0" distB="0" distL="0" distR="0" wp14:anchorId="477272A9" wp14:editId="505D439D">
+            <wp:extent cx="5943600" cy="4707890"/>
+            <wp:effectExtent l="0" t="0" r="0" b="0"/>
+            <wp:docPr id="1290269177" name="Picture 1"/>
+            <wp:cNvGraphicFramePr>
+              <a:graphicFrameLocks xmlns:a="http://schemas.openxmlformats.org/drawingml/2006/main" noChangeAspect="1"/>
+            </wp:cNvGraphicFramePr>
+            <a:graphic xmlns:a="http://schemas.openxmlformats.org/drawingml/2006/main">
+              <a:graphicData uri="http://schemas.openxmlformats.org/drawingml/2006/picture">
+                <pic:pic xmlns:pic="http://schemas.openxmlformats.org/drawingml/2006/picture">
+                  <pic:nvPicPr>
+                    <pic:cNvPr id="0" name="Picture 1"/>
+                    <pic:cNvPicPr>
+                      <a:picLocks noChangeAspect="1" noChangeArrowheads="1"/>
+                    </pic:cNvPicPr>
+                  </pic:nvPicPr>
+                  <pic:blipFill>
+                    <a:blip r:embed="rId20" cstate="print">
+                      <a:extLst>
+                        <a:ext uri="{28A0092B-C50C-407E-A947-70E740481C1C}">
+                          <a14:useLocalDpi xmlns:a14="http://schemas.microsoft.com/office/drawing/2010/main" val="0"/>
+                        </a:ext>
+                      </a:extLst>
+                    </a:blip>
+                    <a:srcRect/>
+                    <a:stretch>
+                      <a:fillRect/>
+                    </a:stretch>
+                  </pic:blipFill>
+                  <pic:spPr bwMode="auto">
+                    <a:xfrm>
+                      <a:off x="0" y="0"/>
+                      <a:ext cx="5943600" cy="4707890"/>
+                    </a:xfrm>
+                    <a:prstGeom prst="rect">
+                      <a:avLst/>
+                    </a:prstGeom>
+                    <a:noFill/>
+                    <a:ln>
+                      <a:noFill/>
+                    </a:ln>
+                  </pic:spPr>
+                </pic:pic>
+              </a:graphicData>
+            </a:graphic>
+          </wp:inline>
+        </w:drawing>
+      </w:r>
+    </w:p>
+    <w:p>
+      <w:pPr>
+        <w:spacing w:after="120" w:line="240" w:lineRule="auto"/>
+        <w:jc w:val="center"/>
+        <w:rPr>
+          <w:rFonts w:ascii="Times New Roman" w:hAnsi="Times New Roman" w:cs="Times New Roman"/>
+          <w:sz w:val="20"/>
+          <w:szCs w:val="20"/>
+        </w:rPr>
+      </w:pPr>
+      <w:r>
+        <w:rPr>
+          <w:rFonts w:ascii="Times New Roman" w:hAnsi="Times New Roman" w:cs="Times New Roman"/>
+          <w:noProof/>
+          <w:sz w:val="20"/>
+          <w:szCs w:val="20"/>
+        </w:rPr>
+        <w:t>Recursive Hierarchical query created to better query and understand which locations are associated with other locations</w:t>
+      </w:r>
+      <w:r>
+        <w:rPr>
+          <w:rFonts w:ascii="Times New Roman" w:hAnsi="Times New Roman" w:cs="Times New Roman"/>
+          <w:noProof/>
+          <w:sz w:val="20"/>
+          <w:szCs w:val="20"/>
+        </w:rPr>
+        <w:t>.</w:t>
+      </w:r>
+      <w:r>
+        <w:rPr>
+          <w:rFonts w:ascii="Times New Roman" w:hAnsi="Times New Roman" w:cs="Times New Roman"/>
+          <w:noProof/>
+          <w:sz w:val="20"/>
+          <w:szCs w:val="20"/>
+        </w:rPr>
+        <w:t xml:space="preserve"> | Extrememly useful when wanting to query for detailed inforation about a given location.</w:t>
       </w:r>
     </w:p>
     <w:p>
@@ -3457,15 +3678,43 @@
     </w:p>
     <w:p>
       <w:r>
-        <w:t xml:space="preserve">TODO: mention the geospatial </w:t>
-      </w:r>
-      <w:proofErr w:type="spellStart"/>
-      <w:r>
-        <w:t>duckdb</w:t>
-      </w:r>
-      <w:proofErr w:type="spellEnd"/>
-      <w:r>
-        <w:t xml:space="preserve"> plugin along with showing a query that I created to find all locations within a given distance of a coordinate pair (using St. Thomas coordinate pair for example and create queries that query my data to pull up locations that are 10, 20, and 50 miles within the St. Thomas coordinate)</w:t>
+        <w:t xml:space="preserve">When it comes to geospatial queries, I initially set out to try using DuckDB’s Spatial Extension, however, after some trial and error I discovered that this extension is primarily </w:t>
+      </w:r>
+      <w:proofErr w:type="gramStart"/>
+      <w:r>
+        <w:t>operates</w:t>
+      </w:r>
+      <w:proofErr w:type="gramEnd"/>
+      <w:r>
+        <w:t xml:space="preserve"> on planar (Cartesian) geometry and not spherical (geodesic) in nature</w:t>
+      </w:r>
+      <w:r>
+        <w:t xml:space="preserve"> (</w:t>
+      </w:r>
+      <w:r>
+        <w:rPr>
+          <w:rFonts w:ascii="Times New Roman" w:hAnsi="Times New Roman" w:cs="Times New Roman"/>
+        </w:rPr>
+        <w:t>Spatial Extension</w:t>
+      </w:r>
+      <w:r>
+        <w:t>)</w:t>
+      </w:r>
+      <w:r>
+        <w:t>. This distinction is important because my primary geospatial use case involves distance-based queries, such as determining which locations are within a 20-mile radius of a given point. Since my dataset is currently composed of latitude and longitude coordinates, my distance calculations require spherical geometry where I’m accounting for the Earth’s curvature. I could try to approximate these distance calculations</w:t>
+      </w:r>
+      <w:r>
+        <w:t xml:space="preserve"> by converting my latitude and longitude values</w:t>
+      </w:r>
+      <w:r>
+        <w:t xml:space="preserve"> into a planar format to be queried by DuckDB however, </w:t>
+      </w:r>
+      <w:r>
+        <w:lastRenderedPageBreak/>
+        <w:t>this would reduce accuracy</w:t>
+      </w:r>
+      <w:r>
+        <w:t xml:space="preserve">. I did try this with a few AI generated queries however, the most accuracy I was able to achieve after some iterations were locations that were up to 20 miles outside the chosen radius (20- and 50-mile radiuses in my tests) returning as results of running the query. Therefore, I decided to defer further geospatial calculations until I’ve been able to migrate the data into a PostgreSQL database where in combination with the PostGIS extension, I can run more accurate and easier to craft geospatial queries based on spherical calculations. </w:t>
       </w:r>
     </w:p>
     <w:p>
@@ -3503,7 +3752,213 @@
         <w:rPr>
           <w:rFonts w:ascii="Times New Roman" w:hAnsi="Times New Roman" w:cs="Times New Roman"/>
         </w:rPr>
-        <w:t xml:space="preserve">TODO: create general join query to join all the tables together. This can become a view that I show. </w:t>
+        <w:t xml:space="preserve">This query of the ones created in this </w:t>
+      </w:r>
+      <w:r>
+        <w:rPr>
+          <w:rFonts w:ascii="Times New Roman" w:hAnsi="Times New Roman" w:cs="Times New Roman"/>
+        </w:rPr>
+        <w:t>section</w:t>
+      </w:r>
+      <w:r>
+        <w:rPr>
+          <w:rFonts w:ascii="Times New Roman" w:hAnsi="Times New Roman" w:cs="Times New Roman"/>
+        </w:rPr>
+        <w:t xml:space="preserve"> I would argue is the most important. In a future application, it will be important to display more detailed information about</w:t>
+      </w:r>
+      <w:r>
+        <w:rPr>
+          <w:rFonts w:ascii="Times New Roman" w:hAnsi="Times New Roman" w:cs="Times New Roman"/>
+        </w:rPr>
+        <w:t xml:space="preserve"> each location if the information exists. One way to collect all information is to JOIN all the tables together and organize the data in a way that a server layer can properly and easily send it to the client. In the query shown below, I structured </w:t>
+      </w:r>
+      <w:r>
+        <w:rPr>
+          <w:rFonts w:ascii="Times New Roman" w:hAnsi="Times New Roman" w:cs="Times New Roman"/>
+        </w:rPr>
+        <w:t>it</w:t>
+      </w:r>
+      <w:r>
+        <w:rPr>
+          <w:rFonts w:ascii="Times New Roman" w:hAnsi="Times New Roman" w:cs="Times New Roman"/>
+        </w:rPr>
+        <w:t xml:space="preserve">, so all tables are joined together, and the data is formatted in a way where each primary entity (aka. websites, addresses, contact information, etc.) all have their own column and within each column exists an already formatted JSON object that contains a list of the records that exist for each specific entity. This would allow the server layer to simply run this query and send the database response directly to the client. This format by no means </w:t>
+      </w:r>
+      <w:r>
+        <w:rPr>
+          <w:rFonts w:ascii="Times New Roman" w:hAnsi="Times New Roman" w:cs="Times New Roman"/>
+        </w:rPr>
+        <w:t xml:space="preserve">is </w:t>
+      </w:r>
+      <w:r>
+        <w:rPr>
+          <w:rFonts w:ascii="Times New Roman" w:hAnsi="Times New Roman" w:cs="Times New Roman"/>
+        </w:rPr>
+        <w:t xml:space="preserve">meant to be used for analysis purposes but rather application use. </w:t>
+      </w:r>
+    </w:p>
+    <w:p>
+      <w:pPr>
+        <w:spacing w:after="120" w:line="240" w:lineRule="auto"/>
+        <w:rPr>
+          <w:rFonts w:ascii="Times New Roman" w:hAnsi="Times New Roman" w:cs="Times New Roman"/>
+        </w:rPr>
+      </w:pPr>
+      <w:r>
+        <w:rPr>
+          <w:rFonts w:ascii="Times New Roman" w:hAnsi="Times New Roman" w:cs="Times New Roman"/>
+        </w:rPr>
+        <w:t>One important note about this query is that I’m using LEFT JOIN on all the primary entities. This is needed because a location may not have associated records in any of the primary entity tables including websites, addresses, and contact information. If a standard JOIN was used instead (which by default is INNER JOIN), any missing relationship between the location entity and all others would cause the entire location record to be excluded from the query result. Therefore, using the LEFT JOIN approach ensures that every location is returned regardless of whether related data exists.</w:t>
+      </w:r>
+    </w:p>
+    <w:p>
+      <w:pPr>
+        <w:spacing w:after="120" w:line="240" w:lineRule="auto"/>
+        <w:jc w:val="center"/>
+        <w:rPr>
+          <w:rFonts w:ascii="Times New Roman" w:hAnsi="Times New Roman" w:cs="Times New Roman"/>
+        </w:rPr>
+      </w:pPr>
+      <w:r>
+        <w:rPr>
+          <w:rFonts w:ascii="Times New Roman" w:hAnsi="Times New Roman" w:cs="Times New Roman"/>
+        </w:rPr>
+        <w:lastRenderedPageBreak/>
+        <w:drawing>
+          <wp:inline distT="0" distB="0" distL="0" distR="0" wp14:anchorId="1F3F5A7C" wp14:editId="0F249CB1">
+            <wp:extent cx="5943600" cy="7040880"/>
+            <wp:effectExtent l="0" t="0" r="0" b="7620"/>
+            <wp:docPr id="806476432" name="Picture 1"/>
+            <wp:cNvGraphicFramePr>
+              <a:graphicFrameLocks xmlns:a="http://schemas.openxmlformats.org/drawingml/2006/main" noChangeAspect="1"/>
+            </wp:cNvGraphicFramePr>
+            <a:graphic xmlns:a="http://schemas.openxmlformats.org/drawingml/2006/main">
+              <a:graphicData uri="http://schemas.openxmlformats.org/drawingml/2006/picture">
+                <pic:pic xmlns:pic="http://schemas.openxmlformats.org/drawingml/2006/picture">
+                  <pic:nvPicPr>
+                    <pic:cNvPr id="806476432" name=""/>
+                    <pic:cNvPicPr/>
+                  </pic:nvPicPr>
+                  <pic:blipFill>
+                    <a:blip r:embed="rId21"/>
+                    <a:stretch>
+                      <a:fillRect/>
+                    </a:stretch>
+                  </pic:blipFill>
+                  <pic:spPr>
+                    <a:xfrm>
+                      <a:off x="0" y="0"/>
+                      <a:ext cx="5943600" cy="7040880"/>
+                    </a:xfrm>
+                    <a:prstGeom prst="rect">
+                      <a:avLst/>
+                    </a:prstGeom>
+                  </pic:spPr>
+                </pic:pic>
+              </a:graphicData>
+            </a:graphic>
+          </wp:inline>
+        </w:drawing>
+      </w:r>
+    </w:p>
+    <w:p>
+      <w:pPr>
+        <w:spacing w:after="120" w:line="240" w:lineRule="auto"/>
+        <w:jc w:val="center"/>
+        <w:rPr>
+          <w:rFonts w:ascii="Times New Roman" w:hAnsi="Times New Roman" w:cs="Times New Roman"/>
+        </w:rPr>
+      </w:pPr>
+      <w:r>
+        <w:rPr>
+          <w:rFonts w:ascii="Times New Roman" w:hAnsi="Times New Roman" w:cs="Times New Roman"/>
+        </w:rPr>
+        <w:lastRenderedPageBreak/>
+        <w:drawing>
+          <wp:inline distT="0" distB="0" distL="0" distR="0" wp14:anchorId="044D8EE8" wp14:editId="64C5667C">
+            <wp:extent cx="5943600" cy="6297295"/>
+            <wp:effectExtent l="0" t="0" r="0" b="8255"/>
+            <wp:docPr id="897311601" name="Picture 1"/>
+            <wp:cNvGraphicFramePr>
+              <a:graphicFrameLocks xmlns:a="http://schemas.openxmlformats.org/drawingml/2006/main" noChangeAspect="1"/>
+            </wp:cNvGraphicFramePr>
+            <a:graphic xmlns:a="http://schemas.openxmlformats.org/drawingml/2006/main">
+              <a:graphicData uri="http://schemas.openxmlformats.org/drawingml/2006/picture">
+                <pic:pic xmlns:pic="http://schemas.openxmlformats.org/drawingml/2006/picture">
+                  <pic:nvPicPr>
+                    <pic:cNvPr id="897311601" name=""/>
+                    <pic:cNvPicPr/>
+                  </pic:nvPicPr>
+                  <pic:blipFill>
+                    <a:blip r:embed="rId22"/>
+                    <a:stretch>
+                      <a:fillRect/>
+                    </a:stretch>
+                  </pic:blipFill>
+                  <pic:spPr>
+                    <a:xfrm>
+                      <a:off x="0" y="0"/>
+                      <a:ext cx="5943600" cy="6297295"/>
+                    </a:xfrm>
+                    <a:prstGeom prst="rect">
+                      <a:avLst/>
+                    </a:prstGeom>
+                  </pic:spPr>
+                </pic:pic>
+              </a:graphicData>
+            </a:graphic>
+          </wp:inline>
+        </w:drawing>
+      </w:r>
+    </w:p>
+    <w:p>
+      <w:pPr>
+        <w:spacing w:after="120" w:line="240" w:lineRule="auto"/>
+        <w:jc w:val="center"/>
+        <w:rPr>
+          <w:rFonts w:ascii="Times New Roman" w:hAnsi="Times New Roman" w:cs="Times New Roman"/>
+        </w:rPr>
+      </w:pPr>
+      <w:r>
+        <w:rPr>
+          <w:rFonts w:ascii="Times New Roman" w:hAnsi="Times New Roman" w:cs="Times New Roman"/>
+        </w:rPr>
+        <w:lastRenderedPageBreak/>
+        <w:drawing>
+          <wp:inline distT="0" distB="0" distL="0" distR="0" wp14:anchorId="681B6097" wp14:editId="7D5564EB">
+            <wp:extent cx="5318125" cy="8229600"/>
+            <wp:effectExtent l="0" t="0" r="0" b="0"/>
+            <wp:docPr id="857539571" name="Picture 1"/>
+            <wp:cNvGraphicFramePr>
+              <a:graphicFrameLocks xmlns:a="http://schemas.openxmlformats.org/drawingml/2006/main" noChangeAspect="1"/>
+            </wp:cNvGraphicFramePr>
+            <a:graphic xmlns:a="http://schemas.openxmlformats.org/drawingml/2006/main">
+              <a:graphicData uri="http://schemas.openxmlformats.org/drawingml/2006/picture">
+                <pic:pic xmlns:pic="http://schemas.openxmlformats.org/drawingml/2006/picture">
+                  <pic:nvPicPr>
+                    <pic:cNvPr id="857539571" name=""/>
+                    <pic:cNvPicPr/>
+                  </pic:nvPicPr>
+                  <pic:blipFill>
+                    <a:blip r:embed="rId23"/>
+                    <a:stretch>
+                      <a:fillRect/>
+                    </a:stretch>
+                  </pic:blipFill>
+                  <pic:spPr>
+                    <a:xfrm>
+                      <a:off x="0" y="0"/>
+                      <a:ext cx="5318125" cy="8229600"/>
+                    </a:xfrm>
+                    <a:prstGeom prst="rect">
+                      <a:avLst/>
+                    </a:prstGeom>
+                  </pic:spPr>
+                </pic:pic>
+              </a:graphicData>
+            </a:graphic>
+          </wp:inline>
+        </w:drawing>
       </w:r>
     </w:p>
     <w:p>
@@ -3619,38 +4074,37 @@
         <w:rPr>
           <w:rFonts w:ascii="Times New Roman" w:hAnsi="Times New Roman" w:cs="Times New Roman"/>
         </w:rPr>
-        <w:t>Transactions with Rollback built into views</w:t>
-      </w:r>
-      <w:r>
-        <w:rPr>
-          <w:rFonts w:ascii="Times New Roman" w:hAnsi="Times New Roman" w:cs="Times New Roman"/>
-        </w:rPr>
-        <w:t xml:space="preserve"> </w:t>
-      </w:r>
-      <w:r>
-        <w:rPr>
-          <w:rFonts w:ascii="Times New Roman" w:hAnsi="Times New Roman" w:cs="Times New Roman"/>
-        </w:rPr>
-        <w:t>–</w:t>
-      </w:r>
-      <w:r>
-        <w:rPr>
-          <w:rFonts w:ascii="Times New Roman" w:hAnsi="Times New Roman" w:cs="Times New Roman"/>
-        </w:rPr>
-        <w:t xml:space="preserve"> TODO</w:t>
-      </w:r>
-    </w:p>
-    <w:p>
-      <w:pPr>
-        <w:rPr>
-          <w:rFonts w:ascii="Times New Roman" w:hAnsi="Times New Roman" w:cs="Times New Roman"/>
-        </w:rPr>
-      </w:pPr>
-      <w:r>
-        <w:rPr>
-          <w:rFonts w:ascii="Times New Roman" w:hAnsi="Times New Roman" w:cs="Times New Roman"/>
-        </w:rPr>
-        <w:t>TODO: discuss how each script is created and explain why it was created with the being transaction and commit and explain the automatic rollback on a failure</w:t>
+        <w:t xml:space="preserve">I mainly utilized transactional safety when working on running the INSERT queries from the data source tables into the final normalized </w:t>
+      </w:r>
+      <w:r>
+        <w:rPr>
+          <w:rFonts w:ascii="Times New Roman" w:hAnsi="Times New Roman" w:cs="Times New Roman"/>
+        </w:rPr>
+        <w:t>schema</w:t>
+      </w:r>
+      <w:r>
+        <w:rPr>
+          <w:rFonts w:ascii="Times New Roman" w:hAnsi="Times New Roman" w:cs="Times New Roman"/>
+        </w:rPr>
+        <w:t xml:space="preserve">. </w:t>
+      </w:r>
+      <w:r>
+        <w:rPr>
+          <w:rFonts w:ascii="Times New Roman" w:hAnsi="Times New Roman" w:cs="Times New Roman"/>
+        </w:rPr>
+        <w:t>W</w:t>
+      </w:r>
+      <w:r>
+        <w:rPr>
+          <w:rFonts w:ascii="Times New Roman" w:hAnsi="Times New Roman" w:cs="Times New Roman"/>
+        </w:rPr>
+        <w:t>hile doing this one thing that I wanted to keep track of and manage is only</w:t>
+      </w:r>
+      <w:r>
+        <w:rPr>
+          <w:rFonts w:ascii="Times New Roman" w:hAnsi="Times New Roman" w:cs="Times New Roman"/>
+        </w:rPr>
+        <w:t xml:space="preserve"> to update the normalized namespace tables if the entire migrations script succeeds. To achieve this, I created an individual SQL script file for each source and wrapped all the migration logic (aka the INSERT queries) in a single transaction using BEGIN TRANSACTION and COMMIT. This allows all INSERT statements to be executed within one transaction block, and if any step fails during execution, the transaction is not committed, the transaction is automatically rolled back and none of the data that was being transferred during the transaction makes it into any of the normalized namespace tables. This approach guarantees no partial data ever makes it into any of the tables and I don’t have worry about data duplication or remnant data existing from a previous data transformation/migration attempt.</w:t>
       </w:r>
     </w:p>
     <w:p>
@@ -3674,54 +4128,119 @@
           <w:sz w:val="28"/>
           <w:szCs w:val="28"/>
         </w:rPr>
+        <w:t>ACID Compliance</w:t>
+      </w:r>
+    </w:p>
+    <w:p>
+      <w:pPr>
+        <w:rPr>
+          <w:rFonts w:ascii="Times New Roman" w:hAnsi="Times New Roman" w:cs="Times New Roman"/>
+        </w:rPr>
+      </w:pPr>
+      <w:r>
+        <w:rPr>
+          <w:rFonts w:ascii="Times New Roman" w:hAnsi="Times New Roman" w:cs="Times New Roman"/>
+        </w:rPr>
+        <w:t xml:space="preserve">ACID is an acronym that represents four guarantees of reliable database transactions which are Atomicity, Consistency, Isolation, and Durability. Atomicity simply ensures an “all or nothing” result, meaning that if any part of the transaction fails, none of it is applied to the database. The next guarantee is consistency, which ensures that the database will be in a valid state </w:t>
+      </w:r>
+      <w:r>
+        <w:rPr>
+          <w:rFonts w:ascii="Times New Roman" w:hAnsi="Times New Roman" w:cs="Times New Roman"/>
+        </w:rPr>
+        <w:t xml:space="preserve">before and after the transaction executes with all constraints, relationships, and rules remaining satisfied. Isolation ensures that transactions that are running at the same time do not interfere with one another, thus preventing intermediate or partial states from being visible to another transaction while one is running. The final guarantee is durability which ensures that once a transaction is committed, its changes remain, even if the system crashes shortly after the transaction completes.  </w:t>
+      </w:r>
+    </w:p>
+    <w:p>
+      <w:pPr>
+        <w:rPr>
+          <w:rFonts w:ascii="Times New Roman" w:hAnsi="Times New Roman" w:cs="Times New Roman"/>
+        </w:rPr>
+      </w:pPr>
+      <w:r>
+        <w:rPr>
+          <w:rFonts w:ascii="Times New Roman" w:hAnsi="Times New Roman" w:cs="Times New Roman"/>
+        </w:rPr>
+        <w:t>Using an ACID compliant database is an important consideration for this project, especially during the data transformation process when data is being migrated from the source tables to the normalized schema. By placing all the INSERT SQL statements within a transactional boundary, I ensured atomicity where either all the data was successfully migrated, or none of it is. This prevented partial writ</w:t>
+      </w:r>
+      <w:r>
+        <w:rPr>
+          <w:rFonts w:ascii="Times New Roman" w:hAnsi="Times New Roman" w:cs="Times New Roman"/>
+        </w:rPr>
+        <w:t>es</w:t>
+      </w:r>
+      <w:r>
+        <w:rPr>
+          <w:rFonts w:ascii="Times New Roman" w:hAnsi="Times New Roman" w:cs="Times New Roman"/>
+        </w:rPr>
+        <w:t xml:space="preserve"> to the database that would have made additional work reset</w:t>
+      </w:r>
+      <w:r>
+        <w:rPr>
+          <w:rFonts w:ascii="Times New Roman" w:hAnsi="Times New Roman" w:cs="Times New Roman"/>
+        </w:rPr>
+        <w:t xml:space="preserve"> the database</w:t>
+      </w:r>
+      <w:r>
+        <w:rPr>
+          <w:rFonts w:ascii="Times New Roman" w:hAnsi="Times New Roman" w:cs="Times New Roman"/>
+        </w:rPr>
+        <w:t xml:space="preserve"> before trying the migration process again</w:t>
+      </w:r>
+      <w:r>
+        <w:rPr>
+          <w:rFonts w:ascii="Times New Roman" w:hAnsi="Times New Roman" w:cs="Times New Roman"/>
+        </w:rPr>
+        <w:t xml:space="preserve"> while also </w:t>
+      </w:r>
+      <w:r>
+        <w:rPr>
+          <w:rFonts w:ascii="Times New Roman" w:hAnsi="Times New Roman" w:cs="Times New Roman"/>
+        </w:rPr>
+        <w:t>reinforc</w:t>
+      </w:r>
+      <w:r>
+        <w:rPr>
+          <w:rFonts w:ascii="Times New Roman" w:hAnsi="Times New Roman" w:cs="Times New Roman"/>
+        </w:rPr>
+        <w:t>ing</w:t>
+      </w:r>
+      <w:r>
+        <w:rPr>
+          <w:rFonts w:ascii="Times New Roman" w:hAnsi="Times New Roman" w:cs="Times New Roman"/>
+        </w:rPr>
+        <w:t xml:space="preserve"> overall data integrity.</w:t>
+      </w:r>
+    </w:p>
+    <w:p>
+      <w:pPr>
+        <w:rPr>
+          <w:rFonts w:ascii="Times New Roman" w:hAnsi="Times New Roman" w:cs="Times New Roman"/>
+        </w:rPr>
+      </w:pPr>
+      <w:r>
+        <w:rPr>
+          <w:rFonts w:ascii="Times New Roman" w:hAnsi="Times New Roman" w:cs="Times New Roman"/>
+        </w:rPr>
         <w:lastRenderedPageBreak/>
-        <w:t>ACID Compliance</w:t>
-      </w:r>
-    </w:p>
-    <w:p>
-      <w:pPr>
-        <w:rPr>
-          <w:rFonts w:ascii="Times New Roman" w:hAnsi="Times New Roman" w:cs="Times New Roman"/>
-        </w:rPr>
-      </w:pPr>
-      <w:r>
-        <w:rPr>
-          <w:rFonts w:ascii="Times New Roman" w:hAnsi="Times New Roman" w:cs="Times New Roman"/>
-        </w:rPr>
-        <w:t>ACID compliance – Transaction properties</w:t>
-      </w:r>
-      <w:r>
-        <w:rPr>
-          <w:rFonts w:ascii="Times New Roman" w:hAnsi="Times New Roman" w:cs="Times New Roman"/>
-        </w:rPr>
-        <w:t xml:space="preserve"> </w:t>
-      </w:r>
-      <w:r>
-        <w:rPr>
-          <w:rFonts w:ascii="Times New Roman" w:hAnsi="Times New Roman" w:cs="Times New Roman"/>
-        </w:rPr>
-        <w:t>–</w:t>
-      </w:r>
-      <w:r>
-        <w:rPr>
-          <w:rFonts w:ascii="Times New Roman" w:hAnsi="Times New Roman" w:cs="Times New Roman"/>
-        </w:rPr>
-        <w:t xml:space="preserve"> TODO</w:t>
-      </w:r>
-    </w:p>
-    <w:p>
-      <w:pPr>
-        <w:rPr>
-          <w:rFonts w:ascii="Times New Roman" w:hAnsi="Times New Roman" w:cs="Times New Roman"/>
-          <w:i/>
-          <w:iCs/>
-        </w:rPr>
-      </w:pPr>
-      <w:r>
-        <w:rPr>
-          <w:rFonts w:ascii="Times New Roman" w:hAnsi="Times New Roman" w:cs="Times New Roman"/>
-        </w:rPr>
-        <w:t>TODO: outline the ACID Compliance and how it helps out this project</w:t>
+        <w:t xml:space="preserve">It is also worth noting that both DuckDB and PostgreSQL are ACID compliant databases, but they are optimized for different use cases. DuckDB on one hand is designed for OLAP (analytical) workloads, making it well suited for data transformation and processing tasks. PostgreSQL on the other hand is optimized for OLTP (transactional) workloads and supports high concurrency, making it </w:t>
+      </w:r>
+      <w:r>
+        <w:rPr>
+          <w:rFonts w:ascii="Times New Roman" w:hAnsi="Times New Roman" w:cs="Times New Roman"/>
+        </w:rPr>
+        <w:t>more optimized for serving data in an application environment. In this project, DuckDB was used to transform and prepare data for application use, while PostgreSQL is intended to serve it. PostgreSQL also outshines DuckDB based on its optimization for high-concurrent workloads that can scale based on application usage</w:t>
+      </w:r>
+      <w:r>
+        <w:rPr>
+          <w:rFonts w:ascii="Times New Roman" w:hAnsi="Times New Roman" w:cs="Times New Roman"/>
+        </w:rPr>
+        <w:t xml:space="preserve"> (Kutz)</w:t>
+      </w:r>
+      <w:r>
+        <w:rPr>
+          <w:rFonts w:ascii="Times New Roman" w:hAnsi="Times New Roman" w:cs="Times New Roman"/>
+        </w:rPr>
+        <w:t xml:space="preserve">. </w:t>
       </w:r>
     </w:p>
     <w:p>
@@ -3779,7 +4298,19 @@
         <w:rPr>
           <w:rFonts w:ascii="Times New Roman" w:hAnsi="Times New Roman" w:cs="Times New Roman"/>
         </w:rPr>
-        <w:t xml:space="preserve">I learned a lot from this project. First, I learned about DuckDB as a piece of technology mainly used for analytical purposes. Working with DuckDB was quick to setup, easy to interact with, and interesting to use when properly uploading and managing data from multiple different sources. </w:t>
+        <w:t xml:space="preserve">I learned a lot from this project. First, I learned about DuckDB as a piece of technology mainly used for analytical purposes. Working with DuckDB was quick to </w:t>
+      </w:r>
+      <w:r>
+        <w:rPr>
+          <w:rFonts w:ascii="Times New Roman" w:hAnsi="Times New Roman" w:cs="Times New Roman"/>
+        </w:rPr>
+        <w:t>set up</w:t>
+      </w:r>
+      <w:r>
+        <w:rPr>
+          <w:rFonts w:ascii="Times New Roman" w:hAnsi="Times New Roman" w:cs="Times New Roman"/>
+        </w:rPr>
+        <w:t xml:space="preserve">, easy to interact with, and interesting to use when properly uploading and managing data from multiple different sources. </w:t>
       </w:r>
     </w:p>
     <w:p>
@@ -3910,21 +4441,28 @@
           <w:rFonts w:ascii="Times New Roman" w:eastAsia="Arial" w:hAnsi="Times New Roman" w:cs="Times New Roman"/>
           <w:color w:val="1A1A1A"/>
         </w:rPr>
-        <w:t>First, not all data sources are equally complete. The NPS data source is the most comprehensive. However, the MN DNR and MN GIS data sources are only partial, and there is meaningful overlap between them that ideally would be merged. The next step for this project after the semester would be to create a process that analyzes locations by their latitude and longitude proximity and estimates which locations should be merged, made parent-child relationships, or treated as distinct entities.</w:t>
-      </w:r>
-    </w:p>
-    <w:p>
-      <w:pPr>
-        <w:rPr>
-          <w:rFonts w:ascii="Times New Roman" w:hAnsi="Times New Roman" w:cs="Times New Roman"/>
-        </w:rPr>
-      </w:pPr>
+        <w:t xml:space="preserve">First, not all data sources are equally complete. The NPS data source is the most comprehensive. However, the MN DNR and MN GIS data sources are only partial, and there is meaningful overlap between them that ideally would be merged. The next step for this project after the semester would be to create a process that analyzes locations by their latitude and longitude </w:t>
+      </w:r>
       <w:r>
         <w:rPr>
           <w:rFonts w:ascii="Times New Roman" w:eastAsia="Arial" w:hAnsi="Times New Roman" w:cs="Times New Roman"/>
           <w:color w:val="1A1A1A"/>
         </w:rPr>
         <w:lastRenderedPageBreak/>
+        <w:t>proximity and estimates which locations should be merged, made parent-child relationships, or treated as distinct entities.</w:t>
+      </w:r>
+    </w:p>
+    <w:p>
+      <w:pPr>
+        <w:rPr>
+          <w:rFonts w:ascii="Times New Roman" w:hAnsi="Times New Roman" w:cs="Times New Roman"/>
+        </w:rPr>
+      </w:pPr>
+      <w:r>
+        <w:rPr>
+          <w:rFonts w:ascii="Times New Roman" w:eastAsia="Arial" w:hAnsi="Times New Roman" w:cs="Times New Roman"/>
+          <w:color w:val="1A1A1A"/>
+        </w:rPr>
         <w:t xml:space="preserve">Second, it was difficult to properly assign locations </w:t>
       </w:r>
       <w:r>
@@ -4079,17 +4617,40 @@
     <w:p>
       <w:pPr>
         <w:rPr>
-          <w:rFonts w:ascii="Times New Roman" w:hAnsi="Times New Roman" w:cs="Times New Roman"/>
-        </w:rPr>
-      </w:pPr>
-      <w:r>
-        <w:rPr>
           <w:rFonts w:ascii="Times New Roman" w:eastAsia="Arial" w:hAnsi="Times New Roman" w:cs="Times New Roman"/>
           <w:color w:val="1A1A1A"/>
           <w:sz w:val="22"/>
           <w:szCs w:val="22"/>
         </w:rPr>
-        <w:t xml:space="preserve">The first limitation is that several data sources are not entirely complete. The RIDB and NPS data sources are the most comprehensive. However, the MN DNR and MN GIS sources are far from complete and likely contain overlapping location references to the same physical places. The next step will be to create a </w:t>
+      </w:pPr>
+      <w:r>
+        <w:rPr>
+          <w:rFonts w:ascii="Times New Roman" w:eastAsia="Arial" w:hAnsi="Times New Roman" w:cs="Times New Roman"/>
+          <w:color w:val="1A1A1A"/>
+          <w:sz w:val="22"/>
+          <w:szCs w:val="22"/>
+        </w:rPr>
+        <w:t xml:space="preserve">The first limitation is that several data sources are not entirely complete. </w:t>
+      </w:r>
+      <w:proofErr w:type="gramStart"/>
+      <w:r>
+        <w:rPr>
+          <w:rFonts w:ascii="Times New Roman" w:eastAsia="Arial" w:hAnsi="Times New Roman" w:cs="Times New Roman"/>
+          <w:color w:val="1A1A1A"/>
+          <w:sz w:val="22"/>
+          <w:szCs w:val="22"/>
+        </w:rPr>
+        <w:t>The RIDB</w:t>
+      </w:r>
+      <w:proofErr w:type="gramEnd"/>
+      <w:r>
+        <w:rPr>
+          <w:rFonts w:ascii="Times New Roman" w:eastAsia="Arial" w:hAnsi="Times New Roman" w:cs="Times New Roman"/>
+          <w:color w:val="1A1A1A"/>
+          <w:sz w:val="22"/>
+          <w:szCs w:val="22"/>
+        </w:rPr>
+        <w:t xml:space="preserve"> and NPS data sources are the most comprehensive. However, the MN DNR and MN GIS sources are far from complete and likely contain overlapping location references to the same physical places. The next step will be to create a </w:t>
       </w:r>
       <w:r>
         <w:rPr>
@@ -4239,6 +4800,7 @@
           <w:bCs/>
           <w:color w:val="1A1A1A"/>
         </w:rPr>
+        <w:lastRenderedPageBreak/>
         <w:t>Data Licensing and Public Availability</w:t>
       </w:r>
       <w:r>
@@ -4246,15 +4808,7 @@
           <w:rFonts w:ascii="Times New Roman" w:eastAsia="Arial" w:hAnsi="Times New Roman" w:cs="Times New Roman"/>
           <w:color w:val="1A1A1A"/>
         </w:rPr>
-        <w:t xml:space="preserve">: Most data collected for this project comes from state and federal government websites, which are generally considered publicly available. However, before publishing this project or its data publicly, I would need to confirm that </w:t>
-      </w:r>
-      <w:r>
-        <w:rPr>
-          <w:rFonts w:ascii="Times New Roman" w:eastAsia="Arial" w:hAnsi="Times New Roman" w:cs="Times New Roman"/>
-          <w:color w:val="1A1A1A"/>
-        </w:rPr>
-        <w:lastRenderedPageBreak/>
-        <w:t>the specific datasets used can be legally redistributed on a personal</w:t>
+        <w:t>: Most data collected for this project comes from state and federal government websites, which are generally considered publicly available. However, before publishing this project or its data publicly, I would need to confirm that the specific datasets used can be legally redistributed on a personal</w:t>
       </w:r>
       <w:r>
         <w:rPr>
@@ -4268,7 +4822,23 @@
           <w:rFonts w:ascii="Times New Roman" w:eastAsia="Arial" w:hAnsi="Times New Roman" w:cs="Times New Roman"/>
           <w:color w:val="1A1A1A"/>
         </w:rPr>
-        <w:t xml:space="preserve"> website, particularly the Google Places API data, which has specific terms of service around caching and redistribution.</w:t>
+        <w:t xml:space="preserve"> website, particularly </w:t>
+      </w:r>
+      <w:proofErr w:type="gramStart"/>
+      <w:r>
+        <w:rPr>
+          <w:rFonts w:ascii="Times New Roman" w:eastAsia="Arial" w:hAnsi="Times New Roman" w:cs="Times New Roman"/>
+          <w:color w:val="1A1A1A"/>
+        </w:rPr>
+        <w:t>the Google</w:t>
+      </w:r>
+      <w:proofErr w:type="gramEnd"/>
+      <w:r>
+        <w:rPr>
+          <w:rFonts w:ascii="Times New Roman" w:eastAsia="Arial" w:hAnsi="Times New Roman" w:cs="Times New Roman"/>
+          <w:color w:val="1A1A1A"/>
+        </w:rPr>
+        <w:t xml:space="preserve"> Places API data, which has specific terms of service around caching and redistribution.</w:t>
       </w:r>
       <w:r>
         <w:rPr>
@@ -4326,8 +4896,17 @@
           <w:rFonts w:ascii="Times New Roman" w:eastAsia="Arial" w:hAnsi="Times New Roman" w:cs="Times New Roman"/>
           <w:color w:val="1A1A1A"/>
         </w:rPr>
-        <w:t xml:space="preserve"> project</w:t>
-      </w:r>
+        <w:t xml:space="preserve"> </w:t>
+      </w:r>
+      <w:proofErr w:type="gramStart"/>
+      <w:r>
+        <w:rPr>
+          <w:rFonts w:ascii="Times New Roman" w:eastAsia="Arial" w:hAnsi="Times New Roman" w:cs="Times New Roman"/>
+          <w:color w:val="1A1A1A"/>
+        </w:rPr>
+        <w:t>project</w:t>
+      </w:r>
+      <w:proofErr w:type="gramEnd"/>
       <w:r>
         <w:rPr>
           <w:rFonts w:ascii="Times New Roman" w:eastAsia="Arial" w:hAnsi="Times New Roman" w:cs="Times New Roman"/>
@@ -4489,8 +5068,1073 @@
         </w:rPr>
       </w:pPr>
     </w:p>
+    <w:p>
+      <w:pPr>
+        <w:jc w:val="center"/>
+        <w:rPr>
+          <w:b/>
+          <w:bCs/>
+          <w:color w:val="156082" w:themeColor="accent1"/>
+          <w:sz w:val="32"/>
+          <w:szCs w:val="32"/>
+        </w:rPr>
+      </w:pPr>
+    </w:p>
+    <w:p>
+      <w:pPr>
+        <w:jc w:val="center"/>
+        <w:rPr>
+          <w:b/>
+          <w:bCs/>
+          <w:color w:val="156082" w:themeColor="accent1"/>
+          <w:sz w:val="32"/>
+          <w:szCs w:val="32"/>
+        </w:rPr>
+      </w:pPr>
+      <w:r>
+        <w:rPr>
+          <w:b/>
+          <w:bCs/>
+          <w:color w:val="156082" w:themeColor="accent1"/>
+          <w:sz w:val="32"/>
+          <w:szCs w:val="32"/>
+        </w:rPr>
+        <w:lastRenderedPageBreak/>
+        <w:t>Works Cited</w:t>
+      </w:r>
+    </w:p>
+    <w:p>
+      <w:pPr>
+        <w:rPr>
+          <w:rFonts w:ascii="Times New Roman" w:hAnsi="Times New Roman" w:cs="Times New Roman"/>
+        </w:rPr>
+      </w:pPr>
+      <w:r>
+        <w:rPr>
+          <w:rFonts w:ascii="Times New Roman" w:hAnsi="Times New Roman" w:cs="Times New Roman"/>
+        </w:rPr>
+        <w:t xml:space="preserve">“6 Best </w:t>
+      </w:r>
+      <w:proofErr w:type="gramStart"/>
+      <w:r>
+        <w:rPr>
+          <w:rFonts w:ascii="Times New Roman" w:hAnsi="Times New Roman" w:cs="Times New Roman"/>
+        </w:rPr>
+        <w:t>Open Source</w:t>
+      </w:r>
+      <w:proofErr w:type="gramEnd"/>
+      <w:r>
+        <w:rPr>
+          <w:rFonts w:ascii="Times New Roman" w:hAnsi="Times New Roman" w:cs="Times New Roman"/>
+        </w:rPr>
+        <w:t xml:space="preserve"> Geodatabase Solutions to Explore.”</w:t>
+      </w:r>
+      <w:r>
+        <w:rPr>
+          <w:rFonts w:ascii="Times New Roman" w:hAnsi="Times New Roman" w:cs="Times New Roman"/>
+        </w:rPr>
+        <w:t xml:space="preserve"> </w:t>
+      </w:r>
+      <w:r>
+        <w:rPr>
+          <w:rFonts w:ascii="Times New Roman" w:hAnsi="Times New Roman" w:cs="Times New Roman"/>
+          <w:i/>
+          <w:iCs/>
+        </w:rPr>
+        <w:t>maplibrary.org</w:t>
+      </w:r>
+      <w:r>
+        <w:rPr>
+          <w:rFonts w:ascii="Times New Roman" w:hAnsi="Times New Roman" w:cs="Times New Roman"/>
+        </w:rPr>
+        <w:t>,</w:t>
+      </w:r>
+      <w:r>
+        <w:rPr>
+          <w:rFonts w:ascii="Times New Roman" w:hAnsi="Times New Roman" w:cs="Times New Roman"/>
+        </w:rPr>
+        <w:t xml:space="preserve"> Map Library, </w:t>
+      </w:r>
+      <w:hyperlink r:id="rId24" w:history="1">
+        <w:r>
+          <w:rPr>
+            <w:rStyle w:val="Hyperlink"/>
+            <w:rFonts w:ascii="Times New Roman" w:hAnsi="Times New Roman" w:cs="Times New Roman"/>
+          </w:rPr>
+          <w:t>https://www.maplibrary.org/10579/6-best-open-source-geodatabas</w:t>
+        </w:r>
+        <w:r>
+          <w:rPr>
+            <w:rStyle w:val="Hyperlink"/>
+            <w:rFonts w:ascii="Times New Roman" w:hAnsi="Times New Roman" w:cs="Times New Roman"/>
+          </w:rPr>
+          <w:t>e</w:t>
+        </w:r>
+        <w:r>
+          <w:rPr>
+            <w:rStyle w:val="Hyperlink"/>
+            <w:rFonts w:ascii="Times New Roman" w:hAnsi="Times New Roman" w:cs="Times New Roman"/>
+          </w:rPr>
+          <w:t>-solutions-to-explore/</w:t>
+        </w:r>
+      </w:hyperlink>
+      <w:r>
+        <w:rPr>
+          <w:rFonts w:ascii="Times New Roman" w:hAnsi="Times New Roman" w:cs="Times New Roman"/>
+        </w:rPr>
+        <w:t>.</w:t>
+      </w:r>
+      <w:r>
+        <w:rPr>
+          <w:rFonts w:ascii="Times New Roman" w:hAnsi="Times New Roman" w:cs="Times New Roman"/>
+        </w:rPr>
+        <w:t xml:space="preserve"> Accessed 2</w:t>
+      </w:r>
+      <w:r>
+        <w:rPr>
+          <w:rFonts w:ascii="Times New Roman" w:hAnsi="Times New Roman" w:cs="Times New Roman"/>
+        </w:rPr>
+        <w:t>4</w:t>
+      </w:r>
+      <w:r>
+        <w:rPr>
+          <w:rFonts w:ascii="Times New Roman" w:hAnsi="Times New Roman" w:cs="Times New Roman"/>
+        </w:rPr>
+        <w:t xml:space="preserve"> April 2026.</w:t>
+      </w:r>
+    </w:p>
+    <w:p>
+      <w:pPr>
+        <w:rPr>
+          <w:rFonts w:ascii="Times New Roman" w:hAnsi="Times New Roman" w:cs="Times New Roman"/>
+        </w:rPr>
+      </w:pPr>
+      <w:r>
+        <w:rPr>
+          <w:rFonts w:ascii="Times New Roman" w:hAnsi="Times New Roman" w:cs="Times New Roman"/>
+        </w:rPr>
+        <w:t xml:space="preserve">“DuckDB vs PostgreSQL: </w:t>
+      </w:r>
+      <w:r>
+        <w:rPr>
+          <w:rFonts w:ascii="Times New Roman" w:hAnsi="Times New Roman" w:cs="Times New Roman"/>
+        </w:rPr>
+        <w:t>What’s Better for Data Analysis in 2025?</w:t>
+      </w:r>
+      <w:r>
+        <w:rPr>
+          <w:rFonts w:ascii="Times New Roman" w:hAnsi="Times New Roman" w:cs="Times New Roman"/>
+        </w:rPr>
+        <w:t>.”</w:t>
+      </w:r>
+      <w:r>
+        <w:rPr>
+          <w:rFonts w:ascii="Times New Roman" w:hAnsi="Times New Roman" w:cs="Times New Roman"/>
+        </w:rPr>
+        <w:t xml:space="preserve"> </w:t>
+      </w:r>
+      <w:r>
+        <w:rPr>
+          <w:rFonts w:ascii="Times New Roman" w:hAnsi="Times New Roman" w:cs="Times New Roman"/>
+          <w:i/>
+          <w:iCs/>
+        </w:rPr>
+        <w:t>digitalogy.co</w:t>
+      </w:r>
+      <w:r>
+        <w:rPr>
+          <w:rFonts w:ascii="Times New Roman" w:hAnsi="Times New Roman" w:cs="Times New Roman"/>
+        </w:rPr>
+        <w:t>,</w:t>
+      </w:r>
+      <w:r>
+        <w:rPr>
+          <w:rFonts w:ascii="Times New Roman" w:hAnsi="Times New Roman" w:cs="Times New Roman"/>
+        </w:rPr>
+        <w:t xml:space="preserve"> </w:t>
+      </w:r>
+      <w:proofErr w:type="spellStart"/>
+      <w:r>
+        <w:rPr>
+          <w:rFonts w:ascii="Times New Roman" w:hAnsi="Times New Roman" w:cs="Times New Roman"/>
+        </w:rPr>
+        <w:t>Digitalogy</w:t>
+      </w:r>
+      <w:proofErr w:type="spellEnd"/>
+      <w:r>
+        <w:rPr>
+          <w:rFonts w:ascii="Times New Roman" w:hAnsi="Times New Roman" w:cs="Times New Roman"/>
+        </w:rPr>
+        <w:t>,</w:t>
+      </w:r>
+      <w:r>
+        <w:rPr>
+          <w:rFonts w:ascii="Times New Roman" w:hAnsi="Times New Roman" w:cs="Times New Roman"/>
+        </w:rPr>
+        <w:t xml:space="preserve"> 13 May 2025,</w:t>
+      </w:r>
+      <w:r>
+        <w:rPr>
+          <w:rFonts w:ascii="Times New Roman" w:hAnsi="Times New Roman" w:cs="Times New Roman"/>
+        </w:rPr>
+        <w:t xml:space="preserve"> </w:t>
+      </w:r>
+      <w:r>
+        <w:rPr>
+          <w:rFonts w:ascii="Times New Roman" w:hAnsi="Times New Roman" w:cs="Times New Roman"/>
+        </w:rPr>
+        <w:t xml:space="preserve"> </w:t>
+      </w:r>
+      <w:hyperlink r:id="rId25" w:history="1">
+        <w:r>
+          <w:rPr>
+            <w:rStyle w:val="Hyperlink"/>
+            <w:rFonts w:ascii="Times New Roman" w:hAnsi="Times New Roman" w:cs="Times New Roman"/>
+          </w:rPr>
+          <w:t>https://www.digitalogy.co/blog/duckdb-vs-postgresql/</w:t>
+        </w:r>
+      </w:hyperlink>
+      <w:r>
+        <w:rPr>
+          <w:rFonts w:ascii="Times New Roman" w:hAnsi="Times New Roman" w:cs="Times New Roman"/>
+        </w:rPr>
+        <w:t>.</w:t>
+      </w:r>
+      <w:r>
+        <w:rPr>
+          <w:rFonts w:ascii="Times New Roman" w:hAnsi="Times New Roman" w:cs="Times New Roman"/>
+        </w:rPr>
+        <w:t xml:space="preserve"> Accessed 21 April 2026.</w:t>
+      </w:r>
+    </w:p>
+    <w:p>
+      <w:pPr>
+        <w:rPr>
+          <w:rFonts w:ascii="Times New Roman" w:hAnsi="Times New Roman" w:cs="Times New Roman"/>
+        </w:rPr>
+      </w:pPr>
+      <w:r>
+        <w:rPr>
+          <w:rFonts w:ascii="Times New Roman" w:hAnsi="Times New Roman" w:cs="Times New Roman"/>
+        </w:rPr>
+        <w:t xml:space="preserve">Kutz, Jim. </w:t>
+      </w:r>
+      <w:r>
+        <w:rPr>
+          <w:rFonts w:ascii="Times New Roman" w:hAnsi="Times New Roman" w:cs="Times New Roman"/>
+        </w:rPr>
+        <w:t>“DuckDB vs Postgres</w:t>
+      </w:r>
+      <w:r>
+        <w:rPr>
+          <w:rFonts w:ascii="Times New Roman" w:hAnsi="Times New Roman" w:cs="Times New Roman"/>
+        </w:rPr>
+        <w:t xml:space="preserve"> - </w:t>
+      </w:r>
+      <w:r>
+        <w:rPr>
+          <w:rFonts w:ascii="Times New Roman" w:hAnsi="Times New Roman" w:cs="Times New Roman"/>
+        </w:rPr>
+        <w:t xml:space="preserve">Key Differences.” </w:t>
+      </w:r>
+      <w:r>
+        <w:rPr>
+          <w:rFonts w:ascii="Times New Roman" w:hAnsi="Times New Roman" w:cs="Times New Roman"/>
+          <w:i/>
+          <w:iCs/>
+        </w:rPr>
+        <w:t>Airbyte.com</w:t>
+      </w:r>
+      <w:r>
+        <w:rPr>
+          <w:rFonts w:ascii="Times New Roman" w:hAnsi="Times New Roman" w:cs="Times New Roman"/>
+        </w:rPr>
+        <w:t xml:space="preserve">, </w:t>
+      </w:r>
+      <w:proofErr w:type="spellStart"/>
+      <w:r>
+        <w:rPr>
+          <w:rFonts w:ascii="Times New Roman" w:hAnsi="Times New Roman" w:cs="Times New Roman"/>
+        </w:rPr>
+        <w:t>Airbyte</w:t>
+      </w:r>
+      <w:proofErr w:type="spellEnd"/>
+      <w:r>
+        <w:rPr>
+          <w:rFonts w:ascii="Times New Roman" w:hAnsi="Times New Roman" w:cs="Times New Roman"/>
+        </w:rPr>
+        <w:t>, 1 Sept. 2025</w:t>
+      </w:r>
+      <w:r>
+        <w:rPr>
+          <w:rFonts w:ascii="Times New Roman" w:hAnsi="Times New Roman" w:cs="Times New Roman"/>
+        </w:rPr>
+        <w:t xml:space="preserve">, </w:t>
+      </w:r>
+      <w:hyperlink r:id="rId26" w:history="1">
+        <w:r>
+          <w:rPr>
+            <w:rStyle w:val="Hyperlink"/>
+            <w:rFonts w:ascii="Times New Roman" w:hAnsi="Times New Roman" w:cs="Times New Roman"/>
+          </w:rPr>
+          <w:t>http</w:t>
+        </w:r>
+        <w:r>
+          <w:rPr>
+            <w:rStyle w:val="Hyperlink"/>
+            <w:rFonts w:ascii="Times New Roman" w:hAnsi="Times New Roman" w:cs="Times New Roman"/>
+          </w:rPr>
+          <w:t>s</w:t>
+        </w:r>
+        <w:r>
+          <w:rPr>
+            <w:rStyle w:val="Hyperlink"/>
+            <w:rFonts w:ascii="Times New Roman" w:hAnsi="Times New Roman" w:cs="Times New Roman"/>
+          </w:rPr>
+          <w:t>://airbyte.com/data-engineering-resources/duckdb-vs-postgres</w:t>
+        </w:r>
+      </w:hyperlink>
+      <w:r>
+        <w:rPr>
+          <w:rFonts w:ascii="Times New Roman" w:hAnsi="Times New Roman" w:cs="Times New Roman"/>
+        </w:rPr>
+        <w:t>.</w:t>
+      </w:r>
+      <w:r>
+        <w:rPr>
+          <w:rFonts w:ascii="Times New Roman" w:hAnsi="Times New Roman" w:cs="Times New Roman"/>
+        </w:rPr>
+        <w:t xml:space="preserve"> Accessed 21 April 2026.</w:t>
+      </w:r>
+    </w:p>
+    <w:p>
+      <w:pPr>
+        <w:rPr>
+          <w:rFonts w:ascii="Times New Roman" w:hAnsi="Times New Roman" w:cs="Times New Roman"/>
+        </w:rPr>
+      </w:pPr>
+      <w:r>
+        <w:rPr>
+          <w:rFonts w:ascii="Times New Roman" w:hAnsi="Times New Roman" w:cs="Times New Roman"/>
+        </w:rPr>
+        <w:t>Matson, Jacob and Aditya Somani</w:t>
+      </w:r>
+      <w:r>
+        <w:rPr>
+          <w:rFonts w:ascii="Times New Roman" w:hAnsi="Times New Roman" w:cs="Times New Roman"/>
+        </w:rPr>
+        <w:t>.</w:t>
+      </w:r>
+      <w:r>
+        <w:rPr>
+          <w:rFonts w:ascii="Times New Roman" w:hAnsi="Times New Roman" w:cs="Times New Roman"/>
+        </w:rPr>
+        <w:t xml:space="preserve"> </w:t>
+      </w:r>
+      <w:r>
+        <w:rPr>
+          <w:rFonts w:ascii="Times New Roman" w:hAnsi="Times New Roman" w:cs="Times New Roman"/>
+        </w:rPr>
+        <w:t>“</w:t>
+      </w:r>
+      <w:r>
+        <w:rPr>
+          <w:rFonts w:ascii="Times New Roman" w:hAnsi="Times New Roman" w:cs="Times New Roman"/>
+        </w:rPr>
+        <w:t>PostgreSQL and Ducks: The Perfect Analytical Pairing</w:t>
+      </w:r>
+      <w:r>
+        <w:rPr>
+          <w:rFonts w:ascii="Times New Roman" w:hAnsi="Times New Roman" w:cs="Times New Roman"/>
+        </w:rPr>
+        <w:t xml:space="preserve">” </w:t>
+      </w:r>
+      <w:r>
+        <w:rPr>
+          <w:rFonts w:ascii="Times New Roman" w:hAnsi="Times New Roman" w:cs="Times New Roman"/>
+          <w:i/>
+          <w:iCs/>
+        </w:rPr>
+        <w:t>motherduck.com</w:t>
+      </w:r>
+      <w:r>
+        <w:rPr>
+          <w:rFonts w:ascii="Times New Roman" w:hAnsi="Times New Roman" w:cs="Times New Roman"/>
+        </w:rPr>
+        <w:t>,</w:t>
+      </w:r>
+      <w:r>
+        <w:rPr>
+          <w:rFonts w:ascii="Times New Roman" w:hAnsi="Times New Roman" w:cs="Times New Roman"/>
+          <w:i/>
+          <w:iCs/>
+        </w:rPr>
+        <w:t xml:space="preserve"> </w:t>
+      </w:r>
+      <w:proofErr w:type="spellStart"/>
+      <w:r>
+        <w:rPr>
+          <w:rFonts w:ascii="Times New Roman" w:hAnsi="Times New Roman" w:cs="Times New Roman"/>
+        </w:rPr>
+        <w:t>MotherDuck</w:t>
+      </w:r>
+      <w:proofErr w:type="spellEnd"/>
+      <w:r>
+        <w:rPr>
+          <w:rFonts w:ascii="Times New Roman" w:hAnsi="Times New Roman" w:cs="Times New Roman"/>
+        </w:rPr>
+        <w:t>,</w:t>
+      </w:r>
+      <w:r>
+        <w:rPr>
+          <w:rFonts w:ascii="Times New Roman" w:hAnsi="Times New Roman" w:cs="Times New Roman"/>
+        </w:rPr>
+        <w:t xml:space="preserve"> 16 June 2025,</w:t>
+      </w:r>
+      <w:r>
+        <w:rPr>
+          <w:rFonts w:ascii="Times New Roman" w:hAnsi="Times New Roman" w:cs="Times New Roman"/>
+        </w:rPr>
+        <w:t xml:space="preserve"> </w:t>
+      </w:r>
+      <w:hyperlink r:id="rId27" w:history="1">
+        <w:r>
+          <w:rPr>
+            <w:rStyle w:val="Hyperlink"/>
+            <w:rFonts w:ascii="Times New Roman" w:hAnsi="Times New Roman" w:cs="Times New Roman"/>
+          </w:rPr>
+          <w:t>https://motherduck.com/blog/postgres-duckdb-options/</w:t>
+        </w:r>
+      </w:hyperlink>
+      <w:r>
+        <w:rPr>
+          <w:rFonts w:ascii="Times New Roman" w:hAnsi="Times New Roman" w:cs="Times New Roman"/>
+        </w:rPr>
+        <w:t>.</w:t>
+      </w:r>
+      <w:r>
+        <w:rPr>
+          <w:rFonts w:ascii="Times New Roman" w:hAnsi="Times New Roman" w:cs="Times New Roman"/>
+        </w:rPr>
+        <w:t xml:space="preserve"> Accessed 21 April 2026.</w:t>
+      </w:r>
+    </w:p>
+    <w:p>
+      <w:pPr>
+        <w:rPr>
+          <w:rFonts w:ascii="Times New Roman" w:hAnsi="Times New Roman" w:cs="Times New Roman"/>
+        </w:rPr>
+      </w:pPr>
+      <w:r>
+        <w:rPr>
+          <w:rFonts w:ascii="Times New Roman" w:hAnsi="Times New Roman" w:cs="Times New Roman"/>
+        </w:rPr>
+        <w:t xml:space="preserve">Mannino, Michael. </w:t>
+      </w:r>
+      <w:r>
+        <w:rPr>
+          <w:rFonts w:ascii="Times New Roman" w:hAnsi="Times New Roman" w:cs="Times New Roman"/>
+        </w:rPr>
+        <w:t>“</w:t>
+      </w:r>
+      <w:r>
+        <w:rPr>
+          <w:rFonts w:ascii="Times New Roman" w:hAnsi="Times New Roman" w:cs="Times New Roman"/>
+        </w:rPr>
+        <w:t>Database Design, Query, Formulation, and Administration</w:t>
+      </w:r>
+      <w:r>
+        <w:rPr>
+          <w:rFonts w:ascii="Times New Roman" w:hAnsi="Times New Roman" w:cs="Times New Roman"/>
+        </w:rPr>
+        <w:t>”</w:t>
+      </w:r>
+      <w:r>
+        <w:rPr>
+          <w:rFonts w:ascii="Times New Roman" w:hAnsi="Times New Roman" w:cs="Times New Roman"/>
+        </w:rPr>
+        <w:t xml:space="preserve">. 8th ed., </w:t>
+      </w:r>
+      <w:r>
+        <w:rPr>
+          <w:rFonts w:ascii="Times New Roman" w:hAnsi="Times New Roman" w:cs="Times New Roman"/>
+          <w:i/>
+          <w:iCs/>
+        </w:rPr>
+        <w:t>Chicago Business Press</w:t>
+      </w:r>
+      <w:r>
+        <w:rPr>
+          <w:rFonts w:ascii="Times New Roman" w:hAnsi="Times New Roman" w:cs="Times New Roman"/>
+        </w:rPr>
+        <w:t>, 2022.</w:t>
+      </w:r>
+    </w:p>
+    <w:p>
+      <w:pPr>
+        <w:rPr>
+          <w:rFonts w:ascii="Times New Roman" w:hAnsi="Times New Roman" w:cs="Times New Roman"/>
+        </w:rPr>
+      </w:pPr>
+      <w:r>
+        <w:rPr>
+          <w:rFonts w:ascii="Times New Roman" w:hAnsi="Times New Roman" w:cs="Times New Roman"/>
+        </w:rPr>
+        <w:t>Rolli, Daniel</w:t>
+      </w:r>
+      <w:r>
+        <w:rPr>
+          <w:rFonts w:ascii="Times New Roman" w:hAnsi="Times New Roman" w:cs="Times New Roman"/>
+        </w:rPr>
+        <w:t>.</w:t>
+      </w:r>
+      <w:r>
+        <w:rPr>
+          <w:rFonts w:ascii="Times New Roman" w:hAnsi="Times New Roman" w:cs="Times New Roman"/>
+        </w:rPr>
+        <w:t xml:space="preserve"> </w:t>
+      </w:r>
+      <w:r>
+        <w:rPr>
+          <w:rFonts w:ascii="Times New Roman" w:hAnsi="Times New Roman" w:cs="Times New Roman"/>
+        </w:rPr>
+        <w:t>“</w:t>
+      </w:r>
+      <w:r>
+        <w:rPr>
+          <w:rFonts w:ascii="Times New Roman" w:hAnsi="Times New Roman" w:cs="Times New Roman"/>
+        </w:rPr>
+        <w:t>Tales of a Salesforce Migration: Challenges and Pitfalls to Avoid</w:t>
+      </w:r>
+      <w:r>
+        <w:rPr>
+          <w:rFonts w:ascii="Times New Roman" w:hAnsi="Times New Roman" w:cs="Times New Roman"/>
+        </w:rPr>
+        <w:t xml:space="preserve">.” </w:t>
+      </w:r>
+      <w:r>
+        <w:rPr>
+          <w:rFonts w:ascii="Times New Roman" w:hAnsi="Times New Roman" w:cs="Times New Roman"/>
+          <w:i/>
+          <w:iCs/>
+        </w:rPr>
+        <w:t>salesforceben.com</w:t>
+      </w:r>
+      <w:r>
+        <w:rPr>
+          <w:rFonts w:ascii="Times New Roman" w:hAnsi="Times New Roman" w:cs="Times New Roman"/>
+        </w:rPr>
+        <w:t xml:space="preserve">, </w:t>
+      </w:r>
+      <w:r>
+        <w:rPr>
+          <w:rFonts w:ascii="Times New Roman" w:hAnsi="Times New Roman" w:cs="Times New Roman"/>
+        </w:rPr>
+        <w:t>Salesforce Ben,</w:t>
+      </w:r>
+      <w:r>
+        <w:rPr>
+          <w:rFonts w:ascii="Times New Roman" w:hAnsi="Times New Roman" w:cs="Times New Roman"/>
+        </w:rPr>
+        <w:t xml:space="preserve"> 14 March 2025,</w:t>
+      </w:r>
+      <w:r>
+        <w:rPr>
+          <w:rFonts w:ascii="Times New Roman" w:hAnsi="Times New Roman" w:cs="Times New Roman"/>
+        </w:rPr>
+        <w:t xml:space="preserve"> </w:t>
+      </w:r>
+      <w:hyperlink r:id="rId28" w:history="1">
+        <w:r>
+          <w:rPr>
+            <w:rStyle w:val="Hyperlink"/>
+            <w:rFonts w:ascii="Times New Roman" w:hAnsi="Times New Roman" w:cs="Times New Roman"/>
+          </w:rPr>
+          <w:t>https://www.salesforceben.com/tales-of-a-salesforce-migration-challenges-and-pitfalls-to-avoid/</w:t>
+        </w:r>
+      </w:hyperlink>
+      <w:r>
+        <w:rPr>
+          <w:rFonts w:ascii="Times New Roman" w:hAnsi="Times New Roman" w:cs="Times New Roman"/>
+        </w:rPr>
+        <w:t>.</w:t>
+      </w:r>
+      <w:r>
+        <w:rPr>
+          <w:rFonts w:ascii="Times New Roman" w:hAnsi="Times New Roman" w:cs="Times New Roman"/>
+        </w:rPr>
+        <w:t xml:space="preserve"> Accessed 22 April 2026.</w:t>
+      </w:r>
+    </w:p>
+    <w:p>
+      <w:pPr>
+        <w:rPr>
+          <w:rFonts w:ascii="Times New Roman" w:hAnsi="Times New Roman" w:cs="Times New Roman"/>
+        </w:rPr>
+      </w:pPr>
+      <w:r>
+        <w:rPr>
+          <w:rFonts w:ascii="Times New Roman" w:hAnsi="Times New Roman" w:cs="Times New Roman"/>
+        </w:rPr>
+        <w:t>“Schema.”</w:t>
+      </w:r>
+      <w:r>
+        <w:rPr>
+          <w:rFonts w:ascii="Times New Roman" w:hAnsi="Times New Roman" w:cs="Times New Roman"/>
+        </w:rPr>
+        <w:t xml:space="preserve"> </w:t>
+      </w:r>
+      <w:r>
+        <w:rPr>
+          <w:rFonts w:ascii="Times New Roman" w:hAnsi="Times New Roman" w:cs="Times New Roman"/>
+          <w:i/>
+          <w:iCs/>
+        </w:rPr>
+        <w:t>m</w:t>
+      </w:r>
+      <w:r>
+        <w:rPr>
+          <w:rFonts w:ascii="Times New Roman" w:hAnsi="Times New Roman" w:cs="Times New Roman"/>
+          <w:i/>
+          <w:iCs/>
+        </w:rPr>
+        <w:t>otherduck.com</w:t>
+      </w:r>
+      <w:r>
+        <w:rPr>
+          <w:rFonts w:ascii="Times New Roman" w:hAnsi="Times New Roman" w:cs="Times New Roman"/>
+        </w:rPr>
+        <w:t>,</w:t>
+      </w:r>
+      <w:r>
+        <w:rPr>
+          <w:rFonts w:ascii="Times New Roman" w:hAnsi="Times New Roman" w:cs="Times New Roman"/>
+        </w:rPr>
+        <w:t xml:space="preserve"> </w:t>
+      </w:r>
+      <w:proofErr w:type="spellStart"/>
+      <w:r>
+        <w:rPr>
+          <w:rFonts w:ascii="Times New Roman" w:hAnsi="Times New Roman" w:cs="Times New Roman"/>
+        </w:rPr>
+        <w:t>MotherDuck</w:t>
+      </w:r>
+      <w:proofErr w:type="spellEnd"/>
+      <w:r>
+        <w:rPr>
+          <w:rFonts w:ascii="Times New Roman" w:hAnsi="Times New Roman" w:cs="Times New Roman"/>
+        </w:rPr>
+        <w:t xml:space="preserve"> Glossary, </w:t>
+      </w:r>
+      <w:hyperlink r:id="rId29" w:history="1">
+        <w:r>
+          <w:rPr>
+            <w:rStyle w:val="Hyperlink"/>
+            <w:rFonts w:ascii="Times New Roman" w:hAnsi="Times New Roman" w:cs="Times New Roman"/>
+          </w:rPr>
+          <w:t>https://</w:t>
+        </w:r>
+        <w:r>
+          <w:rPr>
+            <w:rStyle w:val="Hyperlink"/>
+            <w:rFonts w:ascii="Times New Roman" w:hAnsi="Times New Roman" w:cs="Times New Roman"/>
+          </w:rPr>
+          <w:t>m</w:t>
+        </w:r>
+        <w:r>
+          <w:rPr>
+            <w:rStyle w:val="Hyperlink"/>
+            <w:rFonts w:ascii="Times New Roman" w:hAnsi="Times New Roman" w:cs="Times New Roman"/>
+          </w:rPr>
+          <w:t>otherduck.com/glossary/schema/</w:t>
+        </w:r>
+      </w:hyperlink>
+      <w:r>
+        <w:rPr>
+          <w:rFonts w:ascii="Times New Roman" w:hAnsi="Times New Roman" w:cs="Times New Roman"/>
+        </w:rPr>
+        <w:t>.</w:t>
+      </w:r>
+      <w:r>
+        <w:rPr>
+          <w:rFonts w:ascii="Times New Roman" w:hAnsi="Times New Roman" w:cs="Times New Roman"/>
+        </w:rPr>
+        <w:t xml:space="preserve"> Accessed 21 April 2026.</w:t>
+      </w:r>
+    </w:p>
+    <w:p>
+      <w:pPr>
+        <w:rPr>
+          <w:rFonts w:ascii="Times New Roman" w:hAnsi="Times New Roman" w:cs="Times New Roman"/>
+        </w:rPr>
+      </w:pPr>
+      <w:r>
+        <w:rPr>
+          <w:rFonts w:ascii="Times New Roman" w:hAnsi="Times New Roman" w:cs="Times New Roman"/>
+        </w:rPr>
+        <w:t>“Spatial Extension.”</w:t>
+      </w:r>
+      <w:r>
+        <w:rPr>
+          <w:rFonts w:ascii="Times New Roman" w:hAnsi="Times New Roman" w:cs="Times New Roman"/>
+        </w:rPr>
+        <w:t xml:space="preserve"> </w:t>
+      </w:r>
+      <w:r>
+        <w:rPr>
+          <w:rFonts w:ascii="Times New Roman" w:hAnsi="Times New Roman" w:cs="Times New Roman"/>
+          <w:i/>
+          <w:iCs/>
+        </w:rPr>
+        <w:t>duckdb.org</w:t>
+      </w:r>
+      <w:r>
+        <w:rPr>
+          <w:rFonts w:ascii="Times New Roman" w:hAnsi="Times New Roman" w:cs="Times New Roman"/>
+        </w:rPr>
+        <w:t>,</w:t>
+      </w:r>
+      <w:r>
+        <w:rPr>
+          <w:rFonts w:ascii="Times New Roman" w:hAnsi="Times New Roman" w:cs="Times New Roman"/>
+        </w:rPr>
+        <w:t xml:space="preserve"> DuckDB</w:t>
+      </w:r>
+      <w:r>
+        <w:rPr>
+          <w:rFonts w:ascii="Times New Roman" w:hAnsi="Times New Roman" w:cs="Times New Roman"/>
+        </w:rPr>
+        <w:t xml:space="preserve"> Docs</w:t>
+      </w:r>
+      <w:r>
+        <w:rPr>
+          <w:rFonts w:ascii="Times New Roman" w:hAnsi="Times New Roman" w:cs="Times New Roman"/>
+        </w:rPr>
+        <w:t xml:space="preserve">, </w:t>
+      </w:r>
+      <w:hyperlink r:id="rId30" w:history="1">
+        <w:r>
+          <w:rPr>
+            <w:rStyle w:val="Hyperlink"/>
+            <w:rFonts w:ascii="Times New Roman" w:hAnsi="Times New Roman" w:cs="Times New Roman"/>
+          </w:rPr>
+          <w:t>https://duckdb.org/docs/current/core_extensions/spatial/overview</w:t>
+        </w:r>
+      </w:hyperlink>
+      <w:r>
+        <w:rPr>
+          <w:rFonts w:ascii="Times New Roman" w:hAnsi="Times New Roman" w:cs="Times New Roman"/>
+        </w:rPr>
+        <w:t>.</w:t>
+      </w:r>
+      <w:r>
+        <w:rPr>
+          <w:rFonts w:ascii="Times New Roman" w:hAnsi="Times New Roman" w:cs="Times New Roman"/>
+        </w:rPr>
+        <w:t xml:space="preserve"> </w:t>
+      </w:r>
+      <w:r>
+        <w:rPr>
+          <w:rFonts w:ascii="Times New Roman" w:hAnsi="Times New Roman" w:cs="Times New Roman"/>
+        </w:rPr>
+        <w:t xml:space="preserve">Accessed </w:t>
+      </w:r>
+      <w:r>
+        <w:rPr>
+          <w:rFonts w:ascii="Times New Roman" w:hAnsi="Times New Roman" w:cs="Times New Roman"/>
+        </w:rPr>
+        <w:t>26 April 2026.</w:t>
+      </w:r>
+    </w:p>
+    <w:p>
+      <w:pPr>
+        <w:rPr>
+          <w:rFonts w:ascii="Times New Roman" w:hAnsi="Times New Roman" w:cs="Times New Roman"/>
+        </w:rPr>
+      </w:pPr>
+      <w:r>
+        <w:rPr>
+          <w:rFonts w:ascii="Times New Roman" w:hAnsi="Times New Roman" w:cs="Times New Roman"/>
+        </w:rPr>
+        <w:t xml:space="preserve">“Top 5 Spatial Databases for GIS Professionals in 2025.” Geodata Insights, </w:t>
+      </w:r>
+      <w:hyperlink r:id="rId31" w:history="1">
+        <w:r>
+          <w:rPr>
+            <w:rStyle w:val="Hyperlink"/>
+            <w:rFonts w:ascii="Times New Roman" w:hAnsi="Times New Roman" w:cs="Times New Roman"/>
+          </w:rPr>
+          <w:t>https://geodatainsights.com/top-5-spatial-databases-for-gis-professionals-in-2025/</w:t>
+        </w:r>
+      </w:hyperlink>
+      <w:r>
+        <w:rPr>
+          <w:rFonts w:ascii="Times New Roman" w:hAnsi="Times New Roman" w:cs="Times New Roman"/>
+        </w:rPr>
+        <w:t>.</w:t>
+      </w:r>
+      <w:r>
+        <w:rPr>
+          <w:rFonts w:ascii="Times New Roman" w:hAnsi="Times New Roman" w:cs="Times New Roman"/>
+        </w:rPr>
+        <w:t xml:space="preserve"> </w:t>
+      </w:r>
+      <w:r>
+        <w:rPr>
+          <w:rFonts w:ascii="Times New Roman" w:hAnsi="Times New Roman" w:cs="Times New Roman"/>
+        </w:rPr>
+        <w:t xml:space="preserve">Accessed </w:t>
+      </w:r>
+      <w:r>
+        <w:rPr>
+          <w:rFonts w:ascii="Times New Roman" w:hAnsi="Times New Roman" w:cs="Times New Roman"/>
+        </w:rPr>
+        <w:t>24 April 2026.</w:t>
+      </w:r>
+    </w:p>
+    <w:p>
+      <w:pPr>
+        <w:rPr>
+          <w:rFonts w:ascii="Times New Roman" w:hAnsi="Times New Roman" w:cs="Times New Roman"/>
+        </w:rPr>
+      </w:pPr>
+      <w:r>
+        <w:rPr>
+          <w:rFonts w:ascii="Times New Roman" w:hAnsi="Times New Roman" w:cs="Times New Roman"/>
+        </w:rPr>
+        <w:t xml:space="preserve">Veeraraghavan, Anantharaman. </w:t>
+      </w:r>
+      <w:r>
+        <w:rPr>
+          <w:rFonts w:ascii="Times New Roman" w:hAnsi="Times New Roman" w:cs="Times New Roman"/>
+        </w:rPr>
+        <w:t>“</w:t>
+      </w:r>
+      <w:r>
+        <w:rPr>
+          <w:rFonts w:ascii="Times New Roman" w:hAnsi="Times New Roman" w:cs="Times New Roman"/>
+        </w:rPr>
+        <w:t>Common Challenges In Salesforce Data Migration</w:t>
+      </w:r>
+      <w:r>
+        <w:rPr>
+          <w:rFonts w:ascii="Times New Roman" w:hAnsi="Times New Roman" w:cs="Times New Roman"/>
+        </w:rPr>
+        <w:t>.”</w:t>
+      </w:r>
+      <w:r>
+        <w:rPr>
+          <w:rFonts w:ascii="Times New Roman" w:hAnsi="Times New Roman" w:cs="Times New Roman"/>
+        </w:rPr>
+        <w:t xml:space="preserve"> </w:t>
+      </w:r>
+      <w:r>
+        <w:rPr>
+          <w:rFonts w:ascii="Times New Roman" w:hAnsi="Times New Roman" w:cs="Times New Roman"/>
+          <w:i/>
+          <w:iCs/>
+        </w:rPr>
+        <w:t>minisculetechnologies.com</w:t>
+      </w:r>
+      <w:r>
+        <w:rPr>
+          <w:rFonts w:ascii="Times New Roman" w:hAnsi="Times New Roman" w:cs="Times New Roman"/>
+        </w:rPr>
+        <w:t>,</w:t>
+      </w:r>
+      <w:r>
+        <w:rPr>
+          <w:rFonts w:ascii="Times New Roman" w:hAnsi="Times New Roman" w:cs="Times New Roman"/>
+        </w:rPr>
+        <w:t xml:space="preserve"> Minuscule Technologies, </w:t>
+      </w:r>
+      <w:hyperlink r:id="rId32" w:history="1">
+        <w:r>
+          <w:rPr>
+            <w:rStyle w:val="Hyperlink"/>
+            <w:rFonts w:ascii="Times New Roman" w:hAnsi="Times New Roman" w:cs="Times New Roman"/>
+          </w:rPr>
+          <w:t>https://www.minusculetechnologies.com/blogs/salesforce-data-migration-challenges</w:t>
+        </w:r>
+      </w:hyperlink>
+      <w:r>
+        <w:rPr>
+          <w:rFonts w:ascii="Times New Roman" w:hAnsi="Times New Roman" w:cs="Times New Roman"/>
+        </w:rPr>
+        <w:t>.</w:t>
+      </w:r>
+      <w:r>
+        <w:rPr>
+          <w:rFonts w:ascii="Times New Roman" w:hAnsi="Times New Roman" w:cs="Times New Roman"/>
+        </w:rPr>
+        <w:t xml:space="preserve"> </w:t>
+      </w:r>
+      <w:r>
+        <w:rPr>
+          <w:rFonts w:ascii="Times New Roman" w:hAnsi="Times New Roman" w:cs="Times New Roman"/>
+        </w:rPr>
+        <w:t xml:space="preserve">Accessed </w:t>
+      </w:r>
+      <w:r>
+        <w:rPr>
+          <w:rFonts w:ascii="Times New Roman" w:hAnsi="Times New Roman" w:cs="Times New Roman"/>
+        </w:rPr>
+        <w:t>22 April 2026.</w:t>
+      </w:r>
+    </w:p>
+    <w:p>
+      <w:pPr>
+        <w:jc w:val="center"/>
+        <w:rPr>
+          <w:b/>
+          <w:bCs/>
+          <w:color w:val="156082" w:themeColor="accent1"/>
+          <w:sz w:val="32"/>
+          <w:szCs w:val="32"/>
+        </w:rPr>
+      </w:pPr>
+      <w:r>
+        <w:rPr>
+          <w:b/>
+          <w:bCs/>
+          <w:color w:val="156082" w:themeColor="accent1"/>
+          <w:sz w:val="32"/>
+          <w:szCs w:val="32"/>
+        </w:rPr>
+        <w:t>Resources</w:t>
+      </w:r>
+    </w:p>
+    <w:p>
+      <w:pPr>
+        <w:rPr>
+          <w:rFonts w:ascii="Times New Roman" w:hAnsi="Times New Roman" w:cs="Times New Roman"/>
+        </w:rPr>
+      </w:pPr>
+      <w:r>
+        <w:rPr>
+          <w:rFonts w:ascii="Times New Roman" w:hAnsi="Times New Roman" w:cs="Times New Roman"/>
+        </w:rPr>
+        <w:t xml:space="preserve">ChatGPT Discussion: </w:t>
+      </w:r>
+      <w:hyperlink r:id="rId33" w:history="1">
+        <w:r>
+          <w:rPr>
+            <w:rStyle w:val="Hyperlink"/>
+            <w:rFonts w:ascii="Times New Roman" w:hAnsi="Times New Roman" w:cs="Times New Roman"/>
+          </w:rPr>
+          <w:t>https://chatgpt.com/share/69f68ab8-c35c-83ea-8c44-318dc10a8f30</w:t>
+        </w:r>
+      </w:hyperlink>
+    </w:p>
+    <w:p>
+      <w:pPr>
+        <w:rPr>
+          <w:rFonts w:ascii="Times New Roman" w:hAnsi="Times New Roman" w:cs="Times New Roman"/>
+        </w:rPr>
+      </w:pPr>
+      <w:r>
+        <w:rPr>
+          <w:rFonts w:ascii="Times New Roman" w:hAnsi="Times New Roman" w:cs="Times New Roman"/>
+        </w:rPr>
+        <w:t xml:space="preserve">DuckDB Repository: </w:t>
+      </w:r>
+      <w:hyperlink r:id="rId34" w:history="1">
+        <w:r>
+          <w:rPr>
+            <w:rStyle w:val="Hyperlink"/>
+            <w:rFonts w:ascii="Times New Roman" w:hAnsi="Times New Roman" w:cs="Times New Roman"/>
+          </w:rPr>
+          <w:t>https://github.com/duckdb/duckdb</w:t>
+        </w:r>
+      </w:hyperlink>
+    </w:p>
+    <w:p>
+      <w:pPr>
+        <w:rPr>
+          <w:rFonts w:ascii="Times New Roman" w:hAnsi="Times New Roman" w:cs="Times New Roman"/>
+        </w:rPr>
+      </w:pPr>
+      <w:r>
+        <w:rPr>
+          <w:rFonts w:ascii="Times New Roman" w:hAnsi="Times New Roman" w:cs="Times New Roman"/>
+        </w:rPr>
+        <w:lastRenderedPageBreak/>
+        <w:t xml:space="preserve">DuckDB Documentation: </w:t>
+      </w:r>
+      <w:hyperlink r:id="rId35" w:history="1">
+        <w:r>
+          <w:rPr>
+            <w:rStyle w:val="Hyperlink"/>
+            <w:rFonts w:ascii="Times New Roman" w:hAnsi="Times New Roman" w:cs="Times New Roman"/>
+          </w:rPr>
+          <w:t>https://duckdb.org</w:t>
+        </w:r>
+      </w:hyperlink>
+      <w:r>
+        <w:rPr>
+          <w:rFonts w:ascii="Times New Roman" w:hAnsi="Times New Roman" w:cs="Times New Roman"/>
+        </w:rPr>
+        <w:t xml:space="preserve"> </w:t>
+      </w:r>
+    </w:p>
+    <w:p>
+      <w:pPr>
+        <w:rPr>
+          <w:rFonts w:ascii="Times New Roman" w:hAnsi="Times New Roman" w:cs="Times New Roman"/>
+        </w:rPr>
+      </w:pPr>
+      <w:r>
+        <w:rPr>
+          <w:rFonts w:ascii="Times New Roman" w:hAnsi="Times New Roman" w:cs="Times New Roman"/>
+        </w:rPr>
+        <w:t xml:space="preserve">GitHub Repository where project is managed: </w:t>
+      </w:r>
+      <w:hyperlink r:id="rId36" w:history="1">
+        <w:r>
+          <w:rPr>
+            <w:rStyle w:val="Hyperlink"/>
+            <w:rFonts w:ascii="Times New Roman" w:hAnsi="Times New Roman" w:cs="Times New Roman"/>
+          </w:rPr>
+          <w:t>https://github.com/Tuck1297/University-of-St.-Thomas-Graduate-Projects/tree/main/GIS-Data-Migration-Project</w:t>
+        </w:r>
+      </w:hyperlink>
+      <w:r>
+        <w:rPr>
+          <w:rFonts w:ascii="Times New Roman" w:hAnsi="Times New Roman" w:cs="Times New Roman"/>
+        </w:rPr>
+        <w:t xml:space="preserve"> </w:t>
+      </w:r>
+    </w:p>
+    <w:p>
+      <w:pPr>
+        <w:rPr>
+          <w:rFonts w:ascii="Times New Roman" w:hAnsi="Times New Roman" w:cs="Times New Roman"/>
+        </w:rPr>
+      </w:pPr>
+      <w:r>
+        <w:rPr>
+          <w:rFonts w:ascii="Times New Roman" w:hAnsi="Times New Roman" w:cs="Times New Roman"/>
+        </w:rPr>
+        <w:t xml:space="preserve">PostgreSQL Documentation: </w:t>
+      </w:r>
+      <w:hyperlink r:id="rId37" w:history="1">
+        <w:r>
+          <w:rPr>
+            <w:rStyle w:val="Hyperlink"/>
+            <w:rFonts w:ascii="Times New Roman" w:hAnsi="Times New Roman" w:cs="Times New Roman"/>
+          </w:rPr>
+          <w:t>https://www.postgresql.org</w:t>
+        </w:r>
+      </w:hyperlink>
+      <w:r>
+        <w:rPr>
+          <w:rFonts w:ascii="Times New Roman" w:hAnsi="Times New Roman" w:cs="Times New Roman"/>
+        </w:rPr>
+        <w:t xml:space="preserve"> </w:t>
+      </w:r>
+    </w:p>
     <w:sectPr>
-      <w:headerReference w:type="default" r:id="rId27"/>
+      <w:headerReference w:type="default" r:id="rId38"/>
       <w:pgSz w:w="12240" w:h="15840"/>
       <w:pgMar w:top="1440" w:right="1440" w:bottom="1440" w:left="1440" w:header="720" w:footer="720" w:gutter="0"/>
       <w:cols w:space="720"/>
@@ -6664,7 +8308,7 @@
   <w:style w:type="paragraph" w:default="1" w:styleId="Normal">
     <w:name w:val="Normal"/>
     <w:qFormat/>
-    <w:rsid w:val="00C47237"/>
+    <w:rsid w:val="00377872"/>
   </w:style>
   <w:style w:type="paragraph" w:styleId="Heading1">
     <w:name w:val="heading 1"/>
@@ -6867,7 +8511,6 @@
   <w:style w:type="character" w:default="1" w:styleId="DefaultParagraphFont">
     <w:name w:val="Default Paragraph Font"/>
     <w:uiPriority w:val="1"/>
-    <w:semiHidden/>
     <w:unhideWhenUsed/>
   </w:style>
   <w:style w:type="table" w:default="1" w:styleId="TableNormal">
@@ -7246,6 +8889,18 @@
       <w:shd w:val="clear" w:color="auto" w:fill="E1DFDD"/>
     </w:rPr>
   </w:style>
+  <w:style w:type="character" w:styleId="FollowedHyperlink">
+    <w:name w:val="FollowedHyperlink"/>
+    <w:basedOn w:val="DefaultParagraphFont"/>
+    <w:uiPriority w:val="99"/>
+    <w:semiHidden/>
+    <w:unhideWhenUsed/>
+    <w:rsid w:val="00AE3FA8"/>
+    <w:rPr>
+      <w:color w:val="96607D" w:themeColor="followedHyperlink"/>
+      <w:u w:val="single"/>
+    </w:rPr>
+  </w:style>
 </w:styles>
 </file>
 

</xml_diff>